<commit_message>
add arrays notes js
</commit_message>
<xml_diff>
--- a/Javascript/Javascript basic notes.docx
+++ b/Javascript/Javascript basic notes.docx
@@ -44,11 +44,10 @@
           <w:sz w:val="22"/>
           <w:szCs w:val="22"/>
         </w:rPr>
-        <w:t>In this document I will have a javascript bootcamp of 6 days including code before I move on into backend and node.js. this might take longer in case I have to improve my AWS skills more.</w:t>
-      </w:r>
-    </w:p>
-    <w:p>
-      <w:pPr>
+        <w:t xml:space="preserve">In this document I will have a </w:t>
+      </w:r>
+      <w:proofErr w:type="spellStart"/>
+      <w:r>
         <w:rPr>
           <w:i/>
           <w:iCs/>
@@ -56,6 +55,51 @@
           <w:sz w:val="22"/>
           <w:szCs w:val="22"/>
         </w:rPr>
+        <w:t>javascript</w:t>
+      </w:r>
+      <w:proofErr w:type="spellEnd"/>
+      <w:r>
+        <w:rPr>
+          <w:i/>
+          <w:iCs/>
+          <w:color w:val="000000" w:themeColor="text1"/>
+          <w:sz w:val="22"/>
+          <w:szCs w:val="22"/>
+        </w:rPr>
+        <w:t xml:space="preserve"> bootcamp of 6 days including code before I move on into backend and node.js. </w:t>
+      </w:r>
+      <w:proofErr w:type="gramStart"/>
+      <w:r>
+        <w:rPr>
+          <w:i/>
+          <w:iCs/>
+          <w:color w:val="000000" w:themeColor="text1"/>
+          <w:sz w:val="22"/>
+          <w:szCs w:val="22"/>
+        </w:rPr>
+        <w:t>this</w:t>
+      </w:r>
+      <w:proofErr w:type="gramEnd"/>
+      <w:r>
+        <w:rPr>
+          <w:i/>
+          <w:iCs/>
+          <w:color w:val="000000" w:themeColor="text1"/>
+          <w:sz w:val="22"/>
+          <w:szCs w:val="22"/>
+        </w:rPr>
+        <w:t xml:space="preserve"> might take longer in case I have to improve my AWS skills more.</w:t>
+      </w:r>
+    </w:p>
+    <w:p>
+      <w:pPr>
+        <w:rPr>
+          <w:i/>
+          <w:iCs/>
+          <w:color w:val="000000" w:themeColor="text1"/>
+          <w:sz w:val="22"/>
+          <w:szCs w:val="22"/>
+        </w:rPr>
       </w:pPr>
     </w:p>
     <w:p>
@@ -67,6 +111,7 @@
           <w:u w:val="single"/>
         </w:rPr>
       </w:pPr>
+      <w:proofErr w:type="spellStart"/>
       <w:r>
         <w:rPr>
           <w:b/>
@@ -74,232 +119,534 @@
           <w:color w:val="000000" w:themeColor="text1"/>
           <w:u w:val="single"/>
         </w:rPr>
-        <w:t>Javascript basics and general information:</w:t>
-      </w:r>
-    </w:p>
-    <w:p>
-      <w:pPr>
-        <w:pStyle w:val="ListParagraph"/>
-        <w:numPr>
-          <w:ilvl w:val="0"/>
-          <w:numId w:val="1"/>
-        </w:numPr>
-        <w:rPr>
-          <w:color w:val="000000" w:themeColor="text1"/>
-          <w:sz w:val="22"/>
-          <w:szCs w:val="22"/>
-        </w:rPr>
-      </w:pPr>
-      <w:r>
-        <w:rPr>
-          <w:color w:val="000000" w:themeColor="text1"/>
-          <w:sz w:val="22"/>
-          <w:szCs w:val="22"/>
-        </w:rPr>
-        <w:t>in javascript to avoid any inaccuracies during calculations we shall calcualte in cents then multiply by 100 to the final result.</w:t>
-      </w:r>
-    </w:p>
-    <w:p>
-      <w:pPr>
-        <w:pStyle w:val="ListParagraph"/>
-        <w:numPr>
-          <w:ilvl w:val="0"/>
-          <w:numId w:val="1"/>
-        </w:numPr>
-        <w:rPr>
-          <w:color w:val="000000" w:themeColor="text1"/>
-          <w:sz w:val="22"/>
-          <w:szCs w:val="22"/>
-        </w:rPr>
-      </w:pPr>
-      <w:r>
-        <w:rPr>
-          <w:color w:val="000000" w:themeColor="text1"/>
-          <w:sz w:val="22"/>
-          <w:szCs w:val="22"/>
-        </w:rPr>
-        <w:t>to round a number we use the function Math.round(number);</w:t>
-      </w:r>
-      <w:r>
-        <w:rPr>
-          <w:color w:val="000000" w:themeColor="text1"/>
-          <w:sz w:val="22"/>
-          <w:szCs w:val="22"/>
-        </w:rPr>
-        <w:t xml:space="preserve"> it rounds normally, to round up we use Math.ceil(); and to round down we use Math.floor();</w:t>
-      </w:r>
-    </w:p>
-    <w:p>
-      <w:pPr>
-        <w:pStyle w:val="ListParagraph"/>
-        <w:numPr>
-          <w:ilvl w:val="0"/>
-          <w:numId w:val="1"/>
-        </w:numPr>
-        <w:rPr>
-          <w:color w:val="000000" w:themeColor="text1"/>
-          <w:sz w:val="22"/>
-          <w:szCs w:val="22"/>
-        </w:rPr>
-      </w:pPr>
-      <w:r>
-        <w:rPr>
-          <w:color w:val="000000" w:themeColor="text1"/>
-          <w:sz w:val="22"/>
-          <w:szCs w:val="22"/>
-        </w:rPr>
-        <w:t>even when we round a number we should do so in cents, we only convert to normal numbers ones we are ready to display the result.</w:t>
-      </w:r>
-    </w:p>
-    <w:p>
-      <w:pPr>
-        <w:pStyle w:val="ListParagraph"/>
-        <w:numPr>
-          <w:ilvl w:val="0"/>
-          <w:numId w:val="1"/>
-        </w:numPr>
-        <w:rPr>
-          <w:color w:val="000000" w:themeColor="text1"/>
-          <w:sz w:val="22"/>
-          <w:szCs w:val="22"/>
-        </w:rPr>
-      </w:pPr>
-      <w:r>
-        <w:rPr>
-          <w:color w:val="000000" w:themeColor="text1"/>
-          <w:sz w:val="22"/>
-          <w:szCs w:val="22"/>
-        </w:rPr>
-        <w:t>We can check the type of a variable, object, or array using the typeof keyword</w:t>
-      </w:r>
-    </w:p>
-    <w:p>
-      <w:pPr>
-        <w:pStyle w:val="ListParagraph"/>
-        <w:numPr>
-          <w:ilvl w:val="0"/>
-          <w:numId w:val="1"/>
-        </w:numPr>
-        <w:rPr>
-          <w:color w:val="000000" w:themeColor="text1"/>
-          <w:sz w:val="22"/>
-          <w:szCs w:val="22"/>
-        </w:rPr>
-      </w:pPr>
-      <w:r>
-        <w:rPr>
-          <w:color w:val="000000" w:themeColor="text1"/>
-          <w:sz w:val="22"/>
-          <w:szCs w:val="22"/>
-        </w:rPr>
-        <w:t>We have escape characters just the same as in C++ and in Java.</w:t>
-      </w:r>
-    </w:p>
-    <w:p>
-      <w:pPr>
-        <w:pStyle w:val="ListParagraph"/>
-        <w:numPr>
-          <w:ilvl w:val="0"/>
-          <w:numId w:val="1"/>
-        </w:numPr>
-        <w:rPr>
-          <w:color w:val="000000" w:themeColor="text1"/>
-          <w:sz w:val="22"/>
-          <w:szCs w:val="22"/>
-        </w:rPr>
-      </w:pPr>
-      <w:r>
-        <w:rPr>
-          <w:color w:val="000000" w:themeColor="text1"/>
-          <w:sz w:val="22"/>
-          <w:szCs w:val="22"/>
-        </w:rPr>
-        <w:t>When using addition if one of the values is a string javascript will type cast all the elements into strings so “5” + 3 will be 53, the same with 3 + “5”</w:t>
-      </w:r>
-    </w:p>
-    <w:p>
-      <w:pPr>
-        <w:pStyle w:val="ListParagraph"/>
-        <w:numPr>
-          <w:ilvl w:val="0"/>
-          <w:numId w:val="1"/>
-        </w:numPr>
-        <w:rPr>
-          <w:color w:val="000000" w:themeColor="text1"/>
-          <w:sz w:val="22"/>
-          <w:szCs w:val="22"/>
-        </w:rPr>
-      </w:pPr>
-      <w:r>
-        <w:rPr>
-          <w:color w:val="000000" w:themeColor="text1"/>
-          <w:sz w:val="22"/>
-          <w:szCs w:val="22"/>
-        </w:rPr>
-        <w:t>${}</w:t>
-      </w:r>
-      <w:r>
-        <w:rPr>
-          <w:color w:val="000000" w:themeColor="text1"/>
-          <w:sz w:val="22"/>
-          <w:szCs w:val="22"/>
-        </w:rPr>
-        <w:t xml:space="preserve"> to include a variable inside a print the print should be of type ``</w:t>
-      </w:r>
-    </w:p>
-    <w:p>
-      <w:pPr>
-        <w:pStyle w:val="ListParagraph"/>
-        <w:numPr>
-          <w:ilvl w:val="0"/>
-          <w:numId w:val="1"/>
-        </w:numPr>
-        <w:rPr>
-          <w:color w:val="000000" w:themeColor="text1"/>
-          <w:sz w:val="22"/>
-          <w:szCs w:val="22"/>
-        </w:rPr>
-      </w:pPr>
-      <w:r>
-        <w:rPr>
-          <w:color w:val="000000" w:themeColor="text1"/>
-          <w:sz w:val="22"/>
-          <w:szCs w:val="22"/>
-        </w:rPr>
-        <w:t>Javascript uses camelCase</w:t>
-      </w:r>
-    </w:p>
-    <w:p>
-      <w:pPr>
-        <w:pStyle w:val="ListParagraph"/>
-        <w:numPr>
-          <w:ilvl w:val="0"/>
-          <w:numId w:val="1"/>
-        </w:numPr>
-        <w:rPr>
-          <w:color w:val="000000" w:themeColor="text1"/>
-          <w:sz w:val="22"/>
-          <w:szCs w:val="22"/>
-        </w:rPr>
-      </w:pPr>
-      <w:r>
-        <w:rPr>
-          <w:color w:val="000000" w:themeColor="text1"/>
-          <w:sz w:val="22"/>
-          <w:szCs w:val="22"/>
-        </w:rPr>
-        <w:t>Onclick is an event handler for the event of clicking. It runs javascript code. We can include the javascript code directly on the onclick or we can store it into a function that gets called.</w:t>
-      </w:r>
-    </w:p>
-    <w:p>
-      <w:pPr>
+        <w:t>Javascript</w:t>
+      </w:r>
+      <w:proofErr w:type="spellEnd"/>
+      <w:r>
         <w:rPr>
           <w:b/>
           <w:bCs/>
           <w:color w:val="000000" w:themeColor="text1"/>
           <w:u w:val="single"/>
         </w:rPr>
-      </w:pPr>
+        <w:t xml:space="preserve"> basics and general information:</w:t>
+      </w:r>
+    </w:p>
+    <w:p>
+      <w:pPr>
+        <w:pStyle w:val="ListParagraph"/>
+        <w:numPr>
+          <w:ilvl w:val="0"/>
+          <w:numId w:val="1"/>
+        </w:numPr>
+        <w:rPr>
+          <w:color w:val="000000" w:themeColor="text1"/>
+          <w:sz w:val="22"/>
+          <w:szCs w:val="22"/>
+        </w:rPr>
+      </w:pPr>
+      <w:r>
+        <w:rPr>
+          <w:color w:val="000000" w:themeColor="text1"/>
+          <w:sz w:val="22"/>
+          <w:szCs w:val="22"/>
+        </w:rPr>
+        <w:t xml:space="preserve">in </w:t>
+      </w:r>
+      <w:proofErr w:type="spellStart"/>
+      <w:r>
+        <w:rPr>
+          <w:color w:val="000000" w:themeColor="text1"/>
+          <w:sz w:val="22"/>
+          <w:szCs w:val="22"/>
+        </w:rPr>
+        <w:t>javascript</w:t>
+      </w:r>
+      <w:proofErr w:type="spellEnd"/>
+      <w:r>
+        <w:rPr>
+          <w:color w:val="000000" w:themeColor="text1"/>
+          <w:sz w:val="22"/>
+          <w:szCs w:val="22"/>
+        </w:rPr>
+        <w:t xml:space="preserve"> to avoid any inaccuracies during calculations we shall </w:t>
+      </w:r>
+      <w:proofErr w:type="spellStart"/>
+      <w:r>
+        <w:rPr>
+          <w:color w:val="000000" w:themeColor="text1"/>
+          <w:sz w:val="22"/>
+          <w:szCs w:val="22"/>
+        </w:rPr>
+        <w:t>calcualte</w:t>
+      </w:r>
+      <w:proofErr w:type="spellEnd"/>
+      <w:r>
+        <w:rPr>
+          <w:color w:val="000000" w:themeColor="text1"/>
+          <w:sz w:val="22"/>
+          <w:szCs w:val="22"/>
+        </w:rPr>
+        <w:t xml:space="preserve"> in cents then multiply by 100 to </w:t>
+      </w:r>
+      <w:proofErr w:type="gramStart"/>
+      <w:r>
+        <w:rPr>
+          <w:color w:val="000000" w:themeColor="text1"/>
+          <w:sz w:val="22"/>
+          <w:szCs w:val="22"/>
+        </w:rPr>
+        <w:t>the final result</w:t>
+      </w:r>
+      <w:proofErr w:type="gramEnd"/>
+      <w:r>
+        <w:rPr>
+          <w:color w:val="000000" w:themeColor="text1"/>
+          <w:sz w:val="22"/>
+          <w:szCs w:val="22"/>
+        </w:rPr>
+        <w:t>.</w:t>
+      </w:r>
+    </w:p>
+    <w:p>
+      <w:pPr>
+        <w:pStyle w:val="ListParagraph"/>
+        <w:numPr>
+          <w:ilvl w:val="0"/>
+          <w:numId w:val="1"/>
+        </w:numPr>
+        <w:rPr>
+          <w:color w:val="000000" w:themeColor="text1"/>
+          <w:sz w:val="22"/>
+          <w:szCs w:val="22"/>
+        </w:rPr>
+      </w:pPr>
+      <w:proofErr w:type="gramStart"/>
+      <w:r>
+        <w:rPr>
+          <w:color w:val="000000" w:themeColor="text1"/>
+          <w:sz w:val="22"/>
+          <w:szCs w:val="22"/>
+        </w:rPr>
+        <w:t>to</w:t>
+      </w:r>
+      <w:proofErr w:type="gramEnd"/>
+      <w:r>
+        <w:rPr>
+          <w:color w:val="000000" w:themeColor="text1"/>
+          <w:sz w:val="22"/>
+          <w:szCs w:val="22"/>
+        </w:rPr>
+        <w:t xml:space="preserve"> round a </w:t>
+      </w:r>
+      <w:proofErr w:type="gramStart"/>
+      <w:r>
+        <w:rPr>
+          <w:color w:val="000000" w:themeColor="text1"/>
+          <w:sz w:val="22"/>
+          <w:szCs w:val="22"/>
+        </w:rPr>
+        <w:t>number</w:t>
+      </w:r>
+      <w:proofErr w:type="gramEnd"/>
+      <w:r>
+        <w:rPr>
+          <w:color w:val="000000" w:themeColor="text1"/>
+          <w:sz w:val="22"/>
+          <w:szCs w:val="22"/>
+        </w:rPr>
+        <w:t xml:space="preserve"> we use the </w:t>
+      </w:r>
+      <w:proofErr w:type="gramStart"/>
+      <w:r>
+        <w:rPr>
+          <w:color w:val="000000" w:themeColor="text1"/>
+          <w:sz w:val="22"/>
+          <w:szCs w:val="22"/>
+        </w:rPr>
+        <w:t>function</w:t>
+      </w:r>
+      <w:proofErr w:type="gramEnd"/>
+      <w:r>
+        <w:rPr>
+          <w:color w:val="000000" w:themeColor="text1"/>
+          <w:sz w:val="22"/>
+          <w:szCs w:val="22"/>
+        </w:rPr>
+        <w:t xml:space="preserve"> </w:t>
+      </w:r>
+      <w:proofErr w:type="spellStart"/>
+      <w:r>
+        <w:rPr>
+          <w:color w:val="000000" w:themeColor="text1"/>
+          <w:sz w:val="22"/>
+          <w:szCs w:val="22"/>
+        </w:rPr>
+        <w:t>Math.round</w:t>
+      </w:r>
+      <w:proofErr w:type="spellEnd"/>
+      <w:r>
+        <w:rPr>
+          <w:color w:val="000000" w:themeColor="text1"/>
+          <w:sz w:val="22"/>
+          <w:szCs w:val="22"/>
+        </w:rPr>
+        <w:t>(number);</w:t>
+      </w:r>
+      <w:r>
+        <w:rPr>
+          <w:color w:val="000000" w:themeColor="text1"/>
+          <w:sz w:val="22"/>
+          <w:szCs w:val="22"/>
+        </w:rPr>
+        <w:t xml:space="preserve"> it rounds normally, to round up we use </w:t>
+      </w:r>
+      <w:proofErr w:type="spellStart"/>
+      <w:r>
+        <w:rPr>
+          <w:color w:val="000000" w:themeColor="text1"/>
+          <w:sz w:val="22"/>
+          <w:szCs w:val="22"/>
+        </w:rPr>
+        <w:t>Math.ceil</w:t>
+      </w:r>
+      <w:proofErr w:type="spellEnd"/>
+      <w:r>
+        <w:rPr>
+          <w:color w:val="000000" w:themeColor="text1"/>
+          <w:sz w:val="22"/>
+          <w:szCs w:val="22"/>
+        </w:rPr>
+        <w:t xml:space="preserve">(); and to round down we use </w:t>
+      </w:r>
+      <w:proofErr w:type="spellStart"/>
+      <w:r>
+        <w:rPr>
+          <w:color w:val="000000" w:themeColor="text1"/>
+          <w:sz w:val="22"/>
+          <w:szCs w:val="22"/>
+        </w:rPr>
+        <w:t>Math.floor</w:t>
+      </w:r>
+      <w:proofErr w:type="spellEnd"/>
+      <w:r>
+        <w:rPr>
+          <w:color w:val="000000" w:themeColor="text1"/>
+          <w:sz w:val="22"/>
+          <w:szCs w:val="22"/>
+        </w:rPr>
+        <w:t>();</w:t>
+      </w:r>
+    </w:p>
+    <w:p>
+      <w:pPr>
+        <w:pStyle w:val="ListParagraph"/>
+        <w:numPr>
+          <w:ilvl w:val="0"/>
+          <w:numId w:val="1"/>
+        </w:numPr>
+        <w:rPr>
+          <w:color w:val="000000" w:themeColor="text1"/>
+          <w:sz w:val="22"/>
+          <w:szCs w:val="22"/>
+        </w:rPr>
+      </w:pPr>
+      <w:proofErr w:type="gramStart"/>
+      <w:r>
+        <w:rPr>
+          <w:color w:val="000000" w:themeColor="text1"/>
+          <w:sz w:val="22"/>
+          <w:szCs w:val="22"/>
+        </w:rPr>
+        <w:t>even</w:t>
+      </w:r>
+      <w:proofErr w:type="gramEnd"/>
+      <w:r>
+        <w:rPr>
+          <w:color w:val="000000" w:themeColor="text1"/>
+          <w:sz w:val="22"/>
+          <w:szCs w:val="22"/>
+        </w:rPr>
+        <w:t xml:space="preserve"> when we round a </w:t>
+      </w:r>
+      <w:proofErr w:type="gramStart"/>
+      <w:r>
+        <w:rPr>
+          <w:color w:val="000000" w:themeColor="text1"/>
+          <w:sz w:val="22"/>
+          <w:szCs w:val="22"/>
+        </w:rPr>
+        <w:t>number</w:t>
+      </w:r>
+      <w:proofErr w:type="gramEnd"/>
+      <w:r>
+        <w:rPr>
+          <w:color w:val="000000" w:themeColor="text1"/>
+          <w:sz w:val="22"/>
+          <w:szCs w:val="22"/>
+        </w:rPr>
+        <w:t xml:space="preserve"> we should do so in cents, we only convert to normal </w:t>
+      </w:r>
+      <w:proofErr w:type="gramStart"/>
+      <w:r>
+        <w:rPr>
+          <w:color w:val="000000" w:themeColor="text1"/>
+          <w:sz w:val="22"/>
+          <w:szCs w:val="22"/>
+        </w:rPr>
+        <w:t>numbers</w:t>
+      </w:r>
+      <w:proofErr w:type="gramEnd"/>
+      <w:r>
+        <w:rPr>
+          <w:color w:val="000000" w:themeColor="text1"/>
+          <w:sz w:val="22"/>
+          <w:szCs w:val="22"/>
+        </w:rPr>
+        <w:t xml:space="preserve"> ones we are ready to display the result.</w:t>
+      </w:r>
+    </w:p>
+    <w:p>
+      <w:pPr>
+        <w:pStyle w:val="ListParagraph"/>
+        <w:numPr>
+          <w:ilvl w:val="0"/>
+          <w:numId w:val="1"/>
+        </w:numPr>
+        <w:rPr>
+          <w:color w:val="000000" w:themeColor="text1"/>
+          <w:sz w:val="22"/>
+          <w:szCs w:val="22"/>
+        </w:rPr>
+      </w:pPr>
+      <w:r>
+        <w:rPr>
+          <w:color w:val="000000" w:themeColor="text1"/>
+          <w:sz w:val="22"/>
+          <w:szCs w:val="22"/>
+        </w:rPr>
+        <w:t xml:space="preserve">We can check the type of a variable, object, or array using the </w:t>
+      </w:r>
+      <w:proofErr w:type="spellStart"/>
+      <w:proofErr w:type="gramStart"/>
+      <w:r>
+        <w:rPr>
+          <w:color w:val="000000" w:themeColor="text1"/>
+          <w:sz w:val="22"/>
+          <w:szCs w:val="22"/>
+        </w:rPr>
+        <w:t>typeof</w:t>
+      </w:r>
+      <w:proofErr w:type="spellEnd"/>
+      <w:proofErr w:type="gramEnd"/>
+      <w:r>
+        <w:rPr>
+          <w:color w:val="000000" w:themeColor="text1"/>
+          <w:sz w:val="22"/>
+          <w:szCs w:val="22"/>
+        </w:rPr>
+        <w:t xml:space="preserve"> keyword</w:t>
+      </w:r>
+    </w:p>
+    <w:p>
+      <w:pPr>
+        <w:pStyle w:val="ListParagraph"/>
+        <w:numPr>
+          <w:ilvl w:val="0"/>
+          <w:numId w:val="1"/>
+        </w:numPr>
+        <w:rPr>
+          <w:color w:val="000000" w:themeColor="text1"/>
+          <w:sz w:val="22"/>
+          <w:szCs w:val="22"/>
+        </w:rPr>
+      </w:pPr>
+      <w:r>
+        <w:rPr>
+          <w:color w:val="000000" w:themeColor="text1"/>
+          <w:sz w:val="22"/>
+          <w:szCs w:val="22"/>
+        </w:rPr>
+        <w:t>We have escape characters just the same as in C++ and in Java.</w:t>
+      </w:r>
+    </w:p>
+    <w:p>
+      <w:pPr>
+        <w:pStyle w:val="ListParagraph"/>
+        <w:numPr>
+          <w:ilvl w:val="0"/>
+          <w:numId w:val="1"/>
+        </w:numPr>
+        <w:rPr>
+          <w:color w:val="000000" w:themeColor="text1"/>
+          <w:sz w:val="22"/>
+          <w:szCs w:val="22"/>
+        </w:rPr>
+      </w:pPr>
+      <w:r>
+        <w:rPr>
+          <w:color w:val="000000" w:themeColor="text1"/>
+          <w:sz w:val="22"/>
+          <w:szCs w:val="22"/>
+        </w:rPr>
+        <w:t xml:space="preserve">When using addition if one of the values is a string </w:t>
+      </w:r>
+      <w:proofErr w:type="spellStart"/>
+      <w:r>
+        <w:rPr>
+          <w:color w:val="000000" w:themeColor="text1"/>
+          <w:sz w:val="22"/>
+          <w:szCs w:val="22"/>
+        </w:rPr>
+        <w:t>javascript</w:t>
+      </w:r>
+      <w:proofErr w:type="spellEnd"/>
+      <w:r>
+        <w:rPr>
+          <w:color w:val="000000" w:themeColor="text1"/>
+          <w:sz w:val="22"/>
+          <w:szCs w:val="22"/>
+        </w:rPr>
+        <w:t xml:space="preserve"> will type cast all the elements into strings so “5” + 3 will be 53, the same with 3 + “5”</w:t>
+      </w:r>
+    </w:p>
+    <w:p>
+      <w:pPr>
+        <w:pStyle w:val="ListParagraph"/>
+        <w:numPr>
+          <w:ilvl w:val="0"/>
+          <w:numId w:val="1"/>
+        </w:numPr>
+        <w:rPr>
+          <w:color w:val="000000" w:themeColor="text1"/>
+          <w:sz w:val="22"/>
+          <w:szCs w:val="22"/>
+        </w:rPr>
+      </w:pPr>
+      <w:r>
+        <w:rPr>
+          <w:color w:val="000000" w:themeColor="text1"/>
+          <w:sz w:val="22"/>
+          <w:szCs w:val="22"/>
+        </w:rPr>
+        <w:t>${}</w:t>
+      </w:r>
+      <w:r>
+        <w:rPr>
+          <w:color w:val="000000" w:themeColor="text1"/>
+          <w:sz w:val="22"/>
+          <w:szCs w:val="22"/>
+        </w:rPr>
+        <w:t xml:space="preserve"> to include a variable inside a print the print should be of type ``</w:t>
+      </w:r>
+    </w:p>
+    <w:p>
+      <w:pPr>
+        <w:pStyle w:val="ListParagraph"/>
+        <w:numPr>
+          <w:ilvl w:val="0"/>
+          <w:numId w:val="1"/>
+        </w:numPr>
+        <w:rPr>
+          <w:color w:val="000000" w:themeColor="text1"/>
+          <w:sz w:val="22"/>
+          <w:szCs w:val="22"/>
+        </w:rPr>
+      </w:pPr>
+      <w:proofErr w:type="spellStart"/>
+      <w:r>
+        <w:rPr>
+          <w:color w:val="000000" w:themeColor="text1"/>
+          <w:sz w:val="22"/>
+          <w:szCs w:val="22"/>
+        </w:rPr>
+        <w:t>Javascript</w:t>
+      </w:r>
+      <w:proofErr w:type="spellEnd"/>
+      <w:r>
+        <w:rPr>
+          <w:color w:val="000000" w:themeColor="text1"/>
+          <w:sz w:val="22"/>
+          <w:szCs w:val="22"/>
+        </w:rPr>
+        <w:t xml:space="preserve"> uses camelCase</w:t>
+      </w:r>
+    </w:p>
+    <w:p>
+      <w:pPr>
+        <w:pStyle w:val="ListParagraph"/>
+        <w:numPr>
+          <w:ilvl w:val="0"/>
+          <w:numId w:val="1"/>
+        </w:numPr>
+        <w:rPr>
+          <w:color w:val="000000" w:themeColor="text1"/>
+          <w:sz w:val="22"/>
+          <w:szCs w:val="22"/>
+        </w:rPr>
+      </w:pPr>
+      <w:r>
+        <w:rPr>
+          <w:color w:val="000000" w:themeColor="text1"/>
+          <w:sz w:val="22"/>
+          <w:szCs w:val="22"/>
+        </w:rPr>
+        <w:t xml:space="preserve">Onclick is an event handler for the event of clicking. It runs </w:t>
+      </w:r>
+      <w:proofErr w:type="spellStart"/>
+      <w:r>
+        <w:rPr>
+          <w:color w:val="000000" w:themeColor="text1"/>
+          <w:sz w:val="22"/>
+          <w:szCs w:val="22"/>
+        </w:rPr>
+        <w:t>javascript</w:t>
+      </w:r>
+      <w:proofErr w:type="spellEnd"/>
+      <w:r>
+        <w:rPr>
+          <w:color w:val="000000" w:themeColor="text1"/>
+          <w:sz w:val="22"/>
+          <w:szCs w:val="22"/>
+        </w:rPr>
+        <w:t xml:space="preserve"> code. We can include the </w:t>
+      </w:r>
+      <w:proofErr w:type="spellStart"/>
+      <w:r>
+        <w:rPr>
+          <w:color w:val="000000" w:themeColor="text1"/>
+          <w:sz w:val="22"/>
+          <w:szCs w:val="22"/>
+        </w:rPr>
+        <w:t>javascript</w:t>
+      </w:r>
+      <w:proofErr w:type="spellEnd"/>
+      <w:r>
+        <w:rPr>
+          <w:color w:val="000000" w:themeColor="text1"/>
+          <w:sz w:val="22"/>
+          <w:szCs w:val="22"/>
+        </w:rPr>
+        <w:t xml:space="preserve"> code directly on the onclick or we can store it </w:t>
+      </w:r>
+      <w:proofErr w:type="gramStart"/>
+      <w:r>
+        <w:rPr>
+          <w:color w:val="000000" w:themeColor="text1"/>
+          <w:sz w:val="22"/>
+          <w:szCs w:val="22"/>
+        </w:rPr>
+        <w:t>into</w:t>
+      </w:r>
+      <w:proofErr w:type="gramEnd"/>
+      <w:r>
+        <w:rPr>
+          <w:color w:val="000000" w:themeColor="text1"/>
+          <w:sz w:val="22"/>
+          <w:szCs w:val="22"/>
+        </w:rPr>
+        <w:t xml:space="preserve"> a function that gets called.</w:t>
+      </w:r>
     </w:p>
     <w:p>
       <w:pPr>
@@ -310,226 +657,436 @@
           <w:u w:val="single"/>
         </w:rPr>
       </w:pPr>
-      <w:r>
+    </w:p>
+    <w:p>
+      <w:pPr>
         <w:rPr>
           <w:b/>
           <w:bCs/>
           <w:color w:val="000000" w:themeColor="text1"/>
           <w:u w:val="single"/>
         </w:rPr>
-        <w:t>Numbers &amp; Math:</w:t>
-      </w:r>
-    </w:p>
-    <w:p>
-      <w:pPr>
-        <w:pStyle w:val="ListParagraph"/>
-        <w:numPr>
-          <w:ilvl w:val="0"/>
-          <w:numId w:val="2"/>
-        </w:numPr>
-        <w:rPr>
-          <w:color w:val="000000" w:themeColor="text1"/>
-          <w:sz w:val="22"/>
-          <w:szCs w:val="22"/>
-        </w:rPr>
-      </w:pPr>
-      <w:r>
-        <w:rPr>
-          <w:color w:val="000000" w:themeColor="text1"/>
-          <w:sz w:val="22"/>
-          <w:szCs w:val="22"/>
-        </w:rPr>
-        <w:t>For numerical values javascript has only one numerical datatype which is Number, no int &amp; float like Java.</w:t>
-      </w:r>
-    </w:p>
-    <w:p>
-      <w:pPr>
-        <w:pStyle w:val="ListParagraph"/>
-        <w:numPr>
-          <w:ilvl w:val="0"/>
-          <w:numId w:val="2"/>
-        </w:numPr>
-        <w:rPr>
-          <w:color w:val="000000" w:themeColor="text1"/>
-          <w:sz w:val="22"/>
-          <w:szCs w:val="22"/>
-        </w:rPr>
-      </w:pPr>
-      <w:r>
-        <w:rPr>
-          <w:color w:val="000000" w:themeColor="text1"/>
-          <w:sz w:val="22"/>
-          <w:szCs w:val="22"/>
-        </w:rPr>
-        <w:t xml:space="preserve">Has addition, subtraction, power using **, and follows the math operation heirerachy. </w:t>
-      </w:r>
-    </w:p>
-    <w:p>
-      <w:pPr>
-        <w:pStyle w:val="ListParagraph"/>
-        <w:numPr>
-          <w:ilvl w:val="0"/>
-          <w:numId w:val="2"/>
-        </w:numPr>
-        <w:rPr>
-          <w:color w:val="000000" w:themeColor="text1"/>
-          <w:sz w:val="22"/>
-          <w:szCs w:val="22"/>
-        </w:rPr>
-      </w:pPr>
-      <w:r>
-        <w:rPr>
-          <w:color w:val="000000" w:themeColor="text1"/>
-          <w:sz w:val="22"/>
-          <w:szCs w:val="22"/>
-        </w:rPr>
-        <w:t>Has also Math.sqrt() and other mathematical functions.</w:t>
-      </w:r>
-      <w:r>
-        <w:t xml:space="preserve"> </w:t>
-      </w:r>
-      <w:r>
-        <w:rPr>
-          <w:color w:val="000000" w:themeColor="text1"/>
-          <w:sz w:val="22"/>
-          <w:szCs w:val="22"/>
-        </w:rPr>
-        <w:t>Math.abs()</w:t>
-      </w:r>
-      <w:r>
-        <w:rPr>
-          <w:color w:val="000000" w:themeColor="text1"/>
-          <w:sz w:val="22"/>
-          <w:szCs w:val="22"/>
-        </w:rPr>
-        <w:t xml:space="preserve">, </w:t>
-      </w:r>
-      <w:r>
-        <w:rPr>
-          <w:color w:val="000000" w:themeColor="text1"/>
-          <w:sz w:val="22"/>
-          <w:szCs w:val="22"/>
-        </w:rPr>
-        <w:t>Math.sqrt(),</w:t>
-      </w:r>
-      <w:r>
-        <w:rPr>
-          <w:color w:val="000000" w:themeColor="text1"/>
-          <w:sz w:val="22"/>
-          <w:szCs w:val="22"/>
-        </w:rPr>
-        <w:t xml:space="preserve"> </w:t>
-      </w:r>
-      <w:r>
-        <w:rPr>
-          <w:color w:val="000000" w:themeColor="text1"/>
-          <w:sz w:val="22"/>
-          <w:szCs w:val="22"/>
-        </w:rPr>
-        <w:t>Math.pow(),</w:t>
-      </w:r>
-      <w:r>
-        <w:rPr>
-          <w:color w:val="000000" w:themeColor="text1"/>
-          <w:sz w:val="22"/>
-          <w:szCs w:val="22"/>
-        </w:rPr>
-        <w:t xml:space="preserve"> </w:t>
-      </w:r>
-      <w:r>
-        <w:rPr>
-          <w:color w:val="000000" w:themeColor="text1"/>
-          <w:sz w:val="22"/>
-          <w:szCs w:val="22"/>
-        </w:rPr>
-        <w:t>Math.max(),</w:t>
-      </w:r>
-      <w:r>
-        <w:rPr>
-          <w:color w:val="000000" w:themeColor="text1"/>
-          <w:sz w:val="22"/>
-          <w:szCs w:val="22"/>
-        </w:rPr>
-        <w:t xml:space="preserve"> </w:t>
-      </w:r>
-      <w:r>
-        <w:rPr>
-          <w:color w:val="000000" w:themeColor="text1"/>
-          <w:sz w:val="22"/>
-          <w:szCs w:val="22"/>
-        </w:rPr>
-        <w:t>Math.min()</w:t>
-      </w:r>
-    </w:p>
-    <w:p>
-      <w:pPr>
-        <w:pStyle w:val="ListParagraph"/>
-        <w:numPr>
-          <w:ilvl w:val="0"/>
-          <w:numId w:val="2"/>
-        </w:numPr>
-        <w:rPr>
-          <w:color w:val="000000" w:themeColor="text1"/>
-          <w:sz w:val="22"/>
-          <w:szCs w:val="22"/>
-        </w:rPr>
-      </w:pPr>
-      <w:r>
-        <w:rPr>
-          <w:color w:val="000000" w:themeColor="text1"/>
-          <w:sz w:val="22"/>
-          <w:szCs w:val="22"/>
-        </w:rPr>
-        <w:t>Math.random() returns a number between 0-1 including the 0 but not the 1</w:t>
-      </w:r>
-    </w:p>
-    <w:p>
-      <w:pPr>
-        <w:pStyle w:val="ListParagraph"/>
-        <w:numPr>
-          <w:ilvl w:val="0"/>
-          <w:numId w:val="2"/>
-        </w:numPr>
-        <w:rPr>
-          <w:color w:val="000000" w:themeColor="text1"/>
-          <w:sz w:val="22"/>
-          <w:szCs w:val="22"/>
-        </w:rPr>
-      </w:pPr>
-      <w:r>
-        <w:rPr>
-          <w:color w:val="000000" w:themeColor="text1"/>
-          <w:sz w:val="22"/>
-          <w:szCs w:val="22"/>
-        </w:rPr>
-        <w:t>We have BigInt() datatype, that we can use for huge numerical values and it ends with n so 13423423532523532n is a big integer and can be only operated on with other Bigint variables</w:t>
-      </w:r>
-    </w:p>
-    <w:p>
-      <w:pPr>
-        <w:rPr>
-          <w:color w:val="000000" w:themeColor="text1"/>
-          <w:sz w:val="22"/>
-          <w:szCs w:val="22"/>
-        </w:rPr>
-      </w:pPr>
-    </w:p>
-    <w:p>
-      <w:pPr>
+      </w:pPr>
+      <w:r>
         <w:rPr>
           <w:b/>
           <w:bCs/>
           <w:color w:val="000000" w:themeColor="text1"/>
           <w:u w:val="single"/>
         </w:rPr>
-      </w:pPr>
-      <w:r>
+        <w:t>Numbers &amp; Math:</w:t>
+      </w:r>
+    </w:p>
+    <w:p>
+      <w:pPr>
+        <w:pStyle w:val="ListParagraph"/>
+        <w:numPr>
+          <w:ilvl w:val="0"/>
+          <w:numId w:val="2"/>
+        </w:numPr>
+        <w:rPr>
+          <w:color w:val="000000" w:themeColor="text1"/>
+          <w:sz w:val="22"/>
+          <w:szCs w:val="22"/>
+        </w:rPr>
+      </w:pPr>
+      <w:r>
+        <w:rPr>
+          <w:color w:val="000000" w:themeColor="text1"/>
+          <w:sz w:val="22"/>
+          <w:szCs w:val="22"/>
+        </w:rPr>
+        <w:t xml:space="preserve">For numerical values </w:t>
+      </w:r>
+      <w:proofErr w:type="spellStart"/>
+      <w:r>
+        <w:rPr>
+          <w:color w:val="000000" w:themeColor="text1"/>
+          <w:sz w:val="22"/>
+          <w:szCs w:val="22"/>
+        </w:rPr>
+        <w:t>javascript</w:t>
+      </w:r>
+      <w:proofErr w:type="spellEnd"/>
+      <w:r>
+        <w:rPr>
+          <w:color w:val="000000" w:themeColor="text1"/>
+          <w:sz w:val="22"/>
+          <w:szCs w:val="22"/>
+        </w:rPr>
+        <w:t xml:space="preserve"> has only one numerical datatype which is Number, no int &amp; float like Java.</w:t>
+      </w:r>
+    </w:p>
+    <w:p>
+      <w:pPr>
+        <w:pStyle w:val="ListParagraph"/>
+        <w:numPr>
+          <w:ilvl w:val="0"/>
+          <w:numId w:val="2"/>
+        </w:numPr>
+        <w:rPr>
+          <w:color w:val="000000" w:themeColor="text1"/>
+          <w:sz w:val="22"/>
+          <w:szCs w:val="22"/>
+        </w:rPr>
+      </w:pPr>
+      <w:r>
+        <w:rPr>
+          <w:color w:val="000000" w:themeColor="text1"/>
+          <w:sz w:val="22"/>
+          <w:szCs w:val="22"/>
+        </w:rPr>
+        <w:t xml:space="preserve">Has addition, subtraction, power using **, and follows the math operation </w:t>
+      </w:r>
+      <w:proofErr w:type="spellStart"/>
+      <w:r>
+        <w:rPr>
+          <w:color w:val="000000" w:themeColor="text1"/>
+          <w:sz w:val="22"/>
+          <w:szCs w:val="22"/>
+        </w:rPr>
+        <w:t>heirerachy</w:t>
+      </w:r>
+      <w:proofErr w:type="spellEnd"/>
+      <w:r>
+        <w:rPr>
+          <w:color w:val="000000" w:themeColor="text1"/>
+          <w:sz w:val="22"/>
+          <w:szCs w:val="22"/>
+        </w:rPr>
+        <w:t xml:space="preserve">. </w:t>
+      </w:r>
+    </w:p>
+    <w:p>
+      <w:pPr>
+        <w:pStyle w:val="ListParagraph"/>
+        <w:numPr>
+          <w:ilvl w:val="0"/>
+          <w:numId w:val="2"/>
+        </w:numPr>
+        <w:rPr>
+          <w:color w:val="000000" w:themeColor="text1"/>
+          <w:sz w:val="22"/>
+          <w:szCs w:val="22"/>
+        </w:rPr>
+      </w:pPr>
+      <w:r>
+        <w:rPr>
+          <w:color w:val="000000" w:themeColor="text1"/>
+          <w:sz w:val="22"/>
+          <w:szCs w:val="22"/>
+        </w:rPr>
+        <w:t xml:space="preserve">Has also </w:t>
+      </w:r>
+      <w:proofErr w:type="spellStart"/>
+      <w:r>
+        <w:rPr>
+          <w:color w:val="000000" w:themeColor="text1"/>
+          <w:sz w:val="22"/>
+          <w:szCs w:val="22"/>
+        </w:rPr>
+        <w:t>Math.sqrt</w:t>
+      </w:r>
+      <w:proofErr w:type="spellEnd"/>
+      <w:r>
+        <w:rPr>
+          <w:color w:val="000000" w:themeColor="text1"/>
+          <w:sz w:val="22"/>
+          <w:szCs w:val="22"/>
+        </w:rPr>
+        <w:t>() and other mathematical functions.</w:t>
+      </w:r>
+      <w:r>
+        <w:t xml:space="preserve"> </w:t>
+      </w:r>
+      <w:proofErr w:type="spellStart"/>
+      <w:proofErr w:type="gramStart"/>
+      <w:r>
+        <w:rPr>
+          <w:color w:val="000000" w:themeColor="text1"/>
+          <w:sz w:val="22"/>
+          <w:szCs w:val="22"/>
+        </w:rPr>
+        <w:t>Math.abs</w:t>
+      </w:r>
+      <w:proofErr w:type="spellEnd"/>
+      <w:r>
+        <w:rPr>
+          <w:color w:val="000000" w:themeColor="text1"/>
+          <w:sz w:val="22"/>
+          <w:szCs w:val="22"/>
+        </w:rPr>
+        <w:t>(</w:t>
+      </w:r>
+      <w:proofErr w:type="gramEnd"/>
+      <w:r>
+        <w:rPr>
+          <w:color w:val="000000" w:themeColor="text1"/>
+          <w:sz w:val="22"/>
+          <w:szCs w:val="22"/>
+        </w:rPr>
+        <w:t>)</w:t>
+      </w:r>
+      <w:r>
+        <w:rPr>
+          <w:color w:val="000000" w:themeColor="text1"/>
+          <w:sz w:val="22"/>
+          <w:szCs w:val="22"/>
+        </w:rPr>
+        <w:t xml:space="preserve">, </w:t>
+      </w:r>
+      <w:proofErr w:type="spellStart"/>
+      <w:r>
+        <w:rPr>
+          <w:color w:val="000000" w:themeColor="text1"/>
+          <w:sz w:val="22"/>
+          <w:szCs w:val="22"/>
+        </w:rPr>
+        <w:t>Math.sqrt</w:t>
+      </w:r>
+      <w:proofErr w:type="spellEnd"/>
+      <w:r>
+        <w:rPr>
+          <w:color w:val="000000" w:themeColor="text1"/>
+          <w:sz w:val="22"/>
+          <w:szCs w:val="22"/>
+        </w:rPr>
+        <w:t>(),</w:t>
+      </w:r>
+      <w:r>
+        <w:rPr>
+          <w:color w:val="000000" w:themeColor="text1"/>
+          <w:sz w:val="22"/>
+          <w:szCs w:val="22"/>
+        </w:rPr>
+        <w:t xml:space="preserve"> </w:t>
+      </w:r>
+      <w:proofErr w:type="spellStart"/>
+      <w:proofErr w:type="gramStart"/>
+      <w:r>
+        <w:rPr>
+          <w:color w:val="000000" w:themeColor="text1"/>
+          <w:sz w:val="22"/>
+          <w:szCs w:val="22"/>
+        </w:rPr>
+        <w:t>Math.pow</w:t>
+      </w:r>
+      <w:proofErr w:type="spellEnd"/>
+      <w:r>
+        <w:rPr>
+          <w:color w:val="000000" w:themeColor="text1"/>
+          <w:sz w:val="22"/>
+          <w:szCs w:val="22"/>
+        </w:rPr>
+        <w:t>(</w:t>
+      </w:r>
+      <w:proofErr w:type="gramEnd"/>
+      <w:r>
+        <w:rPr>
+          <w:color w:val="000000" w:themeColor="text1"/>
+          <w:sz w:val="22"/>
+          <w:szCs w:val="22"/>
+        </w:rPr>
+        <w:t>),</w:t>
+      </w:r>
+      <w:r>
+        <w:rPr>
+          <w:color w:val="000000" w:themeColor="text1"/>
+          <w:sz w:val="22"/>
+          <w:szCs w:val="22"/>
+        </w:rPr>
+        <w:t xml:space="preserve"> </w:t>
+      </w:r>
+      <w:proofErr w:type="spellStart"/>
+      <w:proofErr w:type="gramStart"/>
+      <w:r>
+        <w:rPr>
+          <w:color w:val="000000" w:themeColor="text1"/>
+          <w:sz w:val="22"/>
+          <w:szCs w:val="22"/>
+        </w:rPr>
+        <w:t>Math.max</w:t>
+      </w:r>
+      <w:proofErr w:type="spellEnd"/>
+      <w:r>
+        <w:rPr>
+          <w:color w:val="000000" w:themeColor="text1"/>
+          <w:sz w:val="22"/>
+          <w:szCs w:val="22"/>
+        </w:rPr>
+        <w:t>(</w:t>
+      </w:r>
+      <w:proofErr w:type="gramEnd"/>
+      <w:r>
+        <w:rPr>
+          <w:color w:val="000000" w:themeColor="text1"/>
+          <w:sz w:val="22"/>
+          <w:szCs w:val="22"/>
+        </w:rPr>
+        <w:t>),</w:t>
+      </w:r>
+      <w:r>
+        <w:rPr>
+          <w:color w:val="000000" w:themeColor="text1"/>
+          <w:sz w:val="22"/>
+          <w:szCs w:val="22"/>
+        </w:rPr>
+        <w:t xml:space="preserve"> </w:t>
+      </w:r>
+      <w:proofErr w:type="spellStart"/>
+      <w:proofErr w:type="gramStart"/>
+      <w:r>
+        <w:rPr>
+          <w:color w:val="000000" w:themeColor="text1"/>
+          <w:sz w:val="22"/>
+          <w:szCs w:val="22"/>
+        </w:rPr>
+        <w:t>Math.min</w:t>
+      </w:r>
+      <w:proofErr w:type="spellEnd"/>
+      <w:r>
+        <w:rPr>
+          <w:color w:val="000000" w:themeColor="text1"/>
+          <w:sz w:val="22"/>
+          <w:szCs w:val="22"/>
+        </w:rPr>
+        <w:t>(</w:t>
+      </w:r>
+      <w:proofErr w:type="gramEnd"/>
+      <w:r>
+        <w:rPr>
+          <w:color w:val="000000" w:themeColor="text1"/>
+          <w:sz w:val="22"/>
+          <w:szCs w:val="22"/>
+        </w:rPr>
+        <w:t>)</w:t>
+      </w:r>
+    </w:p>
+    <w:p>
+      <w:pPr>
+        <w:pStyle w:val="ListParagraph"/>
+        <w:numPr>
+          <w:ilvl w:val="0"/>
+          <w:numId w:val="2"/>
+        </w:numPr>
+        <w:rPr>
+          <w:color w:val="000000" w:themeColor="text1"/>
+          <w:sz w:val="22"/>
+          <w:szCs w:val="22"/>
+        </w:rPr>
+      </w:pPr>
+      <w:proofErr w:type="spellStart"/>
+      <w:r>
+        <w:rPr>
+          <w:color w:val="000000" w:themeColor="text1"/>
+          <w:sz w:val="22"/>
+          <w:szCs w:val="22"/>
+        </w:rPr>
+        <w:t>Math.random</w:t>
+      </w:r>
+      <w:proofErr w:type="spellEnd"/>
+      <w:r>
+        <w:rPr>
+          <w:color w:val="000000" w:themeColor="text1"/>
+          <w:sz w:val="22"/>
+          <w:szCs w:val="22"/>
+        </w:rPr>
+        <w:t>() returns a number between 0-1 including the 0 but not the 1</w:t>
+      </w:r>
+    </w:p>
+    <w:p>
+      <w:pPr>
+        <w:pStyle w:val="ListParagraph"/>
+        <w:numPr>
+          <w:ilvl w:val="0"/>
+          <w:numId w:val="2"/>
+        </w:numPr>
+        <w:rPr>
+          <w:color w:val="000000" w:themeColor="text1"/>
+          <w:sz w:val="22"/>
+          <w:szCs w:val="22"/>
+        </w:rPr>
+      </w:pPr>
+      <w:r>
+        <w:rPr>
+          <w:color w:val="000000" w:themeColor="text1"/>
+          <w:sz w:val="22"/>
+          <w:szCs w:val="22"/>
+        </w:rPr>
+        <w:t xml:space="preserve">We have </w:t>
+      </w:r>
+      <w:proofErr w:type="spellStart"/>
+      <w:proofErr w:type="gramStart"/>
+      <w:r>
+        <w:rPr>
+          <w:color w:val="000000" w:themeColor="text1"/>
+          <w:sz w:val="22"/>
+          <w:szCs w:val="22"/>
+        </w:rPr>
+        <w:t>BigInt</w:t>
+      </w:r>
+      <w:proofErr w:type="spellEnd"/>
+      <w:r>
+        <w:rPr>
+          <w:color w:val="000000" w:themeColor="text1"/>
+          <w:sz w:val="22"/>
+          <w:szCs w:val="22"/>
+        </w:rPr>
+        <w:t>(</w:t>
+      </w:r>
+      <w:proofErr w:type="gramEnd"/>
+      <w:r>
+        <w:rPr>
+          <w:color w:val="000000" w:themeColor="text1"/>
+          <w:sz w:val="22"/>
+          <w:szCs w:val="22"/>
+        </w:rPr>
+        <w:t xml:space="preserve">) datatype, that we can use for huge numerical values and it ends with n so 13423423532523532n is a big integer and can be only operated on with other </w:t>
+      </w:r>
+      <w:proofErr w:type="spellStart"/>
+      <w:r>
+        <w:rPr>
+          <w:color w:val="000000" w:themeColor="text1"/>
+          <w:sz w:val="22"/>
+          <w:szCs w:val="22"/>
+        </w:rPr>
+        <w:t>Bigint</w:t>
+      </w:r>
+      <w:proofErr w:type="spellEnd"/>
+      <w:r>
+        <w:rPr>
+          <w:color w:val="000000" w:themeColor="text1"/>
+          <w:sz w:val="22"/>
+          <w:szCs w:val="22"/>
+        </w:rPr>
+        <w:t xml:space="preserve"> variables</w:t>
+      </w:r>
+    </w:p>
+    <w:p>
+      <w:pPr>
+        <w:rPr>
+          <w:color w:val="000000" w:themeColor="text1"/>
+          <w:sz w:val="22"/>
+          <w:szCs w:val="22"/>
+        </w:rPr>
+      </w:pPr>
+    </w:p>
+    <w:p>
+      <w:pPr>
         <w:rPr>
           <w:b/>
           <w:bCs/>
           <w:color w:val="000000" w:themeColor="text1"/>
           <w:u w:val="single"/>
         </w:rPr>
+      </w:pPr>
+      <w:r>
+        <w:rPr>
+          <w:b/>
+          <w:bCs/>
+          <w:color w:val="000000" w:themeColor="text1"/>
+          <w:u w:val="single"/>
+        </w:rPr>
         <w:t>Strings:</w:t>
       </w:r>
     </w:p>
@@ -560,7 +1117,25 @@
           <w:sz w:val="22"/>
           <w:szCs w:val="22"/>
         </w:rPr>
-        <w:t>. For example a mathematical operation.</w:t>
+        <w:t xml:space="preserve">. For </w:t>
+      </w:r>
+      <w:proofErr w:type="gramStart"/>
+      <w:r>
+        <w:rPr>
+          <w:color w:val="000000" w:themeColor="text1"/>
+          <w:sz w:val="22"/>
+          <w:szCs w:val="22"/>
+        </w:rPr>
+        <w:t>example</w:t>
+      </w:r>
+      <w:proofErr w:type="gramEnd"/>
+      <w:r>
+        <w:rPr>
+          <w:color w:val="000000" w:themeColor="text1"/>
+          <w:sz w:val="22"/>
+          <w:szCs w:val="22"/>
+        </w:rPr>
+        <w:t xml:space="preserve"> a mathematical operation.</w:t>
       </w:r>
     </w:p>
     <w:p>
@@ -582,7 +1157,25 @@
           <w:sz w:val="22"/>
           <w:szCs w:val="22"/>
         </w:rPr>
-        <w:t>String concatenation works the same is in Java.</w:t>
+        <w:t xml:space="preserve">String concatenation works the </w:t>
+      </w:r>
+      <w:proofErr w:type="gramStart"/>
+      <w:r>
+        <w:rPr>
+          <w:color w:val="000000" w:themeColor="text1"/>
+          <w:sz w:val="22"/>
+          <w:szCs w:val="22"/>
+        </w:rPr>
+        <w:t>same is</w:t>
+      </w:r>
+      <w:proofErr w:type="gramEnd"/>
+      <w:r>
+        <w:rPr>
+          <w:color w:val="000000" w:themeColor="text1"/>
+          <w:sz w:val="22"/>
+          <w:szCs w:val="22"/>
+        </w:rPr>
+        <w:t xml:space="preserve"> in Java.</w:t>
       </w:r>
     </w:p>
     <w:p>
@@ -604,7 +1197,25 @@
           <w:sz w:val="22"/>
           <w:szCs w:val="22"/>
         </w:rPr>
-        <w:t>We can check the string length by using .length on it.</w:t>
+        <w:t xml:space="preserve">We can check the string length by </w:t>
+      </w:r>
+      <w:proofErr w:type="gramStart"/>
+      <w:r>
+        <w:rPr>
+          <w:color w:val="000000" w:themeColor="text1"/>
+          <w:sz w:val="22"/>
+          <w:szCs w:val="22"/>
+        </w:rPr>
+        <w:t>using .length</w:t>
+      </w:r>
+      <w:proofErr w:type="gramEnd"/>
+      <w:r>
+        <w:rPr>
+          <w:color w:val="000000" w:themeColor="text1"/>
+          <w:sz w:val="22"/>
+          <w:szCs w:val="22"/>
+        </w:rPr>
+        <w:t xml:space="preserve"> on it.</w:t>
       </w:r>
     </w:p>
     <w:p>
@@ -665,13 +1276,79 @@
           <w:szCs w:val="22"/>
         </w:rPr>
       </w:pPr>
-      <w:r>
-        <w:rPr>
-          <w:color w:val="000000" w:themeColor="text1"/>
-          <w:sz w:val="22"/>
-          <w:szCs w:val="22"/>
-        </w:rPr>
-        <w:t>toUpper() and toLower() methods work the same as in Java, trim() is extremely useful in node.js</w:t>
+      <w:proofErr w:type="spellStart"/>
+      <w:proofErr w:type="gramStart"/>
+      <w:r>
+        <w:rPr>
+          <w:color w:val="000000" w:themeColor="text1"/>
+          <w:sz w:val="22"/>
+          <w:szCs w:val="22"/>
+        </w:rPr>
+        <w:t>toUpper</w:t>
+      </w:r>
+      <w:proofErr w:type="spellEnd"/>
+      <w:r>
+        <w:rPr>
+          <w:color w:val="000000" w:themeColor="text1"/>
+          <w:sz w:val="22"/>
+          <w:szCs w:val="22"/>
+        </w:rPr>
+        <w:t>(</w:t>
+      </w:r>
+      <w:proofErr w:type="gramEnd"/>
+      <w:r>
+        <w:rPr>
+          <w:color w:val="000000" w:themeColor="text1"/>
+          <w:sz w:val="22"/>
+          <w:szCs w:val="22"/>
+        </w:rPr>
+        <w:t xml:space="preserve">) and </w:t>
+      </w:r>
+      <w:proofErr w:type="spellStart"/>
+      <w:proofErr w:type="gramStart"/>
+      <w:r>
+        <w:rPr>
+          <w:color w:val="000000" w:themeColor="text1"/>
+          <w:sz w:val="22"/>
+          <w:szCs w:val="22"/>
+        </w:rPr>
+        <w:t>toLower</w:t>
+      </w:r>
+      <w:proofErr w:type="spellEnd"/>
+      <w:r>
+        <w:rPr>
+          <w:color w:val="000000" w:themeColor="text1"/>
+          <w:sz w:val="22"/>
+          <w:szCs w:val="22"/>
+        </w:rPr>
+        <w:t>(</w:t>
+      </w:r>
+      <w:proofErr w:type="gramEnd"/>
+      <w:r>
+        <w:rPr>
+          <w:color w:val="000000" w:themeColor="text1"/>
+          <w:sz w:val="22"/>
+          <w:szCs w:val="22"/>
+        </w:rPr>
+        <w:t xml:space="preserve">) methods work the same as in Java, </w:t>
+      </w:r>
+      <w:proofErr w:type="gramStart"/>
+      <w:r>
+        <w:rPr>
+          <w:color w:val="000000" w:themeColor="text1"/>
+          <w:sz w:val="22"/>
+          <w:szCs w:val="22"/>
+        </w:rPr>
+        <w:t>trim(</w:t>
+      </w:r>
+      <w:proofErr w:type="gramEnd"/>
+      <w:r>
+        <w:rPr>
+          <w:color w:val="000000" w:themeColor="text1"/>
+          <w:sz w:val="22"/>
+          <w:szCs w:val="22"/>
+        </w:rPr>
+        <w:t>) is extremely useful in node.js</w:t>
       </w:r>
     </w:p>
     <w:p>
@@ -687,13 +1364,51 @@
           <w:szCs w:val="22"/>
         </w:rPr>
       </w:pPr>
-      <w:r>
-        <w:rPr>
-          <w:color w:val="000000" w:themeColor="text1"/>
-          <w:sz w:val="22"/>
-          <w:szCs w:val="22"/>
-        </w:rPr>
-        <w:t>slice(startindex, endindex) this lets us extract a certain part of a string.</w:t>
+      <w:proofErr w:type="gramStart"/>
+      <w:r>
+        <w:rPr>
+          <w:color w:val="000000" w:themeColor="text1"/>
+          <w:sz w:val="22"/>
+          <w:szCs w:val="22"/>
+        </w:rPr>
+        <w:t>slice(</w:t>
+      </w:r>
+      <w:proofErr w:type="spellStart"/>
+      <w:proofErr w:type="gramEnd"/>
+      <w:r>
+        <w:rPr>
+          <w:color w:val="000000" w:themeColor="text1"/>
+          <w:sz w:val="22"/>
+          <w:szCs w:val="22"/>
+        </w:rPr>
+        <w:t>startindex</w:t>
+      </w:r>
+      <w:proofErr w:type="spellEnd"/>
+      <w:r>
+        <w:rPr>
+          <w:color w:val="000000" w:themeColor="text1"/>
+          <w:sz w:val="22"/>
+          <w:szCs w:val="22"/>
+        </w:rPr>
+        <w:t xml:space="preserve">, </w:t>
+      </w:r>
+      <w:proofErr w:type="spellStart"/>
+      <w:r>
+        <w:rPr>
+          <w:color w:val="000000" w:themeColor="text1"/>
+          <w:sz w:val="22"/>
+          <w:szCs w:val="22"/>
+        </w:rPr>
+        <w:t>endindex</w:t>
+      </w:r>
+      <w:proofErr w:type="spellEnd"/>
+      <w:r>
+        <w:rPr>
+          <w:color w:val="000000" w:themeColor="text1"/>
+          <w:sz w:val="22"/>
+          <w:szCs w:val="22"/>
+        </w:rPr>
+        <w:t>) this lets us extract a certain part of a string.</w:t>
       </w:r>
     </w:p>
     <w:p>
@@ -709,13 +1424,41 @@
           <w:szCs w:val="22"/>
         </w:rPr>
       </w:pPr>
-      <w:r>
-        <w:rPr>
-          <w:color w:val="000000" w:themeColor="text1"/>
-          <w:sz w:val="22"/>
-          <w:szCs w:val="22"/>
-        </w:rPr>
-        <w:t>Split(,) splits the string into an array, that  will be split based on the passed character into a String array</w:t>
+      <w:proofErr w:type="gramStart"/>
+      <w:r>
+        <w:rPr>
+          <w:color w:val="000000" w:themeColor="text1"/>
+          <w:sz w:val="22"/>
+          <w:szCs w:val="22"/>
+        </w:rPr>
+        <w:t>Split(</w:t>
+      </w:r>
+      <w:proofErr w:type="gramEnd"/>
+      <w:r>
+        <w:rPr>
+          <w:color w:val="000000" w:themeColor="text1"/>
+          <w:sz w:val="22"/>
+          <w:szCs w:val="22"/>
+        </w:rPr>
+        <w:t xml:space="preserve">,) splits the string into an array, </w:t>
+      </w:r>
+      <w:proofErr w:type="gramStart"/>
+      <w:r>
+        <w:rPr>
+          <w:color w:val="000000" w:themeColor="text1"/>
+          <w:sz w:val="22"/>
+          <w:szCs w:val="22"/>
+        </w:rPr>
+        <w:t>that  will</w:t>
+      </w:r>
+      <w:proofErr w:type="gramEnd"/>
+      <w:r>
+        <w:rPr>
+          <w:color w:val="000000" w:themeColor="text1"/>
+          <w:sz w:val="22"/>
+          <w:szCs w:val="22"/>
+        </w:rPr>
+        <w:t xml:space="preserve"> be split based on the passed character into a String array</w:t>
       </w:r>
     </w:p>
     <w:p>
@@ -759,7 +1502,25 @@
           <w:sz w:val="22"/>
           <w:szCs w:val="22"/>
         </w:rPr>
-        <w:t xml:space="preserve">Using the backticks the new lines are actually newlines </w:t>
+        <w:t xml:space="preserve">Using the backticks the new lines are </w:t>
+      </w:r>
+      <w:proofErr w:type="gramStart"/>
+      <w:r>
+        <w:rPr>
+          <w:color w:val="000000" w:themeColor="text1"/>
+          <w:sz w:val="22"/>
+          <w:szCs w:val="22"/>
+        </w:rPr>
+        <w:t>actually newlines</w:t>
+      </w:r>
+      <w:proofErr w:type="gramEnd"/>
+      <w:r>
+        <w:rPr>
+          <w:color w:val="000000" w:themeColor="text1"/>
+          <w:sz w:val="22"/>
+          <w:szCs w:val="22"/>
+        </w:rPr>
+        <w:t xml:space="preserve"> </w:t>
       </w:r>
     </w:p>
     <w:p>
@@ -809,7 +1570,25 @@
           <w:sz w:val="22"/>
           <w:szCs w:val="22"/>
         </w:rPr>
-        <w:t>The main difference between let and var is that var ignores the scope in which it was declared on, which makes var less used and not recommended when using modern javascript code</w:t>
+        <w:t xml:space="preserve">The main difference between let and var is that var ignores the scope in which it was declared on, which makes var less used and not recommended when using modern </w:t>
+      </w:r>
+      <w:proofErr w:type="spellStart"/>
+      <w:r>
+        <w:rPr>
+          <w:color w:val="000000" w:themeColor="text1"/>
+          <w:sz w:val="22"/>
+          <w:szCs w:val="22"/>
+        </w:rPr>
+        <w:t>javascript</w:t>
+      </w:r>
+      <w:proofErr w:type="spellEnd"/>
+      <w:r>
+        <w:rPr>
+          <w:color w:val="000000" w:themeColor="text1"/>
+          <w:sz w:val="22"/>
+          <w:szCs w:val="22"/>
+        </w:rPr>
+        <w:t xml:space="preserve"> code</w:t>
       </w:r>
     </w:p>
     <w:p>
@@ -831,7 +1610,43 @@
           <w:sz w:val="22"/>
           <w:szCs w:val="22"/>
         </w:rPr>
-        <w:t xml:space="preserve">== tries to convert the 2 variables into the same data type while === checks them at the </w:t>
+        <w:t xml:space="preserve">== </w:t>
+      </w:r>
+      <w:proofErr w:type="gramStart"/>
+      <w:r>
+        <w:rPr>
+          <w:color w:val="000000" w:themeColor="text1"/>
+          <w:sz w:val="22"/>
+          <w:szCs w:val="22"/>
+        </w:rPr>
+        <w:t>tries</w:t>
+      </w:r>
+      <w:proofErr w:type="gramEnd"/>
+      <w:r>
+        <w:rPr>
+          <w:color w:val="000000" w:themeColor="text1"/>
+          <w:sz w:val="22"/>
+          <w:szCs w:val="22"/>
+        </w:rPr>
+        <w:t xml:space="preserve"> to convert the 2 variables into the same data type while === </w:t>
+      </w:r>
+      <w:proofErr w:type="gramStart"/>
+      <w:r>
+        <w:rPr>
+          <w:color w:val="000000" w:themeColor="text1"/>
+          <w:sz w:val="22"/>
+          <w:szCs w:val="22"/>
+        </w:rPr>
+        <w:t>checks</w:t>
+      </w:r>
+      <w:proofErr w:type="gramEnd"/>
+      <w:r>
+        <w:rPr>
+          <w:color w:val="000000" w:themeColor="text1"/>
+          <w:sz w:val="22"/>
+          <w:szCs w:val="22"/>
+        </w:rPr>
+        <w:t xml:space="preserve"> them at the </w:t>
       </w:r>
     </w:p>
     <w:p>
@@ -871,7 +1686,27 @@
           <w:sz w:val="22"/>
           <w:szCs w:val="22"/>
         </w:rPr>
-        <w:t>In javascript variables hold different data types they are not tied to a certain datatype</w:t>
+        <w:t xml:space="preserve">In </w:t>
+      </w:r>
+      <w:proofErr w:type="spellStart"/>
+      <w:proofErr w:type="gramStart"/>
+      <w:r>
+        <w:rPr>
+          <w:color w:val="000000" w:themeColor="text1"/>
+          <w:sz w:val="22"/>
+          <w:szCs w:val="22"/>
+        </w:rPr>
+        <w:t>javascript</w:t>
+      </w:r>
+      <w:proofErr w:type="spellEnd"/>
+      <w:proofErr w:type="gramEnd"/>
+      <w:r>
+        <w:rPr>
+          <w:color w:val="000000" w:themeColor="text1"/>
+          <w:sz w:val="22"/>
+          <w:szCs w:val="22"/>
+        </w:rPr>
+        <w:t xml:space="preserve"> variables hold different data types they are not tied to a certain datatype</w:t>
       </w:r>
     </w:p>
     <w:p>
@@ -925,13 +1760,41 @@
         </w:rPr>
         <w:t xml:space="preserve">; </w:t>
       </w:r>
-      <w:r>
-        <w:rPr>
-          <w:color w:val="000000" w:themeColor="text1"/>
-          <w:sz w:val="22"/>
-          <w:szCs w:val="22"/>
-        </w:rPr>
-        <w:t>so a const variable cant be changed, but a const property inside a class can</w:t>
+      <w:proofErr w:type="gramStart"/>
+      <w:r>
+        <w:rPr>
+          <w:color w:val="000000" w:themeColor="text1"/>
+          <w:sz w:val="22"/>
+          <w:szCs w:val="22"/>
+        </w:rPr>
+        <w:t>so</w:t>
+      </w:r>
+      <w:proofErr w:type="gramEnd"/>
+      <w:r>
+        <w:rPr>
+          <w:color w:val="000000" w:themeColor="text1"/>
+          <w:sz w:val="22"/>
+          <w:szCs w:val="22"/>
+        </w:rPr>
+        <w:t xml:space="preserve"> a const variable </w:t>
+      </w:r>
+      <w:proofErr w:type="spellStart"/>
+      <w:r>
+        <w:rPr>
+          <w:color w:val="000000" w:themeColor="text1"/>
+          <w:sz w:val="22"/>
+          <w:szCs w:val="22"/>
+        </w:rPr>
+        <w:t>cant</w:t>
+      </w:r>
+      <w:proofErr w:type="spellEnd"/>
+      <w:r>
+        <w:rPr>
+          <w:color w:val="000000" w:themeColor="text1"/>
+          <w:sz w:val="22"/>
+          <w:szCs w:val="22"/>
+        </w:rPr>
+        <w:t xml:space="preserve"> be changed, but a const property inside a class can</w:t>
       </w:r>
       <w:r>
         <w:rPr>
@@ -1038,13 +1901,23 @@
           <w:szCs w:val="22"/>
         </w:rPr>
       </w:pPr>
-      <w:r>
-        <w:rPr>
-          <w:color w:val="000000" w:themeColor="text1"/>
-          <w:sz w:val="22"/>
-          <w:szCs w:val="22"/>
-        </w:rPr>
-        <w:t>NaN means not a number and is also a false value</w:t>
+      <w:proofErr w:type="spellStart"/>
+      <w:r>
+        <w:rPr>
+          <w:color w:val="000000" w:themeColor="text1"/>
+          <w:sz w:val="22"/>
+          <w:szCs w:val="22"/>
+        </w:rPr>
+        <w:t>NaN</w:t>
+      </w:r>
+      <w:proofErr w:type="spellEnd"/>
+      <w:r>
+        <w:rPr>
+          <w:color w:val="000000" w:themeColor="text1"/>
+          <w:sz w:val="22"/>
+          <w:szCs w:val="22"/>
+        </w:rPr>
+        <w:t xml:space="preserve"> means not a number and is also a false value</w:t>
       </w:r>
     </w:p>
     <w:p>
@@ -1118,7 +1991,43 @@
           <w:sz w:val="22"/>
           <w:szCs w:val="22"/>
         </w:rPr>
-        <w:t>let result = age &gt;= 18 ? "Adult" : "Minor";</w:t>
+        <w:t xml:space="preserve">let result = age &gt;= </w:t>
+      </w:r>
+      <w:proofErr w:type="gramStart"/>
+      <w:r>
+        <w:rPr>
+          <w:color w:val="000000" w:themeColor="text1"/>
+          <w:sz w:val="22"/>
+          <w:szCs w:val="22"/>
+        </w:rPr>
+        <w:t>18 ?</w:t>
+      </w:r>
+      <w:proofErr w:type="gramEnd"/>
+      <w:r>
+        <w:rPr>
+          <w:color w:val="000000" w:themeColor="text1"/>
+          <w:sz w:val="22"/>
+          <w:szCs w:val="22"/>
+        </w:rPr>
+        <w:t xml:space="preserve"> "Adult</w:t>
+      </w:r>
+      <w:proofErr w:type="gramStart"/>
+      <w:r>
+        <w:rPr>
+          <w:color w:val="000000" w:themeColor="text1"/>
+          <w:sz w:val="22"/>
+          <w:szCs w:val="22"/>
+        </w:rPr>
+        <w:t>" :</w:t>
+      </w:r>
+      <w:proofErr w:type="gramEnd"/>
+      <w:r>
+        <w:rPr>
+          <w:color w:val="000000" w:themeColor="text1"/>
+          <w:sz w:val="22"/>
+          <w:szCs w:val="22"/>
+        </w:rPr>
+        <w:t xml:space="preserve"> "Minor";</w:t>
       </w:r>
     </w:p>
     <w:p>
@@ -1174,25 +2083,63 @@
           <w:sz w:val="22"/>
           <w:szCs w:val="22"/>
         </w:rPr>
-        <w:t>let isLoggedIn = true;</w:t>
-      </w:r>
-    </w:p>
-    <w:p>
-      <w:pPr>
-        <w:pStyle w:val="ListParagraph"/>
-        <w:rPr>
-          <w:color w:val="000000" w:themeColor="text1"/>
-          <w:sz w:val="22"/>
-          <w:szCs w:val="22"/>
-        </w:rPr>
-      </w:pPr>
-      <w:r>
-        <w:rPr>
-          <w:color w:val="000000" w:themeColor="text1"/>
-          <w:sz w:val="22"/>
-          <w:szCs w:val="22"/>
-        </w:rPr>
-        <w:t>isLoggedIn &amp;&amp; console.log("Welcome!");</w:t>
+        <w:t xml:space="preserve">let </w:t>
+      </w:r>
+      <w:proofErr w:type="spellStart"/>
+      <w:r>
+        <w:rPr>
+          <w:color w:val="000000" w:themeColor="text1"/>
+          <w:sz w:val="22"/>
+          <w:szCs w:val="22"/>
+        </w:rPr>
+        <w:t>isLoggedIn</w:t>
+      </w:r>
+      <w:proofErr w:type="spellEnd"/>
+      <w:r>
+        <w:rPr>
+          <w:color w:val="000000" w:themeColor="text1"/>
+          <w:sz w:val="22"/>
+          <w:szCs w:val="22"/>
+        </w:rPr>
+        <w:t xml:space="preserve"> = true;</w:t>
+      </w:r>
+    </w:p>
+    <w:p>
+      <w:pPr>
+        <w:pStyle w:val="ListParagraph"/>
+        <w:rPr>
+          <w:color w:val="000000" w:themeColor="text1"/>
+          <w:sz w:val="22"/>
+          <w:szCs w:val="22"/>
+        </w:rPr>
+      </w:pPr>
+      <w:proofErr w:type="spellStart"/>
+      <w:proofErr w:type="gramStart"/>
+      <w:r>
+        <w:rPr>
+          <w:color w:val="000000" w:themeColor="text1"/>
+          <w:sz w:val="22"/>
+          <w:szCs w:val="22"/>
+        </w:rPr>
+        <w:t>isLoggedIn</w:t>
+      </w:r>
+      <w:proofErr w:type="spellEnd"/>
+      <w:r>
+        <w:rPr>
+          <w:color w:val="000000" w:themeColor="text1"/>
+          <w:sz w:val="22"/>
+          <w:szCs w:val="22"/>
+        </w:rPr>
+        <w:t xml:space="preserve"> &amp;&amp;</w:t>
+      </w:r>
+      <w:proofErr w:type="gramEnd"/>
+      <w:r>
+        <w:rPr>
+          <w:color w:val="000000" w:themeColor="text1"/>
+          <w:sz w:val="22"/>
+          <w:szCs w:val="22"/>
+        </w:rPr>
+        <w:t xml:space="preserve"> console.log("Welcome!");</w:t>
       </w:r>
       <w:r>
         <w:rPr>
@@ -1334,7 +2281,25 @@
           <w:sz w:val="22"/>
           <w:szCs w:val="22"/>
         </w:rPr>
-        <w:t>Just like java we can declare parameters and pass arguments to a function, but without declaring the type of the data we are going to pass</w:t>
+        <w:t xml:space="preserve">Just like java we can declare parameters and pass arguments to a function, but without declaring the type of </w:t>
+      </w:r>
+      <w:proofErr w:type="gramStart"/>
+      <w:r>
+        <w:rPr>
+          <w:color w:val="000000" w:themeColor="text1"/>
+          <w:sz w:val="22"/>
+          <w:szCs w:val="22"/>
+        </w:rPr>
+        <w:t>the data</w:t>
+      </w:r>
+      <w:proofErr w:type="gramEnd"/>
+      <w:r>
+        <w:rPr>
+          <w:color w:val="000000" w:themeColor="text1"/>
+          <w:sz w:val="22"/>
+          <w:szCs w:val="22"/>
+        </w:rPr>
+        <w:t xml:space="preserve"> we are going to pass</w:t>
       </w:r>
     </w:p>
     <w:p>
@@ -1416,13 +2381,41 @@
           <w:szCs w:val="22"/>
         </w:rPr>
       </w:pPr>
-      <w:r>
-        <w:rPr>
-          <w:color w:val="000000" w:themeColor="text1"/>
-          <w:sz w:val="22"/>
-          <w:szCs w:val="22"/>
-        </w:rPr>
-        <w:t xml:space="preserve">JSON.stringify() is a function that takes a javascript object format and converts It into a string or JSON </w:t>
+      <w:proofErr w:type="spellStart"/>
+      <w:r>
+        <w:rPr>
+          <w:color w:val="000000" w:themeColor="text1"/>
+          <w:sz w:val="22"/>
+          <w:szCs w:val="22"/>
+        </w:rPr>
+        <w:t>JSON.stringify</w:t>
+      </w:r>
+      <w:proofErr w:type="spellEnd"/>
+      <w:r>
+        <w:rPr>
+          <w:color w:val="000000" w:themeColor="text1"/>
+          <w:sz w:val="22"/>
+          <w:szCs w:val="22"/>
+        </w:rPr>
+        <w:t xml:space="preserve">() is a function that takes a </w:t>
+      </w:r>
+      <w:proofErr w:type="spellStart"/>
+      <w:r>
+        <w:rPr>
+          <w:color w:val="000000" w:themeColor="text1"/>
+          <w:sz w:val="22"/>
+          <w:szCs w:val="22"/>
+        </w:rPr>
+        <w:t>javascript</w:t>
+      </w:r>
+      <w:proofErr w:type="spellEnd"/>
+      <w:r>
+        <w:rPr>
+          <w:color w:val="000000" w:themeColor="text1"/>
+          <w:sz w:val="22"/>
+          <w:szCs w:val="22"/>
+        </w:rPr>
+        <w:t xml:space="preserve"> object format and converts It into a string or JSON </w:t>
       </w:r>
     </w:p>
     <w:p>
@@ -1438,13 +2431,23 @@
           <w:szCs w:val="22"/>
         </w:rPr>
       </w:pPr>
-      <w:r>
-        <w:rPr>
-          <w:color w:val="000000" w:themeColor="text1"/>
-          <w:sz w:val="22"/>
-          <w:szCs w:val="22"/>
-        </w:rPr>
-        <w:t>JSON.parse() does the opposite, it takes a JSON string and turns it back into a JS Object</w:t>
+      <w:proofErr w:type="spellStart"/>
+      <w:r>
+        <w:rPr>
+          <w:color w:val="000000" w:themeColor="text1"/>
+          <w:sz w:val="22"/>
+          <w:szCs w:val="22"/>
+        </w:rPr>
+        <w:t>JSON.parse</w:t>
+      </w:r>
+      <w:proofErr w:type="spellEnd"/>
+      <w:r>
+        <w:rPr>
+          <w:color w:val="000000" w:themeColor="text1"/>
+          <w:sz w:val="22"/>
+          <w:szCs w:val="22"/>
+        </w:rPr>
+        <w:t>() does the opposite, it takes a JSON string and turns it back into a JS Object</w:t>
       </w:r>
     </w:p>
     <w:p>
@@ -1460,13 +2463,43 @@
           <w:szCs w:val="22"/>
         </w:rPr>
       </w:pPr>
-      <w:r>
-        <w:rPr>
-          <w:color w:val="000000" w:themeColor="text1"/>
-          <w:sz w:val="22"/>
-          <w:szCs w:val="22"/>
-        </w:rPr>
-        <w:t>Its important since our Node.js app communicates with other functions, systems using the JSON so we need to handle that JSON as JS Object that we can further develop</w:t>
+      <w:proofErr w:type="spellStart"/>
+      <w:proofErr w:type="gramStart"/>
+      <w:r>
+        <w:rPr>
+          <w:color w:val="000000" w:themeColor="text1"/>
+          <w:sz w:val="22"/>
+          <w:szCs w:val="22"/>
+        </w:rPr>
+        <w:t>Its</w:t>
+      </w:r>
+      <w:proofErr w:type="spellEnd"/>
+      <w:proofErr w:type="gramEnd"/>
+      <w:r>
+        <w:rPr>
+          <w:color w:val="000000" w:themeColor="text1"/>
+          <w:sz w:val="22"/>
+          <w:szCs w:val="22"/>
+        </w:rPr>
+        <w:t xml:space="preserve"> important since our Node.js app communicates with other </w:t>
+      </w:r>
+      <w:proofErr w:type="gramStart"/>
+      <w:r>
+        <w:rPr>
+          <w:color w:val="000000" w:themeColor="text1"/>
+          <w:sz w:val="22"/>
+          <w:szCs w:val="22"/>
+        </w:rPr>
+        <w:t>functions,</w:t>
+      </w:r>
+      <w:proofErr w:type="gramEnd"/>
+      <w:r>
+        <w:rPr>
+          <w:color w:val="000000" w:themeColor="text1"/>
+          <w:sz w:val="22"/>
+          <w:szCs w:val="22"/>
+        </w:rPr>
+        <w:t xml:space="preserve"> systems using the JSON so we need to handle that JSON as JS Object that we can further develop</w:t>
       </w:r>
     </w:p>
     <w:p>
@@ -1516,7 +2549,25 @@
           <w:sz w:val="22"/>
           <w:szCs w:val="22"/>
         </w:rPr>
-        <w:t>Local storage lets the javascript saves some data into the browser so when the user refreshes, closes, or re-open the browser these data are not lost.</w:t>
+        <w:t xml:space="preserve">Local storage lets the </w:t>
+      </w:r>
+      <w:proofErr w:type="spellStart"/>
+      <w:r>
+        <w:rPr>
+          <w:color w:val="000000" w:themeColor="text1"/>
+          <w:sz w:val="22"/>
+          <w:szCs w:val="22"/>
+        </w:rPr>
+        <w:t>javascript</w:t>
+      </w:r>
+      <w:proofErr w:type="spellEnd"/>
+      <w:r>
+        <w:rPr>
+          <w:color w:val="000000" w:themeColor="text1"/>
+          <w:sz w:val="22"/>
+          <w:szCs w:val="22"/>
+        </w:rPr>
+        <w:t xml:space="preserve"> saves some data into the browser so when the user refreshes, closes, or re-open the browser these data are not lost.</w:t>
       </w:r>
     </w:p>
     <w:p>
@@ -1532,13 +2583,23 @@
           <w:szCs w:val="22"/>
         </w:rPr>
       </w:pPr>
-      <w:r>
-        <w:rPr>
-          <w:color w:val="000000" w:themeColor="text1"/>
-          <w:sz w:val="22"/>
-          <w:szCs w:val="22"/>
-        </w:rPr>
-        <w:t>localStorage.setItem(key, value);</w:t>
+      <w:proofErr w:type="spellStart"/>
+      <w:r>
+        <w:rPr>
+          <w:color w:val="000000" w:themeColor="text1"/>
+          <w:sz w:val="22"/>
+          <w:szCs w:val="22"/>
+        </w:rPr>
+        <w:t>localStorage.setItem</w:t>
+      </w:r>
+      <w:proofErr w:type="spellEnd"/>
+      <w:r>
+        <w:rPr>
+          <w:color w:val="000000" w:themeColor="text1"/>
+          <w:sz w:val="22"/>
+          <w:szCs w:val="22"/>
+        </w:rPr>
+        <w:t>(key, value);</w:t>
       </w:r>
       <w:r>
         <w:rPr>
@@ -1562,13 +2623,23 @@
           <w:szCs w:val="22"/>
         </w:rPr>
       </w:pPr>
-      <w:r>
-        <w:rPr>
-          <w:color w:val="000000" w:themeColor="text1"/>
-          <w:sz w:val="22"/>
-          <w:szCs w:val="22"/>
-        </w:rPr>
-        <w:t>localStorage.getItem("username");</w:t>
+      <w:proofErr w:type="spellStart"/>
+      <w:r>
+        <w:rPr>
+          <w:color w:val="000000" w:themeColor="text1"/>
+          <w:sz w:val="22"/>
+          <w:szCs w:val="22"/>
+        </w:rPr>
+        <w:t>localStorage.getItem</w:t>
+      </w:r>
+      <w:proofErr w:type="spellEnd"/>
+      <w:r>
+        <w:rPr>
+          <w:color w:val="000000" w:themeColor="text1"/>
+          <w:sz w:val="22"/>
+          <w:szCs w:val="22"/>
+        </w:rPr>
+        <w:t>("username");</w:t>
       </w:r>
       <w:r>
         <w:rPr>
@@ -1592,13 +2663,23 @@
           <w:szCs w:val="22"/>
         </w:rPr>
       </w:pPr>
-      <w:r>
-        <w:rPr>
-          <w:color w:val="000000" w:themeColor="text1"/>
-          <w:sz w:val="22"/>
-          <w:szCs w:val="22"/>
-        </w:rPr>
-        <w:t>localStorage.removeItem("username");</w:t>
+      <w:proofErr w:type="spellStart"/>
+      <w:r>
+        <w:rPr>
+          <w:color w:val="000000" w:themeColor="text1"/>
+          <w:sz w:val="22"/>
+          <w:szCs w:val="22"/>
+        </w:rPr>
+        <w:t>localStorage.removeItem</w:t>
+      </w:r>
+      <w:proofErr w:type="spellEnd"/>
+      <w:r>
+        <w:rPr>
+          <w:color w:val="000000" w:themeColor="text1"/>
+          <w:sz w:val="22"/>
+          <w:szCs w:val="22"/>
+        </w:rPr>
+        <w:t>("username");</w:t>
       </w:r>
     </w:p>
     <w:p>
@@ -1614,6 +2695,7 @@
           <w:szCs w:val="22"/>
         </w:rPr>
       </w:pPr>
+      <w:proofErr w:type="gramStart"/>
       <w:r>
         <w:rPr>
           <w:color w:val="000000" w:themeColor="text1"/>
@@ -1628,15 +2710,96 @@
           <w:sz w:val="22"/>
           <w:szCs w:val="22"/>
         </w:rPr>
-        <w:t>e need to convert the object int JSON string store it, then fetch it covnert it using parse, then use it again</w:t>
-      </w:r>
-      <w:r>
-        <w:rPr>
-          <w:color w:val="000000" w:themeColor="text1"/>
-          <w:sz w:val="22"/>
-          <w:szCs w:val="22"/>
-        </w:rPr>
-        <w:t>. Since local storage does not store anything beside strings</w:t>
+        <w:t>e</w:t>
+      </w:r>
+      <w:proofErr w:type="gramEnd"/>
+      <w:r>
+        <w:rPr>
+          <w:color w:val="000000" w:themeColor="text1"/>
+          <w:sz w:val="22"/>
+          <w:szCs w:val="22"/>
+        </w:rPr>
+        <w:t xml:space="preserve"> need to convert the object int JSON string </w:t>
+      </w:r>
+      <w:proofErr w:type="gramStart"/>
+      <w:r>
+        <w:rPr>
+          <w:color w:val="000000" w:themeColor="text1"/>
+          <w:sz w:val="22"/>
+          <w:szCs w:val="22"/>
+        </w:rPr>
+        <w:t>store it</w:t>
+      </w:r>
+      <w:proofErr w:type="gramEnd"/>
+      <w:r>
+        <w:rPr>
+          <w:color w:val="000000" w:themeColor="text1"/>
+          <w:sz w:val="22"/>
+          <w:szCs w:val="22"/>
+        </w:rPr>
+        <w:t xml:space="preserve">, then fetch it </w:t>
+      </w:r>
+      <w:proofErr w:type="spellStart"/>
+      <w:r>
+        <w:rPr>
+          <w:color w:val="000000" w:themeColor="text1"/>
+          <w:sz w:val="22"/>
+          <w:szCs w:val="22"/>
+        </w:rPr>
+        <w:t>covnert</w:t>
+      </w:r>
+      <w:proofErr w:type="spellEnd"/>
+      <w:r>
+        <w:rPr>
+          <w:color w:val="000000" w:themeColor="text1"/>
+          <w:sz w:val="22"/>
+          <w:szCs w:val="22"/>
+        </w:rPr>
+        <w:t xml:space="preserve"> it </w:t>
+      </w:r>
+      <w:proofErr w:type="gramStart"/>
+      <w:r>
+        <w:rPr>
+          <w:color w:val="000000" w:themeColor="text1"/>
+          <w:sz w:val="22"/>
+          <w:szCs w:val="22"/>
+        </w:rPr>
+        <w:t>using</w:t>
+      </w:r>
+      <w:proofErr w:type="gramEnd"/>
+      <w:r>
+        <w:rPr>
+          <w:color w:val="000000" w:themeColor="text1"/>
+          <w:sz w:val="22"/>
+          <w:szCs w:val="22"/>
+        </w:rPr>
+        <w:t xml:space="preserve"> parse, then use it again</w:t>
+      </w:r>
+      <w:r>
+        <w:rPr>
+          <w:color w:val="000000" w:themeColor="text1"/>
+          <w:sz w:val="22"/>
+          <w:szCs w:val="22"/>
+        </w:rPr>
+        <w:t xml:space="preserve">. Since local storage does not store anything </w:t>
+      </w:r>
+      <w:proofErr w:type="spellStart"/>
+      <w:r>
+        <w:rPr>
+          <w:color w:val="000000" w:themeColor="text1"/>
+          <w:sz w:val="22"/>
+          <w:szCs w:val="22"/>
+        </w:rPr>
+        <w:t>beside</w:t>
+      </w:r>
+      <w:proofErr w:type="spellEnd"/>
+      <w:r>
+        <w:rPr>
+          <w:color w:val="000000" w:themeColor="text1"/>
+          <w:sz w:val="22"/>
+          <w:szCs w:val="22"/>
+        </w:rPr>
+        <w:t xml:space="preserve"> strings</w:t>
       </w:r>
       <w:r>
         <w:rPr>
@@ -1703,15 +2866,33 @@
           <w:sz w:val="22"/>
           <w:szCs w:val="22"/>
         </w:rPr>
-        <w:t>in JS  a</w:t>
-      </w:r>
-      <w:r>
-        <w:rPr>
-          <w:color w:val="000000" w:themeColor="text1"/>
-          <w:sz w:val="22"/>
-          <w:szCs w:val="22"/>
-        </w:rPr>
-        <w:t>n object is a way to group related data together using key-value pairs.</w:t>
+        <w:t xml:space="preserve">in </w:t>
+      </w:r>
+      <w:proofErr w:type="gramStart"/>
+      <w:r>
+        <w:rPr>
+          <w:color w:val="000000" w:themeColor="text1"/>
+          <w:sz w:val="22"/>
+          <w:szCs w:val="22"/>
+        </w:rPr>
+        <w:t>JS  a</w:t>
+      </w:r>
+      <w:r>
+        <w:rPr>
+          <w:color w:val="000000" w:themeColor="text1"/>
+          <w:sz w:val="22"/>
+          <w:szCs w:val="22"/>
+        </w:rPr>
+        <w:t>n</w:t>
+      </w:r>
+      <w:proofErr w:type="gramEnd"/>
+      <w:r>
+        <w:rPr>
+          <w:color w:val="000000" w:themeColor="text1"/>
+          <w:sz w:val="22"/>
+          <w:szCs w:val="22"/>
+        </w:rPr>
+        <w:t xml:space="preserve"> object is a way to group related data together using key-value pairs.</w:t>
       </w:r>
     </w:p>
     <w:p>
@@ -1733,7 +2914,25 @@
           <w:sz w:val="22"/>
           <w:szCs w:val="22"/>
         </w:rPr>
-        <w:t>We can access a property or a value of a certain attribute in the object using the dot notation or a bracket with a string including the attribute name</w:t>
+        <w:t xml:space="preserve">We can access a property or </w:t>
+      </w:r>
+      <w:proofErr w:type="gramStart"/>
+      <w:r>
+        <w:rPr>
+          <w:color w:val="000000" w:themeColor="text1"/>
+          <w:sz w:val="22"/>
+          <w:szCs w:val="22"/>
+        </w:rPr>
+        <w:t>a value</w:t>
+      </w:r>
+      <w:proofErr w:type="gramEnd"/>
+      <w:r>
+        <w:rPr>
+          <w:color w:val="000000" w:themeColor="text1"/>
+          <w:sz w:val="22"/>
+          <w:szCs w:val="22"/>
+        </w:rPr>
+        <w:t xml:space="preserve"> of a certain attribute in the object using the dot notation or a bracket with a string including the attribute name</w:t>
       </w:r>
     </w:p>
     <w:p>
@@ -1755,7 +2954,27 @@
           <w:sz w:val="22"/>
           <w:szCs w:val="22"/>
         </w:rPr>
-        <w:t>We can add a property by easily just writing the object name.newprop = value</w:t>
+        <w:t xml:space="preserve">We can add a property by easily just writing the object </w:t>
+      </w:r>
+      <w:proofErr w:type="spellStart"/>
+      <w:proofErr w:type="gramStart"/>
+      <w:r>
+        <w:rPr>
+          <w:color w:val="000000" w:themeColor="text1"/>
+          <w:sz w:val="22"/>
+          <w:szCs w:val="22"/>
+        </w:rPr>
+        <w:t>name.newprop</w:t>
+      </w:r>
+      <w:proofErr w:type="spellEnd"/>
+      <w:proofErr w:type="gramEnd"/>
+      <w:r>
+        <w:rPr>
+          <w:color w:val="000000" w:themeColor="text1"/>
+          <w:sz w:val="22"/>
+          <w:szCs w:val="22"/>
+        </w:rPr>
+        <w:t xml:space="preserve"> = value</w:t>
       </w:r>
     </w:p>
     <w:p>
@@ -1777,7 +2996,27 @@
           <w:sz w:val="22"/>
           <w:szCs w:val="22"/>
         </w:rPr>
-        <w:t>delete user.email;</w:t>
+        <w:t xml:space="preserve">delete </w:t>
+      </w:r>
+      <w:proofErr w:type="spellStart"/>
+      <w:proofErr w:type="gramStart"/>
+      <w:r>
+        <w:rPr>
+          <w:color w:val="000000" w:themeColor="text1"/>
+          <w:sz w:val="22"/>
+          <w:szCs w:val="22"/>
+        </w:rPr>
+        <w:t>user.email</w:t>
+      </w:r>
+      <w:proofErr w:type="spellEnd"/>
+      <w:proofErr w:type="gramEnd"/>
+      <w:r>
+        <w:rPr>
+          <w:color w:val="000000" w:themeColor="text1"/>
+          <w:sz w:val="22"/>
+          <w:szCs w:val="22"/>
+        </w:rPr>
+        <w:t>;</w:t>
       </w:r>
       <w:r>
         <w:rPr>
@@ -1807,8 +3046,18 @@
           <w:sz w:val="22"/>
           <w:szCs w:val="22"/>
         </w:rPr>
-        <w:t>Objects can contain:</w:t>
-      </w:r>
+        <w:t xml:space="preserve">Objects can </w:t>
+      </w:r>
+      <w:proofErr w:type="gramStart"/>
+      <w:r>
+        <w:rPr>
+          <w:color w:val="000000" w:themeColor="text1"/>
+          <w:sz w:val="22"/>
+          <w:szCs w:val="22"/>
+        </w:rPr>
+        <w:t>contain:</w:t>
+      </w:r>
+      <w:proofErr w:type="gramEnd"/>
       <w:r>
         <w:rPr>
           <w:color w:val="000000" w:themeColor="text1"/>
@@ -1931,7 +3180,43 @@
           <w:sz w:val="22"/>
           <w:szCs w:val="22"/>
         </w:rPr>
-        <w:t>const user2 = { ...user1 };</w:t>
+        <w:t xml:space="preserve">const user2 = </w:t>
+      </w:r>
+      <w:proofErr w:type="gramStart"/>
+      <w:r>
+        <w:rPr>
+          <w:color w:val="000000" w:themeColor="text1"/>
+          <w:sz w:val="22"/>
+          <w:szCs w:val="22"/>
+        </w:rPr>
+        <w:t>{ ...</w:t>
+      </w:r>
+      <w:proofErr w:type="gramEnd"/>
+      <w:r>
+        <w:rPr>
+          <w:color w:val="000000" w:themeColor="text1"/>
+          <w:sz w:val="22"/>
+          <w:szCs w:val="22"/>
+        </w:rPr>
+        <w:t>user</w:t>
+      </w:r>
+      <w:proofErr w:type="gramStart"/>
+      <w:r>
+        <w:rPr>
+          <w:color w:val="000000" w:themeColor="text1"/>
+          <w:sz w:val="22"/>
+          <w:szCs w:val="22"/>
+        </w:rPr>
+        <w:t>1 }</w:t>
+      </w:r>
+      <w:proofErr w:type="gramEnd"/>
+      <w:r>
+        <w:rPr>
+          <w:color w:val="000000" w:themeColor="text1"/>
+          <w:sz w:val="22"/>
+          <w:szCs w:val="22"/>
+        </w:rPr>
+        <w:t>;</w:t>
       </w:r>
       <w:r>
         <w:rPr>
@@ -1961,7 +3246,25 @@
           <w:sz w:val="22"/>
           <w:szCs w:val="22"/>
         </w:rPr>
-        <w:t>Object destructuring means taking properties out of an object and putting them into variables.</w:t>
+        <w:t xml:space="preserve">Object </w:t>
+      </w:r>
+      <w:proofErr w:type="spellStart"/>
+      <w:r>
+        <w:rPr>
+          <w:color w:val="000000" w:themeColor="text1"/>
+          <w:sz w:val="22"/>
+          <w:szCs w:val="22"/>
+        </w:rPr>
+        <w:t>destructuring</w:t>
+      </w:r>
+      <w:proofErr w:type="spellEnd"/>
+      <w:r>
+        <w:rPr>
+          <w:color w:val="000000" w:themeColor="text1"/>
+          <w:sz w:val="22"/>
+          <w:szCs w:val="22"/>
+        </w:rPr>
+        <w:t xml:space="preserve"> means taking properties out of an object and putting them into variables.</w:t>
       </w:r>
     </w:p>
     <w:p>
@@ -1983,15 +3286,69 @@
           <w:sz w:val="22"/>
           <w:szCs w:val="22"/>
         </w:rPr>
-        <w:t xml:space="preserve">Without destructuring we would need multiple variables for each which is in a new line: </w:t>
-      </w:r>
-      <w:r>
-        <w:rPr>
-          <w:color w:val="000000" w:themeColor="text1"/>
-          <w:sz w:val="22"/>
-          <w:szCs w:val="22"/>
-        </w:rPr>
-        <w:t>const { name, age, email } = user;</w:t>
+        <w:t xml:space="preserve">Without </w:t>
+      </w:r>
+      <w:proofErr w:type="spellStart"/>
+      <w:r>
+        <w:rPr>
+          <w:color w:val="000000" w:themeColor="text1"/>
+          <w:sz w:val="22"/>
+          <w:szCs w:val="22"/>
+        </w:rPr>
+        <w:t>destructuring</w:t>
+      </w:r>
+      <w:proofErr w:type="spellEnd"/>
+      <w:r>
+        <w:rPr>
+          <w:color w:val="000000" w:themeColor="text1"/>
+          <w:sz w:val="22"/>
+          <w:szCs w:val="22"/>
+        </w:rPr>
+        <w:t xml:space="preserve"> we would need multiple variables for each which is in a new line: </w:t>
+      </w:r>
+      <w:r>
+        <w:rPr>
+          <w:color w:val="000000" w:themeColor="text1"/>
+          <w:sz w:val="22"/>
+          <w:szCs w:val="22"/>
+        </w:rPr>
+        <w:t xml:space="preserve">const </w:t>
+      </w:r>
+      <w:proofErr w:type="gramStart"/>
+      <w:r>
+        <w:rPr>
+          <w:color w:val="000000" w:themeColor="text1"/>
+          <w:sz w:val="22"/>
+          <w:szCs w:val="22"/>
+        </w:rPr>
+        <w:t>{ name</w:t>
+      </w:r>
+      <w:proofErr w:type="gramEnd"/>
+      <w:r>
+        <w:rPr>
+          <w:color w:val="000000" w:themeColor="text1"/>
+          <w:sz w:val="22"/>
+          <w:szCs w:val="22"/>
+        </w:rPr>
+        <w:t xml:space="preserve">, age, </w:t>
+      </w:r>
+      <w:proofErr w:type="gramStart"/>
+      <w:r>
+        <w:rPr>
+          <w:color w:val="000000" w:themeColor="text1"/>
+          <w:sz w:val="22"/>
+          <w:szCs w:val="22"/>
+        </w:rPr>
+        <w:t>email }</w:t>
+      </w:r>
+      <w:proofErr w:type="gramEnd"/>
+      <w:r>
+        <w:rPr>
+          <w:color w:val="000000" w:themeColor="text1"/>
+          <w:sz w:val="22"/>
+          <w:szCs w:val="22"/>
+        </w:rPr>
+        <w:t xml:space="preserve"> = user;</w:t>
       </w:r>
       <w:r>
         <w:rPr>
@@ -2022,7 +3379,53 @@
           <w:szCs w:val="22"/>
         </w:rPr>
         <w:lastRenderedPageBreak/>
-        <w:t>const { name: userName } = user;</w:t>
+        <w:t xml:space="preserve">const </w:t>
+      </w:r>
+      <w:proofErr w:type="gramStart"/>
+      <w:r>
+        <w:rPr>
+          <w:color w:val="000000" w:themeColor="text1"/>
+          <w:sz w:val="22"/>
+          <w:szCs w:val="22"/>
+        </w:rPr>
+        <w:t>{ name</w:t>
+      </w:r>
+      <w:proofErr w:type="gramEnd"/>
+      <w:r>
+        <w:rPr>
+          <w:color w:val="000000" w:themeColor="text1"/>
+          <w:sz w:val="22"/>
+          <w:szCs w:val="22"/>
+        </w:rPr>
+        <w:t xml:space="preserve">: </w:t>
+      </w:r>
+      <w:proofErr w:type="spellStart"/>
+      <w:proofErr w:type="gramStart"/>
+      <w:r>
+        <w:rPr>
+          <w:color w:val="000000" w:themeColor="text1"/>
+          <w:sz w:val="22"/>
+          <w:szCs w:val="22"/>
+        </w:rPr>
+        <w:t>userName</w:t>
+      </w:r>
+      <w:proofErr w:type="spellEnd"/>
+      <w:r>
+        <w:rPr>
+          <w:color w:val="000000" w:themeColor="text1"/>
+          <w:sz w:val="22"/>
+          <w:szCs w:val="22"/>
+        </w:rPr>
+        <w:t xml:space="preserve"> }</w:t>
+      </w:r>
+      <w:proofErr w:type="gramEnd"/>
+      <w:r>
+        <w:rPr>
+          <w:color w:val="000000" w:themeColor="text1"/>
+          <w:sz w:val="22"/>
+          <w:szCs w:val="22"/>
+        </w:rPr>
+        <w:t xml:space="preserve"> = user;</w:t>
       </w:r>
       <w:r>
         <w:rPr>
@@ -2052,7 +3455,25 @@
           <w:sz w:val="22"/>
           <w:szCs w:val="22"/>
         </w:rPr>
-        <w:t>we can also while destrcuturing give a property a default value</w:t>
+        <w:t xml:space="preserve">we can also while </w:t>
+      </w:r>
+      <w:proofErr w:type="spellStart"/>
+      <w:r>
+        <w:rPr>
+          <w:color w:val="000000" w:themeColor="text1"/>
+          <w:sz w:val="22"/>
+          <w:szCs w:val="22"/>
+        </w:rPr>
+        <w:t>destrcuturing</w:t>
+      </w:r>
+      <w:proofErr w:type="spellEnd"/>
+      <w:r>
+        <w:rPr>
+          <w:color w:val="000000" w:themeColor="text1"/>
+          <w:sz w:val="22"/>
+          <w:szCs w:val="22"/>
+        </w:rPr>
+        <w:t xml:space="preserve"> give a property a default value</w:t>
       </w:r>
     </w:p>
     <w:p>
@@ -2133,7 +3554,27 @@
           <w:sz w:val="22"/>
           <w:szCs w:val="22"/>
         </w:rPr>
-        <w:t>We can use this DOM to interact with our html and modify it, for example document.querySelector(</w:t>
+        <w:t xml:space="preserve">We can use this DOM to interact with our html and modify it, for example </w:t>
+      </w:r>
+      <w:proofErr w:type="spellStart"/>
+      <w:proofErr w:type="gramStart"/>
+      <w:r>
+        <w:rPr>
+          <w:color w:val="000000" w:themeColor="text1"/>
+          <w:sz w:val="22"/>
+          <w:szCs w:val="22"/>
+        </w:rPr>
+        <w:t>document.querySelector</w:t>
+      </w:r>
+      <w:proofErr w:type="spellEnd"/>
+      <w:proofErr w:type="gramEnd"/>
+      <w:r>
+        <w:rPr>
+          <w:color w:val="000000" w:themeColor="text1"/>
+          <w:sz w:val="22"/>
+          <w:szCs w:val="22"/>
+        </w:rPr>
+        <w:t>(</w:t>
       </w:r>
       <w:r>
         <w:rPr>
@@ -2179,7 +3620,25 @@
           <w:sz w:val="22"/>
           <w:szCs w:val="22"/>
         </w:rPr>
-        <w:t>The browser gives javascript some objects for the DOM to interact with, one of the most important objects is the document; this represents the webpage.</w:t>
+        <w:t xml:space="preserve">The browser gives </w:t>
+      </w:r>
+      <w:proofErr w:type="spellStart"/>
+      <w:r>
+        <w:rPr>
+          <w:color w:val="000000" w:themeColor="text1"/>
+          <w:sz w:val="22"/>
+          <w:szCs w:val="22"/>
+        </w:rPr>
+        <w:t>javascript</w:t>
+      </w:r>
+      <w:proofErr w:type="spellEnd"/>
+      <w:r>
+        <w:rPr>
+          <w:color w:val="000000" w:themeColor="text1"/>
+          <w:sz w:val="22"/>
+          <w:szCs w:val="22"/>
+        </w:rPr>
+        <w:t xml:space="preserve"> some objects for the DOM to interact with, one of the most important objects is the document; this represents the webpage.</w:t>
       </w:r>
     </w:p>
     <w:p>
@@ -2195,21 +3654,43 @@
           <w:szCs w:val="22"/>
         </w:rPr>
       </w:pPr>
-      <w:r>
-        <w:rPr>
-          <w:color w:val="000000" w:themeColor="text1"/>
-          <w:sz w:val="22"/>
-          <w:szCs w:val="22"/>
-        </w:rPr>
-        <w:t xml:space="preserve">Document.title(); allows us to change the title of the current webpage, </w:t>
-      </w:r>
-      <w:r>
-        <w:rPr>
-          <w:color w:val="000000" w:themeColor="text1"/>
-          <w:sz w:val="22"/>
-          <w:szCs w:val="22"/>
-        </w:rPr>
-        <w:t>document.title = "My New Website";</w:t>
+      <w:proofErr w:type="spellStart"/>
+      <w:r>
+        <w:rPr>
+          <w:color w:val="000000" w:themeColor="text1"/>
+          <w:sz w:val="22"/>
+          <w:szCs w:val="22"/>
+        </w:rPr>
+        <w:t>Document.title</w:t>
+      </w:r>
+      <w:proofErr w:type="spellEnd"/>
+      <w:r>
+        <w:rPr>
+          <w:color w:val="000000" w:themeColor="text1"/>
+          <w:sz w:val="22"/>
+          <w:szCs w:val="22"/>
+        </w:rPr>
+        <w:t xml:space="preserve">(); allows us to change the title of the current webpage, </w:t>
+      </w:r>
+      <w:proofErr w:type="spellStart"/>
+      <w:proofErr w:type="gramStart"/>
+      <w:r>
+        <w:rPr>
+          <w:color w:val="000000" w:themeColor="text1"/>
+          <w:sz w:val="22"/>
+          <w:szCs w:val="22"/>
+        </w:rPr>
+        <w:t>document.title</w:t>
+      </w:r>
+      <w:proofErr w:type="spellEnd"/>
+      <w:proofErr w:type="gramEnd"/>
+      <w:r>
+        <w:rPr>
+          <w:color w:val="000000" w:themeColor="text1"/>
+          <w:sz w:val="22"/>
+          <w:szCs w:val="22"/>
+        </w:rPr>
+        <w:t xml:space="preserve"> = "My New Website";</w:t>
       </w:r>
     </w:p>
     <w:p>
@@ -2225,37 +3706,105 @@
           <w:szCs w:val="22"/>
         </w:rPr>
       </w:pPr>
-      <w:r>
-        <w:rPr>
-          <w:color w:val="000000" w:themeColor="text1"/>
-          <w:sz w:val="22"/>
-          <w:szCs w:val="22"/>
-        </w:rPr>
-        <w:t>document.body.innerHTML</w:t>
-      </w:r>
-      <w:r>
-        <w:rPr>
-          <w:color w:val="000000" w:themeColor="text1"/>
-          <w:sz w:val="22"/>
-          <w:szCs w:val="22"/>
-        </w:rPr>
-        <w:t>; this represents the body element inside our html page</w:t>
-      </w:r>
-      <w:r>
-        <w:rPr>
-          <w:color w:val="000000" w:themeColor="text1"/>
-          <w:sz w:val="22"/>
-          <w:szCs w:val="22"/>
-        </w:rPr>
-        <w:t xml:space="preserve">, this method can also accept html as a string so for example: </w:t>
-      </w:r>
-      <w:r>
-        <w:rPr>
-          <w:color w:val="000000" w:themeColor="text1"/>
-          <w:sz w:val="22"/>
-          <w:szCs w:val="22"/>
-        </w:rPr>
-        <w:t>document.body.innerHTML = "&lt;h1&gt;Hello!&lt;/h1&gt;";</w:t>
+      <w:proofErr w:type="spellStart"/>
+      <w:proofErr w:type="gramStart"/>
+      <w:r>
+        <w:rPr>
+          <w:color w:val="000000" w:themeColor="text1"/>
+          <w:sz w:val="22"/>
+          <w:szCs w:val="22"/>
+        </w:rPr>
+        <w:t>document.body</w:t>
+      </w:r>
+      <w:proofErr w:type="gramEnd"/>
+      <w:r>
+        <w:rPr>
+          <w:color w:val="000000" w:themeColor="text1"/>
+          <w:sz w:val="22"/>
+          <w:szCs w:val="22"/>
+        </w:rPr>
+        <w:t>.innerHTML</w:t>
+      </w:r>
+      <w:proofErr w:type="spellEnd"/>
+      <w:r>
+        <w:rPr>
+          <w:color w:val="000000" w:themeColor="text1"/>
+          <w:sz w:val="22"/>
+          <w:szCs w:val="22"/>
+        </w:rPr>
+        <w:t xml:space="preserve">; this represents the body element inside our html </w:t>
+      </w:r>
+      <w:proofErr w:type="gramStart"/>
+      <w:r>
+        <w:rPr>
+          <w:color w:val="000000" w:themeColor="text1"/>
+          <w:sz w:val="22"/>
+          <w:szCs w:val="22"/>
+        </w:rPr>
+        <w:t>page</w:t>
+      </w:r>
+      <w:r>
+        <w:rPr>
+          <w:color w:val="000000" w:themeColor="text1"/>
+          <w:sz w:val="22"/>
+          <w:szCs w:val="22"/>
+        </w:rPr>
+        <w:t>,</w:t>
+      </w:r>
+      <w:proofErr w:type="gramEnd"/>
+      <w:r>
+        <w:rPr>
+          <w:color w:val="000000" w:themeColor="text1"/>
+          <w:sz w:val="22"/>
+          <w:szCs w:val="22"/>
+        </w:rPr>
+        <w:t xml:space="preserve"> this method can also accept html as a string so for example: </w:t>
+      </w:r>
+      <w:proofErr w:type="spellStart"/>
+      <w:proofErr w:type="gramStart"/>
+      <w:r>
+        <w:rPr>
+          <w:color w:val="000000" w:themeColor="text1"/>
+          <w:sz w:val="22"/>
+          <w:szCs w:val="22"/>
+        </w:rPr>
+        <w:t>document.body</w:t>
+      </w:r>
+      <w:proofErr w:type="gramEnd"/>
+      <w:r>
+        <w:rPr>
+          <w:color w:val="000000" w:themeColor="text1"/>
+          <w:sz w:val="22"/>
+          <w:szCs w:val="22"/>
+        </w:rPr>
+        <w:t>.innerHTML</w:t>
+      </w:r>
+      <w:proofErr w:type="spellEnd"/>
+      <w:r>
+        <w:rPr>
+          <w:color w:val="000000" w:themeColor="text1"/>
+          <w:sz w:val="22"/>
+          <w:szCs w:val="22"/>
+        </w:rPr>
+        <w:t xml:space="preserve"> = "&lt;h1&gt;</w:t>
+      </w:r>
+      <w:proofErr w:type="gramStart"/>
+      <w:r>
+        <w:rPr>
+          <w:color w:val="000000" w:themeColor="text1"/>
+          <w:sz w:val="22"/>
+          <w:szCs w:val="22"/>
+        </w:rPr>
+        <w:t>Hello!&lt;</w:t>
+      </w:r>
+      <w:proofErr w:type="gramEnd"/>
+      <w:r>
+        <w:rPr>
+          <w:color w:val="000000" w:themeColor="text1"/>
+          <w:sz w:val="22"/>
+          <w:szCs w:val="22"/>
+        </w:rPr>
+        <w:t>/h1&gt;";</w:t>
       </w:r>
     </w:p>
     <w:p>
@@ -2271,29 +3820,81 @@
           <w:szCs w:val="22"/>
         </w:rPr>
       </w:pPr>
-      <w:r>
-        <w:rPr>
-          <w:color w:val="000000" w:themeColor="text1"/>
-          <w:sz w:val="22"/>
-          <w:szCs w:val="22"/>
-        </w:rPr>
-        <w:t>document.querySelector()</w:t>
-      </w:r>
-      <w:r>
-        <w:rPr>
-          <w:color w:val="000000" w:themeColor="text1"/>
-          <w:sz w:val="22"/>
-          <w:szCs w:val="22"/>
-        </w:rPr>
-        <w:t xml:space="preserve">; allows us to select an html element from the body. We can save it into a constant then change the content inside it. Note that we should call .textContent before changing it; </w:t>
-      </w:r>
-      <w:r>
-        <w:rPr>
-          <w:color w:val="000000" w:themeColor="text1"/>
-          <w:sz w:val="22"/>
-          <w:szCs w:val="22"/>
-        </w:rPr>
-        <w:t>heading.textContent = "Hello JavaScript!";</w:t>
+      <w:proofErr w:type="spellStart"/>
+      <w:proofErr w:type="gramStart"/>
+      <w:r>
+        <w:rPr>
+          <w:color w:val="000000" w:themeColor="text1"/>
+          <w:sz w:val="22"/>
+          <w:szCs w:val="22"/>
+        </w:rPr>
+        <w:t>document.querySelector</w:t>
+      </w:r>
+      <w:proofErr w:type="spellEnd"/>
+      <w:proofErr w:type="gramEnd"/>
+      <w:r>
+        <w:rPr>
+          <w:color w:val="000000" w:themeColor="text1"/>
+          <w:sz w:val="22"/>
+          <w:szCs w:val="22"/>
+        </w:rPr>
+        <w:t>()</w:t>
+      </w:r>
+      <w:r>
+        <w:rPr>
+          <w:color w:val="000000" w:themeColor="text1"/>
+          <w:sz w:val="22"/>
+          <w:szCs w:val="22"/>
+        </w:rPr>
+        <w:t xml:space="preserve">; allows us to select an html element from the body. We can save it into a constant then change the content inside it. Note that we should </w:t>
+      </w:r>
+      <w:proofErr w:type="gramStart"/>
+      <w:r>
+        <w:rPr>
+          <w:color w:val="000000" w:themeColor="text1"/>
+          <w:sz w:val="22"/>
+          <w:szCs w:val="22"/>
+        </w:rPr>
+        <w:t>call .</w:t>
+      </w:r>
+      <w:proofErr w:type="spellStart"/>
+      <w:r>
+        <w:rPr>
+          <w:color w:val="000000" w:themeColor="text1"/>
+          <w:sz w:val="22"/>
+          <w:szCs w:val="22"/>
+        </w:rPr>
+        <w:t>textContent</w:t>
+      </w:r>
+      <w:proofErr w:type="spellEnd"/>
+      <w:proofErr w:type="gramEnd"/>
+      <w:r>
+        <w:rPr>
+          <w:color w:val="000000" w:themeColor="text1"/>
+          <w:sz w:val="22"/>
+          <w:szCs w:val="22"/>
+        </w:rPr>
+        <w:t xml:space="preserve"> before changing it; </w:t>
+      </w:r>
+      <w:proofErr w:type="spellStart"/>
+      <w:proofErr w:type="gramStart"/>
+      <w:r>
+        <w:rPr>
+          <w:color w:val="000000" w:themeColor="text1"/>
+          <w:sz w:val="22"/>
+          <w:szCs w:val="22"/>
+        </w:rPr>
+        <w:t>heading.textContent</w:t>
+      </w:r>
+      <w:proofErr w:type="spellEnd"/>
+      <w:proofErr w:type="gramEnd"/>
+      <w:r>
+        <w:rPr>
+          <w:color w:val="000000" w:themeColor="text1"/>
+          <w:sz w:val="22"/>
+          <w:szCs w:val="22"/>
+        </w:rPr>
+        <w:t xml:space="preserve"> = "Hello JavaScript!";</w:t>
       </w:r>
     </w:p>
     <w:p>
@@ -2309,13 +3910,23 @@
           <w:szCs w:val="22"/>
         </w:rPr>
       </w:pPr>
-      <w:r>
-        <w:rPr>
-          <w:color w:val="000000" w:themeColor="text1"/>
-          <w:sz w:val="22"/>
-          <w:szCs w:val="22"/>
-        </w:rPr>
-        <w:t>it’s a better idea for scalable applications to put a class inside the html element so we can differentiate between them when we select the query</w:t>
+      <w:proofErr w:type="gramStart"/>
+      <w:r>
+        <w:rPr>
+          <w:color w:val="000000" w:themeColor="text1"/>
+          <w:sz w:val="22"/>
+          <w:szCs w:val="22"/>
+        </w:rPr>
+        <w:t>it’s</w:t>
+      </w:r>
+      <w:proofErr w:type="gramEnd"/>
+      <w:r>
+        <w:rPr>
+          <w:color w:val="000000" w:themeColor="text1"/>
+          <w:sz w:val="22"/>
+          <w:szCs w:val="22"/>
+        </w:rPr>
+        <w:t xml:space="preserve"> a better idea for scalable applications to put a class inside the html element so we can differentiate between them when we select the query</w:t>
       </w:r>
     </w:p>
     <w:p>
@@ -2353,14 +3964,72 @@
           <w:szCs w:val="22"/>
         </w:rPr>
       </w:pPr>
-      <w:r>
-        <w:rPr>
-          <w:color w:val="000000" w:themeColor="text1"/>
-          <w:sz w:val="22"/>
-          <w:szCs w:val="22"/>
-        </w:rPr>
-        <w:t>getting a value from the input box, first we declare a class for a certain input, we use this class name with the querySelector(), and store the output into a variable. This variable represents the entire input box. To get the value we store the value into a new variable from the box.value</w:t>
-      </w:r>
+      <w:proofErr w:type="gramStart"/>
+      <w:r>
+        <w:rPr>
+          <w:color w:val="000000" w:themeColor="text1"/>
+          <w:sz w:val="22"/>
+          <w:szCs w:val="22"/>
+        </w:rPr>
+        <w:t>getting</w:t>
+      </w:r>
+      <w:proofErr w:type="gramEnd"/>
+      <w:r>
+        <w:rPr>
+          <w:color w:val="000000" w:themeColor="text1"/>
+          <w:sz w:val="22"/>
+          <w:szCs w:val="22"/>
+        </w:rPr>
+        <w:t xml:space="preserve"> a value from the input box, first we declare a class for a certain input, we use this class name with the </w:t>
+      </w:r>
+      <w:proofErr w:type="spellStart"/>
+      <w:proofErr w:type="gramStart"/>
+      <w:r>
+        <w:rPr>
+          <w:color w:val="000000" w:themeColor="text1"/>
+          <w:sz w:val="22"/>
+          <w:szCs w:val="22"/>
+        </w:rPr>
+        <w:t>querySelector</w:t>
+      </w:r>
+      <w:proofErr w:type="spellEnd"/>
+      <w:r>
+        <w:rPr>
+          <w:color w:val="000000" w:themeColor="text1"/>
+          <w:sz w:val="22"/>
+          <w:szCs w:val="22"/>
+        </w:rPr>
+        <w:t>(), and</w:t>
+      </w:r>
+      <w:proofErr w:type="gramEnd"/>
+      <w:r>
+        <w:rPr>
+          <w:color w:val="000000" w:themeColor="text1"/>
+          <w:sz w:val="22"/>
+          <w:szCs w:val="22"/>
+        </w:rPr>
+        <w:t xml:space="preserve"> store the output into a variable. This variable represents the entire input box. To get the value we store the value into a new variable from the </w:t>
+      </w:r>
+      <w:proofErr w:type="spellStart"/>
+      <w:r>
+        <w:rPr>
+          <w:color w:val="000000" w:themeColor="text1"/>
+          <w:sz w:val="22"/>
+          <w:szCs w:val="22"/>
+        </w:rPr>
+        <w:t>box</w:t>
+      </w:r>
+      <w:proofErr w:type="gramStart"/>
+      <w:r>
+        <w:rPr>
+          <w:color w:val="000000" w:themeColor="text1"/>
+          <w:sz w:val="22"/>
+          <w:szCs w:val="22"/>
+        </w:rPr>
+        <w:t>.value</w:t>
+      </w:r>
+      <w:proofErr w:type="spellEnd"/>
+      <w:proofErr w:type="gramEnd"/>
     </w:p>
     <w:p>
       <w:pPr>
@@ -2375,13 +4044,77 @@
           <w:szCs w:val="22"/>
         </w:rPr>
       </w:pPr>
-      <w:r>
-        <w:rPr>
-          <w:color w:val="000000" w:themeColor="text1"/>
-          <w:sz w:val="22"/>
-          <w:szCs w:val="22"/>
-        </w:rPr>
-        <w:t>keydown tells us when a key was pressed, it does not tell us which key, however the event object stores data about the event which In this case was a key stroke, using event.key tells us what was actually pressed.</w:t>
+      <w:proofErr w:type="spellStart"/>
+      <w:r>
+        <w:rPr>
+          <w:color w:val="000000" w:themeColor="text1"/>
+          <w:sz w:val="22"/>
+          <w:szCs w:val="22"/>
+        </w:rPr>
+        <w:t>keydown</w:t>
+      </w:r>
+      <w:proofErr w:type="spellEnd"/>
+      <w:r>
+        <w:rPr>
+          <w:color w:val="000000" w:themeColor="text1"/>
+          <w:sz w:val="22"/>
+          <w:szCs w:val="22"/>
+        </w:rPr>
+        <w:t xml:space="preserve"> tells us when a key was pressed, it does not tell us which key, however the event object stores data about the event which </w:t>
+      </w:r>
+      <w:proofErr w:type="gramStart"/>
+      <w:r>
+        <w:rPr>
+          <w:color w:val="000000" w:themeColor="text1"/>
+          <w:sz w:val="22"/>
+          <w:szCs w:val="22"/>
+        </w:rPr>
+        <w:t>In</w:t>
+      </w:r>
+      <w:proofErr w:type="gramEnd"/>
+      <w:r>
+        <w:rPr>
+          <w:color w:val="000000" w:themeColor="text1"/>
+          <w:sz w:val="22"/>
+          <w:szCs w:val="22"/>
+        </w:rPr>
+        <w:t xml:space="preserve"> this case was a key stroke, using </w:t>
+      </w:r>
+      <w:proofErr w:type="spellStart"/>
+      <w:r>
+        <w:rPr>
+          <w:color w:val="000000" w:themeColor="text1"/>
+          <w:sz w:val="22"/>
+          <w:szCs w:val="22"/>
+        </w:rPr>
+        <w:t>event.key</w:t>
+      </w:r>
+      <w:proofErr w:type="spellEnd"/>
+      <w:r>
+        <w:rPr>
+          <w:color w:val="000000" w:themeColor="text1"/>
+          <w:sz w:val="22"/>
+          <w:szCs w:val="22"/>
+        </w:rPr>
+        <w:t xml:space="preserve"> tells us what was </w:t>
+      </w:r>
+      <w:proofErr w:type="gramStart"/>
+      <w:r>
+        <w:rPr>
+          <w:color w:val="000000" w:themeColor="text1"/>
+          <w:sz w:val="22"/>
+          <w:szCs w:val="22"/>
+        </w:rPr>
+        <w:t>actually pressed</w:t>
+      </w:r>
+      <w:proofErr w:type="gramEnd"/>
+      <w:r>
+        <w:rPr>
+          <w:color w:val="000000" w:themeColor="text1"/>
+          <w:sz w:val="22"/>
+          <w:szCs w:val="22"/>
+        </w:rPr>
+        <w:t>.</w:t>
       </w:r>
     </w:p>
     <w:p>
@@ -2397,13 +4130,33 @@
           <w:szCs w:val="22"/>
         </w:rPr>
       </w:pPr>
-      <w:r>
-        <w:rPr>
-          <w:color w:val="000000" w:themeColor="text1"/>
-          <w:sz w:val="22"/>
-          <w:szCs w:val="22"/>
-        </w:rPr>
-        <w:t>classList.add()</w:t>
+      <w:proofErr w:type="spellStart"/>
+      <w:proofErr w:type="gramStart"/>
+      <w:r>
+        <w:rPr>
+          <w:color w:val="000000" w:themeColor="text1"/>
+          <w:sz w:val="22"/>
+          <w:szCs w:val="22"/>
+        </w:rPr>
+        <w:t>classList.add</w:t>
+      </w:r>
+      <w:proofErr w:type="spellEnd"/>
+      <w:r>
+        <w:rPr>
+          <w:color w:val="000000" w:themeColor="text1"/>
+          <w:sz w:val="22"/>
+          <w:szCs w:val="22"/>
+        </w:rPr>
+        <w:t>(</w:t>
+      </w:r>
+      <w:proofErr w:type="gramEnd"/>
+      <w:r>
+        <w:rPr>
+          <w:color w:val="000000" w:themeColor="text1"/>
+          <w:sz w:val="22"/>
+          <w:szCs w:val="22"/>
+        </w:rPr>
+        <w:t>)</w:t>
       </w:r>
       <w:r>
         <w:rPr>
@@ -2453,11 +4206,461 @@
     </w:p>
     <w:p>
       <w:pPr>
-        <w:ind w:left="360"/>
-        <w:rPr>
-          <w:color w:val="000000" w:themeColor="text1"/>
-          <w:sz w:val="22"/>
-          <w:szCs w:val="22"/>
+        <w:pStyle w:val="ListParagraph"/>
+        <w:numPr>
+          <w:ilvl w:val="0"/>
+          <w:numId w:val="9"/>
+        </w:numPr>
+        <w:rPr>
+          <w:b/>
+          <w:bCs/>
+          <w:color w:val="000000" w:themeColor="text1"/>
+          <w:u w:val="single"/>
+        </w:rPr>
+      </w:pPr>
+      <w:r>
+        <w:rPr>
+          <w:color w:val="000000" w:themeColor="text1"/>
+          <w:sz w:val="22"/>
+          <w:szCs w:val="22"/>
+        </w:rPr>
+        <w:t>in JS an array can hold different data types, it can hold objects, functions</w:t>
+      </w:r>
+    </w:p>
+    <w:p>
+      <w:pPr>
+        <w:pStyle w:val="ListParagraph"/>
+        <w:numPr>
+          <w:ilvl w:val="0"/>
+          <w:numId w:val="9"/>
+        </w:numPr>
+        <w:rPr>
+          <w:b/>
+          <w:bCs/>
+          <w:color w:val="000000" w:themeColor="text1"/>
+          <w:u w:val="single"/>
+        </w:rPr>
+      </w:pPr>
+      <w:proofErr w:type="spellStart"/>
+      <w:r>
+        <w:rPr>
+          <w:color w:val="000000" w:themeColor="text1"/>
+          <w:sz w:val="22"/>
+          <w:szCs w:val="22"/>
+        </w:rPr>
+        <w:t>Array.isArray</w:t>
+      </w:r>
+      <w:proofErr w:type="spellEnd"/>
+      <w:r>
+        <w:rPr>
+          <w:color w:val="000000" w:themeColor="text1"/>
+          <w:sz w:val="22"/>
+          <w:szCs w:val="22"/>
+        </w:rPr>
+        <w:t>(); is used to check if a variable is array or not</w:t>
+      </w:r>
+    </w:p>
+    <w:p>
+      <w:pPr>
+        <w:pStyle w:val="ListParagraph"/>
+        <w:numPr>
+          <w:ilvl w:val="0"/>
+          <w:numId w:val="9"/>
+        </w:numPr>
+        <w:rPr>
+          <w:b/>
+          <w:bCs/>
+          <w:color w:val="000000" w:themeColor="text1"/>
+          <w:u w:val="single"/>
+        </w:rPr>
+      </w:pPr>
+      <w:proofErr w:type="gramStart"/>
+      <w:r>
+        <w:rPr>
+          <w:color w:val="000000" w:themeColor="text1"/>
+          <w:sz w:val="22"/>
+          <w:szCs w:val="22"/>
+        </w:rPr>
+        <w:t>Push(</w:t>
+      </w:r>
+      <w:proofErr w:type="gramEnd"/>
+      <w:r>
+        <w:rPr>
+          <w:color w:val="000000" w:themeColor="text1"/>
+          <w:sz w:val="22"/>
+          <w:szCs w:val="22"/>
+        </w:rPr>
+        <w:t>) adds a new item to the end of the array</w:t>
+      </w:r>
+    </w:p>
+    <w:p>
+      <w:pPr>
+        <w:pStyle w:val="ListParagraph"/>
+        <w:numPr>
+          <w:ilvl w:val="0"/>
+          <w:numId w:val="9"/>
+        </w:numPr>
+        <w:rPr>
+          <w:b/>
+          <w:bCs/>
+          <w:color w:val="000000" w:themeColor="text1"/>
+          <w:u w:val="single"/>
+        </w:rPr>
+      </w:pPr>
+      <w:proofErr w:type="gramStart"/>
+      <w:r>
+        <w:rPr>
+          <w:color w:val="000000" w:themeColor="text1"/>
+          <w:sz w:val="22"/>
+          <w:szCs w:val="22"/>
+        </w:rPr>
+        <w:t>.splice</w:t>
+      </w:r>
+      <w:proofErr w:type="gramEnd"/>
+      <w:r>
+        <w:rPr>
+          <w:color w:val="000000" w:themeColor="text1"/>
+          <w:sz w:val="22"/>
+          <w:szCs w:val="22"/>
+        </w:rPr>
+        <w:t xml:space="preserve">(); it can add, remove or replace.  </w:t>
+      </w:r>
+      <w:proofErr w:type="gramStart"/>
+      <w:r>
+        <w:rPr>
+          <w:color w:val="000000" w:themeColor="text1"/>
+          <w:sz w:val="22"/>
+          <w:szCs w:val="22"/>
+        </w:rPr>
+        <w:t>Okay</w:t>
+      </w:r>
+      <w:proofErr w:type="gramEnd"/>
+      <w:r>
+        <w:rPr>
+          <w:color w:val="000000" w:themeColor="text1"/>
+          <w:sz w:val="22"/>
+          <w:szCs w:val="22"/>
+        </w:rPr>
+        <w:t xml:space="preserve"> in case we need to remove we will provide 2 variables, the start and how many to remove. In case of </w:t>
+      </w:r>
+      <w:proofErr w:type="gramStart"/>
+      <w:r>
+        <w:rPr>
+          <w:color w:val="000000" w:themeColor="text1"/>
+          <w:sz w:val="22"/>
+          <w:szCs w:val="22"/>
+        </w:rPr>
+        <w:t>addition</w:t>
+      </w:r>
+      <w:proofErr w:type="gramEnd"/>
+      <w:r>
+        <w:rPr>
+          <w:color w:val="000000" w:themeColor="text1"/>
+          <w:sz w:val="22"/>
+          <w:szCs w:val="22"/>
+        </w:rPr>
+        <w:t xml:space="preserve"> we would have more than 2 variables, the first is the start and the second is how many to remove which is always at 0 </w:t>
+      </w:r>
+      <w:r>
+        <w:rPr>
+          <w:color w:val="000000" w:themeColor="text1"/>
+          <w:sz w:val="22"/>
+          <w:szCs w:val="22"/>
+        </w:rPr>
+        <w:lastRenderedPageBreak/>
+        <w:t>and the data we want to add. In case of replace we would provide the index how many to replace and what are the values we will use to replace</w:t>
+      </w:r>
+    </w:p>
+    <w:p>
+      <w:pPr>
+        <w:pStyle w:val="ListParagraph"/>
+        <w:numPr>
+          <w:ilvl w:val="0"/>
+          <w:numId w:val="9"/>
+        </w:numPr>
+        <w:rPr>
+          <w:b/>
+          <w:bCs/>
+          <w:color w:val="000000" w:themeColor="text1"/>
+          <w:u w:val="single"/>
+        </w:rPr>
+      </w:pPr>
+      <w:r>
+        <w:rPr>
+          <w:color w:val="000000" w:themeColor="text1"/>
+          <w:sz w:val="22"/>
+          <w:szCs w:val="22"/>
+        </w:rPr>
+        <w:t>Unlike java we can console.log an entire array without looping through it</w:t>
+      </w:r>
+    </w:p>
+    <w:p>
+      <w:pPr>
+        <w:pStyle w:val="ListParagraph"/>
+        <w:numPr>
+          <w:ilvl w:val="0"/>
+          <w:numId w:val="9"/>
+        </w:numPr>
+        <w:rPr>
+          <w:b/>
+          <w:bCs/>
+          <w:color w:val="000000" w:themeColor="text1"/>
+          <w:u w:val="single"/>
+        </w:rPr>
+      </w:pPr>
+      <w:r>
+        <w:rPr>
+          <w:color w:val="000000" w:themeColor="text1"/>
+          <w:sz w:val="22"/>
+          <w:szCs w:val="22"/>
+        </w:rPr>
+        <w:t xml:space="preserve">Arrays are objects in JS which means they hold a reference to something, this means in case we say arr2 = arr1. If we change </w:t>
+      </w:r>
+      <w:proofErr w:type="spellStart"/>
+      <w:r>
+        <w:rPr>
+          <w:color w:val="000000" w:themeColor="text1"/>
+          <w:sz w:val="22"/>
+          <w:szCs w:val="22"/>
+        </w:rPr>
+        <w:t>smth</w:t>
+      </w:r>
+      <w:proofErr w:type="spellEnd"/>
+      <w:r>
+        <w:rPr>
+          <w:color w:val="000000" w:themeColor="text1"/>
+          <w:sz w:val="22"/>
+          <w:szCs w:val="22"/>
+        </w:rPr>
+        <w:t xml:space="preserve"> in arr2 it’s also changed in arr1</w:t>
+      </w:r>
+    </w:p>
+    <w:p>
+      <w:pPr>
+        <w:pStyle w:val="ListParagraph"/>
+        <w:numPr>
+          <w:ilvl w:val="0"/>
+          <w:numId w:val="9"/>
+        </w:numPr>
+        <w:rPr>
+          <w:b/>
+          <w:bCs/>
+          <w:color w:val="000000" w:themeColor="text1"/>
+          <w:u w:val="single"/>
+        </w:rPr>
+      </w:pPr>
+      <w:r>
+        <w:rPr>
+          <w:color w:val="000000" w:themeColor="text1"/>
+          <w:sz w:val="22"/>
+          <w:szCs w:val="22"/>
+        </w:rPr>
+        <w:t xml:space="preserve">Using </w:t>
+      </w:r>
+      <w:proofErr w:type="gramStart"/>
+      <w:r>
+        <w:rPr>
+          <w:color w:val="000000" w:themeColor="text1"/>
+          <w:sz w:val="22"/>
+          <w:szCs w:val="22"/>
+        </w:rPr>
+        <w:t>slice(</w:t>
+      </w:r>
+      <w:proofErr w:type="gramEnd"/>
+      <w:r>
+        <w:rPr>
+          <w:color w:val="000000" w:themeColor="text1"/>
+          <w:sz w:val="22"/>
+          <w:szCs w:val="22"/>
+        </w:rPr>
+        <w:t xml:space="preserve">) we can pass a copy of an array to </w:t>
+      </w:r>
+      <w:proofErr w:type="gramStart"/>
+      <w:r>
+        <w:rPr>
+          <w:color w:val="000000" w:themeColor="text1"/>
+          <w:sz w:val="22"/>
+          <w:szCs w:val="22"/>
+        </w:rPr>
+        <w:t>another,</w:t>
+      </w:r>
+      <w:proofErr w:type="gramEnd"/>
+      <w:r>
+        <w:rPr>
+          <w:color w:val="000000" w:themeColor="text1"/>
+          <w:sz w:val="22"/>
+          <w:szCs w:val="22"/>
+        </w:rPr>
+        <w:t xml:space="preserve"> this keeps the data in the copied one safe from modification</w:t>
+      </w:r>
+    </w:p>
+    <w:p>
+      <w:pPr>
+        <w:pStyle w:val="ListParagraph"/>
+        <w:numPr>
+          <w:ilvl w:val="0"/>
+          <w:numId w:val="9"/>
+        </w:numPr>
+        <w:rPr>
+          <w:color w:val="000000" w:themeColor="text1"/>
+          <w:sz w:val="22"/>
+          <w:szCs w:val="22"/>
+        </w:rPr>
+      </w:pPr>
+      <w:r>
+        <w:rPr>
+          <w:color w:val="000000" w:themeColor="text1"/>
+          <w:sz w:val="22"/>
+          <w:szCs w:val="22"/>
+        </w:rPr>
+        <w:t>Just like</w:t>
+      </w:r>
+      <w:r>
+        <w:rPr>
+          <w:color w:val="000000" w:themeColor="text1"/>
+          <w:sz w:val="22"/>
+          <w:szCs w:val="22"/>
+        </w:rPr>
+        <w:t xml:space="preserve"> objects we can </w:t>
+      </w:r>
+      <w:proofErr w:type="spellStart"/>
+      <w:r>
+        <w:rPr>
+          <w:color w:val="000000" w:themeColor="text1"/>
+          <w:sz w:val="22"/>
+          <w:szCs w:val="22"/>
+        </w:rPr>
+        <w:t>destructure</w:t>
+      </w:r>
+      <w:proofErr w:type="spellEnd"/>
+      <w:r>
+        <w:rPr>
+          <w:color w:val="000000" w:themeColor="text1"/>
+          <w:sz w:val="22"/>
+          <w:szCs w:val="22"/>
+        </w:rPr>
+        <w:t xml:space="preserve"> arrays, </w:t>
+      </w:r>
+      <w:r>
+        <w:rPr>
+          <w:color w:val="000000" w:themeColor="text1"/>
+          <w:sz w:val="22"/>
+          <w:szCs w:val="22"/>
+        </w:rPr>
+        <w:t>const [</w:t>
+      </w:r>
+      <w:proofErr w:type="spellStart"/>
+      <w:r>
+        <w:rPr>
+          <w:color w:val="000000" w:themeColor="text1"/>
+          <w:sz w:val="22"/>
+          <w:szCs w:val="22"/>
+        </w:rPr>
+        <w:t>firstValue</w:t>
+      </w:r>
+      <w:proofErr w:type="spellEnd"/>
+      <w:r>
+        <w:rPr>
+          <w:color w:val="000000" w:themeColor="text1"/>
+          <w:sz w:val="22"/>
+          <w:szCs w:val="22"/>
+        </w:rPr>
+        <w:t xml:space="preserve">, </w:t>
+      </w:r>
+      <w:proofErr w:type="spellStart"/>
+      <w:r>
+        <w:rPr>
+          <w:color w:val="000000" w:themeColor="text1"/>
+          <w:sz w:val="22"/>
+          <w:szCs w:val="22"/>
+        </w:rPr>
+        <w:t>secondValue</w:t>
+      </w:r>
+      <w:proofErr w:type="spellEnd"/>
+      <w:r>
+        <w:rPr>
+          <w:color w:val="000000" w:themeColor="text1"/>
+          <w:sz w:val="22"/>
+          <w:szCs w:val="22"/>
+        </w:rPr>
+        <w:t>] = [1, 2, 3];</w:t>
+      </w:r>
+      <w:r>
+        <w:rPr>
+          <w:color w:val="000000" w:themeColor="text1"/>
+          <w:sz w:val="22"/>
+          <w:szCs w:val="22"/>
+        </w:rPr>
+        <w:t xml:space="preserve"> this takes the first array value and put it into </w:t>
+      </w:r>
+      <w:proofErr w:type="spellStart"/>
+      <w:r>
+        <w:rPr>
+          <w:color w:val="000000" w:themeColor="text1"/>
+          <w:sz w:val="22"/>
+          <w:szCs w:val="22"/>
+        </w:rPr>
+        <w:t>firstValue</w:t>
+      </w:r>
+      <w:proofErr w:type="spellEnd"/>
+      <w:r>
+        <w:rPr>
+          <w:color w:val="000000" w:themeColor="text1"/>
+          <w:sz w:val="22"/>
+          <w:szCs w:val="22"/>
+        </w:rPr>
+        <w:t xml:space="preserve"> and so on </w:t>
+      </w:r>
+    </w:p>
+    <w:p>
+      <w:pPr>
+        <w:rPr>
+          <w:color w:val="000000" w:themeColor="text1"/>
+          <w:sz w:val="22"/>
+          <w:szCs w:val="22"/>
+        </w:rPr>
+      </w:pPr>
+    </w:p>
+    <w:p>
+      <w:pPr>
+        <w:rPr>
+          <w:b/>
+          <w:bCs/>
+          <w:color w:val="000000" w:themeColor="text1"/>
+          <w:u w:val="single"/>
+        </w:rPr>
+      </w:pPr>
+      <w:r>
+        <w:rPr>
+          <w:b/>
+          <w:bCs/>
+          <w:color w:val="000000" w:themeColor="text1"/>
+          <w:u w:val="single"/>
+        </w:rPr>
+        <w:t>Loops</w:t>
+      </w:r>
+      <w:r>
+        <w:rPr>
+          <w:b/>
+          <w:bCs/>
+          <w:color w:val="000000" w:themeColor="text1"/>
+          <w:u w:val="single"/>
+        </w:rPr>
+        <w:t>:</w:t>
+      </w:r>
+    </w:p>
+    <w:p>
+      <w:pPr>
+        <w:pStyle w:val="ListParagraph"/>
+        <w:numPr>
+          <w:ilvl w:val="0"/>
+          <w:numId w:val="10"/>
+        </w:numPr>
+        <w:rPr>
+          <w:b/>
+          <w:bCs/>
+          <w:color w:val="000000" w:themeColor="text1"/>
+          <w:u w:val="single"/>
         </w:rPr>
       </w:pPr>
     </w:p>
@@ -2750,6 +4953,119 @@
     </w:lvl>
   </w:abstractNum>
   <w:abstractNum w:abstractNumId="2" w15:restartNumberingAfterBreak="0">
+    <w:nsid w:val="287602B0"/>
+    <w:multiLevelType w:val="hybridMultilevel"/>
+    <w:tmpl w:val="9FB6BA26"/>
+    <w:lvl w:ilvl="0" w:tplc="04090001">
+      <w:start w:val="1"/>
+      <w:numFmt w:val="bullet"/>
+      <w:lvlText w:val=""/>
+      <w:lvlJc w:val="left"/>
+      <w:pPr>
+        <w:ind w:left="720" w:hanging="360"/>
+      </w:pPr>
+      <w:rPr>
+        <w:rFonts w:ascii="Symbol" w:hAnsi="Symbol" w:hint="default"/>
+      </w:rPr>
+    </w:lvl>
+    <w:lvl w:ilvl="1" w:tplc="04090003" w:tentative="1">
+      <w:start w:val="1"/>
+      <w:numFmt w:val="bullet"/>
+      <w:lvlText w:val="o"/>
+      <w:lvlJc w:val="left"/>
+      <w:pPr>
+        <w:ind w:left="1440" w:hanging="360"/>
+      </w:pPr>
+      <w:rPr>
+        <w:rFonts w:ascii="Courier New" w:hAnsi="Courier New" w:cs="Courier New" w:hint="default"/>
+      </w:rPr>
+    </w:lvl>
+    <w:lvl w:ilvl="2" w:tplc="04090005" w:tentative="1">
+      <w:start w:val="1"/>
+      <w:numFmt w:val="bullet"/>
+      <w:lvlText w:val=""/>
+      <w:lvlJc w:val="left"/>
+      <w:pPr>
+        <w:ind w:left="2160" w:hanging="360"/>
+      </w:pPr>
+      <w:rPr>
+        <w:rFonts w:ascii="Wingdings" w:hAnsi="Wingdings" w:hint="default"/>
+      </w:rPr>
+    </w:lvl>
+    <w:lvl w:ilvl="3" w:tplc="04090001" w:tentative="1">
+      <w:start w:val="1"/>
+      <w:numFmt w:val="bullet"/>
+      <w:lvlText w:val=""/>
+      <w:lvlJc w:val="left"/>
+      <w:pPr>
+        <w:ind w:left="2880" w:hanging="360"/>
+      </w:pPr>
+      <w:rPr>
+        <w:rFonts w:ascii="Symbol" w:hAnsi="Symbol" w:hint="default"/>
+      </w:rPr>
+    </w:lvl>
+    <w:lvl w:ilvl="4" w:tplc="04090003" w:tentative="1">
+      <w:start w:val="1"/>
+      <w:numFmt w:val="bullet"/>
+      <w:lvlText w:val="o"/>
+      <w:lvlJc w:val="left"/>
+      <w:pPr>
+        <w:ind w:left="3600" w:hanging="360"/>
+      </w:pPr>
+      <w:rPr>
+        <w:rFonts w:ascii="Courier New" w:hAnsi="Courier New" w:cs="Courier New" w:hint="default"/>
+      </w:rPr>
+    </w:lvl>
+    <w:lvl w:ilvl="5" w:tplc="04090005" w:tentative="1">
+      <w:start w:val="1"/>
+      <w:numFmt w:val="bullet"/>
+      <w:lvlText w:val=""/>
+      <w:lvlJc w:val="left"/>
+      <w:pPr>
+        <w:ind w:left="4320" w:hanging="360"/>
+      </w:pPr>
+      <w:rPr>
+        <w:rFonts w:ascii="Wingdings" w:hAnsi="Wingdings" w:hint="default"/>
+      </w:rPr>
+    </w:lvl>
+    <w:lvl w:ilvl="6" w:tplc="04090001" w:tentative="1">
+      <w:start w:val="1"/>
+      <w:numFmt w:val="bullet"/>
+      <w:lvlText w:val=""/>
+      <w:lvlJc w:val="left"/>
+      <w:pPr>
+        <w:ind w:left="5040" w:hanging="360"/>
+      </w:pPr>
+      <w:rPr>
+        <w:rFonts w:ascii="Symbol" w:hAnsi="Symbol" w:hint="default"/>
+      </w:rPr>
+    </w:lvl>
+    <w:lvl w:ilvl="7" w:tplc="04090003" w:tentative="1">
+      <w:start w:val="1"/>
+      <w:numFmt w:val="bullet"/>
+      <w:lvlText w:val="o"/>
+      <w:lvlJc w:val="left"/>
+      <w:pPr>
+        <w:ind w:left="5760" w:hanging="360"/>
+      </w:pPr>
+      <w:rPr>
+        <w:rFonts w:ascii="Courier New" w:hAnsi="Courier New" w:cs="Courier New" w:hint="default"/>
+      </w:rPr>
+    </w:lvl>
+    <w:lvl w:ilvl="8" w:tplc="04090005" w:tentative="1">
+      <w:start w:val="1"/>
+      <w:numFmt w:val="bullet"/>
+      <w:lvlText w:val=""/>
+      <w:lvlJc w:val="left"/>
+      <w:pPr>
+        <w:ind w:left="6480" w:hanging="360"/>
+      </w:pPr>
+      <w:rPr>
+        <w:rFonts w:ascii="Wingdings" w:hAnsi="Wingdings" w:hint="default"/>
+      </w:rPr>
+    </w:lvl>
+  </w:abstractNum>
+  <w:abstractNum w:abstractNumId="3" w15:restartNumberingAfterBreak="0">
     <w:nsid w:val="32A63574"/>
     <w:multiLevelType w:val="hybridMultilevel"/>
     <w:tmpl w:val="D3E6D67C"/>
@@ -2862,7 +5178,7 @@
       </w:rPr>
     </w:lvl>
   </w:abstractNum>
-  <w:abstractNum w:abstractNumId="3" w15:restartNumberingAfterBreak="0">
+  <w:abstractNum w:abstractNumId="4" w15:restartNumberingAfterBreak="0">
     <w:nsid w:val="572153BA"/>
     <w:multiLevelType w:val="hybridMultilevel"/>
     <w:tmpl w:val="B4FCCD2A"/>
@@ -2975,7 +5291,7 @@
       </w:rPr>
     </w:lvl>
   </w:abstractNum>
-  <w:abstractNum w:abstractNumId="4" w15:restartNumberingAfterBreak="0">
+  <w:abstractNum w:abstractNumId="5" w15:restartNumberingAfterBreak="0">
     <w:nsid w:val="62C452F9"/>
     <w:multiLevelType w:val="hybridMultilevel"/>
     <w:tmpl w:val="CAA478D8"/>
@@ -3088,7 +5404,7 @@
       </w:rPr>
     </w:lvl>
   </w:abstractNum>
-  <w:abstractNum w:abstractNumId="5" w15:restartNumberingAfterBreak="0">
+  <w:abstractNum w:abstractNumId="6" w15:restartNumberingAfterBreak="0">
     <w:nsid w:val="6BF4448B"/>
     <w:multiLevelType w:val="hybridMultilevel"/>
     <w:tmpl w:val="3A8A2742"/>
@@ -3201,7 +5517,120 @@
       </w:rPr>
     </w:lvl>
   </w:abstractNum>
-  <w:abstractNum w:abstractNumId="6" w15:restartNumberingAfterBreak="0">
+  <w:abstractNum w:abstractNumId="7" w15:restartNumberingAfterBreak="0">
+    <w:nsid w:val="74605A05"/>
+    <w:multiLevelType w:val="hybridMultilevel"/>
+    <w:tmpl w:val="795E6AF6"/>
+    <w:lvl w:ilvl="0" w:tplc="04090001">
+      <w:start w:val="1"/>
+      <w:numFmt w:val="bullet"/>
+      <w:lvlText w:val=""/>
+      <w:lvlJc w:val="left"/>
+      <w:pPr>
+        <w:ind w:left="720" w:hanging="360"/>
+      </w:pPr>
+      <w:rPr>
+        <w:rFonts w:ascii="Symbol" w:hAnsi="Symbol" w:hint="default"/>
+      </w:rPr>
+    </w:lvl>
+    <w:lvl w:ilvl="1" w:tplc="04090003" w:tentative="1">
+      <w:start w:val="1"/>
+      <w:numFmt w:val="bullet"/>
+      <w:lvlText w:val="o"/>
+      <w:lvlJc w:val="left"/>
+      <w:pPr>
+        <w:ind w:left="1440" w:hanging="360"/>
+      </w:pPr>
+      <w:rPr>
+        <w:rFonts w:ascii="Courier New" w:hAnsi="Courier New" w:cs="Courier New" w:hint="default"/>
+      </w:rPr>
+    </w:lvl>
+    <w:lvl w:ilvl="2" w:tplc="04090005" w:tentative="1">
+      <w:start w:val="1"/>
+      <w:numFmt w:val="bullet"/>
+      <w:lvlText w:val=""/>
+      <w:lvlJc w:val="left"/>
+      <w:pPr>
+        <w:ind w:left="2160" w:hanging="360"/>
+      </w:pPr>
+      <w:rPr>
+        <w:rFonts w:ascii="Wingdings" w:hAnsi="Wingdings" w:hint="default"/>
+      </w:rPr>
+    </w:lvl>
+    <w:lvl w:ilvl="3" w:tplc="04090001" w:tentative="1">
+      <w:start w:val="1"/>
+      <w:numFmt w:val="bullet"/>
+      <w:lvlText w:val=""/>
+      <w:lvlJc w:val="left"/>
+      <w:pPr>
+        <w:ind w:left="2880" w:hanging="360"/>
+      </w:pPr>
+      <w:rPr>
+        <w:rFonts w:ascii="Symbol" w:hAnsi="Symbol" w:hint="default"/>
+      </w:rPr>
+    </w:lvl>
+    <w:lvl w:ilvl="4" w:tplc="04090003" w:tentative="1">
+      <w:start w:val="1"/>
+      <w:numFmt w:val="bullet"/>
+      <w:lvlText w:val="o"/>
+      <w:lvlJc w:val="left"/>
+      <w:pPr>
+        <w:ind w:left="3600" w:hanging="360"/>
+      </w:pPr>
+      <w:rPr>
+        <w:rFonts w:ascii="Courier New" w:hAnsi="Courier New" w:cs="Courier New" w:hint="default"/>
+      </w:rPr>
+    </w:lvl>
+    <w:lvl w:ilvl="5" w:tplc="04090005" w:tentative="1">
+      <w:start w:val="1"/>
+      <w:numFmt w:val="bullet"/>
+      <w:lvlText w:val=""/>
+      <w:lvlJc w:val="left"/>
+      <w:pPr>
+        <w:ind w:left="4320" w:hanging="360"/>
+      </w:pPr>
+      <w:rPr>
+        <w:rFonts w:ascii="Wingdings" w:hAnsi="Wingdings" w:hint="default"/>
+      </w:rPr>
+    </w:lvl>
+    <w:lvl w:ilvl="6" w:tplc="04090001" w:tentative="1">
+      <w:start w:val="1"/>
+      <w:numFmt w:val="bullet"/>
+      <w:lvlText w:val=""/>
+      <w:lvlJc w:val="left"/>
+      <w:pPr>
+        <w:ind w:left="5040" w:hanging="360"/>
+      </w:pPr>
+      <w:rPr>
+        <w:rFonts w:ascii="Symbol" w:hAnsi="Symbol" w:hint="default"/>
+      </w:rPr>
+    </w:lvl>
+    <w:lvl w:ilvl="7" w:tplc="04090003" w:tentative="1">
+      <w:start w:val="1"/>
+      <w:numFmt w:val="bullet"/>
+      <w:lvlText w:val="o"/>
+      <w:lvlJc w:val="left"/>
+      <w:pPr>
+        <w:ind w:left="5760" w:hanging="360"/>
+      </w:pPr>
+      <w:rPr>
+        <w:rFonts w:ascii="Courier New" w:hAnsi="Courier New" w:cs="Courier New" w:hint="default"/>
+      </w:rPr>
+    </w:lvl>
+    <w:lvl w:ilvl="8" w:tplc="04090005" w:tentative="1">
+      <w:start w:val="1"/>
+      <w:numFmt w:val="bullet"/>
+      <w:lvlText w:val=""/>
+      <w:lvlJc w:val="left"/>
+      <w:pPr>
+        <w:ind w:left="6480" w:hanging="360"/>
+      </w:pPr>
+      <w:rPr>
+        <w:rFonts w:ascii="Wingdings" w:hAnsi="Wingdings" w:hint="default"/>
+      </w:rPr>
+    </w:lvl>
+  </w:abstractNum>
+  <w:abstractNum w:abstractNumId="8" w15:restartNumberingAfterBreak="0">
     <w:nsid w:val="79CD0E53"/>
     <w:multiLevelType w:val="hybridMultilevel"/>
     <w:tmpl w:val="56742AC4"/>
@@ -3314,7 +5743,7 @@
       </w:rPr>
     </w:lvl>
   </w:abstractNum>
-  <w:abstractNum w:abstractNumId="7" w15:restartNumberingAfterBreak="0">
+  <w:abstractNum w:abstractNumId="9" w15:restartNumberingAfterBreak="0">
     <w:nsid w:val="7F72049C"/>
     <w:multiLevelType w:val="multilevel"/>
     <w:tmpl w:val="1F242F62"/>
@@ -3464,28 +5893,34 @@
     </w:lvl>
   </w:abstractNum>
   <w:num w:numId="1" w16cid:durableId="1595670622">
-    <w:abstractNumId w:val="3"/>
+    <w:abstractNumId w:val="4"/>
   </w:num>
   <w:num w:numId="2" w16cid:durableId="1253974616">
-    <w:abstractNumId w:val="2"/>
+    <w:abstractNumId w:val="3"/>
   </w:num>
   <w:num w:numId="3" w16cid:durableId="1151209963">
     <w:abstractNumId w:val="1"/>
   </w:num>
   <w:num w:numId="4" w16cid:durableId="2085225567">
-    <w:abstractNumId w:val="5"/>
+    <w:abstractNumId w:val="6"/>
   </w:num>
   <w:num w:numId="5" w16cid:durableId="968363398">
     <w:abstractNumId w:val="0"/>
   </w:num>
   <w:num w:numId="6" w16cid:durableId="1448768395">
-    <w:abstractNumId w:val="6"/>
+    <w:abstractNumId w:val="8"/>
   </w:num>
   <w:num w:numId="7" w16cid:durableId="97333426">
-    <w:abstractNumId w:val="7"/>
+    <w:abstractNumId w:val="9"/>
   </w:num>
   <w:num w:numId="8" w16cid:durableId="2078238912">
-    <w:abstractNumId w:val="4"/>
+    <w:abstractNumId w:val="5"/>
+  </w:num>
+  <w:num w:numId="9" w16cid:durableId="1133792355">
+    <w:abstractNumId w:val="2"/>
+  </w:num>
+  <w:num w:numId="10" w16cid:durableId="1949001774">
+    <w:abstractNumId w:val="7"/>
   </w:num>
 </w:numbering>
 </file>

</xml_diff>

<commit_message>
add advanced fucntions explanation
</commit_message>
<xml_diff>
--- a/Javascript/Javascript basic notes.docx
+++ b/Javascript/Javascript basic notes.docx
@@ -44,11 +44,10 @@
           <w:sz w:val="22"/>
           <w:szCs w:val="22"/>
         </w:rPr>
-        <w:t>In this document I will have a javascript bootcamp of 6 days including code before I move on into backend and node.js. this might take longer in case I have to improve my AWS skills more.</w:t>
-      </w:r>
-    </w:p>
-    <w:p>
-      <w:pPr>
+        <w:t xml:space="preserve">In this document I will have a javascript bootcamp of 6 days including code before I move on into backend and node.js. </w:t>
+      </w:r>
+      <w:proofErr w:type="gramStart"/>
+      <w:r>
         <w:rPr>
           <w:i/>
           <w:iCs/>
@@ -56,6 +55,29 @@
           <w:sz w:val="22"/>
           <w:szCs w:val="22"/>
         </w:rPr>
+        <w:t>this</w:t>
+      </w:r>
+      <w:proofErr w:type="gramEnd"/>
+      <w:r>
+        <w:rPr>
+          <w:i/>
+          <w:iCs/>
+          <w:color w:val="000000" w:themeColor="text1"/>
+          <w:sz w:val="22"/>
+          <w:szCs w:val="22"/>
+        </w:rPr>
+        <w:t xml:space="preserve"> might take longer in case I have to improve my AWS skills more.</w:t>
+      </w:r>
+    </w:p>
+    <w:p>
+      <w:pPr>
+        <w:rPr>
+          <w:i/>
+          <w:iCs/>
+          <w:color w:val="000000" w:themeColor="text1"/>
+          <w:sz w:val="22"/>
+          <w:szCs w:val="22"/>
+        </w:rPr>
       </w:pPr>
     </w:p>
     <w:p>
@@ -96,7 +118,25 @@
           <w:sz w:val="22"/>
           <w:szCs w:val="22"/>
         </w:rPr>
-        <w:t>in javascript to avoid any inaccuracies during calculations we shall calcualte in cents then multiply by 100 to the final result.</w:t>
+        <w:t xml:space="preserve">in javascript to avoid any inaccuracies during calculations we shall calcualte in cents then multiply by 100 to </w:t>
+      </w:r>
+      <w:proofErr w:type="gramStart"/>
+      <w:r>
+        <w:rPr>
+          <w:color w:val="000000" w:themeColor="text1"/>
+          <w:sz w:val="22"/>
+          <w:szCs w:val="22"/>
+        </w:rPr>
+        <w:t>the final result</w:t>
+      </w:r>
+      <w:proofErr w:type="gramEnd"/>
+      <w:r>
+        <w:rPr>
+          <w:color w:val="000000" w:themeColor="text1"/>
+          <w:sz w:val="22"/>
+          <w:szCs w:val="22"/>
+        </w:rPr>
+        <w:t>.</w:t>
       </w:r>
     </w:p>
     <w:p>
@@ -112,13 +152,59 @@
           <w:szCs w:val="22"/>
         </w:rPr>
       </w:pPr>
-      <w:r>
-        <w:rPr>
-          <w:color w:val="000000" w:themeColor="text1"/>
-          <w:sz w:val="22"/>
-          <w:szCs w:val="22"/>
-        </w:rPr>
-        <w:t>to round a number we use the function Math.round(number);</w:t>
+      <w:proofErr w:type="gramStart"/>
+      <w:r>
+        <w:rPr>
+          <w:color w:val="000000" w:themeColor="text1"/>
+          <w:sz w:val="22"/>
+          <w:szCs w:val="22"/>
+        </w:rPr>
+        <w:t>to</w:t>
+      </w:r>
+      <w:proofErr w:type="gramEnd"/>
+      <w:r>
+        <w:rPr>
+          <w:color w:val="000000" w:themeColor="text1"/>
+          <w:sz w:val="22"/>
+          <w:szCs w:val="22"/>
+        </w:rPr>
+        <w:t xml:space="preserve"> round a </w:t>
+      </w:r>
+      <w:proofErr w:type="gramStart"/>
+      <w:r>
+        <w:rPr>
+          <w:color w:val="000000" w:themeColor="text1"/>
+          <w:sz w:val="22"/>
+          <w:szCs w:val="22"/>
+        </w:rPr>
+        <w:t>number</w:t>
+      </w:r>
+      <w:proofErr w:type="gramEnd"/>
+      <w:r>
+        <w:rPr>
+          <w:color w:val="000000" w:themeColor="text1"/>
+          <w:sz w:val="22"/>
+          <w:szCs w:val="22"/>
+        </w:rPr>
+        <w:t xml:space="preserve"> we use the </w:t>
+      </w:r>
+      <w:proofErr w:type="gramStart"/>
+      <w:r>
+        <w:rPr>
+          <w:color w:val="000000" w:themeColor="text1"/>
+          <w:sz w:val="22"/>
+          <w:szCs w:val="22"/>
+        </w:rPr>
+        <w:t>function</w:t>
+      </w:r>
+      <w:proofErr w:type="gramEnd"/>
+      <w:r>
+        <w:rPr>
+          <w:color w:val="000000" w:themeColor="text1"/>
+          <w:sz w:val="22"/>
+          <w:szCs w:val="22"/>
+        </w:rPr>
+        <w:t xml:space="preserve"> Math.round(number);</w:t>
       </w:r>
       <w:r>
         <w:rPr>
@@ -142,13 +228,59 @@
           <w:szCs w:val="22"/>
         </w:rPr>
       </w:pPr>
-      <w:r>
-        <w:rPr>
-          <w:color w:val="000000" w:themeColor="text1"/>
-          <w:sz w:val="22"/>
-          <w:szCs w:val="22"/>
-        </w:rPr>
-        <w:t>even when we round a number we should do so in cents, we only convert to normal numbers ones we are ready to display the result.</w:t>
+      <w:proofErr w:type="gramStart"/>
+      <w:r>
+        <w:rPr>
+          <w:color w:val="000000" w:themeColor="text1"/>
+          <w:sz w:val="22"/>
+          <w:szCs w:val="22"/>
+        </w:rPr>
+        <w:t>even</w:t>
+      </w:r>
+      <w:proofErr w:type="gramEnd"/>
+      <w:r>
+        <w:rPr>
+          <w:color w:val="000000" w:themeColor="text1"/>
+          <w:sz w:val="22"/>
+          <w:szCs w:val="22"/>
+        </w:rPr>
+        <w:t xml:space="preserve"> when we round a </w:t>
+      </w:r>
+      <w:proofErr w:type="gramStart"/>
+      <w:r>
+        <w:rPr>
+          <w:color w:val="000000" w:themeColor="text1"/>
+          <w:sz w:val="22"/>
+          <w:szCs w:val="22"/>
+        </w:rPr>
+        <w:t>number</w:t>
+      </w:r>
+      <w:proofErr w:type="gramEnd"/>
+      <w:r>
+        <w:rPr>
+          <w:color w:val="000000" w:themeColor="text1"/>
+          <w:sz w:val="22"/>
+          <w:szCs w:val="22"/>
+        </w:rPr>
+        <w:t xml:space="preserve"> we should do so in cents, we only convert to normal </w:t>
+      </w:r>
+      <w:proofErr w:type="gramStart"/>
+      <w:r>
+        <w:rPr>
+          <w:color w:val="000000" w:themeColor="text1"/>
+          <w:sz w:val="22"/>
+          <w:szCs w:val="22"/>
+        </w:rPr>
+        <w:t>numbers</w:t>
+      </w:r>
+      <w:proofErr w:type="gramEnd"/>
+      <w:r>
+        <w:rPr>
+          <w:color w:val="000000" w:themeColor="text1"/>
+          <w:sz w:val="22"/>
+          <w:szCs w:val="22"/>
+        </w:rPr>
+        <w:t xml:space="preserve"> ones we are ready to display the result.</w:t>
       </w:r>
     </w:p>
     <w:p>
@@ -170,7 +302,25 @@
           <w:sz w:val="22"/>
           <w:szCs w:val="22"/>
         </w:rPr>
-        <w:t>We can check the type of a variable, object, or array using the typeof keyword</w:t>
+        <w:t xml:space="preserve">We can check the type of a variable, object, or array using the </w:t>
+      </w:r>
+      <w:proofErr w:type="gramStart"/>
+      <w:r>
+        <w:rPr>
+          <w:color w:val="000000" w:themeColor="text1"/>
+          <w:sz w:val="22"/>
+          <w:szCs w:val="22"/>
+        </w:rPr>
+        <w:t>typeof</w:t>
+      </w:r>
+      <w:proofErr w:type="gramEnd"/>
+      <w:r>
+        <w:rPr>
+          <w:color w:val="000000" w:themeColor="text1"/>
+          <w:sz w:val="22"/>
+          <w:szCs w:val="22"/>
+        </w:rPr>
+        <w:t xml:space="preserve"> keyword</w:t>
       </w:r>
     </w:p>
     <w:p>
@@ -288,7 +438,25 @@
           <w:sz w:val="22"/>
           <w:szCs w:val="22"/>
         </w:rPr>
-        <w:t>Onclick is an event handler for the event of clicking. It runs javascript code. We can include the javascript code directly on the onclick or we can store it into a function that gets called.</w:t>
+        <w:t xml:space="preserve">Onclick is an event handler for the event of clicking. It runs javascript code. We can include the javascript code directly on the onclick or we can store it </w:t>
+      </w:r>
+      <w:proofErr w:type="gramStart"/>
+      <w:r>
+        <w:rPr>
+          <w:color w:val="000000" w:themeColor="text1"/>
+          <w:sz w:val="22"/>
+          <w:szCs w:val="22"/>
+        </w:rPr>
+        <w:t>into</w:t>
+      </w:r>
+      <w:proofErr w:type="gramEnd"/>
+      <w:r>
+        <w:rPr>
+          <w:color w:val="000000" w:themeColor="text1"/>
+          <w:sz w:val="22"/>
+          <w:szCs w:val="22"/>
+        </w:rPr>
+        <w:t xml:space="preserve"> a function that gets called.</w:t>
       </w:r>
     </w:p>
     <w:p>
@@ -388,13 +556,23 @@
       <w:r>
         <w:t xml:space="preserve"> </w:t>
       </w:r>
-      <w:r>
-        <w:rPr>
-          <w:color w:val="000000" w:themeColor="text1"/>
-          <w:sz w:val="22"/>
-          <w:szCs w:val="22"/>
-        </w:rPr>
-        <w:t>Math.abs()</w:t>
+      <w:proofErr w:type="gramStart"/>
+      <w:r>
+        <w:rPr>
+          <w:color w:val="000000" w:themeColor="text1"/>
+          <w:sz w:val="22"/>
+          <w:szCs w:val="22"/>
+        </w:rPr>
+        <w:t>Math.abs(</w:t>
+      </w:r>
+      <w:proofErr w:type="gramEnd"/>
+      <w:r>
+        <w:rPr>
+          <w:color w:val="000000" w:themeColor="text1"/>
+          <w:sz w:val="22"/>
+          <w:szCs w:val="22"/>
+        </w:rPr>
+        <w:t>)</w:t>
       </w:r>
       <w:r>
         <w:rPr>
@@ -420,13 +598,23 @@
         </w:rPr>
         <w:t xml:space="preserve"> </w:t>
       </w:r>
-      <w:r>
-        <w:rPr>
-          <w:color w:val="000000" w:themeColor="text1"/>
-          <w:sz w:val="22"/>
-          <w:szCs w:val="22"/>
-        </w:rPr>
-        <w:t>Math.pow(),</w:t>
+      <w:proofErr w:type="gramStart"/>
+      <w:r>
+        <w:rPr>
+          <w:color w:val="000000" w:themeColor="text1"/>
+          <w:sz w:val="22"/>
+          <w:szCs w:val="22"/>
+        </w:rPr>
+        <w:t>Math.pow(</w:t>
+      </w:r>
+      <w:proofErr w:type="gramEnd"/>
+      <w:r>
+        <w:rPr>
+          <w:color w:val="000000" w:themeColor="text1"/>
+          <w:sz w:val="22"/>
+          <w:szCs w:val="22"/>
+        </w:rPr>
+        <w:t>),</w:t>
       </w:r>
       <w:r>
         <w:rPr>
@@ -436,13 +624,23 @@
         </w:rPr>
         <w:t xml:space="preserve"> </w:t>
       </w:r>
-      <w:r>
-        <w:rPr>
-          <w:color w:val="000000" w:themeColor="text1"/>
-          <w:sz w:val="22"/>
-          <w:szCs w:val="22"/>
-        </w:rPr>
-        <w:t>Math.max(),</w:t>
+      <w:proofErr w:type="gramStart"/>
+      <w:r>
+        <w:rPr>
+          <w:color w:val="000000" w:themeColor="text1"/>
+          <w:sz w:val="22"/>
+          <w:szCs w:val="22"/>
+        </w:rPr>
+        <w:t>Math.max(</w:t>
+      </w:r>
+      <w:proofErr w:type="gramEnd"/>
+      <w:r>
+        <w:rPr>
+          <w:color w:val="000000" w:themeColor="text1"/>
+          <w:sz w:val="22"/>
+          <w:szCs w:val="22"/>
+        </w:rPr>
+        <w:t>),</w:t>
       </w:r>
       <w:r>
         <w:rPr>
@@ -452,13 +650,23 @@
         </w:rPr>
         <w:t xml:space="preserve"> </w:t>
       </w:r>
-      <w:r>
-        <w:rPr>
-          <w:color w:val="000000" w:themeColor="text1"/>
-          <w:sz w:val="22"/>
-          <w:szCs w:val="22"/>
-        </w:rPr>
-        <w:t>Math.min()</w:t>
+      <w:proofErr w:type="gramStart"/>
+      <w:r>
+        <w:rPr>
+          <w:color w:val="000000" w:themeColor="text1"/>
+          <w:sz w:val="22"/>
+          <w:szCs w:val="22"/>
+        </w:rPr>
+        <w:t>Math.min(</w:t>
+      </w:r>
+      <w:proofErr w:type="gramEnd"/>
+      <w:r>
+        <w:rPr>
+          <w:color w:val="000000" w:themeColor="text1"/>
+          <w:sz w:val="22"/>
+          <w:szCs w:val="22"/>
+        </w:rPr>
+        <w:t>)</w:t>
       </w:r>
     </w:p>
     <w:p>
@@ -502,7 +710,25 @@
           <w:sz w:val="22"/>
           <w:szCs w:val="22"/>
         </w:rPr>
-        <w:t>We have BigInt() datatype, that we can use for huge numerical values and it ends with n so 13423423532523532n is a big integer and can be only operated on with other Bigint variables</w:t>
+        <w:t xml:space="preserve">We have </w:t>
+      </w:r>
+      <w:proofErr w:type="gramStart"/>
+      <w:r>
+        <w:rPr>
+          <w:color w:val="000000" w:themeColor="text1"/>
+          <w:sz w:val="22"/>
+          <w:szCs w:val="22"/>
+        </w:rPr>
+        <w:t>BigInt(</w:t>
+      </w:r>
+      <w:proofErr w:type="gramEnd"/>
+      <w:r>
+        <w:rPr>
+          <w:color w:val="000000" w:themeColor="text1"/>
+          <w:sz w:val="22"/>
+          <w:szCs w:val="22"/>
+        </w:rPr>
+        <w:t>) datatype, that we can use for huge numerical values and it ends with n so 13423423532523532n is a big integer and can be only operated on with other Bigint variables</w:t>
       </w:r>
     </w:p>
     <w:p>
@@ -560,7 +786,25 @@
           <w:sz w:val="22"/>
           <w:szCs w:val="22"/>
         </w:rPr>
-        <w:t>. For example a mathematical operation.</w:t>
+        <w:t xml:space="preserve">. For </w:t>
+      </w:r>
+      <w:proofErr w:type="gramStart"/>
+      <w:r>
+        <w:rPr>
+          <w:color w:val="000000" w:themeColor="text1"/>
+          <w:sz w:val="22"/>
+          <w:szCs w:val="22"/>
+        </w:rPr>
+        <w:t>example</w:t>
+      </w:r>
+      <w:proofErr w:type="gramEnd"/>
+      <w:r>
+        <w:rPr>
+          <w:color w:val="000000" w:themeColor="text1"/>
+          <w:sz w:val="22"/>
+          <w:szCs w:val="22"/>
+        </w:rPr>
+        <w:t xml:space="preserve"> a mathematical operation.</w:t>
       </w:r>
     </w:p>
     <w:p>
@@ -582,7 +826,25 @@
           <w:sz w:val="22"/>
           <w:szCs w:val="22"/>
         </w:rPr>
-        <w:t>String concatenation works the same is in Java.</w:t>
+        <w:t xml:space="preserve">String concatenation works the </w:t>
+      </w:r>
+      <w:proofErr w:type="gramStart"/>
+      <w:r>
+        <w:rPr>
+          <w:color w:val="000000" w:themeColor="text1"/>
+          <w:sz w:val="22"/>
+          <w:szCs w:val="22"/>
+        </w:rPr>
+        <w:t>same is</w:t>
+      </w:r>
+      <w:proofErr w:type="gramEnd"/>
+      <w:r>
+        <w:rPr>
+          <w:color w:val="000000" w:themeColor="text1"/>
+          <w:sz w:val="22"/>
+          <w:szCs w:val="22"/>
+        </w:rPr>
+        <w:t xml:space="preserve"> in Java.</w:t>
       </w:r>
     </w:p>
     <w:p>
@@ -604,7 +866,25 @@
           <w:sz w:val="22"/>
           <w:szCs w:val="22"/>
         </w:rPr>
-        <w:t>We can check the string length by using .length on it.</w:t>
+        <w:t xml:space="preserve">We can check the string length by </w:t>
+      </w:r>
+      <w:proofErr w:type="gramStart"/>
+      <w:r>
+        <w:rPr>
+          <w:color w:val="000000" w:themeColor="text1"/>
+          <w:sz w:val="22"/>
+          <w:szCs w:val="22"/>
+        </w:rPr>
+        <w:t>using .length</w:t>
+      </w:r>
+      <w:proofErr w:type="gramEnd"/>
+      <w:r>
+        <w:rPr>
+          <w:color w:val="000000" w:themeColor="text1"/>
+          <w:sz w:val="22"/>
+          <w:szCs w:val="22"/>
+        </w:rPr>
+        <w:t xml:space="preserve"> on it.</w:t>
       </w:r>
     </w:p>
     <w:p>
@@ -665,13 +945,59 @@
           <w:szCs w:val="22"/>
         </w:rPr>
       </w:pPr>
-      <w:r>
-        <w:rPr>
-          <w:color w:val="000000" w:themeColor="text1"/>
-          <w:sz w:val="22"/>
-          <w:szCs w:val="22"/>
-        </w:rPr>
-        <w:t>toUpper() and toLower() methods work the same as in Java, trim() is extremely useful in node.js</w:t>
+      <w:proofErr w:type="gramStart"/>
+      <w:r>
+        <w:rPr>
+          <w:color w:val="000000" w:themeColor="text1"/>
+          <w:sz w:val="22"/>
+          <w:szCs w:val="22"/>
+        </w:rPr>
+        <w:t>toUpper(</w:t>
+      </w:r>
+      <w:proofErr w:type="gramEnd"/>
+      <w:r>
+        <w:rPr>
+          <w:color w:val="000000" w:themeColor="text1"/>
+          <w:sz w:val="22"/>
+          <w:szCs w:val="22"/>
+        </w:rPr>
+        <w:t xml:space="preserve">) and </w:t>
+      </w:r>
+      <w:proofErr w:type="gramStart"/>
+      <w:r>
+        <w:rPr>
+          <w:color w:val="000000" w:themeColor="text1"/>
+          <w:sz w:val="22"/>
+          <w:szCs w:val="22"/>
+        </w:rPr>
+        <w:t>toLower(</w:t>
+      </w:r>
+      <w:proofErr w:type="gramEnd"/>
+      <w:r>
+        <w:rPr>
+          <w:color w:val="000000" w:themeColor="text1"/>
+          <w:sz w:val="22"/>
+          <w:szCs w:val="22"/>
+        </w:rPr>
+        <w:t xml:space="preserve">) methods work the same as in Java, </w:t>
+      </w:r>
+      <w:proofErr w:type="gramStart"/>
+      <w:r>
+        <w:rPr>
+          <w:color w:val="000000" w:themeColor="text1"/>
+          <w:sz w:val="22"/>
+          <w:szCs w:val="22"/>
+        </w:rPr>
+        <w:t>trim(</w:t>
+      </w:r>
+      <w:proofErr w:type="gramEnd"/>
+      <w:r>
+        <w:rPr>
+          <w:color w:val="000000" w:themeColor="text1"/>
+          <w:sz w:val="22"/>
+          <w:szCs w:val="22"/>
+        </w:rPr>
+        <w:t>) is extremely useful in node.js</w:t>
       </w:r>
     </w:p>
     <w:p>
@@ -687,13 +1013,23 @@
           <w:szCs w:val="22"/>
         </w:rPr>
       </w:pPr>
-      <w:r>
-        <w:rPr>
-          <w:color w:val="000000" w:themeColor="text1"/>
-          <w:sz w:val="22"/>
-          <w:szCs w:val="22"/>
-        </w:rPr>
-        <w:t>slice(startindex, endindex) this lets us extract a certain part of a string.</w:t>
+      <w:proofErr w:type="gramStart"/>
+      <w:r>
+        <w:rPr>
+          <w:color w:val="000000" w:themeColor="text1"/>
+          <w:sz w:val="22"/>
+          <w:szCs w:val="22"/>
+        </w:rPr>
+        <w:t>slice(</w:t>
+      </w:r>
+      <w:proofErr w:type="gramEnd"/>
+      <w:r>
+        <w:rPr>
+          <w:color w:val="000000" w:themeColor="text1"/>
+          <w:sz w:val="22"/>
+          <w:szCs w:val="22"/>
+        </w:rPr>
+        <w:t>startindex, endindex) this lets us extract a certain part of a string.</w:t>
       </w:r>
     </w:p>
     <w:p>
@@ -709,13 +1045,41 @@
           <w:szCs w:val="22"/>
         </w:rPr>
       </w:pPr>
-      <w:r>
-        <w:rPr>
-          <w:color w:val="000000" w:themeColor="text1"/>
-          <w:sz w:val="22"/>
-          <w:szCs w:val="22"/>
-        </w:rPr>
-        <w:t>Split(,) splits the string into an array, that  will be split based on the passed character into a String array</w:t>
+      <w:proofErr w:type="gramStart"/>
+      <w:r>
+        <w:rPr>
+          <w:color w:val="000000" w:themeColor="text1"/>
+          <w:sz w:val="22"/>
+          <w:szCs w:val="22"/>
+        </w:rPr>
+        <w:t>Split(</w:t>
+      </w:r>
+      <w:proofErr w:type="gramEnd"/>
+      <w:r>
+        <w:rPr>
+          <w:color w:val="000000" w:themeColor="text1"/>
+          <w:sz w:val="22"/>
+          <w:szCs w:val="22"/>
+        </w:rPr>
+        <w:t xml:space="preserve">,) splits the string into an array, </w:t>
+      </w:r>
+      <w:proofErr w:type="gramStart"/>
+      <w:r>
+        <w:rPr>
+          <w:color w:val="000000" w:themeColor="text1"/>
+          <w:sz w:val="22"/>
+          <w:szCs w:val="22"/>
+        </w:rPr>
+        <w:t>that  will</w:t>
+      </w:r>
+      <w:proofErr w:type="gramEnd"/>
+      <w:r>
+        <w:rPr>
+          <w:color w:val="000000" w:themeColor="text1"/>
+          <w:sz w:val="22"/>
+          <w:szCs w:val="22"/>
+        </w:rPr>
+        <w:t xml:space="preserve"> be split based on the passed character into a String array</w:t>
       </w:r>
     </w:p>
     <w:p>
@@ -759,7 +1123,25 @@
           <w:sz w:val="22"/>
           <w:szCs w:val="22"/>
         </w:rPr>
-        <w:t xml:space="preserve">Using the backticks the new lines are actually newlines </w:t>
+        <w:t xml:space="preserve">Using the backticks the new lines are </w:t>
+      </w:r>
+      <w:proofErr w:type="gramStart"/>
+      <w:r>
+        <w:rPr>
+          <w:color w:val="000000" w:themeColor="text1"/>
+          <w:sz w:val="22"/>
+          <w:szCs w:val="22"/>
+        </w:rPr>
+        <w:t>actually newlines</w:t>
+      </w:r>
+      <w:proofErr w:type="gramEnd"/>
+      <w:r>
+        <w:rPr>
+          <w:color w:val="000000" w:themeColor="text1"/>
+          <w:sz w:val="22"/>
+          <w:szCs w:val="22"/>
+        </w:rPr>
+        <w:t xml:space="preserve"> </w:t>
       </w:r>
     </w:p>
     <w:p>
@@ -831,7 +1213,43 @@
           <w:sz w:val="22"/>
           <w:szCs w:val="22"/>
         </w:rPr>
-        <w:t xml:space="preserve">== tries to convert the 2 variables into the same data type while === checks them at the </w:t>
+        <w:t xml:space="preserve">== </w:t>
+      </w:r>
+      <w:proofErr w:type="gramStart"/>
+      <w:r>
+        <w:rPr>
+          <w:color w:val="000000" w:themeColor="text1"/>
+          <w:sz w:val="22"/>
+          <w:szCs w:val="22"/>
+        </w:rPr>
+        <w:t>tries</w:t>
+      </w:r>
+      <w:proofErr w:type="gramEnd"/>
+      <w:r>
+        <w:rPr>
+          <w:color w:val="000000" w:themeColor="text1"/>
+          <w:sz w:val="22"/>
+          <w:szCs w:val="22"/>
+        </w:rPr>
+        <w:t xml:space="preserve"> to convert the 2 variables into the same data type while === </w:t>
+      </w:r>
+      <w:proofErr w:type="gramStart"/>
+      <w:r>
+        <w:rPr>
+          <w:color w:val="000000" w:themeColor="text1"/>
+          <w:sz w:val="22"/>
+          <w:szCs w:val="22"/>
+        </w:rPr>
+        <w:t>checks</w:t>
+      </w:r>
+      <w:proofErr w:type="gramEnd"/>
+      <w:r>
+        <w:rPr>
+          <w:color w:val="000000" w:themeColor="text1"/>
+          <w:sz w:val="22"/>
+          <w:szCs w:val="22"/>
+        </w:rPr>
+        <w:t xml:space="preserve"> them at the </w:t>
       </w:r>
     </w:p>
     <w:p>
@@ -871,7 +1289,25 @@
           <w:sz w:val="22"/>
           <w:szCs w:val="22"/>
         </w:rPr>
-        <w:t>In javascript variables hold different data types they are not tied to a certain datatype</w:t>
+        <w:t xml:space="preserve">In </w:t>
+      </w:r>
+      <w:proofErr w:type="gramStart"/>
+      <w:r>
+        <w:rPr>
+          <w:color w:val="000000" w:themeColor="text1"/>
+          <w:sz w:val="22"/>
+          <w:szCs w:val="22"/>
+        </w:rPr>
+        <w:t>javascript</w:t>
+      </w:r>
+      <w:proofErr w:type="gramEnd"/>
+      <w:r>
+        <w:rPr>
+          <w:color w:val="000000" w:themeColor="text1"/>
+          <w:sz w:val="22"/>
+          <w:szCs w:val="22"/>
+        </w:rPr>
+        <w:t xml:space="preserve"> variables hold different data types they are not tied to a certain datatype</w:t>
       </w:r>
     </w:p>
     <w:p>
@@ -925,13 +1361,23 @@
         </w:rPr>
         <w:t xml:space="preserve">; </w:t>
       </w:r>
-      <w:r>
-        <w:rPr>
-          <w:color w:val="000000" w:themeColor="text1"/>
-          <w:sz w:val="22"/>
-          <w:szCs w:val="22"/>
-        </w:rPr>
-        <w:t>so a const variable cant be changed, but a const property inside a class can</w:t>
+      <w:proofErr w:type="gramStart"/>
+      <w:r>
+        <w:rPr>
+          <w:color w:val="000000" w:themeColor="text1"/>
+          <w:sz w:val="22"/>
+          <w:szCs w:val="22"/>
+        </w:rPr>
+        <w:t>so</w:t>
+      </w:r>
+      <w:proofErr w:type="gramEnd"/>
+      <w:r>
+        <w:rPr>
+          <w:color w:val="000000" w:themeColor="text1"/>
+          <w:sz w:val="22"/>
+          <w:szCs w:val="22"/>
+        </w:rPr>
+        <w:t xml:space="preserve"> a const variable cant be changed, but a const property inside a class can</w:t>
       </w:r>
       <w:r>
         <w:rPr>
@@ -1118,7 +1564,43 @@
           <w:sz w:val="22"/>
           <w:szCs w:val="22"/>
         </w:rPr>
-        <w:t>let result = age &gt;= 18 ? "Adult" : "Minor";</w:t>
+        <w:t xml:space="preserve">let result = age &gt;= </w:t>
+      </w:r>
+      <w:proofErr w:type="gramStart"/>
+      <w:r>
+        <w:rPr>
+          <w:color w:val="000000" w:themeColor="text1"/>
+          <w:sz w:val="22"/>
+          <w:szCs w:val="22"/>
+        </w:rPr>
+        <w:t>18 ?</w:t>
+      </w:r>
+      <w:proofErr w:type="gramEnd"/>
+      <w:r>
+        <w:rPr>
+          <w:color w:val="000000" w:themeColor="text1"/>
+          <w:sz w:val="22"/>
+          <w:szCs w:val="22"/>
+        </w:rPr>
+        <w:t xml:space="preserve"> "Adult</w:t>
+      </w:r>
+      <w:proofErr w:type="gramStart"/>
+      <w:r>
+        <w:rPr>
+          <w:color w:val="000000" w:themeColor="text1"/>
+          <w:sz w:val="22"/>
+          <w:szCs w:val="22"/>
+        </w:rPr>
+        <w:t>" :</w:t>
+      </w:r>
+      <w:proofErr w:type="gramEnd"/>
+      <w:r>
+        <w:rPr>
+          <w:color w:val="000000" w:themeColor="text1"/>
+          <w:sz w:val="22"/>
+          <w:szCs w:val="22"/>
+        </w:rPr>
+        <w:t xml:space="preserve"> "Minor";</w:t>
       </w:r>
     </w:p>
     <w:p>
@@ -1186,13 +1668,23 @@
           <w:szCs w:val="22"/>
         </w:rPr>
       </w:pPr>
-      <w:r>
-        <w:rPr>
-          <w:color w:val="000000" w:themeColor="text1"/>
-          <w:sz w:val="22"/>
-          <w:szCs w:val="22"/>
-        </w:rPr>
-        <w:t>isLoggedIn &amp;&amp; console.log("Welcome!");</w:t>
+      <w:proofErr w:type="gramStart"/>
+      <w:r>
+        <w:rPr>
+          <w:color w:val="000000" w:themeColor="text1"/>
+          <w:sz w:val="22"/>
+          <w:szCs w:val="22"/>
+        </w:rPr>
+        <w:t>isLoggedIn &amp;&amp;</w:t>
+      </w:r>
+      <w:proofErr w:type="gramEnd"/>
+      <w:r>
+        <w:rPr>
+          <w:color w:val="000000" w:themeColor="text1"/>
+          <w:sz w:val="22"/>
+          <w:szCs w:val="22"/>
+        </w:rPr>
+        <w:t xml:space="preserve"> console.log("Welcome!");</w:t>
       </w:r>
       <w:r>
         <w:rPr>
@@ -1334,7 +1826,25 @@
           <w:sz w:val="22"/>
           <w:szCs w:val="22"/>
         </w:rPr>
-        <w:t>Just like java we can declare parameters and pass arguments to a function, but without declaring the type of the data we are going to pass</w:t>
+        <w:t xml:space="preserve">Just like java we can declare parameters and pass arguments to a function, but without declaring the type of </w:t>
+      </w:r>
+      <w:proofErr w:type="gramStart"/>
+      <w:r>
+        <w:rPr>
+          <w:color w:val="000000" w:themeColor="text1"/>
+          <w:sz w:val="22"/>
+          <w:szCs w:val="22"/>
+        </w:rPr>
+        <w:t>the data</w:t>
+      </w:r>
+      <w:proofErr w:type="gramEnd"/>
+      <w:r>
+        <w:rPr>
+          <w:color w:val="000000" w:themeColor="text1"/>
+          <w:sz w:val="22"/>
+          <w:szCs w:val="22"/>
+        </w:rPr>
+        <w:t xml:space="preserve"> we are going to pass</w:t>
       </w:r>
     </w:p>
     <w:p>
@@ -1460,13 +1970,41 @@
           <w:szCs w:val="22"/>
         </w:rPr>
       </w:pPr>
-      <w:r>
-        <w:rPr>
-          <w:color w:val="000000" w:themeColor="text1"/>
-          <w:sz w:val="22"/>
-          <w:szCs w:val="22"/>
-        </w:rPr>
-        <w:t>Its important since our Node.js app communicates with other functions, systems using the JSON so we need to handle that JSON as JS Object that we can further develop</w:t>
+      <w:proofErr w:type="gramStart"/>
+      <w:r>
+        <w:rPr>
+          <w:color w:val="000000" w:themeColor="text1"/>
+          <w:sz w:val="22"/>
+          <w:szCs w:val="22"/>
+        </w:rPr>
+        <w:t>Its</w:t>
+      </w:r>
+      <w:proofErr w:type="gramEnd"/>
+      <w:r>
+        <w:rPr>
+          <w:color w:val="000000" w:themeColor="text1"/>
+          <w:sz w:val="22"/>
+          <w:szCs w:val="22"/>
+        </w:rPr>
+        <w:t xml:space="preserve"> important since our Node.js app communicates with other </w:t>
+      </w:r>
+      <w:proofErr w:type="gramStart"/>
+      <w:r>
+        <w:rPr>
+          <w:color w:val="000000" w:themeColor="text1"/>
+          <w:sz w:val="22"/>
+          <w:szCs w:val="22"/>
+        </w:rPr>
+        <w:t>functions,</w:t>
+      </w:r>
+      <w:proofErr w:type="gramEnd"/>
+      <w:r>
+        <w:rPr>
+          <w:color w:val="000000" w:themeColor="text1"/>
+          <w:sz w:val="22"/>
+          <w:szCs w:val="22"/>
+        </w:rPr>
+        <w:t xml:space="preserve"> systems using the JSON so we need to handle that JSON as JS Object that we can further develop</w:t>
       </w:r>
     </w:p>
     <w:p>
@@ -1614,6 +2152,7 @@
           <w:szCs w:val="22"/>
         </w:rPr>
       </w:pPr>
+      <w:proofErr w:type="gramStart"/>
       <w:r>
         <w:rPr>
           <w:color w:val="000000" w:themeColor="text1"/>
@@ -1628,7 +2167,52 @@
           <w:sz w:val="22"/>
           <w:szCs w:val="22"/>
         </w:rPr>
-        <w:t>e need to convert the object int JSON string store it, then fetch it covnert it using parse, then use it again</w:t>
+        <w:t>e</w:t>
+      </w:r>
+      <w:proofErr w:type="gramEnd"/>
+      <w:r>
+        <w:rPr>
+          <w:color w:val="000000" w:themeColor="text1"/>
+          <w:sz w:val="22"/>
+          <w:szCs w:val="22"/>
+        </w:rPr>
+        <w:t xml:space="preserve"> need to convert the object int JSON string </w:t>
+      </w:r>
+      <w:proofErr w:type="gramStart"/>
+      <w:r>
+        <w:rPr>
+          <w:color w:val="000000" w:themeColor="text1"/>
+          <w:sz w:val="22"/>
+          <w:szCs w:val="22"/>
+        </w:rPr>
+        <w:t>store it</w:t>
+      </w:r>
+      <w:proofErr w:type="gramEnd"/>
+      <w:r>
+        <w:rPr>
+          <w:color w:val="000000" w:themeColor="text1"/>
+          <w:sz w:val="22"/>
+          <w:szCs w:val="22"/>
+        </w:rPr>
+        <w:t xml:space="preserve">, then fetch it covnert it </w:t>
+      </w:r>
+      <w:proofErr w:type="gramStart"/>
+      <w:r>
+        <w:rPr>
+          <w:color w:val="000000" w:themeColor="text1"/>
+          <w:sz w:val="22"/>
+          <w:szCs w:val="22"/>
+        </w:rPr>
+        <w:t>using</w:t>
+      </w:r>
+      <w:proofErr w:type="gramEnd"/>
+      <w:r>
+        <w:rPr>
+          <w:color w:val="000000" w:themeColor="text1"/>
+          <w:sz w:val="22"/>
+          <w:szCs w:val="22"/>
+        </w:rPr>
+        <w:t xml:space="preserve"> parse, then use it again</w:t>
       </w:r>
       <w:r>
         <w:rPr>
@@ -1703,15 +2287,33 @@
           <w:sz w:val="22"/>
           <w:szCs w:val="22"/>
         </w:rPr>
-        <w:t>in JS  a</w:t>
-      </w:r>
-      <w:r>
-        <w:rPr>
-          <w:color w:val="000000" w:themeColor="text1"/>
-          <w:sz w:val="22"/>
-          <w:szCs w:val="22"/>
-        </w:rPr>
-        <w:t>n object is a way to group related data together using key-value pairs.</w:t>
+        <w:t xml:space="preserve">in </w:t>
+      </w:r>
+      <w:proofErr w:type="gramStart"/>
+      <w:r>
+        <w:rPr>
+          <w:color w:val="000000" w:themeColor="text1"/>
+          <w:sz w:val="22"/>
+          <w:szCs w:val="22"/>
+        </w:rPr>
+        <w:t>JS  a</w:t>
+      </w:r>
+      <w:r>
+        <w:rPr>
+          <w:color w:val="000000" w:themeColor="text1"/>
+          <w:sz w:val="22"/>
+          <w:szCs w:val="22"/>
+        </w:rPr>
+        <w:t>n</w:t>
+      </w:r>
+      <w:proofErr w:type="gramEnd"/>
+      <w:r>
+        <w:rPr>
+          <w:color w:val="000000" w:themeColor="text1"/>
+          <w:sz w:val="22"/>
+          <w:szCs w:val="22"/>
+        </w:rPr>
+        <w:t xml:space="preserve"> object is a way to group related data together using key-value pairs.</w:t>
       </w:r>
     </w:p>
     <w:p>
@@ -1733,7 +2335,25 @@
           <w:sz w:val="22"/>
           <w:szCs w:val="22"/>
         </w:rPr>
-        <w:t>We can access a property or a value of a certain attribute in the object using the dot notation or a bracket with a string including the attribute name</w:t>
+        <w:t xml:space="preserve">We can access a property or </w:t>
+      </w:r>
+      <w:proofErr w:type="gramStart"/>
+      <w:r>
+        <w:rPr>
+          <w:color w:val="000000" w:themeColor="text1"/>
+          <w:sz w:val="22"/>
+          <w:szCs w:val="22"/>
+        </w:rPr>
+        <w:t>a value</w:t>
+      </w:r>
+      <w:proofErr w:type="gramEnd"/>
+      <w:r>
+        <w:rPr>
+          <w:color w:val="000000" w:themeColor="text1"/>
+          <w:sz w:val="22"/>
+          <w:szCs w:val="22"/>
+        </w:rPr>
+        <w:t xml:space="preserve"> of a certain attribute in the object using the dot notation or a bracket with a string including the attribute name</w:t>
       </w:r>
     </w:p>
     <w:p>
@@ -1755,7 +2375,25 @@
           <w:sz w:val="22"/>
           <w:szCs w:val="22"/>
         </w:rPr>
-        <w:t>We can add a property by easily just writing the object name.newprop = value</w:t>
+        <w:t xml:space="preserve">We can add a property by easily just writing the object </w:t>
+      </w:r>
+      <w:proofErr w:type="gramStart"/>
+      <w:r>
+        <w:rPr>
+          <w:color w:val="000000" w:themeColor="text1"/>
+          <w:sz w:val="22"/>
+          <w:szCs w:val="22"/>
+        </w:rPr>
+        <w:t>name.newprop</w:t>
+      </w:r>
+      <w:proofErr w:type="gramEnd"/>
+      <w:r>
+        <w:rPr>
+          <w:color w:val="000000" w:themeColor="text1"/>
+          <w:sz w:val="22"/>
+          <w:szCs w:val="22"/>
+        </w:rPr>
+        <w:t xml:space="preserve"> = value</w:t>
       </w:r>
     </w:p>
     <w:p>
@@ -1777,7 +2415,25 @@
           <w:sz w:val="22"/>
           <w:szCs w:val="22"/>
         </w:rPr>
-        <w:t>delete user.email;</w:t>
+        <w:t xml:space="preserve">delete </w:t>
+      </w:r>
+      <w:proofErr w:type="gramStart"/>
+      <w:r>
+        <w:rPr>
+          <w:color w:val="000000" w:themeColor="text1"/>
+          <w:sz w:val="22"/>
+          <w:szCs w:val="22"/>
+        </w:rPr>
+        <w:t>user.email</w:t>
+      </w:r>
+      <w:proofErr w:type="gramEnd"/>
+      <w:r>
+        <w:rPr>
+          <w:color w:val="000000" w:themeColor="text1"/>
+          <w:sz w:val="22"/>
+          <w:szCs w:val="22"/>
+        </w:rPr>
+        <w:t>;</w:t>
       </w:r>
       <w:r>
         <w:rPr>
@@ -1807,8 +2463,18 @@
           <w:sz w:val="22"/>
           <w:szCs w:val="22"/>
         </w:rPr>
-        <w:t>Objects can contain:</w:t>
-      </w:r>
+        <w:t xml:space="preserve">Objects can </w:t>
+      </w:r>
+      <w:proofErr w:type="gramStart"/>
+      <w:r>
+        <w:rPr>
+          <w:color w:val="000000" w:themeColor="text1"/>
+          <w:sz w:val="22"/>
+          <w:szCs w:val="22"/>
+        </w:rPr>
+        <w:t>contain:</w:t>
+      </w:r>
+      <w:proofErr w:type="gramEnd"/>
       <w:r>
         <w:rPr>
           <w:color w:val="000000" w:themeColor="text1"/>
@@ -1931,7 +2597,43 @@
           <w:sz w:val="22"/>
           <w:szCs w:val="22"/>
         </w:rPr>
-        <w:t>const user2 = { ...user1 };</w:t>
+        <w:t xml:space="preserve">const user2 = </w:t>
+      </w:r>
+      <w:proofErr w:type="gramStart"/>
+      <w:r>
+        <w:rPr>
+          <w:color w:val="000000" w:themeColor="text1"/>
+          <w:sz w:val="22"/>
+          <w:szCs w:val="22"/>
+        </w:rPr>
+        <w:t>{ ...</w:t>
+      </w:r>
+      <w:proofErr w:type="gramEnd"/>
+      <w:r>
+        <w:rPr>
+          <w:color w:val="000000" w:themeColor="text1"/>
+          <w:sz w:val="22"/>
+          <w:szCs w:val="22"/>
+        </w:rPr>
+        <w:t>user</w:t>
+      </w:r>
+      <w:proofErr w:type="gramStart"/>
+      <w:r>
+        <w:rPr>
+          <w:color w:val="000000" w:themeColor="text1"/>
+          <w:sz w:val="22"/>
+          <w:szCs w:val="22"/>
+        </w:rPr>
+        <w:t>1 }</w:t>
+      </w:r>
+      <w:proofErr w:type="gramEnd"/>
+      <w:r>
+        <w:rPr>
+          <w:color w:val="000000" w:themeColor="text1"/>
+          <w:sz w:val="22"/>
+          <w:szCs w:val="22"/>
+        </w:rPr>
+        <w:t>;</w:t>
       </w:r>
       <w:r>
         <w:rPr>
@@ -1991,7 +2693,43 @@
           <w:sz w:val="22"/>
           <w:szCs w:val="22"/>
         </w:rPr>
-        <w:t>const { name, age, email } = user;</w:t>
+        <w:t xml:space="preserve">const </w:t>
+      </w:r>
+      <w:proofErr w:type="gramStart"/>
+      <w:r>
+        <w:rPr>
+          <w:color w:val="000000" w:themeColor="text1"/>
+          <w:sz w:val="22"/>
+          <w:szCs w:val="22"/>
+        </w:rPr>
+        <w:t>{ name</w:t>
+      </w:r>
+      <w:proofErr w:type="gramEnd"/>
+      <w:r>
+        <w:rPr>
+          <w:color w:val="000000" w:themeColor="text1"/>
+          <w:sz w:val="22"/>
+          <w:szCs w:val="22"/>
+        </w:rPr>
+        <w:t xml:space="preserve">, age, </w:t>
+      </w:r>
+      <w:proofErr w:type="gramStart"/>
+      <w:r>
+        <w:rPr>
+          <w:color w:val="000000" w:themeColor="text1"/>
+          <w:sz w:val="22"/>
+          <w:szCs w:val="22"/>
+        </w:rPr>
+        <w:t>email }</w:t>
+      </w:r>
+      <w:proofErr w:type="gramEnd"/>
+      <w:r>
+        <w:rPr>
+          <w:color w:val="000000" w:themeColor="text1"/>
+          <w:sz w:val="22"/>
+          <w:szCs w:val="22"/>
+        </w:rPr>
+        <w:t xml:space="preserve"> = user;</w:t>
       </w:r>
       <w:r>
         <w:rPr>
@@ -2022,7 +2760,43 @@
           <w:szCs w:val="22"/>
         </w:rPr>
         <w:lastRenderedPageBreak/>
-        <w:t>const { name: userName } = user;</w:t>
+        <w:t xml:space="preserve">const </w:t>
+      </w:r>
+      <w:proofErr w:type="gramStart"/>
+      <w:r>
+        <w:rPr>
+          <w:color w:val="000000" w:themeColor="text1"/>
+          <w:sz w:val="22"/>
+          <w:szCs w:val="22"/>
+        </w:rPr>
+        <w:t>{ name</w:t>
+      </w:r>
+      <w:proofErr w:type="gramEnd"/>
+      <w:r>
+        <w:rPr>
+          <w:color w:val="000000" w:themeColor="text1"/>
+          <w:sz w:val="22"/>
+          <w:szCs w:val="22"/>
+        </w:rPr>
+        <w:t xml:space="preserve">: </w:t>
+      </w:r>
+      <w:proofErr w:type="gramStart"/>
+      <w:r>
+        <w:rPr>
+          <w:color w:val="000000" w:themeColor="text1"/>
+          <w:sz w:val="22"/>
+          <w:szCs w:val="22"/>
+        </w:rPr>
+        <w:t>userName }</w:t>
+      </w:r>
+      <w:proofErr w:type="gramEnd"/>
+      <w:r>
+        <w:rPr>
+          <w:color w:val="000000" w:themeColor="text1"/>
+          <w:sz w:val="22"/>
+          <w:szCs w:val="22"/>
+        </w:rPr>
+        <w:t xml:space="preserve"> = user;</w:t>
       </w:r>
       <w:r>
         <w:rPr>
@@ -2133,7 +2907,25 @@
           <w:sz w:val="22"/>
           <w:szCs w:val="22"/>
         </w:rPr>
-        <w:t>We can use this DOM to interact with our html and modify it, for example document.querySelector(</w:t>
+        <w:t xml:space="preserve">We can use this DOM to interact with our html and modify it, for example </w:t>
+      </w:r>
+      <w:proofErr w:type="gramStart"/>
+      <w:r>
+        <w:rPr>
+          <w:color w:val="000000" w:themeColor="text1"/>
+          <w:sz w:val="22"/>
+          <w:szCs w:val="22"/>
+        </w:rPr>
+        <w:t>document.querySelector</w:t>
+      </w:r>
+      <w:proofErr w:type="gramEnd"/>
+      <w:r>
+        <w:rPr>
+          <w:color w:val="000000" w:themeColor="text1"/>
+          <w:sz w:val="22"/>
+          <w:szCs w:val="22"/>
+        </w:rPr>
+        <w:t>(</w:t>
       </w:r>
       <w:r>
         <w:rPr>
@@ -2203,13 +2995,23 @@
         </w:rPr>
         <w:t xml:space="preserve">Document.title(); allows us to change the title of the current webpage, </w:t>
       </w:r>
-      <w:r>
-        <w:rPr>
-          <w:color w:val="000000" w:themeColor="text1"/>
-          <w:sz w:val="22"/>
-          <w:szCs w:val="22"/>
-        </w:rPr>
-        <w:t>document.title = "My New Website";</w:t>
+      <w:proofErr w:type="gramStart"/>
+      <w:r>
+        <w:rPr>
+          <w:color w:val="000000" w:themeColor="text1"/>
+          <w:sz w:val="22"/>
+          <w:szCs w:val="22"/>
+        </w:rPr>
+        <w:t>document.title</w:t>
+      </w:r>
+      <w:proofErr w:type="gramEnd"/>
+      <w:r>
+        <w:rPr>
+          <w:color w:val="000000" w:themeColor="text1"/>
+          <w:sz w:val="22"/>
+          <w:szCs w:val="22"/>
+        </w:rPr>
+        <w:t xml:space="preserve"> = "My New Website";</w:t>
       </w:r>
     </w:p>
     <w:p>
@@ -2225,37 +3027,93 @@
           <w:szCs w:val="22"/>
         </w:rPr>
       </w:pPr>
-      <w:r>
-        <w:rPr>
-          <w:color w:val="000000" w:themeColor="text1"/>
-          <w:sz w:val="22"/>
-          <w:szCs w:val="22"/>
-        </w:rPr>
-        <w:t>document.body.innerHTML</w:t>
-      </w:r>
-      <w:r>
-        <w:rPr>
-          <w:color w:val="000000" w:themeColor="text1"/>
-          <w:sz w:val="22"/>
-          <w:szCs w:val="22"/>
-        </w:rPr>
-        <w:t>; this represents the body element inside our html page</w:t>
-      </w:r>
-      <w:r>
-        <w:rPr>
-          <w:color w:val="000000" w:themeColor="text1"/>
-          <w:sz w:val="22"/>
-          <w:szCs w:val="22"/>
-        </w:rPr>
-        <w:t xml:space="preserve">, this method can also accept html as a string so for example: </w:t>
-      </w:r>
-      <w:r>
-        <w:rPr>
-          <w:color w:val="000000" w:themeColor="text1"/>
-          <w:sz w:val="22"/>
-          <w:szCs w:val="22"/>
-        </w:rPr>
-        <w:t>document.body.innerHTML = "&lt;h1&gt;Hello!&lt;/h1&gt;";</w:t>
+      <w:proofErr w:type="gramStart"/>
+      <w:r>
+        <w:rPr>
+          <w:color w:val="000000" w:themeColor="text1"/>
+          <w:sz w:val="22"/>
+          <w:szCs w:val="22"/>
+        </w:rPr>
+        <w:t>document.body</w:t>
+      </w:r>
+      <w:proofErr w:type="gramEnd"/>
+      <w:r>
+        <w:rPr>
+          <w:color w:val="000000" w:themeColor="text1"/>
+          <w:sz w:val="22"/>
+          <w:szCs w:val="22"/>
+        </w:rPr>
+        <w:t>.innerHTML</w:t>
+      </w:r>
+      <w:r>
+        <w:rPr>
+          <w:color w:val="000000" w:themeColor="text1"/>
+          <w:sz w:val="22"/>
+          <w:szCs w:val="22"/>
+        </w:rPr>
+        <w:t xml:space="preserve">; this represents the body element inside our html </w:t>
+      </w:r>
+      <w:proofErr w:type="gramStart"/>
+      <w:r>
+        <w:rPr>
+          <w:color w:val="000000" w:themeColor="text1"/>
+          <w:sz w:val="22"/>
+          <w:szCs w:val="22"/>
+        </w:rPr>
+        <w:t>page</w:t>
+      </w:r>
+      <w:r>
+        <w:rPr>
+          <w:color w:val="000000" w:themeColor="text1"/>
+          <w:sz w:val="22"/>
+          <w:szCs w:val="22"/>
+        </w:rPr>
+        <w:t>,</w:t>
+      </w:r>
+      <w:proofErr w:type="gramEnd"/>
+      <w:r>
+        <w:rPr>
+          <w:color w:val="000000" w:themeColor="text1"/>
+          <w:sz w:val="22"/>
+          <w:szCs w:val="22"/>
+        </w:rPr>
+        <w:t xml:space="preserve"> this method can also accept html as a string so for example: </w:t>
+      </w:r>
+      <w:proofErr w:type="gramStart"/>
+      <w:r>
+        <w:rPr>
+          <w:color w:val="000000" w:themeColor="text1"/>
+          <w:sz w:val="22"/>
+          <w:szCs w:val="22"/>
+        </w:rPr>
+        <w:t>document.body</w:t>
+      </w:r>
+      <w:proofErr w:type="gramEnd"/>
+      <w:r>
+        <w:rPr>
+          <w:color w:val="000000" w:themeColor="text1"/>
+          <w:sz w:val="22"/>
+          <w:szCs w:val="22"/>
+        </w:rPr>
+        <w:t>.innerHTML = "&lt;h1&gt;</w:t>
+      </w:r>
+      <w:proofErr w:type="gramStart"/>
+      <w:r>
+        <w:rPr>
+          <w:color w:val="000000" w:themeColor="text1"/>
+          <w:sz w:val="22"/>
+          <w:szCs w:val="22"/>
+        </w:rPr>
+        <w:t>Hello!&lt;</w:t>
+      </w:r>
+      <w:proofErr w:type="gramEnd"/>
+      <w:r>
+        <w:rPr>
+          <w:color w:val="000000" w:themeColor="text1"/>
+          <w:sz w:val="22"/>
+          <w:szCs w:val="22"/>
+        </w:rPr>
+        <w:t>/h1&gt;";</w:t>
       </w:r>
     </w:p>
     <w:p>
@@ -2271,29 +3129,67 @@
           <w:szCs w:val="22"/>
         </w:rPr>
       </w:pPr>
-      <w:r>
-        <w:rPr>
-          <w:color w:val="000000" w:themeColor="text1"/>
-          <w:sz w:val="22"/>
-          <w:szCs w:val="22"/>
-        </w:rPr>
-        <w:t>document.querySelector()</w:t>
-      </w:r>
-      <w:r>
-        <w:rPr>
-          <w:color w:val="000000" w:themeColor="text1"/>
-          <w:sz w:val="22"/>
-          <w:szCs w:val="22"/>
-        </w:rPr>
-        <w:t xml:space="preserve">; allows us to select an html element from the body. We can save it into a constant then change the content inside it. Note that we should call .textContent before changing it; </w:t>
-      </w:r>
-      <w:r>
-        <w:rPr>
-          <w:color w:val="000000" w:themeColor="text1"/>
-          <w:sz w:val="22"/>
-          <w:szCs w:val="22"/>
-        </w:rPr>
-        <w:t>heading.textContent = "Hello JavaScript!";</w:t>
+      <w:proofErr w:type="gramStart"/>
+      <w:r>
+        <w:rPr>
+          <w:color w:val="000000" w:themeColor="text1"/>
+          <w:sz w:val="22"/>
+          <w:szCs w:val="22"/>
+        </w:rPr>
+        <w:t>document.querySelector</w:t>
+      </w:r>
+      <w:proofErr w:type="gramEnd"/>
+      <w:r>
+        <w:rPr>
+          <w:color w:val="000000" w:themeColor="text1"/>
+          <w:sz w:val="22"/>
+          <w:szCs w:val="22"/>
+        </w:rPr>
+        <w:t>()</w:t>
+      </w:r>
+      <w:r>
+        <w:rPr>
+          <w:color w:val="000000" w:themeColor="text1"/>
+          <w:sz w:val="22"/>
+          <w:szCs w:val="22"/>
+        </w:rPr>
+        <w:t xml:space="preserve">; allows us to select an html element from the body. We can save it into a constant then change the content inside it. Note that we should </w:t>
+      </w:r>
+      <w:proofErr w:type="gramStart"/>
+      <w:r>
+        <w:rPr>
+          <w:color w:val="000000" w:themeColor="text1"/>
+          <w:sz w:val="22"/>
+          <w:szCs w:val="22"/>
+        </w:rPr>
+        <w:t>call .textContent</w:t>
+      </w:r>
+      <w:proofErr w:type="gramEnd"/>
+      <w:r>
+        <w:rPr>
+          <w:color w:val="000000" w:themeColor="text1"/>
+          <w:sz w:val="22"/>
+          <w:szCs w:val="22"/>
+        </w:rPr>
+        <w:t xml:space="preserve"> before changing it; </w:t>
+      </w:r>
+      <w:proofErr w:type="gramStart"/>
+      <w:r>
+        <w:rPr>
+          <w:color w:val="000000" w:themeColor="text1"/>
+          <w:sz w:val="22"/>
+          <w:szCs w:val="22"/>
+        </w:rPr>
+        <w:t>heading.textContent</w:t>
+      </w:r>
+      <w:proofErr w:type="gramEnd"/>
+      <w:r>
+        <w:rPr>
+          <w:color w:val="000000" w:themeColor="text1"/>
+          <w:sz w:val="22"/>
+          <w:szCs w:val="22"/>
+        </w:rPr>
+        <w:t xml:space="preserve"> = "Hello JavaScript!";</w:t>
       </w:r>
     </w:p>
     <w:p>
@@ -2309,13 +3205,23 @@
           <w:szCs w:val="22"/>
         </w:rPr>
       </w:pPr>
-      <w:r>
-        <w:rPr>
-          <w:color w:val="000000" w:themeColor="text1"/>
-          <w:sz w:val="22"/>
-          <w:szCs w:val="22"/>
-        </w:rPr>
-        <w:t>it’s a better idea for scalable applications to put a class inside the html element so we can differentiate between them when we select the query</w:t>
+      <w:proofErr w:type="gramStart"/>
+      <w:r>
+        <w:rPr>
+          <w:color w:val="000000" w:themeColor="text1"/>
+          <w:sz w:val="22"/>
+          <w:szCs w:val="22"/>
+        </w:rPr>
+        <w:t>it’s</w:t>
+      </w:r>
+      <w:proofErr w:type="gramEnd"/>
+      <w:r>
+        <w:rPr>
+          <w:color w:val="000000" w:themeColor="text1"/>
+          <w:sz w:val="22"/>
+          <w:szCs w:val="22"/>
+        </w:rPr>
+        <w:t xml:space="preserve"> a better idea for scalable applications to put a class inside the html element so we can differentiate between them when we select the query</w:t>
       </w:r>
     </w:p>
     <w:p>
@@ -2353,14 +3259,52 @@
           <w:szCs w:val="22"/>
         </w:rPr>
       </w:pPr>
-      <w:r>
-        <w:rPr>
-          <w:color w:val="000000" w:themeColor="text1"/>
-          <w:sz w:val="22"/>
-          <w:szCs w:val="22"/>
-        </w:rPr>
-        <w:t>getting a value from the input box, first we declare a class for a certain input, we use this class name with the querySelector(), and store the output into a variable. This variable represents the entire input box. To get the value we store the value into a new variable from the box.value</w:t>
-      </w:r>
+      <w:proofErr w:type="gramStart"/>
+      <w:r>
+        <w:rPr>
+          <w:color w:val="000000" w:themeColor="text1"/>
+          <w:sz w:val="22"/>
+          <w:szCs w:val="22"/>
+        </w:rPr>
+        <w:t>getting</w:t>
+      </w:r>
+      <w:proofErr w:type="gramEnd"/>
+      <w:r>
+        <w:rPr>
+          <w:color w:val="000000" w:themeColor="text1"/>
+          <w:sz w:val="22"/>
+          <w:szCs w:val="22"/>
+        </w:rPr>
+        <w:t xml:space="preserve"> a value from the input box, first we declare a class for a certain input, we use this class name with the </w:t>
+      </w:r>
+      <w:proofErr w:type="gramStart"/>
+      <w:r>
+        <w:rPr>
+          <w:color w:val="000000" w:themeColor="text1"/>
+          <w:sz w:val="22"/>
+          <w:szCs w:val="22"/>
+        </w:rPr>
+        <w:t>querySelector(), and</w:t>
+      </w:r>
+      <w:proofErr w:type="gramEnd"/>
+      <w:r>
+        <w:rPr>
+          <w:color w:val="000000" w:themeColor="text1"/>
+          <w:sz w:val="22"/>
+          <w:szCs w:val="22"/>
+        </w:rPr>
+        <w:t xml:space="preserve"> store the output into a variable. This variable represents the entire input box. To get the value we store the value into a new variable from the box</w:t>
+      </w:r>
+      <w:proofErr w:type="gramStart"/>
+      <w:r>
+        <w:rPr>
+          <w:color w:val="000000" w:themeColor="text1"/>
+          <w:sz w:val="22"/>
+          <w:szCs w:val="22"/>
+        </w:rPr>
+        <w:t>.value</w:t>
+      </w:r>
+      <w:proofErr w:type="gramEnd"/>
     </w:p>
     <w:p>
       <w:pPr>
@@ -2381,7 +3325,43 @@
           <w:sz w:val="22"/>
           <w:szCs w:val="22"/>
         </w:rPr>
-        <w:t>keydown tells us when a key was pressed, it does not tell us which key, however the event object stores data about the event which In this case was a key stroke, using event.key tells us what was actually pressed.</w:t>
+        <w:t xml:space="preserve">keydown tells us when a key was pressed, it does not tell us which key, however the event object stores data about the event which </w:t>
+      </w:r>
+      <w:proofErr w:type="gramStart"/>
+      <w:r>
+        <w:rPr>
+          <w:color w:val="000000" w:themeColor="text1"/>
+          <w:sz w:val="22"/>
+          <w:szCs w:val="22"/>
+        </w:rPr>
+        <w:t>In</w:t>
+      </w:r>
+      <w:proofErr w:type="gramEnd"/>
+      <w:r>
+        <w:rPr>
+          <w:color w:val="000000" w:themeColor="text1"/>
+          <w:sz w:val="22"/>
+          <w:szCs w:val="22"/>
+        </w:rPr>
+        <w:t xml:space="preserve"> this case was a key stroke, using event.key tells us what was </w:t>
+      </w:r>
+      <w:proofErr w:type="gramStart"/>
+      <w:r>
+        <w:rPr>
+          <w:color w:val="000000" w:themeColor="text1"/>
+          <w:sz w:val="22"/>
+          <w:szCs w:val="22"/>
+        </w:rPr>
+        <w:t>actually pressed</w:t>
+      </w:r>
+      <w:proofErr w:type="gramEnd"/>
+      <w:r>
+        <w:rPr>
+          <w:color w:val="000000" w:themeColor="text1"/>
+          <w:sz w:val="22"/>
+          <w:szCs w:val="22"/>
+        </w:rPr>
+        <w:t>.</w:t>
       </w:r>
     </w:p>
     <w:p>
@@ -2397,13 +3377,23 @@
           <w:szCs w:val="22"/>
         </w:rPr>
       </w:pPr>
-      <w:r>
-        <w:rPr>
-          <w:color w:val="000000" w:themeColor="text1"/>
-          <w:sz w:val="22"/>
-          <w:szCs w:val="22"/>
-        </w:rPr>
-        <w:t>classList.add()</w:t>
+      <w:proofErr w:type="gramStart"/>
+      <w:r>
+        <w:rPr>
+          <w:color w:val="000000" w:themeColor="text1"/>
+          <w:sz w:val="22"/>
+          <w:szCs w:val="22"/>
+        </w:rPr>
+        <w:t>classList.add(</w:t>
+      </w:r>
+      <w:proofErr w:type="gramEnd"/>
+      <w:r>
+        <w:rPr>
+          <w:color w:val="000000" w:themeColor="text1"/>
+          <w:sz w:val="22"/>
+          <w:szCs w:val="22"/>
+        </w:rPr>
+        <w:t>)</w:t>
       </w:r>
       <w:r>
         <w:rPr>
@@ -2511,13 +3501,23 @@
           <w:u w:val="single"/>
         </w:rPr>
       </w:pPr>
-      <w:r>
-        <w:rPr>
-          <w:color w:val="000000" w:themeColor="text1"/>
-          <w:sz w:val="22"/>
-          <w:szCs w:val="22"/>
-        </w:rPr>
-        <w:t>Push() adds a new item to the end of the array</w:t>
+      <w:proofErr w:type="gramStart"/>
+      <w:r>
+        <w:rPr>
+          <w:color w:val="000000" w:themeColor="text1"/>
+          <w:sz w:val="22"/>
+          <w:szCs w:val="22"/>
+        </w:rPr>
+        <w:t>Push(</w:t>
+      </w:r>
+      <w:proofErr w:type="gramEnd"/>
+      <w:r>
+        <w:rPr>
+          <w:color w:val="000000" w:themeColor="text1"/>
+          <w:sz w:val="22"/>
+          <w:szCs w:val="22"/>
+        </w:rPr>
+        <w:t>) adds a new item to the end of the array</w:t>
       </w:r>
     </w:p>
     <w:p>
@@ -2534,13 +3534,59 @@
           <w:u w:val="single"/>
         </w:rPr>
       </w:pPr>
-      <w:r>
-        <w:rPr>
-          <w:color w:val="000000" w:themeColor="text1"/>
-          <w:sz w:val="22"/>
-          <w:szCs w:val="22"/>
-        </w:rPr>
-        <w:t xml:space="preserve">.splice(); it can add, remove or replace.  Okay in case we need to remove we will provide 2 variables, the start and how many to remove. In case of addition we would have more than 2 variables, the first is the start and the second is how many to remove which is always at 0 </w:t>
+      <w:proofErr w:type="gramStart"/>
+      <w:r>
+        <w:rPr>
+          <w:color w:val="000000" w:themeColor="text1"/>
+          <w:sz w:val="22"/>
+          <w:szCs w:val="22"/>
+        </w:rPr>
+        <w:t>.splice</w:t>
+      </w:r>
+      <w:proofErr w:type="gramEnd"/>
+      <w:r>
+        <w:rPr>
+          <w:color w:val="000000" w:themeColor="text1"/>
+          <w:sz w:val="22"/>
+          <w:szCs w:val="22"/>
+        </w:rPr>
+        <w:t xml:space="preserve">(); it can add, remove or replace.  </w:t>
+      </w:r>
+      <w:proofErr w:type="gramStart"/>
+      <w:r>
+        <w:rPr>
+          <w:color w:val="000000" w:themeColor="text1"/>
+          <w:sz w:val="22"/>
+          <w:szCs w:val="22"/>
+        </w:rPr>
+        <w:t>Okay</w:t>
+      </w:r>
+      <w:proofErr w:type="gramEnd"/>
+      <w:r>
+        <w:rPr>
+          <w:color w:val="000000" w:themeColor="text1"/>
+          <w:sz w:val="22"/>
+          <w:szCs w:val="22"/>
+        </w:rPr>
+        <w:t xml:space="preserve"> in case we need to remove we will provide 2 variables, the start and how many to remove. In case of </w:t>
+      </w:r>
+      <w:proofErr w:type="gramStart"/>
+      <w:r>
+        <w:rPr>
+          <w:color w:val="000000" w:themeColor="text1"/>
+          <w:sz w:val="22"/>
+          <w:szCs w:val="22"/>
+        </w:rPr>
+        <w:t>addition</w:t>
+      </w:r>
+      <w:proofErr w:type="gramEnd"/>
+      <w:r>
+        <w:rPr>
+          <w:color w:val="000000" w:themeColor="text1"/>
+          <w:sz w:val="22"/>
+          <w:szCs w:val="22"/>
+        </w:rPr>
+        <w:t xml:space="preserve"> we would have more than 2 variables, the first is the start and the second is how many to remove which is always at 0 </w:t>
       </w:r>
       <w:r>
         <w:rPr>
@@ -2618,7 +3664,43 @@
           <w:sz w:val="22"/>
           <w:szCs w:val="22"/>
         </w:rPr>
-        <w:t>Using slice() we can pass a copy of an array to another, this keeps the data in the copied one safe from modification</w:t>
+        <w:t xml:space="preserve">Using </w:t>
+      </w:r>
+      <w:proofErr w:type="gramStart"/>
+      <w:r>
+        <w:rPr>
+          <w:color w:val="000000" w:themeColor="text1"/>
+          <w:sz w:val="22"/>
+          <w:szCs w:val="22"/>
+        </w:rPr>
+        <w:t>slice(</w:t>
+      </w:r>
+      <w:proofErr w:type="gramEnd"/>
+      <w:r>
+        <w:rPr>
+          <w:color w:val="000000" w:themeColor="text1"/>
+          <w:sz w:val="22"/>
+          <w:szCs w:val="22"/>
+        </w:rPr>
+        <w:t xml:space="preserve">) we can pass a copy of an array to </w:t>
+      </w:r>
+      <w:proofErr w:type="gramStart"/>
+      <w:r>
+        <w:rPr>
+          <w:color w:val="000000" w:themeColor="text1"/>
+          <w:sz w:val="22"/>
+          <w:szCs w:val="22"/>
+        </w:rPr>
+        <w:t>another,</w:t>
+      </w:r>
+      <w:proofErr w:type="gramEnd"/>
+      <w:r>
+        <w:rPr>
+          <w:color w:val="000000" w:themeColor="text1"/>
+          <w:sz w:val="22"/>
+          <w:szCs w:val="22"/>
+        </w:rPr>
+        <w:t xml:space="preserve"> this keeps the data in the copied one safe from modification</w:t>
       </w:r>
     </w:p>
     <w:p>
@@ -2723,7 +3805,34 @@
           <w:sz w:val="22"/>
           <w:szCs w:val="22"/>
         </w:rPr>
-        <w:t xml:space="preserve">Syntax of for loops: </w:t>
+        <w:t xml:space="preserve">Syntax of </w:t>
+      </w:r>
+      <w:proofErr w:type="gramStart"/>
+      <w:r>
+        <w:rPr>
+          <w:color w:val="000000" w:themeColor="text1"/>
+          <w:sz w:val="22"/>
+          <w:szCs w:val="22"/>
+        </w:rPr>
+        <w:t>for</w:t>
+      </w:r>
+      <w:proofErr w:type="gramEnd"/>
+      <w:r>
+        <w:rPr>
+          <w:color w:val="000000" w:themeColor="text1"/>
+          <w:sz w:val="22"/>
+          <w:szCs w:val="22"/>
+        </w:rPr>
+        <w:t xml:space="preserve"> loops</w:t>
+      </w:r>
+      <w:proofErr w:type="gramStart"/>
+      <w:r>
+        <w:rPr>
+          <w:color w:val="000000" w:themeColor="text1"/>
+          <w:sz w:val="22"/>
+          <w:szCs w:val="22"/>
+        </w:rPr>
+        <w:t xml:space="preserve">: </w:t>
       </w:r>
       <w:r>
         <w:rPr>
@@ -2739,8 +3848,45 @@
           <w:sz w:val="22"/>
           <w:szCs w:val="22"/>
         </w:rPr>
-        <w:t>for (let i = 0; i &lt; 5; i++) {    console.log(i);}</w:t>
-      </w:r>
+        <w:t>for</w:t>
+      </w:r>
+      <w:proofErr w:type="gramEnd"/>
+      <w:r>
+        <w:rPr>
+          <w:color w:val="000000" w:themeColor="text1"/>
+          <w:sz w:val="22"/>
+          <w:szCs w:val="22"/>
+        </w:rPr>
+        <w:t xml:space="preserve"> (let i = 0; i &lt; 5; i++) </w:t>
+      </w:r>
+      <w:proofErr w:type="gramStart"/>
+      <w:r>
+        <w:rPr>
+          <w:color w:val="000000" w:themeColor="text1"/>
+          <w:sz w:val="22"/>
+          <w:szCs w:val="22"/>
+        </w:rPr>
+        <w:t xml:space="preserve">{  </w:t>
+      </w:r>
+      <w:proofErr w:type="gramEnd"/>
+      <w:r>
+        <w:rPr>
+          <w:color w:val="000000" w:themeColor="text1"/>
+          <w:sz w:val="22"/>
+          <w:szCs w:val="22"/>
+        </w:rPr>
+        <w:t xml:space="preserve">  console.log(i</w:t>
+      </w:r>
+      <w:proofErr w:type="gramStart"/>
+      <w:r>
+        <w:rPr>
+          <w:color w:val="000000" w:themeColor="text1"/>
+          <w:sz w:val="22"/>
+          <w:szCs w:val="22"/>
+        </w:rPr>
+        <w:t>);}</w:t>
+      </w:r>
+      <w:proofErr w:type="gramEnd"/>
     </w:p>
     <w:p>
       <w:pPr>
@@ -2783,7 +3929,16 @@
           <w:sz w:val="22"/>
           <w:szCs w:val="22"/>
         </w:rPr>
-        <w:t xml:space="preserve">We have a for each looping in js the same we have in java and python here is a code example: </w:t>
+        <w:t>We have a for each looping in js the same we have in java and python here is a code example</w:t>
+      </w:r>
+      <w:proofErr w:type="gramStart"/>
+      <w:r>
+        <w:rPr>
+          <w:color w:val="000000" w:themeColor="text1"/>
+          <w:sz w:val="22"/>
+          <w:szCs w:val="22"/>
+        </w:rPr>
+        <w:t xml:space="preserve">: </w:t>
       </w:r>
       <w:r>
         <w:rPr>
@@ -2799,8 +3954,45 @@
           <w:sz w:val="22"/>
           <w:szCs w:val="22"/>
         </w:rPr>
-        <w:t>for (const fruit of fruits) { console.log(fruit);}</w:t>
-      </w:r>
+        <w:t>for</w:t>
+      </w:r>
+      <w:proofErr w:type="gramEnd"/>
+      <w:r>
+        <w:rPr>
+          <w:color w:val="000000" w:themeColor="text1"/>
+          <w:sz w:val="22"/>
+          <w:szCs w:val="22"/>
+        </w:rPr>
+        <w:t xml:space="preserve"> (const fruit of fruits) </w:t>
+      </w:r>
+      <w:proofErr w:type="gramStart"/>
+      <w:r>
+        <w:rPr>
+          <w:color w:val="000000" w:themeColor="text1"/>
+          <w:sz w:val="22"/>
+          <w:szCs w:val="22"/>
+        </w:rPr>
+        <w:t>{ console.log</w:t>
+      </w:r>
+      <w:proofErr w:type="gramEnd"/>
+      <w:r>
+        <w:rPr>
+          <w:color w:val="000000" w:themeColor="text1"/>
+          <w:sz w:val="22"/>
+          <w:szCs w:val="22"/>
+        </w:rPr>
+        <w:t>(fruit</w:t>
+      </w:r>
+      <w:proofErr w:type="gramStart"/>
+      <w:r>
+        <w:rPr>
+          <w:color w:val="000000" w:themeColor="text1"/>
+          <w:sz w:val="22"/>
+          <w:szCs w:val="22"/>
+        </w:rPr>
+        <w:t>);}</w:t>
+      </w:r>
+      <w:proofErr w:type="gramEnd"/>
     </w:p>
     <w:p>
       <w:pPr>
@@ -2815,13 +4007,23 @@
           <w:szCs w:val="22"/>
         </w:rPr>
       </w:pPr>
-      <w:r>
-        <w:rPr>
-          <w:color w:val="000000" w:themeColor="text1"/>
-          <w:sz w:val="22"/>
-          <w:szCs w:val="22"/>
-        </w:rPr>
-        <w:t>find() → find the first matching element</w:t>
+      <w:proofErr w:type="gramStart"/>
+      <w:r>
+        <w:rPr>
+          <w:color w:val="000000" w:themeColor="text1"/>
+          <w:sz w:val="22"/>
+          <w:szCs w:val="22"/>
+        </w:rPr>
+        <w:t>find(</w:t>
+      </w:r>
+      <w:proofErr w:type="gramEnd"/>
+      <w:r>
+        <w:rPr>
+          <w:color w:val="000000" w:themeColor="text1"/>
+          <w:sz w:val="22"/>
+          <w:szCs w:val="22"/>
+        </w:rPr>
+        <w:t>) → find the first matching element</w:t>
       </w:r>
     </w:p>
     <w:p>
@@ -2935,7 +4137,43 @@
           <w:sz w:val="22"/>
           <w:szCs w:val="22"/>
         </w:rPr>
-        <w:t>Breaks stops the loop, continue skips the current iteration</w:t>
+        <w:t xml:space="preserve">Breaks </w:t>
+      </w:r>
+      <w:proofErr w:type="gramStart"/>
+      <w:r>
+        <w:rPr>
+          <w:color w:val="000000" w:themeColor="text1"/>
+          <w:sz w:val="22"/>
+          <w:szCs w:val="22"/>
+        </w:rPr>
+        <w:t>stops</w:t>
+      </w:r>
+      <w:proofErr w:type="gramEnd"/>
+      <w:r>
+        <w:rPr>
+          <w:color w:val="000000" w:themeColor="text1"/>
+          <w:sz w:val="22"/>
+          <w:szCs w:val="22"/>
+        </w:rPr>
+        <w:t xml:space="preserve"> the loop, continue </w:t>
+      </w:r>
+      <w:proofErr w:type="gramStart"/>
+      <w:r>
+        <w:rPr>
+          <w:color w:val="000000" w:themeColor="text1"/>
+          <w:sz w:val="22"/>
+          <w:szCs w:val="22"/>
+        </w:rPr>
+        <w:t>skips</w:t>
+      </w:r>
+      <w:proofErr w:type="gramEnd"/>
+      <w:r>
+        <w:rPr>
+          <w:color w:val="000000" w:themeColor="text1"/>
+          <w:sz w:val="22"/>
+          <w:szCs w:val="22"/>
+        </w:rPr>
+        <w:t xml:space="preserve"> the current iteration</w:t>
       </w:r>
     </w:p>
     <w:p>
@@ -2981,13 +4219,23 @@
           <w:szCs w:val="22"/>
         </w:rPr>
       </w:pPr>
-      <w:r>
-        <w:rPr>
-          <w:color w:val="000000" w:themeColor="text1"/>
-          <w:sz w:val="22"/>
-          <w:szCs w:val="22"/>
-        </w:rPr>
-        <w:t>.map() is an array method that lets you go through every item in an array and create a new array based on those items.</w:t>
+      <w:proofErr w:type="gramStart"/>
+      <w:r>
+        <w:rPr>
+          <w:color w:val="000000" w:themeColor="text1"/>
+          <w:sz w:val="22"/>
+          <w:szCs w:val="22"/>
+        </w:rPr>
+        <w:t>.map</w:t>
+      </w:r>
+      <w:proofErr w:type="gramEnd"/>
+      <w:r>
+        <w:rPr>
+          <w:color w:val="000000" w:themeColor="text1"/>
+          <w:sz w:val="22"/>
+          <w:szCs w:val="22"/>
+        </w:rPr>
+        <w:t>() is an array method that lets you go through every item in an array and create a new array based on those items.</w:t>
       </w:r>
       <w:r>
         <w:rPr>
@@ -3011,13 +4259,23 @@
           <w:szCs w:val="22"/>
         </w:rPr>
       </w:pPr>
-      <w:r>
-        <w:rPr>
-          <w:color w:val="000000" w:themeColor="text1"/>
-          <w:sz w:val="22"/>
-          <w:szCs w:val="22"/>
-        </w:rPr>
-        <w:t>.map() most general use it to take an array, manipulate its data and save this manipulated data into a new array</w:t>
+      <w:proofErr w:type="gramStart"/>
+      <w:r>
+        <w:rPr>
+          <w:color w:val="000000" w:themeColor="text1"/>
+          <w:sz w:val="22"/>
+          <w:szCs w:val="22"/>
+        </w:rPr>
+        <w:t>.map</w:t>
+      </w:r>
+      <w:proofErr w:type="gramEnd"/>
+      <w:r>
+        <w:rPr>
+          <w:color w:val="000000" w:themeColor="text1"/>
+          <w:sz w:val="22"/>
+          <w:szCs w:val="22"/>
+        </w:rPr>
+        <w:t>() most general use it to take an array, manipulate its data and save this manipulated data into a new array</w:t>
       </w:r>
     </w:p>
     <w:p>
@@ -3033,24 +4291,941 @@
           <w:szCs w:val="22"/>
         </w:rPr>
       </w:pPr>
-      <w:r>
-        <w:rPr>
-          <w:color w:val="000000" w:themeColor="text1"/>
-          <w:sz w:val="22"/>
-          <w:szCs w:val="22"/>
-        </w:rPr>
-        <w:t>.filter() is basically a .map() that has a filter to decide what data stays in the new array and what not, it does not manipulate the data unlike .map()</w:t>
-      </w:r>
-    </w:p>
-    <w:p>
-      <w:pPr>
-        <w:pStyle w:val="ListParagraph"/>
-        <w:rPr>
-          <w:color w:val="000000" w:themeColor="text1"/>
-          <w:sz w:val="22"/>
-          <w:szCs w:val="22"/>
-        </w:rPr>
-      </w:pPr>
+      <w:proofErr w:type="gramStart"/>
+      <w:r>
+        <w:rPr>
+          <w:color w:val="000000" w:themeColor="text1"/>
+          <w:sz w:val="22"/>
+          <w:szCs w:val="22"/>
+        </w:rPr>
+        <w:t>.filter</w:t>
+      </w:r>
+      <w:proofErr w:type="gramEnd"/>
+      <w:r>
+        <w:rPr>
+          <w:color w:val="000000" w:themeColor="text1"/>
+          <w:sz w:val="22"/>
+          <w:szCs w:val="22"/>
+        </w:rPr>
+        <w:t xml:space="preserve">() is basically </w:t>
+      </w:r>
+      <w:proofErr w:type="gramStart"/>
+      <w:r>
+        <w:rPr>
+          <w:color w:val="000000" w:themeColor="text1"/>
+          <w:sz w:val="22"/>
+          <w:szCs w:val="22"/>
+        </w:rPr>
+        <w:t>a .map</w:t>
+      </w:r>
+      <w:proofErr w:type="gramEnd"/>
+      <w:r>
+        <w:rPr>
+          <w:color w:val="000000" w:themeColor="text1"/>
+          <w:sz w:val="22"/>
+          <w:szCs w:val="22"/>
+        </w:rPr>
+        <w:t xml:space="preserve">() that has a filter to decide what data stays in the new array and what not, it does not manipulate the data </w:t>
+      </w:r>
+      <w:proofErr w:type="gramStart"/>
+      <w:r>
+        <w:rPr>
+          <w:color w:val="000000" w:themeColor="text1"/>
+          <w:sz w:val="22"/>
+          <w:szCs w:val="22"/>
+        </w:rPr>
+        <w:t>unlike .map</w:t>
+      </w:r>
+      <w:proofErr w:type="gramEnd"/>
+      <w:r>
+        <w:rPr>
+          <w:color w:val="000000" w:themeColor="text1"/>
+          <w:sz w:val="22"/>
+          <w:szCs w:val="22"/>
+        </w:rPr>
+        <w:t>()</w:t>
+      </w:r>
+    </w:p>
+    <w:p>
+      <w:pPr>
+        <w:rPr>
+          <w:color w:val="000000" w:themeColor="text1"/>
+          <w:sz w:val="22"/>
+          <w:szCs w:val="22"/>
+        </w:rPr>
+      </w:pPr>
+    </w:p>
+    <w:p>
+      <w:pPr>
+        <w:rPr>
+          <w:b/>
+          <w:bCs/>
+          <w:color w:val="000000" w:themeColor="text1"/>
+          <w:u w:val="single"/>
+        </w:rPr>
+      </w:pPr>
+      <w:r>
+        <w:rPr>
+          <w:b/>
+          <w:bCs/>
+          <w:color w:val="000000" w:themeColor="text1"/>
+          <w:u w:val="single"/>
+        </w:rPr>
+        <w:t>Advanced Functions:</w:t>
+      </w:r>
+    </w:p>
+    <w:p>
+      <w:pPr>
+        <w:pStyle w:val="ListParagraph"/>
+        <w:numPr>
+          <w:ilvl w:val="0"/>
+          <w:numId w:val="11"/>
+        </w:numPr>
+        <w:rPr>
+          <w:color w:val="000000" w:themeColor="text1"/>
+          <w:sz w:val="22"/>
+          <w:szCs w:val="22"/>
+        </w:rPr>
+      </w:pPr>
+      <w:r>
+        <w:rPr>
+          <w:color w:val="000000" w:themeColor="text1"/>
+          <w:sz w:val="22"/>
+          <w:szCs w:val="22"/>
+        </w:rPr>
+        <w:t>we can save a function into a variable</w:t>
+      </w:r>
+    </w:p>
+    <w:p>
+      <w:pPr>
+        <w:pStyle w:val="ListParagraph"/>
+        <w:numPr>
+          <w:ilvl w:val="0"/>
+          <w:numId w:val="11"/>
+        </w:numPr>
+        <w:rPr>
+          <w:color w:val="000000" w:themeColor="text1"/>
+          <w:sz w:val="22"/>
+          <w:szCs w:val="22"/>
+        </w:rPr>
+      </w:pPr>
+      <w:proofErr w:type="gramStart"/>
+      <w:r>
+        <w:rPr>
+          <w:color w:val="000000" w:themeColor="text1"/>
+          <w:sz w:val="22"/>
+          <w:szCs w:val="22"/>
+        </w:rPr>
+        <w:t>an</w:t>
+      </w:r>
+      <w:proofErr w:type="gramEnd"/>
+      <w:r>
+        <w:rPr>
+          <w:color w:val="000000" w:themeColor="text1"/>
+          <w:sz w:val="22"/>
+          <w:szCs w:val="22"/>
+        </w:rPr>
+        <w:t xml:space="preserve"> anonymous function is a function that has no name, we usually do this when we pass a function into another function, or if we need the function temporarily.</w:t>
+      </w:r>
+    </w:p>
+    <w:p>
+      <w:pPr>
+        <w:pStyle w:val="ListParagraph"/>
+        <w:numPr>
+          <w:ilvl w:val="0"/>
+          <w:numId w:val="11"/>
+        </w:numPr>
+        <w:rPr>
+          <w:color w:val="000000" w:themeColor="text1"/>
+          <w:sz w:val="22"/>
+          <w:szCs w:val="22"/>
+        </w:rPr>
+      </w:pPr>
+      <w:r>
+        <w:rPr>
+          <w:color w:val="000000" w:themeColor="text1"/>
+          <w:sz w:val="22"/>
+          <w:szCs w:val="22"/>
+        </w:rPr>
+        <w:t xml:space="preserve">Hoisting means that JS allows us to use a function before declaring it. </w:t>
+      </w:r>
+      <w:r>
+        <w:rPr>
+          <w:color w:val="000000" w:themeColor="text1"/>
+          <w:sz w:val="22"/>
+          <w:szCs w:val="22"/>
+        </w:rPr>
+        <w:t xml:space="preserve"> It does not provide an extra feature or </w:t>
+      </w:r>
+      <w:proofErr w:type="gramStart"/>
+      <w:r>
+        <w:rPr>
+          <w:color w:val="000000" w:themeColor="text1"/>
+          <w:sz w:val="22"/>
+          <w:szCs w:val="22"/>
+        </w:rPr>
+        <w:t>functionality</w:t>
+      </w:r>
+      <w:proofErr w:type="gramEnd"/>
+      <w:r>
+        <w:rPr>
+          <w:color w:val="000000" w:themeColor="text1"/>
+          <w:sz w:val="22"/>
+          <w:szCs w:val="22"/>
+        </w:rPr>
+        <w:t xml:space="preserve"> </w:t>
+      </w:r>
+      <w:proofErr w:type="gramStart"/>
+      <w:r>
+        <w:rPr>
+          <w:color w:val="000000" w:themeColor="text1"/>
+          <w:sz w:val="22"/>
+          <w:szCs w:val="22"/>
+        </w:rPr>
+        <w:t>its</w:t>
+      </w:r>
+      <w:proofErr w:type="gramEnd"/>
+      <w:r>
+        <w:rPr>
+          <w:color w:val="000000" w:themeColor="text1"/>
+          <w:sz w:val="22"/>
+          <w:szCs w:val="22"/>
+        </w:rPr>
+        <w:t xml:space="preserve"> just used to provide readability and better structure</w:t>
+      </w:r>
+    </w:p>
+    <w:p>
+      <w:pPr>
+        <w:pStyle w:val="ListParagraph"/>
+        <w:numPr>
+          <w:ilvl w:val="0"/>
+          <w:numId w:val="11"/>
+        </w:numPr>
+        <w:rPr>
+          <w:color w:val="000000" w:themeColor="text1"/>
+          <w:sz w:val="22"/>
+          <w:szCs w:val="22"/>
+        </w:rPr>
+      </w:pPr>
+      <w:r>
+        <w:rPr>
+          <w:color w:val="000000" w:themeColor="text1"/>
+          <w:sz w:val="22"/>
+          <w:szCs w:val="22"/>
+        </w:rPr>
+        <w:t>Inside an object we can store a function under a key name or a property</w:t>
+      </w:r>
+    </w:p>
+    <w:p>
+      <w:pPr>
+        <w:pStyle w:val="ListParagraph"/>
+        <w:numPr>
+          <w:ilvl w:val="0"/>
+          <w:numId w:val="11"/>
+        </w:numPr>
+        <w:rPr>
+          <w:color w:val="000000" w:themeColor="text1"/>
+          <w:sz w:val="22"/>
+          <w:szCs w:val="22"/>
+        </w:rPr>
+      </w:pPr>
+      <w:r>
+        <w:rPr>
+          <w:color w:val="000000" w:themeColor="text1"/>
+          <w:sz w:val="22"/>
+          <w:szCs w:val="22"/>
+        </w:rPr>
+        <w:lastRenderedPageBreak/>
+        <w:t>Why put functions inside objects?</w:t>
+      </w:r>
+      <w:r>
+        <w:rPr>
+          <w:color w:val="000000" w:themeColor="text1"/>
+          <w:sz w:val="22"/>
+          <w:szCs w:val="22"/>
+        </w:rPr>
+        <w:t xml:space="preserve"> </w:t>
+      </w:r>
+      <w:r>
+        <w:rPr>
+          <w:color w:val="000000" w:themeColor="text1"/>
+          <w:sz w:val="22"/>
+          <w:szCs w:val="22"/>
+        </w:rPr>
+        <w:t>Because sometimes you want to group data and the actions related to that data together.</w:t>
+      </w:r>
+    </w:p>
+    <w:p>
+      <w:pPr>
+        <w:pStyle w:val="ListParagraph"/>
+        <w:numPr>
+          <w:ilvl w:val="0"/>
+          <w:numId w:val="11"/>
+        </w:numPr>
+        <w:rPr>
+          <w:color w:val="000000" w:themeColor="text1"/>
+          <w:sz w:val="22"/>
+          <w:szCs w:val="22"/>
+        </w:rPr>
+      </w:pPr>
+      <w:r>
+        <w:rPr>
+          <w:color w:val="000000" w:themeColor="text1"/>
+          <w:sz w:val="22"/>
+          <w:szCs w:val="22"/>
+        </w:rPr>
+        <w:t>When a function belongs to an object, we commonly call it a method.</w:t>
+      </w:r>
+    </w:p>
+    <w:p>
+      <w:pPr>
+        <w:pStyle w:val="ListParagraph"/>
+        <w:numPr>
+          <w:ilvl w:val="0"/>
+          <w:numId w:val="11"/>
+        </w:numPr>
+        <w:rPr>
+          <w:color w:val="000000" w:themeColor="text1"/>
+          <w:sz w:val="22"/>
+          <w:szCs w:val="22"/>
+        </w:rPr>
+      </w:pPr>
+      <w:r>
+        <w:rPr>
+          <w:color w:val="000000" w:themeColor="text1"/>
+          <w:sz w:val="22"/>
+          <w:szCs w:val="22"/>
+        </w:rPr>
+        <w:t>In backend we can go and create a constant called user, this constant stores data and functions related to user, for example a Boolean function that checks and stores if a user is an admin. The name of the user and so on.</w:t>
+      </w:r>
+    </w:p>
+    <w:p>
+      <w:pPr>
+        <w:pStyle w:val="ListParagraph"/>
+        <w:numPr>
+          <w:ilvl w:val="0"/>
+          <w:numId w:val="11"/>
+        </w:numPr>
+        <w:rPr>
+          <w:color w:val="000000" w:themeColor="text1"/>
+          <w:sz w:val="22"/>
+          <w:szCs w:val="22"/>
+        </w:rPr>
+      </w:pPr>
+      <w:r>
+        <w:rPr>
+          <w:color w:val="000000" w:themeColor="text1"/>
+          <w:sz w:val="22"/>
+          <w:szCs w:val="22"/>
+        </w:rPr>
+        <w:t xml:space="preserve">We can declare a method that takes a variable and later processes it as a function, this is called passing a function into a function. Since functions are also values in JS </w:t>
+      </w:r>
+    </w:p>
+    <w:p>
+      <w:pPr>
+        <w:pStyle w:val="pdq2pgselectionanchorcontainer"/>
+        <w:numPr>
+          <w:ilvl w:val="0"/>
+          <w:numId w:val="11"/>
+        </w:numPr>
+        <w:rPr>
+          <w:rFonts w:asciiTheme="minorHAnsi" w:eastAsiaTheme="minorHAnsi" w:hAnsiTheme="minorHAnsi" w:cstheme="minorBidi"/>
+          <w:color w:val="000000" w:themeColor="text1"/>
+          <w:kern w:val="2"/>
+          <w:sz w:val="22"/>
+          <w:szCs w:val="22"/>
+          <w14:ligatures w14:val="standardContextual"/>
+        </w:rPr>
+      </w:pPr>
+      <w:r>
+        <w:rPr>
+          <w:rFonts w:asciiTheme="minorHAnsi" w:eastAsiaTheme="minorHAnsi" w:hAnsiTheme="minorHAnsi" w:cstheme="minorBidi"/>
+          <w:color w:val="000000" w:themeColor="text1"/>
+          <w:kern w:val="2"/>
+          <w:sz w:val="22"/>
+          <w:szCs w:val="22"/>
+          <w14:ligatures w14:val="standardContextual"/>
+        </w:rPr>
+        <w:t>Parameter = the variable waiting to receive something.</w:t>
+      </w:r>
+      <w:r>
+        <w:rPr>
+          <w:rFonts w:asciiTheme="minorHAnsi" w:eastAsiaTheme="minorHAnsi" w:hAnsiTheme="minorHAnsi" w:cstheme="minorBidi"/>
+          <w:color w:val="000000" w:themeColor="text1"/>
+          <w:kern w:val="2"/>
+          <w:sz w:val="22"/>
+          <w:szCs w:val="22"/>
+          <w14:ligatures w14:val="standardContextual"/>
+        </w:rPr>
+        <w:t xml:space="preserve"> </w:t>
+      </w:r>
+      <w:r>
+        <w:rPr>
+          <w:rFonts w:asciiTheme="minorHAnsi" w:eastAsiaTheme="minorHAnsi" w:hAnsiTheme="minorHAnsi" w:cstheme="minorBidi"/>
+          <w:color w:val="000000" w:themeColor="text1"/>
+          <w:kern w:val="2"/>
+          <w:sz w:val="22"/>
+          <w:szCs w:val="22"/>
+          <w14:ligatures w14:val="standardContextual"/>
+        </w:rPr>
+        <w:t xml:space="preserve">Argument = the actual value you pass </w:t>
+      </w:r>
+      <w:proofErr w:type="gramStart"/>
+      <w:r>
+        <w:rPr>
+          <w:rFonts w:asciiTheme="minorHAnsi" w:eastAsiaTheme="minorHAnsi" w:hAnsiTheme="minorHAnsi" w:cstheme="minorBidi"/>
+          <w:color w:val="000000" w:themeColor="text1"/>
+          <w:kern w:val="2"/>
+          <w:sz w:val="22"/>
+          <w:szCs w:val="22"/>
+          <w14:ligatures w14:val="standardContextual"/>
+        </w:rPr>
+        <w:t>in</w:t>
+      </w:r>
+      <w:proofErr w:type="gramEnd"/>
+      <w:r>
+        <w:rPr>
+          <w:rFonts w:asciiTheme="minorHAnsi" w:eastAsiaTheme="minorHAnsi" w:hAnsiTheme="minorHAnsi" w:cstheme="minorBidi"/>
+          <w:color w:val="000000" w:themeColor="text1"/>
+          <w:kern w:val="2"/>
+          <w:sz w:val="22"/>
+          <w:szCs w:val="22"/>
+          <w14:ligatures w14:val="standardContextual"/>
+        </w:rPr>
+        <w:t>.</w:t>
+      </w:r>
+    </w:p>
+    <w:p>
+      <w:pPr>
+        <w:pStyle w:val="ListParagraph"/>
+        <w:numPr>
+          <w:ilvl w:val="0"/>
+          <w:numId w:val="11"/>
+        </w:numPr>
+        <w:rPr>
+          <w:color w:val="000000" w:themeColor="text1"/>
+          <w:sz w:val="22"/>
+          <w:szCs w:val="22"/>
+        </w:rPr>
+      </w:pPr>
+      <w:proofErr w:type="gramStart"/>
+      <w:r>
+        <w:rPr>
+          <w:color w:val="000000" w:themeColor="text1"/>
+          <w:sz w:val="22"/>
+          <w:szCs w:val="22"/>
+        </w:rPr>
+        <w:t>Set time</w:t>
+      </w:r>
+      <w:proofErr w:type="gramEnd"/>
+      <w:r>
+        <w:rPr>
+          <w:color w:val="000000" w:themeColor="text1"/>
+          <w:sz w:val="22"/>
+          <w:szCs w:val="22"/>
+        </w:rPr>
+        <w:t xml:space="preserve"> out function allows asynchronous programming. We set a timer for a function and then we have a call back for it, we </w:t>
+      </w:r>
+      <w:proofErr w:type="gramStart"/>
+      <w:r>
+        <w:rPr>
+          <w:color w:val="000000" w:themeColor="text1"/>
+          <w:sz w:val="22"/>
+          <w:szCs w:val="22"/>
+        </w:rPr>
+        <w:t>have to</w:t>
+      </w:r>
+      <w:proofErr w:type="gramEnd"/>
+      <w:r>
+        <w:rPr>
+          <w:color w:val="000000" w:themeColor="text1"/>
+          <w:sz w:val="22"/>
+          <w:szCs w:val="22"/>
+        </w:rPr>
+        <w:t xml:space="preserve"> always pass a function inside. We usually declare an anonymous function and inside it we do something like </w:t>
+      </w:r>
+      <w:proofErr w:type="gramStart"/>
+      <w:r>
+        <w:rPr>
+          <w:color w:val="000000" w:themeColor="text1"/>
+          <w:sz w:val="22"/>
+          <w:szCs w:val="22"/>
+        </w:rPr>
+        <w:t>actually passing</w:t>
+      </w:r>
+      <w:proofErr w:type="gramEnd"/>
+      <w:r>
+        <w:rPr>
+          <w:color w:val="000000" w:themeColor="text1"/>
+          <w:sz w:val="22"/>
+          <w:szCs w:val="22"/>
+        </w:rPr>
+        <w:t xml:space="preserve"> the function that we need to run. It only runs onetime after we hace waited.   Code example:</w:t>
+      </w:r>
+    </w:p>
+    <w:p>
+      <w:pPr>
+        <w:pStyle w:val="ListParagraph"/>
+        <w:rPr>
+          <w:color w:val="000000" w:themeColor="text1"/>
+          <w:sz w:val="22"/>
+          <w:szCs w:val="22"/>
+        </w:rPr>
+      </w:pPr>
+      <w:r>
+        <w:rPr>
+          <w:color w:val="000000" w:themeColor="text1"/>
+          <w:sz w:val="22"/>
+          <w:szCs w:val="22"/>
+        </w:rPr>
+        <w:t>setTimeout(</w:t>
+      </w:r>
+      <w:proofErr w:type="gramStart"/>
+      <w:r>
+        <w:rPr>
+          <w:color w:val="000000" w:themeColor="text1"/>
+          <w:sz w:val="22"/>
+          <w:szCs w:val="22"/>
+        </w:rPr>
+        <w:t>function() {</w:t>
+      </w:r>
+      <w:proofErr w:type="gramEnd"/>
+    </w:p>
+    <w:p>
+      <w:pPr>
+        <w:pStyle w:val="ListParagraph"/>
+        <w:rPr>
+          <w:color w:val="000000" w:themeColor="text1"/>
+          <w:sz w:val="22"/>
+          <w:szCs w:val="22"/>
+        </w:rPr>
+      </w:pPr>
+      <w:r>
+        <w:rPr>
+          <w:color w:val="000000" w:themeColor="text1"/>
+          <w:sz w:val="22"/>
+          <w:szCs w:val="22"/>
+        </w:rPr>
+        <w:t xml:space="preserve">    console.log("Hello");</w:t>
+      </w:r>
+    </w:p>
+    <w:p>
+      <w:pPr>
+        <w:pStyle w:val="ListParagraph"/>
+        <w:rPr>
+          <w:color w:val="000000" w:themeColor="text1"/>
+          <w:sz w:val="22"/>
+          <w:szCs w:val="22"/>
+        </w:rPr>
+      </w:pPr>
+      <w:r>
+        <w:rPr>
+          <w:color w:val="000000" w:themeColor="text1"/>
+          <w:sz w:val="22"/>
+          <w:szCs w:val="22"/>
+        </w:rPr>
+        <w:t>}, 2000);</w:t>
+      </w:r>
+    </w:p>
+    <w:p>
+      <w:pPr>
+        <w:pStyle w:val="ListParagraph"/>
+        <w:rPr>
+          <w:color w:val="000000" w:themeColor="text1"/>
+          <w:sz w:val="22"/>
+          <w:szCs w:val="22"/>
+        </w:rPr>
+      </w:pPr>
+    </w:p>
+    <w:p>
+      <w:pPr>
+        <w:pStyle w:val="ListParagraph"/>
+        <w:numPr>
+          <w:ilvl w:val="0"/>
+          <w:numId w:val="11"/>
+        </w:numPr>
+        <w:rPr>
+          <w:color w:val="000000" w:themeColor="text1"/>
+          <w:sz w:val="22"/>
+          <w:szCs w:val="22"/>
+        </w:rPr>
+      </w:pPr>
+      <w:proofErr w:type="gramStart"/>
+      <w:r>
+        <w:rPr>
+          <w:color w:val="000000" w:themeColor="text1"/>
+          <w:sz w:val="22"/>
+          <w:szCs w:val="22"/>
+        </w:rPr>
+        <w:t>setInterval(</w:t>
+      </w:r>
+      <w:proofErr w:type="gramEnd"/>
+      <w:r>
+        <w:rPr>
+          <w:color w:val="000000" w:themeColor="text1"/>
+          <w:sz w:val="22"/>
+          <w:szCs w:val="22"/>
+        </w:rPr>
+        <w:t xml:space="preserve">) is </w:t>
+      </w:r>
+      <w:proofErr w:type="gramStart"/>
+      <w:r>
+        <w:rPr>
+          <w:color w:val="000000" w:themeColor="text1"/>
+          <w:sz w:val="22"/>
+          <w:szCs w:val="22"/>
+        </w:rPr>
+        <w:t>similar to</w:t>
+      </w:r>
+      <w:proofErr w:type="gramEnd"/>
+      <w:r>
+        <w:rPr>
+          <w:color w:val="000000" w:themeColor="text1"/>
+          <w:sz w:val="22"/>
+          <w:szCs w:val="22"/>
+        </w:rPr>
+        <w:t xml:space="preserve"> </w:t>
+      </w:r>
+      <w:proofErr w:type="gramStart"/>
+      <w:r>
+        <w:rPr>
+          <w:color w:val="000000" w:themeColor="text1"/>
+          <w:sz w:val="22"/>
+          <w:szCs w:val="22"/>
+        </w:rPr>
+        <w:t>setTimeout(</w:t>
+      </w:r>
+      <w:proofErr w:type="gramEnd"/>
+      <w:r>
+        <w:rPr>
+          <w:color w:val="000000" w:themeColor="text1"/>
+          <w:sz w:val="22"/>
+          <w:szCs w:val="22"/>
+        </w:rPr>
+        <w:t>), but instead of running the function once, it runs it repeatedly.</w:t>
+      </w:r>
+    </w:p>
+    <w:p>
+      <w:pPr>
+        <w:pStyle w:val="ListParagraph"/>
+        <w:numPr>
+          <w:ilvl w:val="0"/>
+          <w:numId w:val="11"/>
+        </w:numPr>
+        <w:rPr>
+          <w:color w:val="000000" w:themeColor="text1"/>
+          <w:sz w:val="22"/>
+          <w:szCs w:val="22"/>
+        </w:rPr>
+      </w:pPr>
+      <w:proofErr w:type="gramStart"/>
+      <w:r>
+        <w:rPr>
+          <w:color w:val="000000" w:themeColor="text1"/>
+          <w:sz w:val="22"/>
+          <w:szCs w:val="22"/>
+        </w:rPr>
+        <w:t>clearInterval(</w:t>
+      </w:r>
+      <w:proofErr w:type="gramEnd"/>
+      <w:r>
+        <w:rPr>
+          <w:color w:val="000000" w:themeColor="text1"/>
+          <w:sz w:val="22"/>
+          <w:szCs w:val="22"/>
+        </w:rPr>
+        <w:t>) stops an interval.</w:t>
+      </w:r>
+      <w:r>
+        <w:rPr>
+          <w:color w:val="000000" w:themeColor="text1"/>
+          <w:sz w:val="22"/>
+          <w:szCs w:val="22"/>
+        </w:rPr>
+        <w:t xml:space="preserve"> When we create an </w:t>
+      </w:r>
+      <w:proofErr w:type="gramStart"/>
+      <w:r>
+        <w:rPr>
+          <w:color w:val="000000" w:themeColor="text1"/>
+          <w:sz w:val="22"/>
+          <w:szCs w:val="22"/>
+        </w:rPr>
+        <w:t>interval</w:t>
+      </w:r>
+      <w:proofErr w:type="gramEnd"/>
+      <w:r>
+        <w:rPr>
+          <w:color w:val="000000" w:themeColor="text1"/>
+          <w:sz w:val="22"/>
+          <w:szCs w:val="22"/>
+        </w:rPr>
+        <w:t xml:space="preserve"> the function returns an interval id that we can use to stop the interval.</w:t>
+      </w:r>
+    </w:p>
+    <w:p>
+      <w:pPr>
+        <w:pStyle w:val="ListParagraph"/>
+        <w:numPr>
+          <w:ilvl w:val="0"/>
+          <w:numId w:val="11"/>
+        </w:numPr>
+        <w:rPr>
+          <w:color w:val="000000" w:themeColor="text1"/>
+          <w:sz w:val="22"/>
+          <w:szCs w:val="22"/>
+        </w:rPr>
+      </w:pPr>
+      <w:proofErr w:type="gramStart"/>
+      <w:r>
+        <w:rPr>
+          <w:color w:val="000000" w:themeColor="text1"/>
+          <w:sz w:val="22"/>
+          <w:szCs w:val="22"/>
+        </w:rPr>
+        <w:t>.forEach</w:t>
+      </w:r>
+      <w:proofErr w:type="gramEnd"/>
+      <w:r>
+        <w:rPr>
+          <w:color w:val="000000" w:themeColor="text1"/>
+          <w:sz w:val="22"/>
+          <w:szCs w:val="22"/>
+        </w:rPr>
+        <w:t>()</w:t>
+      </w:r>
+      <w:r>
+        <w:rPr>
+          <w:color w:val="000000" w:themeColor="text1"/>
+          <w:sz w:val="22"/>
+          <w:szCs w:val="22"/>
+        </w:rPr>
+        <w:t xml:space="preserve"> </w:t>
+      </w:r>
+      <w:r>
+        <w:rPr>
+          <w:color w:val="000000" w:themeColor="text1"/>
+          <w:sz w:val="22"/>
+          <w:szCs w:val="22"/>
+        </w:rPr>
+        <w:sym w:font="Wingdings" w:char="F0E0"/>
+      </w:r>
+      <w:r>
+        <w:rPr>
+          <w:color w:val="000000" w:themeColor="text1"/>
+          <w:sz w:val="22"/>
+          <w:szCs w:val="22"/>
+        </w:rPr>
+        <w:t xml:space="preserve"> </w:t>
+      </w:r>
+      <w:r>
+        <w:rPr>
+          <w:color w:val="000000" w:themeColor="text1"/>
+          <w:sz w:val="22"/>
+          <w:szCs w:val="22"/>
+        </w:rPr>
+        <w:t>Usually, you use it when you want to perform an action for every item, rather than create a new array.</w:t>
+      </w:r>
+    </w:p>
+    <w:p>
+      <w:pPr>
+        <w:pStyle w:val="ListParagraph"/>
+        <w:numPr>
+          <w:ilvl w:val="0"/>
+          <w:numId w:val="11"/>
+        </w:numPr>
+        <w:rPr>
+          <w:color w:val="000000" w:themeColor="text1"/>
+          <w:sz w:val="22"/>
+          <w:szCs w:val="22"/>
+        </w:rPr>
+      </w:pPr>
+      <w:r>
+        <w:rPr>
+          <w:color w:val="000000" w:themeColor="text1"/>
+          <w:sz w:val="22"/>
+          <w:szCs w:val="22"/>
+        </w:rPr>
+        <w:t>Arrow functions are a shorter way to write functions.</w:t>
+      </w:r>
+    </w:p>
+    <w:p>
+      <w:pPr>
+        <w:pStyle w:val="ListParagraph"/>
+        <w:numPr>
+          <w:ilvl w:val="0"/>
+          <w:numId w:val="11"/>
+        </w:numPr>
+        <w:rPr>
+          <w:color w:val="000000" w:themeColor="text1"/>
+          <w:sz w:val="22"/>
+          <w:szCs w:val="22"/>
+        </w:rPr>
+      </w:pPr>
+      <w:r>
+        <w:rPr>
+          <w:color w:val="000000" w:themeColor="text1"/>
+          <w:sz w:val="22"/>
+          <w:szCs w:val="22"/>
+        </w:rPr>
+        <w:t>Hoisting does not work for arrow functions we should declare the arrow function in the code before we use it in the code</w:t>
+      </w:r>
+    </w:p>
+    <w:p>
+      <w:pPr>
+        <w:pStyle w:val="ListParagraph"/>
+        <w:numPr>
+          <w:ilvl w:val="0"/>
+          <w:numId w:val="11"/>
+        </w:numPr>
+        <w:rPr>
+          <w:color w:val="000000" w:themeColor="text1"/>
+          <w:sz w:val="22"/>
+          <w:szCs w:val="22"/>
+        </w:rPr>
+      </w:pPr>
+      <w:r>
+        <w:rPr>
+          <w:color w:val="000000" w:themeColor="text1"/>
+          <w:sz w:val="22"/>
+          <w:szCs w:val="22"/>
+        </w:rPr>
+        <w:t>when adding an event listener, you give it a function that should be executed when the event happens.</w:t>
+      </w:r>
+    </w:p>
+    <w:p>
+      <w:pPr>
+        <w:pStyle w:val="ListParagraph"/>
+        <w:numPr>
+          <w:ilvl w:val="0"/>
+          <w:numId w:val="11"/>
+        </w:numPr>
+        <w:rPr>
+          <w:color w:val="000000" w:themeColor="text1"/>
+          <w:sz w:val="22"/>
+          <w:szCs w:val="22"/>
+        </w:rPr>
+      </w:pPr>
+      <w:r>
+        <w:rPr>
+          <w:color w:val="000000" w:themeColor="text1"/>
+          <w:sz w:val="22"/>
+          <w:szCs w:val="22"/>
+        </w:rPr>
+        <w:t xml:space="preserve">addEventListener needs to take a trigger and a function that acts once this trigger has happened the trigger can be a keydown and the action is a function that first checks for the type of the </w:t>
+      </w:r>
+      <w:proofErr w:type="gramStart"/>
+      <w:r>
+        <w:rPr>
+          <w:color w:val="000000" w:themeColor="text1"/>
+          <w:sz w:val="22"/>
+          <w:szCs w:val="22"/>
+        </w:rPr>
+        <w:t>event.key  then</w:t>
+      </w:r>
+      <w:proofErr w:type="gramEnd"/>
+      <w:r>
+        <w:rPr>
+          <w:color w:val="000000" w:themeColor="text1"/>
+          <w:sz w:val="22"/>
+          <w:szCs w:val="22"/>
+        </w:rPr>
+        <w:t xml:space="preserve"> acts upon it</w:t>
+      </w:r>
+    </w:p>
+    <w:p>
+      <w:pPr>
+        <w:pStyle w:val="ListParagraph"/>
+        <w:numPr>
+          <w:ilvl w:val="0"/>
+          <w:numId w:val="11"/>
+        </w:numPr>
+        <w:rPr>
+          <w:color w:val="000000" w:themeColor="text1"/>
+          <w:sz w:val="22"/>
+          <w:szCs w:val="22"/>
+        </w:rPr>
+      </w:pPr>
+      <w:proofErr w:type="gramStart"/>
+      <w:r>
+        <w:rPr>
+          <w:color w:val="000000" w:themeColor="text1"/>
+          <w:sz w:val="22"/>
+          <w:szCs w:val="22"/>
+        </w:rPr>
+        <w:t>document.body</w:t>
+      </w:r>
+      <w:proofErr w:type="gramEnd"/>
+      <w:r>
+        <w:rPr>
+          <w:color w:val="000000" w:themeColor="text1"/>
+          <w:sz w:val="22"/>
+          <w:szCs w:val="22"/>
+        </w:rPr>
+        <w:t>.</w:t>
+      </w:r>
+      <w:proofErr w:type="gramStart"/>
+      <w:r>
+        <w:rPr>
+          <w:color w:val="000000" w:themeColor="text1"/>
+          <w:sz w:val="22"/>
+          <w:szCs w:val="22"/>
+        </w:rPr>
+        <w:t>addEventListener(</w:t>
+      </w:r>
+      <w:proofErr w:type="gramEnd"/>
+      <w:r>
+        <w:rPr>
+          <w:color w:val="000000" w:themeColor="text1"/>
+          <w:sz w:val="22"/>
+          <w:szCs w:val="22"/>
+        </w:rPr>
+        <w:t xml:space="preserve">"keydown", (event) =&gt; </w:t>
+      </w:r>
+      <w:proofErr w:type="gramStart"/>
+      <w:r>
+        <w:rPr>
+          <w:color w:val="000000" w:themeColor="text1"/>
+          <w:sz w:val="22"/>
+          <w:szCs w:val="22"/>
+        </w:rPr>
+        <w:t>{ /</w:t>
+      </w:r>
+      <w:proofErr w:type="gramEnd"/>
+      <w:r>
+        <w:rPr>
+          <w:color w:val="000000" w:themeColor="text1"/>
+          <w:sz w:val="22"/>
+          <w:szCs w:val="22"/>
+        </w:rPr>
+        <w:t xml:space="preserve">/ </w:t>
+      </w:r>
+      <w:proofErr w:type="gramStart"/>
+      <w:r>
+        <w:rPr>
+          <w:color w:val="000000" w:themeColor="text1"/>
+          <w:sz w:val="22"/>
+          <w:szCs w:val="22"/>
+        </w:rPr>
+        <w:t>... }</w:t>
+      </w:r>
+      <w:proofErr w:type="gramEnd"/>
+      <w:r>
+        <w:rPr>
+          <w:color w:val="000000" w:themeColor="text1"/>
+          <w:sz w:val="22"/>
+          <w:szCs w:val="22"/>
+        </w:rPr>
+        <w:t>);</w:t>
+      </w:r>
+      <w:r>
+        <w:rPr>
+          <w:color w:val="000000" w:themeColor="text1"/>
+          <w:sz w:val="22"/>
+          <w:szCs w:val="22"/>
+        </w:rPr>
+        <w:t xml:space="preserve"> this listens for events on the entire webpage which is not a good design or logic</w:t>
+      </w:r>
     </w:p>
     <w:sectPr>
       <w:pgSz w:w="12240" w:h="15840"/>
@@ -4132,6 +6307,119 @@
     </w:lvl>
   </w:abstractNum>
   <w:abstractNum w:abstractNumId="9" w15:restartNumberingAfterBreak="0">
+    <w:nsid w:val="7CA817BC"/>
+    <w:multiLevelType w:val="hybridMultilevel"/>
+    <w:tmpl w:val="7C287A30"/>
+    <w:lvl w:ilvl="0" w:tplc="04090001">
+      <w:start w:val="1"/>
+      <w:numFmt w:val="bullet"/>
+      <w:lvlText w:val=""/>
+      <w:lvlJc w:val="left"/>
+      <w:pPr>
+        <w:ind w:left="720" w:hanging="360"/>
+      </w:pPr>
+      <w:rPr>
+        <w:rFonts w:ascii="Symbol" w:hAnsi="Symbol" w:hint="default"/>
+      </w:rPr>
+    </w:lvl>
+    <w:lvl w:ilvl="1" w:tplc="04090003" w:tentative="1">
+      <w:start w:val="1"/>
+      <w:numFmt w:val="bullet"/>
+      <w:lvlText w:val="o"/>
+      <w:lvlJc w:val="left"/>
+      <w:pPr>
+        <w:ind w:left="1440" w:hanging="360"/>
+      </w:pPr>
+      <w:rPr>
+        <w:rFonts w:ascii="Courier New" w:hAnsi="Courier New" w:cs="Courier New" w:hint="default"/>
+      </w:rPr>
+    </w:lvl>
+    <w:lvl w:ilvl="2" w:tplc="04090005" w:tentative="1">
+      <w:start w:val="1"/>
+      <w:numFmt w:val="bullet"/>
+      <w:lvlText w:val=""/>
+      <w:lvlJc w:val="left"/>
+      <w:pPr>
+        <w:ind w:left="2160" w:hanging="360"/>
+      </w:pPr>
+      <w:rPr>
+        <w:rFonts w:ascii="Wingdings" w:hAnsi="Wingdings" w:hint="default"/>
+      </w:rPr>
+    </w:lvl>
+    <w:lvl w:ilvl="3" w:tplc="04090001" w:tentative="1">
+      <w:start w:val="1"/>
+      <w:numFmt w:val="bullet"/>
+      <w:lvlText w:val=""/>
+      <w:lvlJc w:val="left"/>
+      <w:pPr>
+        <w:ind w:left="2880" w:hanging="360"/>
+      </w:pPr>
+      <w:rPr>
+        <w:rFonts w:ascii="Symbol" w:hAnsi="Symbol" w:hint="default"/>
+      </w:rPr>
+    </w:lvl>
+    <w:lvl w:ilvl="4" w:tplc="04090003" w:tentative="1">
+      <w:start w:val="1"/>
+      <w:numFmt w:val="bullet"/>
+      <w:lvlText w:val="o"/>
+      <w:lvlJc w:val="left"/>
+      <w:pPr>
+        <w:ind w:left="3600" w:hanging="360"/>
+      </w:pPr>
+      <w:rPr>
+        <w:rFonts w:ascii="Courier New" w:hAnsi="Courier New" w:cs="Courier New" w:hint="default"/>
+      </w:rPr>
+    </w:lvl>
+    <w:lvl w:ilvl="5" w:tplc="04090005" w:tentative="1">
+      <w:start w:val="1"/>
+      <w:numFmt w:val="bullet"/>
+      <w:lvlText w:val=""/>
+      <w:lvlJc w:val="left"/>
+      <w:pPr>
+        <w:ind w:left="4320" w:hanging="360"/>
+      </w:pPr>
+      <w:rPr>
+        <w:rFonts w:ascii="Wingdings" w:hAnsi="Wingdings" w:hint="default"/>
+      </w:rPr>
+    </w:lvl>
+    <w:lvl w:ilvl="6" w:tplc="04090001" w:tentative="1">
+      <w:start w:val="1"/>
+      <w:numFmt w:val="bullet"/>
+      <w:lvlText w:val=""/>
+      <w:lvlJc w:val="left"/>
+      <w:pPr>
+        <w:ind w:left="5040" w:hanging="360"/>
+      </w:pPr>
+      <w:rPr>
+        <w:rFonts w:ascii="Symbol" w:hAnsi="Symbol" w:hint="default"/>
+      </w:rPr>
+    </w:lvl>
+    <w:lvl w:ilvl="7" w:tplc="04090003" w:tentative="1">
+      <w:start w:val="1"/>
+      <w:numFmt w:val="bullet"/>
+      <w:lvlText w:val="o"/>
+      <w:lvlJc w:val="left"/>
+      <w:pPr>
+        <w:ind w:left="5760" w:hanging="360"/>
+      </w:pPr>
+      <w:rPr>
+        <w:rFonts w:ascii="Courier New" w:hAnsi="Courier New" w:cs="Courier New" w:hint="default"/>
+      </w:rPr>
+    </w:lvl>
+    <w:lvl w:ilvl="8" w:tplc="04090005" w:tentative="1">
+      <w:start w:val="1"/>
+      <w:numFmt w:val="bullet"/>
+      <w:lvlText w:val=""/>
+      <w:lvlJc w:val="left"/>
+      <w:pPr>
+        <w:ind w:left="6480" w:hanging="360"/>
+      </w:pPr>
+      <w:rPr>
+        <w:rFonts w:ascii="Wingdings" w:hAnsi="Wingdings" w:hint="default"/>
+      </w:rPr>
+    </w:lvl>
+  </w:abstractNum>
+  <w:abstractNum w:abstractNumId="10" w15:restartNumberingAfterBreak="0">
     <w:nsid w:val="7F72049C"/>
     <w:multiLevelType w:val="multilevel"/>
     <w:tmpl w:val="1F242F62"/>
@@ -4299,7 +6587,7 @@
     <w:abstractNumId w:val="8"/>
   </w:num>
   <w:num w:numId="7" w16cid:durableId="97333426">
-    <w:abstractNumId w:val="9"/>
+    <w:abstractNumId w:val="10"/>
   </w:num>
   <w:num w:numId="8" w16cid:durableId="2078238912">
     <w:abstractNumId w:val="5"/>
@@ -4309,6 +6597,9 @@
   </w:num>
   <w:num w:numId="10" w16cid:durableId="1949001774">
     <w:abstractNumId w:val="7"/>
+  </w:num>
+  <w:num w:numId="11" w16cid:durableId="49500872">
+    <w:abstractNumId w:val="9"/>
   </w:num>
 </w:numbering>
 </file>
@@ -4741,7 +7032,6 @@
     <w:next w:val="Normal"/>
     <w:link w:val="Heading2Char"/>
     <w:uiPriority w:val="9"/>
-    <w:semiHidden/>
     <w:unhideWhenUsed/>
     <w:qFormat/>
     <w:rsid w:val="004E4906"/>
@@ -4956,7 +7246,6 @@
     <w:basedOn w:val="DefaultParagraphFont"/>
     <w:link w:val="Heading2"/>
     <w:uiPriority w:val="9"/>
-    <w:semiHidden/>
     <w:rsid w:val="004E4906"/>
     <w:rPr>
       <w:rFonts w:asciiTheme="majorHAnsi" w:eastAsiaTheme="majorEastAsia" w:hAnsiTheme="majorHAnsi" w:cstheme="majorBidi"/>
@@ -5290,6 +7579,35 @@
       <w:bCs/>
     </w:rPr>
   </w:style>
+  <w:style w:type="paragraph" w:styleId="NormalWeb">
+    <w:name w:val="Normal (Web)"/>
+    <w:basedOn w:val="Normal"/>
+    <w:uiPriority w:val="99"/>
+    <w:semiHidden/>
+    <w:unhideWhenUsed/>
+    <w:rsid w:val="003F6567"/>
+    <w:pPr>
+      <w:spacing w:before="100" w:beforeAutospacing="1" w:after="100" w:afterAutospacing="1" w:line="240" w:lineRule="auto"/>
+    </w:pPr>
+    <w:rPr>
+      <w:rFonts w:ascii="Times New Roman" w:eastAsia="Times New Roman" w:hAnsi="Times New Roman" w:cs="Times New Roman"/>
+      <w:kern w:val="0"/>
+      <w14:ligatures w14:val="none"/>
+    </w:rPr>
+  </w:style>
+  <w:style w:type="paragraph" w:customStyle="1" w:styleId="pdq2pgselectionanchorcontainer">
+    <w:name w:val="pdq2pg_selectionanchorcontainer"/>
+    <w:basedOn w:val="Normal"/>
+    <w:rsid w:val="00BF6FFC"/>
+    <w:pPr>
+      <w:spacing w:before="100" w:beforeAutospacing="1" w:after="100" w:afterAutospacing="1" w:line="240" w:lineRule="auto"/>
+    </w:pPr>
+    <w:rPr>
+      <w:rFonts w:ascii="Times New Roman" w:eastAsia="Times New Roman" w:hAnsi="Times New Roman" w:cs="Times New Roman"/>
+      <w:kern w:val="0"/>
+      <w14:ligatures w14:val="none"/>
+    </w:rPr>
+  </w:style>
 </w:styles>
 </file>
 

</xml_diff>

<commit_message>
add module notes unfinished
</commit_message>
<xml_diff>
--- a/Javascript/Javascript basic notes.docx
+++ b/Javascript/Javascript basic notes.docx
@@ -44,9 +44,9 @@
           <w:sz w:val="22"/>
           <w:szCs w:val="22"/>
         </w:rPr>
-        <w:t xml:space="preserve">In this document I will have a javascript bootcamp of 6 days including code before I move on into backend and node.js. </w:t>
-      </w:r>
-      <w:proofErr w:type="gramStart"/>
+        <w:t xml:space="preserve">In this document I will have a </w:t>
+      </w:r>
+      <w:proofErr w:type="spellStart"/>
       <w:r>
         <w:rPr>
           <w:i/>
@@ -55,9 +55,9 @@
           <w:sz w:val="22"/>
           <w:szCs w:val="22"/>
         </w:rPr>
-        <w:t>this</w:t>
-      </w:r>
-      <w:proofErr w:type="gramEnd"/>
+        <w:t>javascript</w:t>
+      </w:r>
+      <w:proofErr w:type="spellEnd"/>
       <w:r>
         <w:rPr>
           <w:i/>
@@ -66,11 +66,10 @@
           <w:sz w:val="22"/>
           <w:szCs w:val="22"/>
         </w:rPr>
-        <w:t xml:space="preserve"> might take longer in case I have to improve my AWS skills more.</w:t>
-      </w:r>
-    </w:p>
-    <w:p>
-      <w:pPr>
+        <w:t xml:space="preserve"> bootcamp of 6 days including code before I move on into backend and node.js. </w:t>
+      </w:r>
+      <w:proofErr w:type="gramStart"/>
+      <w:r>
         <w:rPr>
           <w:i/>
           <w:iCs/>
@@ -78,6 +77,29 @@
           <w:sz w:val="22"/>
           <w:szCs w:val="22"/>
         </w:rPr>
+        <w:t>this</w:t>
+      </w:r>
+      <w:proofErr w:type="gramEnd"/>
+      <w:r>
+        <w:rPr>
+          <w:i/>
+          <w:iCs/>
+          <w:color w:val="000000" w:themeColor="text1"/>
+          <w:sz w:val="22"/>
+          <w:szCs w:val="22"/>
+        </w:rPr>
+        <w:t xml:space="preserve"> might take longer in case I have to improve my AWS skills more.</w:t>
+      </w:r>
+    </w:p>
+    <w:p>
+      <w:pPr>
+        <w:rPr>
+          <w:i/>
+          <w:iCs/>
+          <w:color w:val="000000" w:themeColor="text1"/>
+          <w:sz w:val="22"/>
+          <w:szCs w:val="22"/>
+        </w:rPr>
       </w:pPr>
     </w:p>
     <w:p>
@@ -89,6 +111,7 @@
           <w:u w:val="single"/>
         </w:rPr>
       </w:pPr>
+      <w:proofErr w:type="spellStart"/>
       <w:r>
         <w:rPr>
           <w:b/>
@@ -96,378 +119,534 @@
           <w:color w:val="000000" w:themeColor="text1"/>
           <w:u w:val="single"/>
         </w:rPr>
-        <w:t>Javascript basics and general information:</w:t>
-      </w:r>
-    </w:p>
-    <w:p>
-      <w:pPr>
-        <w:pStyle w:val="ListParagraph"/>
-        <w:numPr>
-          <w:ilvl w:val="0"/>
-          <w:numId w:val="1"/>
-        </w:numPr>
-        <w:rPr>
-          <w:color w:val="000000" w:themeColor="text1"/>
-          <w:sz w:val="22"/>
-          <w:szCs w:val="22"/>
-        </w:rPr>
-      </w:pPr>
-      <w:r>
-        <w:rPr>
-          <w:color w:val="000000" w:themeColor="text1"/>
-          <w:sz w:val="22"/>
-          <w:szCs w:val="22"/>
-        </w:rPr>
-        <w:t xml:space="preserve">in javascript to avoid any inaccuracies during calculations we shall calcualte in cents then multiply by 100 to </w:t>
-      </w:r>
-      <w:proofErr w:type="gramStart"/>
-      <w:r>
-        <w:rPr>
-          <w:color w:val="000000" w:themeColor="text1"/>
-          <w:sz w:val="22"/>
-          <w:szCs w:val="22"/>
-        </w:rPr>
-        <w:t>the final result</w:t>
-      </w:r>
-      <w:proofErr w:type="gramEnd"/>
-      <w:r>
-        <w:rPr>
-          <w:color w:val="000000" w:themeColor="text1"/>
-          <w:sz w:val="22"/>
-          <w:szCs w:val="22"/>
-        </w:rPr>
-        <w:t>.</w:t>
-      </w:r>
-    </w:p>
-    <w:p>
-      <w:pPr>
-        <w:pStyle w:val="ListParagraph"/>
-        <w:numPr>
-          <w:ilvl w:val="0"/>
-          <w:numId w:val="1"/>
-        </w:numPr>
-        <w:rPr>
-          <w:color w:val="000000" w:themeColor="text1"/>
-          <w:sz w:val="22"/>
-          <w:szCs w:val="22"/>
-        </w:rPr>
-      </w:pPr>
-      <w:proofErr w:type="gramStart"/>
-      <w:r>
-        <w:rPr>
-          <w:color w:val="000000" w:themeColor="text1"/>
-          <w:sz w:val="22"/>
-          <w:szCs w:val="22"/>
-        </w:rPr>
-        <w:t>to</w:t>
-      </w:r>
-      <w:proofErr w:type="gramEnd"/>
-      <w:r>
-        <w:rPr>
-          <w:color w:val="000000" w:themeColor="text1"/>
-          <w:sz w:val="22"/>
-          <w:szCs w:val="22"/>
-        </w:rPr>
-        <w:t xml:space="preserve"> round a </w:t>
-      </w:r>
-      <w:proofErr w:type="gramStart"/>
-      <w:r>
-        <w:rPr>
-          <w:color w:val="000000" w:themeColor="text1"/>
-          <w:sz w:val="22"/>
-          <w:szCs w:val="22"/>
-        </w:rPr>
-        <w:t>number</w:t>
-      </w:r>
-      <w:proofErr w:type="gramEnd"/>
-      <w:r>
-        <w:rPr>
-          <w:color w:val="000000" w:themeColor="text1"/>
-          <w:sz w:val="22"/>
-          <w:szCs w:val="22"/>
-        </w:rPr>
-        <w:t xml:space="preserve"> we use the </w:t>
-      </w:r>
-      <w:proofErr w:type="gramStart"/>
-      <w:r>
-        <w:rPr>
-          <w:color w:val="000000" w:themeColor="text1"/>
-          <w:sz w:val="22"/>
-          <w:szCs w:val="22"/>
-        </w:rPr>
-        <w:t>function</w:t>
-      </w:r>
-      <w:proofErr w:type="gramEnd"/>
-      <w:r>
-        <w:rPr>
-          <w:color w:val="000000" w:themeColor="text1"/>
-          <w:sz w:val="22"/>
-          <w:szCs w:val="22"/>
-        </w:rPr>
-        <w:t xml:space="preserve"> Math.round(number);</w:t>
-      </w:r>
-      <w:r>
-        <w:rPr>
-          <w:color w:val="000000" w:themeColor="text1"/>
-          <w:sz w:val="22"/>
-          <w:szCs w:val="22"/>
-        </w:rPr>
-        <w:t xml:space="preserve"> it rounds normally, to round up we use Math.ceil(); and to round down we use Math.floor();</w:t>
-      </w:r>
-    </w:p>
-    <w:p>
-      <w:pPr>
-        <w:pStyle w:val="ListParagraph"/>
-        <w:numPr>
-          <w:ilvl w:val="0"/>
-          <w:numId w:val="1"/>
-        </w:numPr>
-        <w:rPr>
-          <w:color w:val="000000" w:themeColor="text1"/>
-          <w:sz w:val="22"/>
-          <w:szCs w:val="22"/>
-        </w:rPr>
-      </w:pPr>
-      <w:proofErr w:type="gramStart"/>
-      <w:r>
-        <w:rPr>
-          <w:color w:val="000000" w:themeColor="text1"/>
-          <w:sz w:val="22"/>
-          <w:szCs w:val="22"/>
-        </w:rPr>
-        <w:t>even</w:t>
-      </w:r>
-      <w:proofErr w:type="gramEnd"/>
-      <w:r>
-        <w:rPr>
-          <w:color w:val="000000" w:themeColor="text1"/>
-          <w:sz w:val="22"/>
-          <w:szCs w:val="22"/>
-        </w:rPr>
-        <w:t xml:space="preserve"> when we round a </w:t>
-      </w:r>
-      <w:proofErr w:type="gramStart"/>
-      <w:r>
-        <w:rPr>
-          <w:color w:val="000000" w:themeColor="text1"/>
-          <w:sz w:val="22"/>
-          <w:szCs w:val="22"/>
-        </w:rPr>
-        <w:t>number</w:t>
-      </w:r>
-      <w:proofErr w:type="gramEnd"/>
-      <w:r>
-        <w:rPr>
-          <w:color w:val="000000" w:themeColor="text1"/>
-          <w:sz w:val="22"/>
-          <w:szCs w:val="22"/>
-        </w:rPr>
-        <w:t xml:space="preserve"> we should do so in cents, we only convert to normal </w:t>
-      </w:r>
-      <w:proofErr w:type="gramStart"/>
-      <w:r>
-        <w:rPr>
-          <w:color w:val="000000" w:themeColor="text1"/>
-          <w:sz w:val="22"/>
-          <w:szCs w:val="22"/>
-        </w:rPr>
-        <w:t>numbers</w:t>
-      </w:r>
-      <w:proofErr w:type="gramEnd"/>
-      <w:r>
-        <w:rPr>
-          <w:color w:val="000000" w:themeColor="text1"/>
-          <w:sz w:val="22"/>
-          <w:szCs w:val="22"/>
-        </w:rPr>
-        <w:t xml:space="preserve"> ones we are ready to display the result.</w:t>
-      </w:r>
-    </w:p>
-    <w:p>
-      <w:pPr>
-        <w:pStyle w:val="ListParagraph"/>
-        <w:numPr>
-          <w:ilvl w:val="0"/>
-          <w:numId w:val="1"/>
-        </w:numPr>
-        <w:rPr>
-          <w:color w:val="000000" w:themeColor="text1"/>
-          <w:sz w:val="22"/>
-          <w:szCs w:val="22"/>
-        </w:rPr>
-      </w:pPr>
-      <w:r>
-        <w:rPr>
-          <w:color w:val="000000" w:themeColor="text1"/>
-          <w:sz w:val="22"/>
-          <w:szCs w:val="22"/>
-        </w:rPr>
-        <w:t xml:space="preserve">We can check the type of a variable, object, or array using the </w:t>
-      </w:r>
-      <w:proofErr w:type="gramStart"/>
-      <w:r>
-        <w:rPr>
-          <w:color w:val="000000" w:themeColor="text1"/>
-          <w:sz w:val="22"/>
-          <w:szCs w:val="22"/>
-        </w:rPr>
-        <w:t>typeof</w:t>
-      </w:r>
-      <w:proofErr w:type="gramEnd"/>
-      <w:r>
-        <w:rPr>
-          <w:color w:val="000000" w:themeColor="text1"/>
-          <w:sz w:val="22"/>
-          <w:szCs w:val="22"/>
-        </w:rPr>
-        <w:t xml:space="preserve"> keyword</w:t>
-      </w:r>
-    </w:p>
-    <w:p>
-      <w:pPr>
-        <w:pStyle w:val="ListParagraph"/>
-        <w:numPr>
-          <w:ilvl w:val="0"/>
-          <w:numId w:val="1"/>
-        </w:numPr>
-        <w:rPr>
-          <w:color w:val="000000" w:themeColor="text1"/>
-          <w:sz w:val="22"/>
-          <w:szCs w:val="22"/>
-        </w:rPr>
-      </w:pPr>
-      <w:r>
-        <w:rPr>
-          <w:color w:val="000000" w:themeColor="text1"/>
-          <w:sz w:val="22"/>
-          <w:szCs w:val="22"/>
-        </w:rPr>
-        <w:t>We have escape characters just the same as in C++ and in Java.</w:t>
-      </w:r>
-    </w:p>
-    <w:p>
-      <w:pPr>
-        <w:pStyle w:val="ListParagraph"/>
-        <w:numPr>
-          <w:ilvl w:val="0"/>
-          <w:numId w:val="1"/>
-        </w:numPr>
-        <w:rPr>
-          <w:color w:val="000000" w:themeColor="text1"/>
-          <w:sz w:val="22"/>
-          <w:szCs w:val="22"/>
-        </w:rPr>
-      </w:pPr>
-      <w:r>
-        <w:rPr>
-          <w:color w:val="000000" w:themeColor="text1"/>
-          <w:sz w:val="22"/>
-          <w:szCs w:val="22"/>
-        </w:rPr>
-        <w:t>When using addition if one of the values is a string javascript will type cast all the elements into strings so “5” + 3 will be 53, the same with 3 + “5”</w:t>
-      </w:r>
-    </w:p>
-    <w:p>
-      <w:pPr>
-        <w:pStyle w:val="ListParagraph"/>
-        <w:numPr>
-          <w:ilvl w:val="0"/>
-          <w:numId w:val="1"/>
-        </w:numPr>
-        <w:rPr>
-          <w:color w:val="000000" w:themeColor="text1"/>
-          <w:sz w:val="22"/>
-          <w:szCs w:val="22"/>
-        </w:rPr>
-      </w:pPr>
-      <w:r>
-        <w:rPr>
-          <w:color w:val="000000" w:themeColor="text1"/>
-          <w:sz w:val="22"/>
-          <w:szCs w:val="22"/>
-        </w:rPr>
-        <w:t>${}</w:t>
-      </w:r>
-      <w:r>
-        <w:rPr>
-          <w:color w:val="000000" w:themeColor="text1"/>
-          <w:sz w:val="22"/>
-          <w:szCs w:val="22"/>
-        </w:rPr>
-        <w:t xml:space="preserve"> to include a variable inside a print the print should be of type ``</w:t>
-      </w:r>
-    </w:p>
-    <w:p>
-      <w:pPr>
-        <w:pStyle w:val="ListParagraph"/>
-        <w:numPr>
-          <w:ilvl w:val="0"/>
-          <w:numId w:val="1"/>
-        </w:numPr>
-        <w:rPr>
-          <w:color w:val="000000" w:themeColor="text1"/>
-          <w:sz w:val="22"/>
-          <w:szCs w:val="22"/>
-        </w:rPr>
-      </w:pPr>
-      <w:r>
-        <w:rPr>
-          <w:color w:val="000000" w:themeColor="text1"/>
-          <w:sz w:val="22"/>
-          <w:szCs w:val="22"/>
-        </w:rPr>
-        <w:t>Javascript uses camelCase</w:t>
-      </w:r>
-    </w:p>
-    <w:p>
-      <w:pPr>
-        <w:pStyle w:val="ListParagraph"/>
-        <w:numPr>
-          <w:ilvl w:val="0"/>
-          <w:numId w:val="1"/>
-        </w:numPr>
-        <w:rPr>
-          <w:color w:val="000000" w:themeColor="text1"/>
-          <w:sz w:val="22"/>
-          <w:szCs w:val="22"/>
-        </w:rPr>
-      </w:pPr>
-      <w:r>
-        <w:rPr>
-          <w:color w:val="000000" w:themeColor="text1"/>
-          <w:sz w:val="22"/>
-          <w:szCs w:val="22"/>
-        </w:rPr>
-        <w:t xml:space="preserve">Onclick is an event handler for the event of clicking. It runs javascript code. We can include the javascript code directly on the onclick or we can store it </w:t>
-      </w:r>
-      <w:proofErr w:type="gramStart"/>
-      <w:r>
-        <w:rPr>
-          <w:color w:val="000000" w:themeColor="text1"/>
-          <w:sz w:val="22"/>
-          <w:szCs w:val="22"/>
-        </w:rPr>
-        <w:t>into</w:t>
-      </w:r>
-      <w:proofErr w:type="gramEnd"/>
-      <w:r>
-        <w:rPr>
-          <w:color w:val="000000" w:themeColor="text1"/>
-          <w:sz w:val="22"/>
-          <w:szCs w:val="22"/>
-        </w:rPr>
-        <w:t xml:space="preserve"> a function that gets called.</w:t>
-      </w:r>
-    </w:p>
-    <w:p>
-      <w:pPr>
+        <w:t>Javascript</w:t>
+      </w:r>
+      <w:proofErr w:type="spellEnd"/>
+      <w:r>
         <w:rPr>
           <w:b/>
           <w:bCs/>
           <w:color w:val="000000" w:themeColor="text1"/>
           <w:u w:val="single"/>
         </w:rPr>
-      </w:pPr>
+        <w:t xml:space="preserve"> basics and general information:</w:t>
+      </w:r>
+    </w:p>
+    <w:p>
+      <w:pPr>
+        <w:pStyle w:val="ListParagraph"/>
+        <w:numPr>
+          <w:ilvl w:val="0"/>
+          <w:numId w:val="1"/>
+        </w:numPr>
+        <w:rPr>
+          <w:color w:val="000000" w:themeColor="text1"/>
+          <w:sz w:val="22"/>
+          <w:szCs w:val="22"/>
+        </w:rPr>
+      </w:pPr>
+      <w:r>
+        <w:rPr>
+          <w:color w:val="000000" w:themeColor="text1"/>
+          <w:sz w:val="22"/>
+          <w:szCs w:val="22"/>
+        </w:rPr>
+        <w:t xml:space="preserve">in </w:t>
+      </w:r>
+      <w:proofErr w:type="spellStart"/>
+      <w:r>
+        <w:rPr>
+          <w:color w:val="000000" w:themeColor="text1"/>
+          <w:sz w:val="22"/>
+          <w:szCs w:val="22"/>
+        </w:rPr>
+        <w:t>javascript</w:t>
+      </w:r>
+      <w:proofErr w:type="spellEnd"/>
+      <w:r>
+        <w:rPr>
+          <w:color w:val="000000" w:themeColor="text1"/>
+          <w:sz w:val="22"/>
+          <w:szCs w:val="22"/>
+        </w:rPr>
+        <w:t xml:space="preserve"> to avoid any inaccuracies during calculations we shall </w:t>
+      </w:r>
+      <w:proofErr w:type="spellStart"/>
+      <w:r>
+        <w:rPr>
+          <w:color w:val="000000" w:themeColor="text1"/>
+          <w:sz w:val="22"/>
+          <w:szCs w:val="22"/>
+        </w:rPr>
+        <w:t>calcualte</w:t>
+      </w:r>
+      <w:proofErr w:type="spellEnd"/>
+      <w:r>
+        <w:rPr>
+          <w:color w:val="000000" w:themeColor="text1"/>
+          <w:sz w:val="22"/>
+          <w:szCs w:val="22"/>
+        </w:rPr>
+        <w:t xml:space="preserve"> in cents then multiply by 100 to </w:t>
+      </w:r>
+      <w:proofErr w:type="gramStart"/>
+      <w:r>
+        <w:rPr>
+          <w:color w:val="000000" w:themeColor="text1"/>
+          <w:sz w:val="22"/>
+          <w:szCs w:val="22"/>
+        </w:rPr>
+        <w:t>the final result</w:t>
+      </w:r>
+      <w:proofErr w:type="gramEnd"/>
+      <w:r>
+        <w:rPr>
+          <w:color w:val="000000" w:themeColor="text1"/>
+          <w:sz w:val="22"/>
+          <w:szCs w:val="22"/>
+        </w:rPr>
+        <w:t>.</w:t>
+      </w:r>
+    </w:p>
+    <w:p>
+      <w:pPr>
+        <w:pStyle w:val="ListParagraph"/>
+        <w:numPr>
+          <w:ilvl w:val="0"/>
+          <w:numId w:val="1"/>
+        </w:numPr>
+        <w:rPr>
+          <w:color w:val="000000" w:themeColor="text1"/>
+          <w:sz w:val="22"/>
+          <w:szCs w:val="22"/>
+        </w:rPr>
+      </w:pPr>
+      <w:proofErr w:type="gramStart"/>
+      <w:r>
+        <w:rPr>
+          <w:color w:val="000000" w:themeColor="text1"/>
+          <w:sz w:val="22"/>
+          <w:szCs w:val="22"/>
+        </w:rPr>
+        <w:t>to</w:t>
+      </w:r>
+      <w:proofErr w:type="gramEnd"/>
+      <w:r>
+        <w:rPr>
+          <w:color w:val="000000" w:themeColor="text1"/>
+          <w:sz w:val="22"/>
+          <w:szCs w:val="22"/>
+        </w:rPr>
+        <w:t xml:space="preserve"> round a </w:t>
+      </w:r>
+      <w:proofErr w:type="gramStart"/>
+      <w:r>
+        <w:rPr>
+          <w:color w:val="000000" w:themeColor="text1"/>
+          <w:sz w:val="22"/>
+          <w:szCs w:val="22"/>
+        </w:rPr>
+        <w:t>number</w:t>
+      </w:r>
+      <w:proofErr w:type="gramEnd"/>
+      <w:r>
+        <w:rPr>
+          <w:color w:val="000000" w:themeColor="text1"/>
+          <w:sz w:val="22"/>
+          <w:szCs w:val="22"/>
+        </w:rPr>
+        <w:t xml:space="preserve"> we use the </w:t>
+      </w:r>
+      <w:proofErr w:type="gramStart"/>
+      <w:r>
+        <w:rPr>
+          <w:color w:val="000000" w:themeColor="text1"/>
+          <w:sz w:val="22"/>
+          <w:szCs w:val="22"/>
+        </w:rPr>
+        <w:t>function</w:t>
+      </w:r>
+      <w:proofErr w:type="gramEnd"/>
+      <w:r>
+        <w:rPr>
+          <w:color w:val="000000" w:themeColor="text1"/>
+          <w:sz w:val="22"/>
+          <w:szCs w:val="22"/>
+        </w:rPr>
+        <w:t xml:space="preserve"> </w:t>
+      </w:r>
+      <w:proofErr w:type="spellStart"/>
+      <w:r>
+        <w:rPr>
+          <w:color w:val="000000" w:themeColor="text1"/>
+          <w:sz w:val="22"/>
+          <w:szCs w:val="22"/>
+        </w:rPr>
+        <w:t>Math.round</w:t>
+      </w:r>
+      <w:proofErr w:type="spellEnd"/>
+      <w:r>
+        <w:rPr>
+          <w:color w:val="000000" w:themeColor="text1"/>
+          <w:sz w:val="22"/>
+          <w:szCs w:val="22"/>
+        </w:rPr>
+        <w:t>(number);</w:t>
+      </w:r>
+      <w:r>
+        <w:rPr>
+          <w:color w:val="000000" w:themeColor="text1"/>
+          <w:sz w:val="22"/>
+          <w:szCs w:val="22"/>
+        </w:rPr>
+        <w:t xml:space="preserve"> it rounds normally, to round up we use </w:t>
+      </w:r>
+      <w:proofErr w:type="spellStart"/>
+      <w:r>
+        <w:rPr>
+          <w:color w:val="000000" w:themeColor="text1"/>
+          <w:sz w:val="22"/>
+          <w:szCs w:val="22"/>
+        </w:rPr>
+        <w:t>Math.ceil</w:t>
+      </w:r>
+      <w:proofErr w:type="spellEnd"/>
+      <w:r>
+        <w:rPr>
+          <w:color w:val="000000" w:themeColor="text1"/>
+          <w:sz w:val="22"/>
+          <w:szCs w:val="22"/>
+        </w:rPr>
+        <w:t xml:space="preserve">(); and to round down we use </w:t>
+      </w:r>
+      <w:proofErr w:type="spellStart"/>
+      <w:r>
+        <w:rPr>
+          <w:color w:val="000000" w:themeColor="text1"/>
+          <w:sz w:val="22"/>
+          <w:szCs w:val="22"/>
+        </w:rPr>
+        <w:t>Math.floor</w:t>
+      </w:r>
+      <w:proofErr w:type="spellEnd"/>
+      <w:r>
+        <w:rPr>
+          <w:color w:val="000000" w:themeColor="text1"/>
+          <w:sz w:val="22"/>
+          <w:szCs w:val="22"/>
+        </w:rPr>
+        <w:t>();</w:t>
+      </w:r>
+    </w:p>
+    <w:p>
+      <w:pPr>
+        <w:pStyle w:val="ListParagraph"/>
+        <w:numPr>
+          <w:ilvl w:val="0"/>
+          <w:numId w:val="1"/>
+        </w:numPr>
+        <w:rPr>
+          <w:color w:val="000000" w:themeColor="text1"/>
+          <w:sz w:val="22"/>
+          <w:szCs w:val="22"/>
+        </w:rPr>
+      </w:pPr>
+      <w:proofErr w:type="gramStart"/>
+      <w:r>
+        <w:rPr>
+          <w:color w:val="000000" w:themeColor="text1"/>
+          <w:sz w:val="22"/>
+          <w:szCs w:val="22"/>
+        </w:rPr>
+        <w:t>even</w:t>
+      </w:r>
+      <w:proofErr w:type="gramEnd"/>
+      <w:r>
+        <w:rPr>
+          <w:color w:val="000000" w:themeColor="text1"/>
+          <w:sz w:val="22"/>
+          <w:szCs w:val="22"/>
+        </w:rPr>
+        <w:t xml:space="preserve"> when we round a </w:t>
+      </w:r>
+      <w:proofErr w:type="gramStart"/>
+      <w:r>
+        <w:rPr>
+          <w:color w:val="000000" w:themeColor="text1"/>
+          <w:sz w:val="22"/>
+          <w:szCs w:val="22"/>
+        </w:rPr>
+        <w:t>number</w:t>
+      </w:r>
+      <w:proofErr w:type="gramEnd"/>
+      <w:r>
+        <w:rPr>
+          <w:color w:val="000000" w:themeColor="text1"/>
+          <w:sz w:val="22"/>
+          <w:szCs w:val="22"/>
+        </w:rPr>
+        <w:t xml:space="preserve"> we should do so in cents, we only convert to normal </w:t>
+      </w:r>
+      <w:proofErr w:type="gramStart"/>
+      <w:r>
+        <w:rPr>
+          <w:color w:val="000000" w:themeColor="text1"/>
+          <w:sz w:val="22"/>
+          <w:szCs w:val="22"/>
+        </w:rPr>
+        <w:t>numbers</w:t>
+      </w:r>
+      <w:proofErr w:type="gramEnd"/>
+      <w:r>
+        <w:rPr>
+          <w:color w:val="000000" w:themeColor="text1"/>
+          <w:sz w:val="22"/>
+          <w:szCs w:val="22"/>
+        </w:rPr>
+        <w:t xml:space="preserve"> ones we are ready to display the result.</w:t>
+      </w:r>
+    </w:p>
+    <w:p>
+      <w:pPr>
+        <w:pStyle w:val="ListParagraph"/>
+        <w:numPr>
+          <w:ilvl w:val="0"/>
+          <w:numId w:val="1"/>
+        </w:numPr>
+        <w:rPr>
+          <w:color w:val="000000" w:themeColor="text1"/>
+          <w:sz w:val="22"/>
+          <w:szCs w:val="22"/>
+        </w:rPr>
+      </w:pPr>
+      <w:r>
+        <w:rPr>
+          <w:color w:val="000000" w:themeColor="text1"/>
+          <w:sz w:val="22"/>
+          <w:szCs w:val="22"/>
+        </w:rPr>
+        <w:t xml:space="preserve">We can check the type of a variable, object, or array using the </w:t>
+      </w:r>
+      <w:proofErr w:type="spellStart"/>
+      <w:proofErr w:type="gramStart"/>
+      <w:r>
+        <w:rPr>
+          <w:color w:val="000000" w:themeColor="text1"/>
+          <w:sz w:val="22"/>
+          <w:szCs w:val="22"/>
+        </w:rPr>
+        <w:t>typeof</w:t>
+      </w:r>
+      <w:proofErr w:type="spellEnd"/>
+      <w:proofErr w:type="gramEnd"/>
+      <w:r>
+        <w:rPr>
+          <w:color w:val="000000" w:themeColor="text1"/>
+          <w:sz w:val="22"/>
+          <w:szCs w:val="22"/>
+        </w:rPr>
+        <w:t xml:space="preserve"> keyword</w:t>
+      </w:r>
+    </w:p>
+    <w:p>
+      <w:pPr>
+        <w:pStyle w:val="ListParagraph"/>
+        <w:numPr>
+          <w:ilvl w:val="0"/>
+          <w:numId w:val="1"/>
+        </w:numPr>
+        <w:rPr>
+          <w:color w:val="000000" w:themeColor="text1"/>
+          <w:sz w:val="22"/>
+          <w:szCs w:val="22"/>
+        </w:rPr>
+      </w:pPr>
+      <w:r>
+        <w:rPr>
+          <w:color w:val="000000" w:themeColor="text1"/>
+          <w:sz w:val="22"/>
+          <w:szCs w:val="22"/>
+        </w:rPr>
+        <w:t>We have escape characters just the same as in C++ and in Java.</w:t>
+      </w:r>
+    </w:p>
+    <w:p>
+      <w:pPr>
+        <w:pStyle w:val="ListParagraph"/>
+        <w:numPr>
+          <w:ilvl w:val="0"/>
+          <w:numId w:val="1"/>
+        </w:numPr>
+        <w:rPr>
+          <w:color w:val="000000" w:themeColor="text1"/>
+          <w:sz w:val="22"/>
+          <w:szCs w:val="22"/>
+        </w:rPr>
+      </w:pPr>
+      <w:r>
+        <w:rPr>
+          <w:color w:val="000000" w:themeColor="text1"/>
+          <w:sz w:val="22"/>
+          <w:szCs w:val="22"/>
+        </w:rPr>
+        <w:t xml:space="preserve">When using addition if one of the values is a string </w:t>
+      </w:r>
+      <w:proofErr w:type="spellStart"/>
+      <w:r>
+        <w:rPr>
+          <w:color w:val="000000" w:themeColor="text1"/>
+          <w:sz w:val="22"/>
+          <w:szCs w:val="22"/>
+        </w:rPr>
+        <w:t>javascript</w:t>
+      </w:r>
+      <w:proofErr w:type="spellEnd"/>
+      <w:r>
+        <w:rPr>
+          <w:color w:val="000000" w:themeColor="text1"/>
+          <w:sz w:val="22"/>
+          <w:szCs w:val="22"/>
+        </w:rPr>
+        <w:t xml:space="preserve"> will type cast all the elements into strings so “5” + 3 will be 53, the same with 3 + “5”</w:t>
+      </w:r>
+    </w:p>
+    <w:p>
+      <w:pPr>
+        <w:pStyle w:val="ListParagraph"/>
+        <w:numPr>
+          <w:ilvl w:val="0"/>
+          <w:numId w:val="1"/>
+        </w:numPr>
+        <w:rPr>
+          <w:color w:val="000000" w:themeColor="text1"/>
+          <w:sz w:val="22"/>
+          <w:szCs w:val="22"/>
+        </w:rPr>
+      </w:pPr>
+      <w:r>
+        <w:rPr>
+          <w:color w:val="000000" w:themeColor="text1"/>
+          <w:sz w:val="22"/>
+          <w:szCs w:val="22"/>
+        </w:rPr>
+        <w:t>${}</w:t>
+      </w:r>
+      <w:r>
+        <w:rPr>
+          <w:color w:val="000000" w:themeColor="text1"/>
+          <w:sz w:val="22"/>
+          <w:szCs w:val="22"/>
+        </w:rPr>
+        <w:t xml:space="preserve"> to include a variable inside a print the print should be of type ``</w:t>
+      </w:r>
+    </w:p>
+    <w:p>
+      <w:pPr>
+        <w:pStyle w:val="ListParagraph"/>
+        <w:numPr>
+          <w:ilvl w:val="0"/>
+          <w:numId w:val="1"/>
+        </w:numPr>
+        <w:rPr>
+          <w:color w:val="000000" w:themeColor="text1"/>
+          <w:sz w:val="22"/>
+          <w:szCs w:val="22"/>
+        </w:rPr>
+      </w:pPr>
+      <w:proofErr w:type="spellStart"/>
+      <w:r>
+        <w:rPr>
+          <w:color w:val="000000" w:themeColor="text1"/>
+          <w:sz w:val="22"/>
+          <w:szCs w:val="22"/>
+        </w:rPr>
+        <w:t>Javascript</w:t>
+      </w:r>
+      <w:proofErr w:type="spellEnd"/>
+      <w:r>
+        <w:rPr>
+          <w:color w:val="000000" w:themeColor="text1"/>
+          <w:sz w:val="22"/>
+          <w:szCs w:val="22"/>
+        </w:rPr>
+        <w:t xml:space="preserve"> uses camelCase</w:t>
+      </w:r>
+    </w:p>
+    <w:p>
+      <w:pPr>
+        <w:pStyle w:val="ListParagraph"/>
+        <w:numPr>
+          <w:ilvl w:val="0"/>
+          <w:numId w:val="1"/>
+        </w:numPr>
+        <w:rPr>
+          <w:color w:val="000000" w:themeColor="text1"/>
+          <w:sz w:val="22"/>
+          <w:szCs w:val="22"/>
+        </w:rPr>
+      </w:pPr>
+      <w:r>
+        <w:rPr>
+          <w:color w:val="000000" w:themeColor="text1"/>
+          <w:sz w:val="22"/>
+          <w:szCs w:val="22"/>
+        </w:rPr>
+        <w:t xml:space="preserve">Onclick is an event handler for the event of clicking. It runs </w:t>
+      </w:r>
+      <w:proofErr w:type="spellStart"/>
+      <w:r>
+        <w:rPr>
+          <w:color w:val="000000" w:themeColor="text1"/>
+          <w:sz w:val="22"/>
+          <w:szCs w:val="22"/>
+        </w:rPr>
+        <w:t>javascript</w:t>
+      </w:r>
+      <w:proofErr w:type="spellEnd"/>
+      <w:r>
+        <w:rPr>
+          <w:color w:val="000000" w:themeColor="text1"/>
+          <w:sz w:val="22"/>
+          <w:szCs w:val="22"/>
+        </w:rPr>
+        <w:t xml:space="preserve"> code. We can include the </w:t>
+      </w:r>
+      <w:proofErr w:type="spellStart"/>
+      <w:r>
+        <w:rPr>
+          <w:color w:val="000000" w:themeColor="text1"/>
+          <w:sz w:val="22"/>
+          <w:szCs w:val="22"/>
+        </w:rPr>
+        <w:t>javascript</w:t>
+      </w:r>
+      <w:proofErr w:type="spellEnd"/>
+      <w:r>
+        <w:rPr>
+          <w:color w:val="000000" w:themeColor="text1"/>
+          <w:sz w:val="22"/>
+          <w:szCs w:val="22"/>
+        </w:rPr>
+        <w:t xml:space="preserve"> code directly on the onclick or we can store it </w:t>
+      </w:r>
+      <w:proofErr w:type="gramStart"/>
+      <w:r>
+        <w:rPr>
+          <w:color w:val="000000" w:themeColor="text1"/>
+          <w:sz w:val="22"/>
+          <w:szCs w:val="22"/>
+        </w:rPr>
+        <w:t>into</w:t>
+      </w:r>
+      <w:proofErr w:type="gramEnd"/>
+      <w:r>
+        <w:rPr>
+          <w:color w:val="000000" w:themeColor="text1"/>
+          <w:sz w:val="22"/>
+          <w:szCs w:val="22"/>
+        </w:rPr>
+        <w:t xml:space="preserve"> a function that gets called.</w:t>
+      </w:r>
     </w:p>
     <w:p>
       <w:pPr>
@@ -478,284 +657,436 @@
           <w:u w:val="single"/>
         </w:rPr>
       </w:pPr>
-      <w:r>
+    </w:p>
+    <w:p>
+      <w:pPr>
         <w:rPr>
           <w:b/>
           <w:bCs/>
           <w:color w:val="000000" w:themeColor="text1"/>
           <w:u w:val="single"/>
         </w:rPr>
-        <w:t>Numbers &amp; Math:</w:t>
-      </w:r>
-    </w:p>
-    <w:p>
-      <w:pPr>
-        <w:pStyle w:val="ListParagraph"/>
-        <w:numPr>
-          <w:ilvl w:val="0"/>
-          <w:numId w:val="2"/>
-        </w:numPr>
-        <w:rPr>
-          <w:color w:val="000000" w:themeColor="text1"/>
-          <w:sz w:val="22"/>
-          <w:szCs w:val="22"/>
-        </w:rPr>
-      </w:pPr>
-      <w:r>
-        <w:rPr>
-          <w:color w:val="000000" w:themeColor="text1"/>
-          <w:sz w:val="22"/>
-          <w:szCs w:val="22"/>
-        </w:rPr>
-        <w:t>For numerical values javascript has only one numerical datatype which is Number, no int &amp; float like Java.</w:t>
-      </w:r>
-    </w:p>
-    <w:p>
-      <w:pPr>
-        <w:pStyle w:val="ListParagraph"/>
-        <w:numPr>
-          <w:ilvl w:val="0"/>
-          <w:numId w:val="2"/>
-        </w:numPr>
-        <w:rPr>
-          <w:color w:val="000000" w:themeColor="text1"/>
-          <w:sz w:val="22"/>
-          <w:szCs w:val="22"/>
-        </w:rPr>
-      </w:pPr>
-      <w:r>
-        <w:rPr>
-          <w:color w:val="000000" w:themeColor="text1"/>
-          <w:sz w:val="22"/>
-          <w:szCs w:val="22"/>
-        </w:rPr>
-        <w:t xml:space="preserve">Has addition, subtraction, power using **, and follows the math operation heirerachy. </w:t>
-      </w:r>
-    </w:p>
-    <w:p>
-      <w:pPr>
-        <w:pStyle w:val="ListParagraph"/>
-        <w:numPr>
-          <w:ilvl w:val="0"/>
-          <w:numId w:val="2"/>
-        </w:numPr>
-        <w:rPr>
-          <w:color w:val="000000" w:themeColor="text1"/>
-          <w:sz w:val="22"/>
-          <w:szCs w:val="22"/>
-        </w:rPr>
-      </w:pPr>
-      <w:r>
-        <w:rPr>
-          <w:color w:val="000000" w:themeColor="text1"/>
-          <w:sz w:val="22"/>
-          <w:szCs w:val="22"/>
-        </w:rPr>
-        <w:t>Has also Math.sqrt() and other mathematical functions.</w:t>
-      </w:r>
-      <w:r>
-        <w:t xml:space="preserve"> </w:t>
-      </w:r>
-      <w:proofErr w:type="gramStart"/>
-      <w:r>
-        <w:rPr>
-          <w:color w:val="000000" w:themeColor="text1"/>
-          <w:sz w:val="22"/>
-          <w:szCs w:val="22"/>
-        </w:rPr>
-        <w:t>Math.abs(</w:t>
-      </w:r>
-      <w:proofErr w:type="gramEnd"/>
-      <w:r>
-        <w:rPr>
-          <w:color w:val="000000" w:themeColor="text1"/>
-          <w:sz w:val="22"/>
-          <w:szCs w:val="22"/>
-        </w:rPr>
-        <w:t>)</w:t>
-      </w:r>
-      <w:r>
-        <w:rPr>
-          <w:color w:val="000000" w:themeColor="text1"/>
-          <w:sz w:val="22"/>
-          <w:szCs w:val="22"/>
-        </w:rPr>
-        <w:t xml:space="preserve">, </w:t>
-      </w:r>
-      <w:r>
-        <w:rPr>
-          <w:color w:val="000000" w:themeColor="text1"/>
-          <w:sz w:val="22"/>
-          <w:szCs w:val="22"/>
-        </w:rPr>
-        <w:t>Math.sqrt(),</w:t>
-      </w:r>
-      <w:r>
-        <w:rPr>
-          <w:color w:val="000000" w:themeColor="text1"/>
-          <w:sz w:val="22"/>
-          <w:szCs w:val="22"/>
-        </w:rPr>
-        <w:t xml:space="preserve"> </w:t>
-      </w:r>
-      <w:proofErr w:type="gramStart"/>
-      <w:r>
-        <w:rPr>
-          <w:color w:val="000000" w:themeColor="text1"/>
-          <w:sz w:val="22"/>
-          <w:szCs w:val="22"/>
-        </w:rPr>
-        <w:t>Math.pow(</w:t>
-      </w:r>
-      <w:proofErr w:type="gramEnd"/>
-      <w:r>
-        <w:rPr>
-          <w:color w:val="000000" w:themeColor="text1"/>
-          <w:sz w:val="22"/>
-          <w:szCs w:val="22"/>
-        </w:rPr>
-        <w:t>),</w:t>
-      </w:r>
-      <w:r>
-        <w:rPr>
-          <w:color w:val="000000" w:themeColor="text1"/>
-          <w:sz w:val="22"/>
-          <w:szCs w:val="22"/>
-        </w:rPr>
-        <w:t xml:space="preserve"> </w:t>
-      </w:r>
-      <w:proofErr w:type="gramStart"/>
-      <w:r>
-        <w:rPr>
-          <w:color w:val="000000" w:themeColor="text1"/>
-          <w:sz w:val="22"/>
-          <w:szCs w:val="22"/>
-        </w:rPr>
-        <w:t>Math.max(</w:t>
-      </w:r>
-      <w:proofErr w:type="gramEnd"/>
-      <w:r>
-        <w:rPr>
-          <w:color w:val="000000" w:themeColor="text1"/>
-          <w:sz w:val="22"/>
-          <w:szCs w:val="22"/>
-        </w:rPr>
-        <w:t>),</w:t>
-      </w:r>
-      <w:r>
-        <w:rPr>
-          <w:color w:val="000000" w:themeColor="text1"/>
-          <w:sz w:val="22"/>
-          <w:szCs w:val="22"/>
-        </w:rPr>
-        <w:t xml:space="preserve"> </w:t>
-      </w:r>
-      <w:proofErr w:type="gramStart"/>
-      <w:r>
-        <w:rPr>
-          <w:color w:val="000000" w:themeColor="text1"/>
-          <w:sz w:val="22"/>
-          <w:szCs w:val="22"/>
-        </w:rPr>
-        <w:t>Math.min(</w:t>
-      </w:r>
-      <w:proofErr w:type="gramEnd"/>
-      <w:r>
-        <w:rPr>
-          <w:color w:val="000000" w:themeColor="text1"/>
-          <w:sz w:val="22"/>
-          <w:szCs w:val="22"/>
-        </w:rPr>
-        <w:t>)</w:t>
-      </w:r>
-    </w:p>
-    <w:p>
-      <w:pPr>
-        <w:pStyle w:val="ListParagraph"/>
-        <w:numPr>
-          <w:ilvl w:val="0"/>
-          <w:numId w:val="2"/>
-        </w:numPr>
-        <w:rPr>
-          <w:color w:val="000000" w:themeColor="text1"/>
-          <w:sz w:val="22"/>
-          <w:szCs w:val="22"/>
-        </w:rPr>
-      </w:pPr>
-      <w:r>
-        <w:rPr>
-          <w:color w:val="000000" w:themeColor="text1"/>
-          <w:sz w:val="22"/>
-          <w:szCs w:val="22"/>
-        </w:rPr>
-        <w:t>Math.random() returns a number between 0-1 including the 0 but not the 1</w:t>
-      </w:r>
-    </w:p>
-    <w:p>
-      <w:pPr>
-        <w:pStyle w:val="ListParagraph"/>
-        <w:numPr>
-          <w:ilvl w:val="0"/>
-          <w:numId w:val="2"/>
-        </w:numPr>
-        <w:rPr>
-          <w:color w:val="000000" w:themeColor="text1"/>
-          <w:sz w:val="22"/>
-          <w:szCs w:val="22"/>
-        </w:rPr>
-      </w:pPr>
-      <w:r>
-        <w:rPr>
-          <w:color w:val="000000" w:themeColor="text1"/>
-          <w:sz w:val="22"/>
-          <w:szCs w:val="22"/>
-        </w:rPr>
-        <w:t xml:space="preserve">We have </w:t>
-      </w:r>
-      <w:proofErr w:type="gramStart"/>
-      <w:r>
-        <w:rPr>
-          <w:color w:val="000000" w:themeColor="text1"/>
-          <w:sz w:val="22"/>
-          <w:szCs w:val="22"/>
-        </w:rPr>
-        <w:t>BigInt(</w:t>
-      </w:r>
-      <w:proofErr w:type="gramEnd"/>
-      <w:r>
-        <w:rPr>
-          <w:color w:val="000000" w:themeColor="text1"/>
-          <w:sz w:val="22"/>
-          <w:szCs w:val="22"/>
-        </w:rPr>
-        <w:t>) datatype, that we can use for huge numerical values and it ends with n so 13423423532523532n is a big integer and can be only operated on with other Bigint variables</w:t>
-      </w:r>
-    </w:p>
-    <w:p>
-      <w:pPr>
-        <w:rPr>
-          <w:color w:val="000000" w:themeColor="text1"/>
-          <w:sz w:val="22"/>
-          <w:szCs w:val="22"/>
-        </w:rPr>
-      </w:pPr>
-    </w:p>
-    <w:p>
-      <w:pPr>
+      </w:pPr>
+      <w:r>
         <w:rPr>
           <w:b/>
           <w:bCs/>
           <w:color w:val="000000" w:themeColor="text1"/>
           <w:u w:val="single"/>
         </w:rPr>
-      </w:pPr>
-      <w:r>
+        <w:t>Numbers &amp; Math:</w:t>
+      </w:r>
+    </w:p>
+    <w:p>
+      <w:pPr>
+        <w:pStyle w:val="ListParagraph"/>
+        <w:numPr>
+          <w:ilvl w:val="0"/>
+          <w:numId w:val="2"/>
+        </w:numPr>
+        <w:rPr>
+          <w:color w:val="000000" w:themeColor="text1"/>
+          <w:sz w:val="22"/>
+          <w:szCs w:val="22"/>
+        </w:rPr>
+      </w:pPr>
+      <w:r>
+        <w:rPr>
+          <w:color w:val="000000" w:themeColor="text1"/>
+          <w:sz w:val="22"/>
+          <w:szCs w:val="22"/>
+        </w:rPr>
+        <w:t xml:space="preserve">For numerical values </w:t>
+      </w:r>
+      <w:proofErr w:type="spellStart"/>
+      <w:r>
+        <w:rPr>
+          <w:color w:val="000000" w:themeColor="text1"/>
+          <w:sz w:val="22"/>
+          <w:szCs w:val="22"/>
+        </w:rPr>
+        <w:t>javascript</w:t>
+      </w:r>
+      <w:proofErr w:type="spellEnd"/>
+      <w:r>
+        <w:rPr>
+          <w:color w:val="000000" w:themeColor="text1"/>
+          <w:sz w:val="22"/>
+          <w:szCs w:val="22"/>
+        </w:rPr>
+        <w:t xml:space="preserve"> has only one numerical datatype which is Number, no int &amp; float like Java.</w:t>
+      </w:r>
+    </w:p>
+    <w:p>
+      <w:pPr>
+        <w:pStyle w:val="ListParagraph"/>
+        <w:numPr>
+          <w:ilvl w:val="0"/>
+          <w:numId w:val="2"/>
+        </w:numPr>
+        <w:rPr>
+          <w:color w:val="000000" w:themeColor="text1"/>
+          <w:sz w:val="22"/>
+          <w:szCs w:val="22"/>
+        </w:rPr>
+      </w:pPr>
+      <w:r>
+        <w:rPr>
+          <w:color w:val="000000" w:themeColor="text1"/>
+          <w:sz w:val="22"/>
+          <w:szCs w:val="22"/>
+        </w:rPr>
+        <w:t xml:space="preserve">Has addition, subtraction, power using **, and follows the math operation </w:t>
+      </w:r>
+      <w:proofErr w:type="spellStart"/>
+      <w:r>
+        <w:rPr>
+          <w:color w:val="000000" w:themeColor="text1"/>
+          <w:sz w:val="22"/>
+          <w:szCs w:val="22"/>
+        </w:rPr>
+        <w:t>heirerachy</w:t>
+      </w:r>
+      <w:proofErr w:type="spellEnd"/>
+      <w:r>
+        <w:rPr>
+          <w:color w:val="000000" w:themeColor="text1"/>
+          <w:sz w:val="22"/>
+          <w:szCs w:val="22"/>
+        </w:rPr>
+        <w:t xml:space="preserve">. </w:t>
+      </w:r>
+    </w:p>
+    <w:p>
+      <w:pPr>
+        <w:pStyle w:val="ListParagraph"/>
+        <w:numPr>
+          <w:ilvl w:val="0"/>
+          <w:numId w:val="2"/>
+        </w:numPr>
+        <w:rPr>
+          <w:color w:val="000000" w:themeColor="text1"/>
+          <w:sz w:val="22"/>
+          <w:szCs w:val="22"/>
+        </w:rPr>
+      </w:pPr>
+      <w:r>
+        <w:rPr>
+          <w:color w:val="000000" w:themeColor="text1"/>
+          <w:sz w:val="22"/>
+          <w:szCs w:val="22"/>
+        </w:rPr>
+        <w:t xml:space="preserve">Has also </w:t>
+      </w:r>
+      <w:proofErr w:type="spellStart"/>
+      <w:r>
+        <w:rPr>
+          <w:color w:val="000000" w:themeColor="text1"/>
+          <w:sz w:val="22"/>
+          <w:szCs w:val="22"/>
+        </w:rPr>
+        <w:t>Math.sqrt</w:t>
+      </w:r>
+      <w:proofErr w:type="spellEnd"/>
+      <w:r>
+        <w:rPr>
+          <w:color w:val="000000" w:themeColor="text1"/>
+          <w:sz w:val="22"/>
+          <w:szCs w:val="22"/>
+        </w:rPr>
+        <w:t>() and other mathematical functions.</w:t>
+      </w:r>
+      <w:r>
+        <w:t xml:space="preserve"> </w:t>
+      </w:r>
+      <w:proofErr w:type="spellStart"/>
+      <w:proofErr w:type="gramStart"/>
+      <w:r>
+        <w:rPr>
+          <w:color w:val="000000" w:themeColor="text1"/>
+          <w:sz w:val="22"/>
+          <w:szCs w:val="22"/>
+        </w:rPr>
+        <w:t>Math.abs</w:t>
+      </w:r>
+      <w:proofErr w:type="spellEnd"/>
+      <w:r>
+        <w:rPr>
+          <w:color w:val="000000" w:themeColor="text1"/>
+          <w:sz w:val="22"/>
+          <w:szCs w:val="22"/>
+        </w:rPr>
+        <w:t>(</w:t>
+      </w:r>
+      <w:proofErr w:type="gramEnd"/>
+      <w:r>
+        <w:rPr>
+          <w:color w:val="000000" w:themeColor="text1"/>
+          <w:sz w:val="22"/>
+          <w:szCs w:val="22"/>
+        </w:rPr>
+        <w:t>)</w:t>
+      </w:r>
+      <w:r>
+        <w:rPr>
+          <w:color w:val="000000" w:themeColor="text1"/>
+          <w:sz w:val="22"/>
+          <w:szCs w:val="22"/>
+        </w:rPr>
+        <w:t xml:space="preserve">, </w:t>
+      </w:r>
+      <w:proofErr w:type="spellStart"/>
+      <w:r>
+        <w:rPr>
+          <w:color w:val="000000" w:themeColor="text1"/>
+          <w:sz w:val="22"/>
+          <w:szCs w:val="22"/>
+        </w:rPr>
+        <w:t>Math.sqrt</w:t>
+      </w:r>
+      <w:proofErr w:type="spellEnd"/>
+      <w:r>
+        <w:rPr>
+          <w:color w:val="000000" w:themeColor="text1"/>
+          <w:sz w:val="22"/>
+          <w:szCs w:val="22"/>
+        </w:rPr>
+        <w:t>(),</w:t>
+      </w:r>
+      <w:r>
+        <w:rPr>
+          <w:color w:val="000000" w:themeColor="text1"/>
+          <w:sz w:val="22"/>
+          <w:szCs w:val="22"/>
+        </w:rPr>
+        <w:t xml:space="preserve"> </w:t>
+      </w:r>
+      <w:proofErr w:type="spellStart"/>
+      <w:proofErr w:type="gramStart"/>
+      <w:r>
+        <w:rPr>
+          <w:color w:val="000000" w:themeColor="text1"/>
+          <w:sz w:val="22"/>
+          <w:szCs w:val="22"/>
+        </w:rPr>
+        <w:t>Math.pow</w:t>
+      </w:r>
+      <w:proofErr w:type="spellEnd"/>
+      <w:r>
+        <w:rPr>
+          <w:color w:val="000000" w:themeColor="text1"/>
+          <w:sz w:val="22"/>
+          <w:szCs w:val="22"/>
+        </w:rPr>
+        <w:t>(</w:t>
+      </w:r>
+      <w:proofErr w:type="gramEnd"/>
+      <w:r>
+        <w:rPr>
+          <w:color w:val="000000" w:themeColor="text1"/>
+          <w:sz w:val="22"/>
+          <w:szCs w:val="22"/>
+        </w:rPr>
+        <w:t>),</w:t>
+      </w:r>
+      <w:r>
+        <w:rPr>
+          <w:color w:val="000000" w:themeColor="text1"/>
+          <w:sz w:val="22"/>
+          <w:szCs w:val="22"/>
+        </w:rPr>
+        <w:t xml:space="preserve"> </w:t>
+      </w:r>
+      <w:proofErr w:type="spellStart"/>
+      <w:proofErr w:type="gramStart"/>
+      <w:r>
+        <w:rPr>
+          <w:color w:val="000000" w:themeColor="text1"/>
+          <w:sz w:val="22"/>
+          <w:szCs w:val="22"/>
+        </w:rPr>
+        <w:t>Math.max</w:t>
+      </w:r>
+      <w:proofErr w:type="spellEnd"/>
+      <w:r>
+        <w:rPr>
+          <w:color w:val="000000" w:themeColor="text1"/>
+          <w:sz w:val="22"/>
+          <w:szCs w:val="22"/>
+        </w:rPr>
+        <w:t>(</w:t>
+      </w:r>
+      <w:proofErr w:type="gramEnd"/>
+      <w:r>
+        <w:rPr>
+          <w:color w:val="000000" w:themeColor="text1"/>
+          <w:sz w:val="22"/>
+          <w:szCs w:val="22"/>
+        </w:rPr>
+        <w:t>),</w:t>
+      </w:r>
+      <w:r>
+        <w:rPr>
+          <w:color w:val="000000" w:themeColor="text1"/>
+          <w:sz w:val="22"/>
+          <w:szCs w:val="22"/>
+        </w:rPr>
+        <w:t xml:space="preserve"> </w:t>
+      </w:r>
+      <w:proofErr w:type="spellStart"/>
+      <w:proofErr w:type="gramStart"/>
+      <w:r>
+        <w:rPr>
+          <w:color w:val="000000" w:themeColor="text1"/>
+          <w:sz w:val="22"/>
+          <w:szCs w:val="22"/>
+        </w:rPr>
+        <w:t>Math.min</w:t>
+      </w:r>
+      <w:proofErr w:type="spellEnd"/>
+      <w:r>
+        <w:rPr>
+          <w:color w:val="000000" w:themeColor="text1"/>
+          <w:sz w:val="22"/>
+          <w:szCs w:val="22"/>
+        </w:rPr>
+        <w:t>(</w:t>
+      </w:r>
+      <w:proofErr w:type="gramEnd"/>
+      <w:r>
+        <w:rPr>
+          <w:color w:val="000000" w:themeColor="text1"/>
+          <w:sz w:val="22"/>
+          <w:szCs w:val="22"/>
+        </w:rPr>
+        <w:t>)</w:t>
+      </w:r>
+    </w:p>
+    <w:p>
+      <w:pPr>
+        <w:pStyle w:val="ListParagraph"/>
+        <w:numPr>
+          <w:ilvl w:val="0"/>
+          <w:numId w:val="2"/>
+        </w:numPr>
+        <w:rPr>
+          <w:color w:val="000000" w:themeColor="text1"/>
+          <w:sz w:val="22"/>
+          <w:szCs w:val="22"/>
+        </w:rPr>
+      </w:pPr>
+      <w:proofErr w:type="spellStart"/>
+      <w:r>
+        <w:rPr>
+          <w:color w:val="000000" w:themeColor="text1"/>
+          <w:sz w:val="22"/>
+          <w:szCs w:val="22"/>
+        </w:rPr>
+        <w:t>Math.random</w:t>
+      </w:r>
+      <w:proofErr w:type="spellEnd"/>
+      <w:r>
+        <w:rPr>
+          <w:color w:val="000000" w:themeColor="text1"/>
+          <w:sz w:val="22"/>
+          <w:szCs w:val="22"/>
+        </w:rPr>
+        <w:t>() returns a number between 0-1 including the 0 but not the 1</w:t>
+      </w:r>
+    </w:p>
+    <w:p>
+      <w:pPr>
+        <w:pStyle w:val="ListParagraph"/>
+        <w:numPr>
+          <w:ilvl w:val="0"/>
+          <w:numId w:val="2"/>
+        </w:numPr>
+        <w:rPr>
+          <w:color w:val="000000" w:themeColor="text1"/>
+          <w:sz w:val="22"/>
+          <w:szCs w:val="22"/>
+        </w:rPr>
+      </w:pPr>
+      <w:r>
+        <w:rPr>
+          <w:color w:val="000000" w:themeColor="text1"/>
+          <w:sz w:val="22"/>
+          <w:szCs w:val="22"/>
+        </w:rPr>
+        <w:t xml:space="preserve">We have </w:t>
+      </w:r>
+      <w:proofErr w:type="spellStart"/>
+      <w:proofErr w:type="gramStart"/>
+      <w:r>
+        <w:rPr>
+          <w:color w:val="000000" w:themeColor="text1"/>
+          <w:sz w:val="22"/>
+          <w:szCs w:val="22"/>
+        </w:rPr>
+        <w:t>BigInt</w:t>
+      </w:r>
+      <w:proofErr w:type="spellEnd"/>
+      <w:r>
+        <w:rPr>
+          <w:color w:val="000000" w:themeColor="text1"/>
+          <w:sz w:val="22"/>
+          <w:szCs w:val="22"/>
+        </w:rPr>
+        <w:t>(</w:t>
+      </w:r>
+      <w:proofErr w:type="gramEnd"/>
+      <w:r>
+        <w:rPr>
+          <w:color w:val="000000" w:themeColor="text1"/>
+          <w:sz w:val="22"/>
+          <w:szCs w:val="22"/>
+        </w:rPr>
+        <w:t xml:space="preserve">) datatype, that we can use for huge numerical values and it ends with n so 13423423532523532n is a big integer and can be only operated on with other </w:t>
+      </w:r>
+      <w:proofErr w:type="spellStart"/>
+      <w:r>
+        <w:rPr>
+          <w:color w:val="000000" w:themeColor="text1"/>
+          <w:sz w:val="22"/>
+          <w:szCs w:val="22"/>
+        </w:rPr>
+        <w:t>Bigint</w:t>
+      </w:r>
+      <w:proofErr w:type="spellEnd"/>
+      <w:r>
+        <w:rPr>
+          <w:color w:val="000000" w:themeColor="text1"/>
+          <w:sz w:val="22"/>
+          <w:szCs w:val="22"/>
+        </w:rPr>
+        <w:t xml:space="preserve"> variables</w:t>
+      </w:r>
+    </w:p>
+    <w:p>
+      <w:pPr>
+        <w:rPr>
+          <w:color w:val="000000" w:themeColor="text1"/>
+          <w:sz w:val="22"/>
+          <w:szCs w:val="22"/>
+        </w:rPr>
+      </w:pPr>
+    </w:p>
+    <w:p>
+      <w:pPr>
         <w:rPr>
           <w:b/>
           <w:bCs/>
           <w:color w:val="000000" w:themeColor="text1"/>
           <w:u w:val="single"/>
         </w:rPr>
+      </w:pPr>
+      <w:r>
+        <w:rPr>
+          <w:b/>
+          <w:bCs/>
+          <w:color w:val="000000" w:themeColor="text1"/>
+          <w:u w:val="single"/>
+        </w:rPr>
         <w:t>Strings:</w:t>
       </w:r>
     </w:p>
@@ -945,14 +1276,24 @@
           <w:szCs w:val="22"/>
         </w:rPr>
       </w:pPr>
-      <w:proofErr w:type="gramStart"/>
-      <w:r>
-        <w:rPr>
-          <w:color w:val="000000" w:themeColor="text1"/>
-          <w:sz w:val="22"/>
-          <w:szCs w:val="22"/>
-        </w:rPr>
-        <w:t>toUpper(</w:t>
+      <w:proofErr w:type="spellStart"/>
+      <w:proofErr w:type="gramStart"/>
+      <w:r>
+        <w:rPr>
+          <w:color w:val="000000" w:themeColor="text1"/>
+          <w:sz w:val="22"/>
+          <w:szCs w:val="22"/>
+        </w:rPr>
+        <w:t>toUpper</w:t>
+      </w:r>
+      <w:proofErr w:type="spellEnd"/>
+      <w:r>
+        <w:rPr>
+          <w:color w:val="000000" w:themeColor="text1"/>
+          <w:sz w:val="22"/>
+          <w:szCs w:val="22"/>
+        </w:rPr>
+        <w:t>(</w:t>
       </w:r>
       <w:proofErr w:type="gramEnd"/>
       <w:r>
@@ -963,14 +1304,24 @@
         </w:rPr>
         <w:t xml:space="preserve">) and </w:t>
       </w:r>
-      <w:proofErr w:type="gramStart"/>
-      <w:r>
-        <w:rPr>
-          <w:color w:val="000000" w:themeColor="text1"/>
-          <w:sz w:val="22"/>
-          <w:szCs w:val="22"/>
-        </w:rPr>
-        <w:t>toLower(</w:t>
+      <w:proofErr w:type="spellStart"/>
+      <w:proofErr w:type="gramStart"/>
+      <w:r>
+        <w:rPr>
+          <w:color w:val="000000" w:themeColor="text1"/>
+          <w:sz w:val="22"/>
+          <w:szCs w:val="22"/>
+        </w:rPr>
+        <w:t>toLower</w:t>
+      </w:r>
+      <w:proofErr w:type="spellEnd"/>
+      <w:r>
+        <w:rPr>
+          <w:color w:val="000000" w:themeColor="text1"/>
+          <w:sz w:val="22"/>
+          <w:szCs w:val="22"/>
+        </w:rPr>
+        <w:t>(</w:t>
       </w:r>
       <w:proofErr w:type="gramEnd"/>
       <w:r>
@@ -1022,14 +1373,42 @@
         </w:rPr>
         <w:t>slice(</w:t>
       </w:r>
-      <w:proofErr w:type="gramEnd"/>
-      <w:r>
-        <w:rPr>
-          <w:color w:val="000000" w:themeColor="text1"/>
-          <w:sz w:val="22"/>
-          <w:szCs w:val="22"/>
-        </w:rPr>
-        <w:t>startindex, endindex) this lets us extract a certain part of a string.</w:t>
+      <w:proofErr w:type="spellStart"/>
+      <w:proofErr w:type="gramEnd"/>
+      <w:r>
+        <w:rPr>
+          <w:color w:val="000000" w:themeColor="text1"/>
+          <w:sz w:val="22"/>
+          <w:szCs w:val="22"/>
+        </w:rPr>
+        <w:t>startindex</w:t>
+      </w:r>
+      <w:proofErr w:type="spellEnd"/>
+      <w:r>
+        <w:rPr>
+          <w:color w:val="000000" w:themeColor="text1"/>
+          <w:sz w:val="22"/>
+          <w:szCs w:val="22"/>
+        </w:rPr>
+        <w:t xml:space="preserve">, </w:t>
+      </w:r>
+      <w:proofErr w:type="spellStart"/>
+      <w:r>
+        <w:rPr>
+          <w:color w:val="000000" w:themeColor="text1"/>
+          <w:sz w:val="22"/>
+          <w:szCs w:val="22"/>
+        </w:rPr>
+        <w:t>endindex</w:t>
+      </w:r>
+      <w:proofErr w:type="spellEnd"/>
+      <w:r>
+        <w:rPr>
+          <w:color w:val="000000" w:themeColor="text1"/>
+          <w:sz w:val="22"/>
+          <w:szCs w:val="22"/>
+        </w:rPr>
+        <w:t>) this lets us extract a certain part of a string.</w:t>
       </w:r>
     </w:p>
     <w:p>
@@ -1191,7 +1570,25 @@
           <w:sz w:val="22"/>
           <w:szCs w:val="22"/>
         </w:rPr>
-        <w:t>The main difference between let and var is that var ignores the scope in which it was declared on, which makes var less used and not recommended when using modern javascript code</w:t>
+        <w:t xml:space="preserve">The main difference between let and var is that var ignores the scope in which it was declared on, which makes var less used and not recommended when using modern </w:t>
+      </w:r>
+      <w:proofErr w:type="spellStart"/>
+      <w:r>
+        <w:rPr>
+          <w:color w:val="000000" w:themeColor="text1"/>
+          <w:sz w:val="22"/>
+          <w:szCs w:val="22"/>
+        </w:rPr>
+        <w:t>javascript</w:t>
+      </w:r>
+      <w:proofErr w:type="spellEnd"/>
+      <w:r>
+        <w:rPr>
+          <w:color w:val="000000" w:themeColor="text1"/>
+          <w:sz w:val="22"/>
+          <w:szCs w:val="22"/>
+        </w:rPr>
+        <w:t xml:space="preserve"> code</w:t>
       </w:r>
     </w:p>
     <w:p>
@@ -1291,6 +1688,7 @@
         </w:rPr>
         <w:t xml:space="preserve">In </w:t>
       </w:r>
+      <w:proofErr w:type="spellStart"/>
       <w:proofErr w:type="gramStart"/>
       <w:r>
         <w:rPr>
@@ -1300,6 +1698,7 @@
         </w:rPr>
         <w:t>javascript</w:t>
       </w:r>
+      <w:proofErr w:type="spellEnd"/>
       <w:proofErr w:type="gramEnd"/>
       <w:r>
         <w:rPr>
@@ -1377,7 +1776,25 @@
           <w:sz w:val="22"/>
           <w:szCs w:val="22"/>
         </w:rPr>
-        <w:t xml:space="preserve"> a const variable cant be changed, but a const property inside a class can</w:t>
+        <w:t xml:space="preserve"> a const variable </w:t>
+      </w:r>
+      <w:proofErr w:type="spellStart"/>
+      <w:r>
+        <w:rPr>
+          <w:color w:val="000000" w:themeColor="text1"/>
+          <w:sz w:val="22"/>
+          <w:szCs w:val="22"/>
+        </w:rPr>
+        <w:t>cant</w:t>
+      </w:r>
+      <w:proofErr w:type="spellEnd"/>
+      <w:r>
+        <w:rPr>
+          <w:color w:val="000000" w:themeColor="text1"/>
+          <w:sz w:val="22"/>
+          <w:szCs w:val="22"/>
+        </w:rPr>
+        <w:t xml:space="preserve"> be changed, but a const property inside a class can</w:t>
       </w:r>
       <w:r>
         <w:rPr>
@@ -1484,13 +1901,23 @@
           <w:szCs w:val="22"/>
         </w:rPr>
       </w:pPr>
-      <w:r>
-        <w:rPr>
-          <w:color w:val="000000" w:themeColor="text1"/>
-          <w:sz w:val="22"/>
-          <w:szCs w:val="22"/>
-        </w:rPr>
-        <w:t>NaN means not a number and is also a false value</w:t>
+      <w:proofErr w:type="spellStart"/>
+      <w:r>
+        <w:rPr>
+          <w:color w:val="000000" w:themeColor="text1"/>
+          <w:sz w:val="22"/>
+          <w:szCs w:val="22"/>
+        </w:rPr>
+        <w:t>NaN</w:t>
+      </w:r>
+      <w:proofErr w:type="spellEnd"/>
+      <w:r>
+        <w:rPr>
+          <w:color w:val="000000" w:themeColor="text1"/>
+          <w:sz w:val="22"/>
+          <w:szCs w:val="22"/>
+        </w:rPr>
+        <w:t xml:space="preserve"> means not a number and is also a false value</w:t>
       </w:r>
     </w:p>
     <w:p>
@@ -1656,26 +2083,54 @@
           <w:sz w:val="22"/>
           <w:szCs w:val="22"/>
         </w:rPr>
-        <w:t>let isLoggedIn = true;</w:t>
-      </w:r>
-    </w:p>
-    <w:p>
-      <w:pPr>
-        <w:pStyle w:val="ListParagraph"/>
-        <w:rPr>
-          <w:color w:val="000000" w:themeColor="text1"/>
-          <w:sz w:val="22"/>
-          <w:szCs w:val="22"/>
-        </w:rPr>
-      </w:pPr>
-      <w:proofErr w:type="gramStart"/>
-      <w:r>
-        <w:rPr>
-          <w:color w:val="000000" w:themeColor="text1"/>
-          <w:sz w:val="22"/>
-          <w:szCs w:val="22"/>
-        </w:rPr>
-        <w:t>isLoggedIn &amp;&amp;</w:t>
+        <w:t xml:space="preserve">let </w:t>
+      </w:r>
+      <w:proofErr w:type="spellStart"/>
+      <w:r>
+        <w:rPr>
+          <w:color w:val="000000" w:themeColor="text1"/>
+          <w:sz w:val="22"/>
+          <w:szCs w:val="22"/>
+        </w:rPr>
+        <w:t>isLoggedIn</w:t>
+      </w:r>
+      <w:proofErr w:type="spellEnd"/>
+      <w:r>
+        <w:rPr>
+          <w:color w:val="000000" w:themeColor="text1"/>
+          <w:sz w:val="22"/>
+          <w:szCs w:val="22"/>
+        </w:rPr>
+        <w:t xml:space="preserve"> = true;</w:t>
+      </w:r>
+    </w:p>
+    <w:p>
+      <w:pPr>
+        <w:pStyle w:val="ListParagraph"/>
+        <w:rPr>
+          <w:color w:val="000000" w:themeColor="text1"/>
+          <w:sz w:val="22"/>
+          <w:szCs w:val="22"/>
+        </w:rPr>
+      </w:pPr>
+      <w:proofErr w:type="spellStart"/>
+      <w:proofErr w:type="gramStart"/>
+      <w:r>
+        <w:rPr>
+          <w:color w:val="000000" w:themeColor="text1"/>
+          <w:sz w:val="22"/>
+          <w:szCs w:val="22"/>
+        </w:rPr>
+        <w:t>isLoggedIn</w:t>
+      </w:r>
+      <w:proofErr w:type="spellEnd"/>
+      <w:r>
+        <w:rPr>
+          <w:color w:val="000000" w:themeColor="text1"/>
+          <w:sz w:val="22"/>
+          <w:szCs w:val="22"/>
+        </w:rPr>
+        <w:t xml:space="preserve"> &amp;&amp;</w:t>
       </w:r>
       <w:proofErr w:type="gramEnd"/>
       <w:r>
@@ -1926,13 +2381,41 @@
           <w:szCs w:val="22"/>
         </w:rPr>
       </w:pPr>
-      <w:r>
-        <w:rPr>
-          <w:color w:val="000000" w:themeColor="text1"/>
-          <w:sz w:val="22"/>
-          <w:szCs w:val="22"/>
-        </w:rPr>
-        <w:t xml:space="preserve">JSON.stringify() is a function that takes a javascript object format and converts It into a string or JSON </w:t>
+      <w:proofErr w:type="spellStart"/>
+      <w:r>
+        <w:rPr>
+          <w:color w:val="000000" w:themeColor="text1"/>
+          <w:sz w:val="22"/>
+          <w:szCs w:val="22"/>
+        </w:rPr>
+        <w:t>JSON.stringify</w:t>
+      </w:r>
+      <w:proofErr w:type="spellEnd"/>
+      <w:r>
+        <w:rPr>
+          <w:color w:val="000000" w:themeColor="text1"/>
+          <w:sz w:val="22"/>
+          <w:szCs w:val="22"/>
+        </w:rPr>
+        <w:t xml:space="preserve">() is a function that takes a </w:t>
+      </w:r>
+      <w:proofErr w:type="spellStart"/>
+      <w:r>
+        <w:rPr>
+          <w:color w:val="000000" w:themeColor="text1"/>
+          <w:sz w:val="22"/>
+          <w:szCs w:val="22"/>
+        </w:rPr>
+        <w:t>javascript</w:t>
+      </w:r>
+      <w:proofErr w:type="spellEnd"/>
+      <w:r>
+        <w:rPr>
+          <w:color w:val="000000" w:themeColor="text1"/>
+          <w:sz w:val="22"/>
+          <w:szCs w:val="22"/>
+        </w:rPr>
+        <w:t xml:space="preserve"> object format and converts It into a string or JSON </w:t>
       </w:r>
     </w:p>
     <w:p>
@@ -1948,13 +2431,23 @@
           <w:szCs w:val="22"/>
         </w:rPr>
       </w:pPr>
-      <w:r>
-        <w:rPr>
-          <w:color w:val="000000" w:themeColor="text1"/>
-          <w:sz w:val="22"/>
-          <w:szCs w:val="22"/>
-        </w:rPr>
-        <w:t>JSON.parse() does the opposite, it takes a JSON string and turns it back into a JS Object</w:t>
+      <w:proofErr w:type="spellStart"/>
+      <w:r>
+        <w:rPr>
+          <w:color w:val="000000" w:themeColor="text1"/>
+          <w:sz w:val="22"/>
+          <w:szCs w:val="22"/>
+        </w:rPr>
+        <w:t>JSON.parse</w:t>
+      </w:r>
+      <w:proofErr w:type="spellEnd"/>
+      <w:r>
+        <w:rPr>
+          <w:color w:val="000000" w:themeColor="text1"/>
+          <w:sz w:val="22"/>
+          <w:szCs w:val="22"/>
+        </w:rPr>
+        <w:t>() does the opposite, it takes a JSON string and turns it back into a JS Object</w:t>
       </w:r>
     </w:p>
     <w:p>
@@ -1970,6 +2463,7 @@
           <w:szCs w:val="22"/>
         </w:rPr>
       </w:pPr>
+      <w:proofErr w:type="spellStart"/>
       <w:proofErr w:type="gramStart"/>
       <w:r>
         <w:rPr>
@@ -1979,6 +2473,7 @@
         </w:rPr>
         <w:t>Its</w:t>
       </w:r>
+      <w:proofErr w:type="spellEnd"/>
       <w:proofErr w:type="gramEnd"/>
       <w:r>
         <w:rPr>
@@ -2054,7 +2549,25 @@
           <w:sz w:val="22"/>
           <w:szCs w:val="22"/>
         </w:rPr>
-        <w:t>Local storage lets the javascript saves some data into the browser so when the user refreshes, closes, or re-open the browser these data are not lost.</w:t>
+        <w:t xml:space="preserve">Local storage lets the </w:t>
+      </w:r>
+      <w:proofErr w:type="spellStart"/>
+      <w:r>
+        <w:rPr>
+          <w:color w:val="000000" w:themeColor="text1"/>
+          <w:sz w:val="22"/>
+          <w:szCs w:val="22"/>
+        </w:rPr>
+        <w:t>javascript</w:t>
+      </w:r>
+      <w:proofErr w:type="spellEnd"/>
+      <w:r>
+        <w:rPr>
+          <w:color w:val="000000" w:themeColor="text1"/>
+          <w:sz w:val="22"/>
+          <w:szCs w:val="22"/>
+        </w:rPr>
+        <w:t xml:space="preserve"> saves some data into the browser so when the user refreshes, closes, or re-open the browser these data are not lost.</w:t>
       </w:r>
     </w:p>
     <w:p>
@@ -2070,13 +2583,23 @@
           <w:szCs w:val="22"/>
         </w:rPr>
       </w:pPr>
-      <w:r>
-        <w:rPr>
-          <w:color w:val="000000" w:themeColor="text1"/>
-          <w:sz w:val="22"/>
-          <w:szCs w:val="22"/>
-        </w:rPr>
-        <w:t>localStorage.setItem(key, value);</w:t>
+      <w:proofErr w:type="spellStart"/>
+      <w:r>
+        <w:rPr>
+          <w:color w:val="000000" w:themeColor="text1"/>
+          <w:sz w:val="22"/>
+          <w:szCs w:val="22"/>
+        </w:rPr>
+        <w:t>localStorage.setItem</w:t>
+      </w:r>
+      <w:proofErr w:type="spellEnd"/>
+      <w:r>
+        <w:rPr>
+          <w:color w:val="000000" w:themeColor="text1"/>
+          <w:sz w:val="22"/>
+          <w:szCs w:val="22"/>
+        </w:rPr>
+        <w:t>(key, value);</w:t>
       </w:r>
       <w:r>
         <w:rPr>
@@ -2100,13 +2623,23 @@
           <w:szCs w:val="22"/>
         </w:rPr>
       </w:pPr>
-      <w:r>
-        <w:rPr>
-          <w:color w:val="000000" w:themeColor="text1"/>
-          <w:sz w:val="22"/>
-          <w:szCs w:val="22"/>
-        </w:rPr>
-        <w:t>localStorage.getItem("username");</w:t>
+      <w:proofErr w:type="spellStart"/>
+      <w:r>
+        <w:rPr>
+          <w:color w:val="000000" w:themeColor="text1"/>
+          <w:sz w:val="22"/>
+          <w:szCs w:val="22"/>
+        </w:rPr>
+        <w:t>localStorage.getItem</w:t>
+      </w:r>
+      <w:proofErr w:type="spellEnd"/>
+      <w:r>
+        <w:rPr>
+          <w:color w:val="000000" w:themeColor="text1"/>
+          <w:sz w:val="22"/>
+          <w:szCs w:val="22"/>
+        </w:rPr>
+        <w:t>("username");</w:t>
       </w:r>
       <w:r>
         <w:rPr>
@@ -2130,13 +2663,23 @@
           <w:szCs w:val="22"/>
         </w:rPr>
       </w:pPr>
-      <w:r>
-        <w:rPr>
-          <w:color w:val="000000" w:themeColor="text1"/>
-          <w:sz w:val="22"/>
-          <w:szCs w:val="22"/>
-        </w:rPr>
-        <w:t>localStorage.removeItem("username");</w:t>
+      <w:proofErr w:type="spellStart"/>
+      <w:r>
+        <w:rPr>
+          <w:color w:val="000000" w:themeColor="text1"/>
+          <w:sz w:val="22"/>
+          <w:szCs w:val="22"/>
+        </w:rPr>
+        <w:t>localStorage.removeItem</w:t>
+      </w:r>
+      <w:proofErr w:type="spellEnd"/>
+      <w:r>
+        <w:rPr>
+          <w:color w:val="000000" w:themeColor="text1"/>
+          <w:sz w:val="22"/>
+          <w:szCs w:val="22"/>
+        </w:rPr>
+        <w:t>("username");</w:t>
       </w:r>
     </w:p>
     <w:p>
@@ -2194,7 +2737,25 @@
           <w:sz w:val="22"/>
           <w:szCs w:val="22"/>
         </w:rPr>
-        <w:t xml:space="preserve">, then fetch it covnert it </w:t>
+        <w:t xml:space="preserve">, then fetch it </w:t>
+      </w:r>
+      <w:proofErr w:type="spellStart"/>
+      <w:r>
+        <w:rPr>
+          <w:color w:val="000000" w:themeColor="text1"/>
+          <w:sz w:val="22"/>
+          <w:szCs w:val="22"/>
+        </w:rPr>
+        <w:t>covnert</w:t>
+      </w:r>
+      <w:proofErr w:type="spellEnd"/>
+      <w:r>
+        <w:rPr>
+          <w:color w:val="000000" w:themeColor="text1"/>
+          <w:sz w:val="22"/>
+          <w:szCs w:val="22"/>
+        </w:rPr>
+        <w:t xml:space="preserve"> it </w:t>
       </w:r>
       <w:proofErr w:type="gramStart"/>
       <w:r>
@@ -2220,7 +2781,25 @@
           <w:sz w:val="22"/>
           <w:szCs w:val="22"/>
         </w:rPr>
-        <w:t>. Since local storage does not store anything beside strings</w:t>
+        <w:t xml:space="preserve">. Since local storage does not store anything </w:t>
+      </w:r>
+      <w:proofErr w:type="spellStart"/>
+      <w:r>
+        <w:rPr>
+          <w:color w:val="000000" w:themeColor="text1"/>
+          <w:sz w:val="22"/>
+          <w:szCs w:val="22"/>
+        </w:rPr>
+        <w:t>beside</w:t>
+      </w:r>
+      <w:proofErr w:type="spellEnd"/>
+      <w:r>
+        <w:rPr>
+          <w:color w:val="000000" w:themeColor="text1"/>
+          <w:sz w:val="22"/>
+          <w:szCs w:val="22"/>
+        </w:rPr>
+        <w:t xml:space="preserve"> strings</w:t>
       </w:r>
       <w:r>
         <w:rPr>
@@ -2377,6 +2956,7 @@
         </w:rPr>
         <w:t xml:space="preserve">We can add a property by easily just writing the object </w:t>
       </w:r>
+      <w:proofErr w:type="spellStart"/>
       <w:proofErr w:type="gramStart"/>
       <w:r>
         <w:rPr>
@@ -2386,6 +2966,7 @@
         </w:rPr>
         <w:t>name.newprop</w:t>
       </w:r>
+      <w:proofErr w:type="spellEnd"/>
       <w:proofErr w:type="gramEnd"/>
       <w:r>
         <w:rPr>
@@ -2417,6 +2998,7 @@
         </w:rPr>
         <w:t xml:space="preserve">delete </w:t>
       </w:r>
+      <w:proofErr w:type="spellStart"/>
       <w:proofErr w:type="gramStart"/>
       <w:r>
         <w:rPr>
@@ -2426,6 +3008,7 @@
         </w:rPr>
         <w:t>user.email</w:t>
       </w:r>
+      <w:proofErr w:type="spellEnd"/>
       <w:proofErr w:type="gramEnd"/>
       <w:r>
         <w:rPr>
@@ -2663,7 +3246,25 @@
           <w:sz w:val="22"/>
           <w:szCs w:val="22"/>
         </w:rPr>
-        <w:t>Object destructuring means taking properties out of an object and putting them into variables.</w:t>
+        <w:t xml:space="preserve">Object </w:t>
+      </w:r>
+      <w:proofErr w:type="spellStart"/>
+      <w:r>
+        <w:rPr>
+          <w:color w:val="000000" w:themeColor="text1"/>
+          <w:sz w:val="22"/>
+          <w:szCs w:val="22"/>
+        </w:rPr>
+        <w:t>destructuring</w:t>
+      </w:r>
+      <w:proofErr w:type="spellEnd"/>
+      <w:r>
+        <w:rPr>
+          <w:color w:val="000000" w:themeColor="text1"/>
+          <w:sz w:val="22"/>
+          <w:szCs w:val="22"/>
+        </w:rPr>
+        <w:t xml:space="preserve"> means taking properties out of an object and putting them into variables.</w:t>
       </w:r>
     </w:p>
     <w:p>
@@ -2685,7 +3286,25 @@
           <w:sz w:val="22"/>
           <w:szCs w:val="22"/>
         </w:rPr>
-        <w:t xml:space="preserve">Without destructuring we would need multiple variables for each which is in a new line: </w:t>
+        <w:t xml:space="preserve">Without </w:t>
+      </w:r>
+      <w:proofErr w:type="spellStart"/>
+      <w:r>
+        <w:rPr>
+          <w:color w:val="000000" w:themeColor="text1"/>
+          <w:sz w:val="22"/>
+          <w:szCs w:val="22"/>
+        </w:rPr>
+        <w:t>destructuring</w:t>
+      </w:r>
+      <w:proofErr w:type="spellEnd"/>
+      <w:r>
+        <w:rPr>
+          <w:color w:val="000000" w:themeColor="text1"/>
+          <w:sz w:val="22"/>
+          <w:szCs w:val="22"/>
+        </w:rPr>
+        <w:t xml:space="preserve"> we would need multiple variables for each which is in a new line: </w:t>
       </w:r>
       <w:r>
         <w:rPr>
@@ -2780,14 +3399,24 @@
         </w:rPr>
         <w:t xml:space="preserve">: </w:t>
       </w:r>
-      <w:proofErr w:type="gramStart"/>
-      <w:r>
-        <w:rPr>
-          <w:color w:val="000000" w:themeColor="text1"/>
-          <w:sz w:val="22"/>
-          <w:szCs w:val="22"/>
-        </w:rPr>
-        <w:t>userName }</w:t>
+      <w:proofErr w:type="spellStart"/>
+      <w:proofErr w:type="gramStart"/>
+      <w:r>
+        <w:rPr>
+          <w:color w:val="000000" w:themeColor="text1"/>
+          <w:sz w:val="22"/>
+          <w:szCs w:val="22"/>
+        </w:rPr>
+        <w:t>userName</w:t>
+      </w:r>
+      <w:proofErr w:type="spellEnd"/>
+      <w:r>
+        <w:rPr>
+          <w:color w:val="000000" w:themeColor="text1"/>
+          <w:sz w:val="22"/>
+          <w:szCs w:val="22"/>
+        </w:rPr>
+        <w:t xml:space="preserve"> }</w:t>
       </w:r>
       <w:proofErr w:type="gramEnd"/>
       <w:r>
@@ -2826,7 +3455,25 @@
           <w:sz w:val="22"/>
           <w:szCs w:val="22"/>
         </w:rPr>
-        <w:t>we can also while destrcuturing give a property a default value</w:t>
+        <w:t xml:space="preserve">we can also while </w:t>
+      </w:r>
+      <w:proofErr w:type="spellStart"/>
+      <w:r>
+        <w:rPr>
+          <w:color w:val="000000" w:themeColor="text1"/>
+          <w:sz w:val="22"/>
+          <w:szCs w:val="22"/>
+        </w:rPr>
+        <w:t>destrcuturing</w:t>
+      </w:r>
+      <w:proofErr w:type="spellEnd"/>
+      <w:r>
+        <w:rPr>
+          <w:color w:val="000000" w:themeColor="text1"/>
+          <w:sz w:val="22"/>
+          <w:szCs w:val="22"/>
+        </w:rPr>
+        <w:t xml:space="preserve"> give a property a default value</w:t>
       </w:r>
     </w:p>
     <w:p>
@@ -2909,6 +3556,7 @@
         </w:rPr>
         <w:t xml:space="preserve">We can use this DOM to interact with our html and modify it, for example </w:t>
       </w:r>
+      <w:proofErr w:type="spellStart"/>
       <w:proofErr w:type="gramStart"/>
       <w:r>
         <w:rPr>
@@ -2918,6 +3566,7 @@
         </w:rPr>
         <w:t>document.querySelector</w:t>
       </w:r>
+      <w:proofErr w:type="spellEnd"/>
       <w:proofErr w:type="gramEnd"/>
       <w:r>
         <w:rPr>
@@ -2971,7 +3620,25 @@
           <w:sz w:val="22"/>
           <w:szCs w:val="22"/>
         </w:rPr>
-        <w:t>The browser gives javascript some objects for the DOM to interact with, one of the most important objects is the document; this represents the webpage.</w:t>
+        <w:t xml:space="preserve">The browser gives </w:t>
+      </w:r>
+      <w:proofErr w:type="spellStart"/>
+      <w:r>
+        <w:rPr>
+          <w:color w:val="000000" w:themeColor="text1"/>
+          <w:sz w:val="22"/>
+          <w:szCs w:val="22"/>
+        </w:rPr>
+        <w:t>javascript</w:t>
+      </w:r>
+      <w:proofErr w:type="spellEnd"/>
+      <w:r>
+        <w:rPr>
+          <w:color w:val="000000" w:themeColor="text1"/>
+          <w:sz w:val="22"/>
+          <w:szCs w:val="22"/>
+        </w:rPr>
+        <w:t xml:space="preserve"> some objects for the DOM to interact with, one of the most important objects is the document; this represents the webpage.</w:t>
       </w:r>
     </w:p>
     <w:p>
@@ -2987,14 +3654,25 @@
           <w:szCs w:val="22"/>
         </w:rPr>
       </w:pPr>
-      <w:r>
-        <w:rPr>
-          <w:color w:val="000000" w:themeColor="text1"/>
-          <w:sz w:val="22"/>
-          <w:szCs w:val="22"/>
-        </w:rPr>
-        <w:t xml:space="preserve">Document.title(); allows us to change the title of the current webpage, </w:t>
-      </w:r>
+      <w:proofErr w:type="spellStart"/>
+      <w:r>
+        <w:rPr>
+          <w:color w:val="000000" w:themeColor="text1"/>
+          <w:sz w:val="22"/>
+          <w:szCs w:val="22"/>
+        </w:rPr>
+        <w:t>Document.title</w:t>
+      </w:r>
+      <w:proofErr w:type="spellEnd"/>
+      <w:r>
+        <w:rPr>
+          <w:color w:val="000000" w:themeColor="text1"/>
+          <w:sz w:val="22"/>
+          <w:szCs w:val="22"/>
+        </w:rPr>
+        <w:t xml:space="preserve">(); allows us to change the title of the current webpage, </w:t>
+      </w:r>
+      <w:proofErr w:type="spellStart"/>
       <w:proofErr w:type="gramStart"/>
       <w:r>
         <w:rPr>
@@ -3004,6 +3682,7 @@
         </w:rPr>
         <w:t>document.title</w:t>
       </w:r>
+      <w:proofErr w:type="spellEnd"/>
       <w:proofErr w:type="gramEnd"/>
       <w:r>
         <w:rPr>
@@ -3027,6 +3706,7 @@
           <w:szCs w:val="22"/>
         </w:rPr>
       </w:pPr>
+      <w:proofErr w:type="spellStart"/>
       <w:proofErr w:type="gramStart"/>
       <w:r>
         <w:rPr>
@@ -3045,6 +3725,7 @@
         </w:rPr>
         <w:t>.innerHTML</w:t>
       </w:r>
+      <w:proofErr w:type="spellEnd"/>
       <w:r>
         <w:rPr>
           <w:color w:val="000000" w:themeColor="text1"/>
@@ -3079,6 +3760,7 @@
         </w:rPr>
         <w:t xml:space="preserve"> this method can also accept html as a string so for example: </w:t>
       </w:r>
+      <w:proofErr w:type="spellStart"/>
       <w:proofErr w:type="gramStart"/>
       <w:r>
         <w:rPr>
@@ -3095,7 +3777,16 @@
           <w:sz w:val="22"/>
           <w:szCs w:val="22"/>
         </w:rPr>
-        <w:t>.innerHTML = "&lt;h1&gt;</w:t>
+        <w:t>.innerHTML</w:t>
+      </w:r>
+      <w:proofErr w:type="spellEnd"/>
+      <w:r>
+        <w:rPr>
+          <w:color w:val="000000" w:themeColor="text1"/>
+          <w:sz w:val="22"/>
+          <w:szCs w:val="22"/>
+        </w:rPr>
+        <w:t xml:space="preserve"> = "&lt;h1&gt;</w:t>
       </w:r>
       <w:proofErr w:type="gramStart"/>
       <w:r>
@@ -3129,6 +3820,7 @@
           <w:szCs w:val="22"/>
         </w:rPr>
       </w:pPr>
+      <w:proofErr w:type="spellStart"/>
       <w:proofErr w:type="gramStart"/>
       <w:r>
         <w:rPr>
@@ -3138,6 +3830,7 @@
         </w:rPr>
         <w:t>document.querySelector</w:t>
       </w:r>
+      <w:proofErr w:type="spellEnd"/>
       <w:proofErr w:type="gramEnd"/>
       <w:r>
         <w:rPr>
@@ -3162,8 +3855,18 @@
           <w:sz w:val="22"/>
           <w:szCs w:val="22"/>
         </w:rPr>
-        <w:t>call .textContent</w:t>
-      </w:r>
+        <w:t>call .</w:t>
+      </w:r>
+      <w:proofErr w:type="spellStart"/>
+      <w:r>
+        <w:rPr>
+          <w:color w:val="000000" w:themeColor="text1"/>
+          <w:sz w:val="22"/>
+          <w:szCs w:val="22"/>
+        </w:rPr>
+        <w:t>textContent</w:t>
+      </w:r>
+      <w:proofErr w:type="spellEnd"/>
       <w:proofErr w:type="gramEnd"/>
       <w:r>
         <w:rPr>
@@ -3173,6 +3876,7 @@
         </w:rPr>
         <w:t xml:space="preserve"> before changing it; </w:t>
       </w:r>
+      <w:proofErr w:type="spellStart"/>
       <w:proofErr w:type="gramStart"/>
       <w:r>
         <w:rPr>
@@ -3182,6 +3886,7 @@
         </w:rPr>
         <w:t>heading.textContent</w:t>
       </w:r>
+      <w:proofErr w:type="spellEnd"/>
       <w:proofErr w:type="gramEnd"/>
       <w:r>
         <w:rPr>
@@ -3277,23 +3982,42 @@
         </w:rPr>
         <w:t xml:space="preserve"> a value from the input box, first we declare a class for a certain input, we use this class name with the </w:t>
       </w:r>
-      <w:proofErr w:type="gramStart"/>
-      <w:r>
-        <w:rPr>
-          <w:color w:val="000000" w:themeColor="text1"/>
-          <w:sz w:val="22"/>
-          <w:szCs w:val="22"/>
-        </w:rPr>
-        <w:t>querySelector(), and</w:t>
-      </w:r>
-      <w:proofErr w:type="gramEnd"/>
-      <w:r>
-        <w:rPr>
-          <w:color w:val="000000" w:themeColor="text1"/>
-          <w:sz w:val="22"/>
-          <w:szCs w:val="22"/>
-        </w:rPr>
-        <w:t xml:space="preserve"> store the output into a variable. This variable represents the entire input box. To get the value we store the value into a new variable from the box</w:t>
+      <w:proofErr w:type="spellStart"/>
+      <w:proofErr w:type="gramStart"/>
+      <w:r>
+        <w:rPr>
+          <w:color w:val="000000" w:themeColor="text1"/>
+          <w:sz w:val="22"/>
+          <w:szCs w:val="22"/>
+        </w:rPr>
+        <w:t>querySelector</w:t>
+      </w:r>
+      <w:proofErr w:type="spellEnd"/>
+      <w:r>
+        <w:rPr>
+          <w:color w:val="000000" w:themeColor="text1"/>
+          <w:sz w:val="22"/>
+          <w:szCs w:val="22"/>
+        </w:rPr>
+        <w:t>(), and</w:t>
+      </w:r>
+      <w:proofErr w:type="gramEnd"/>
+      <w:r>
+        <w:rPr>
+          <w:color w:val="000000" w:themeColor="text1"/>
+          <w:sz w:val="22"/>
+          <w:szCs w:val="22"/>
+        </w:rPr>
+        <w:t xml:space="preserve"> store the output into a variable. This variable represents the entire input box. To get the value we store the value into a new variable from the </w:t>
+      </w:r>
+      <w:proofErr w:type="spellStart"/>
+      <w:r>
+        <w:rPr>
+          <w:color w:val="000000" w:themeColor="text1"/>
+          <w:sz w:val="22"/>
+          <w:szCs w:val="22"/>
+        </w:rPr>
+        <w:t>box</w:t>
       </w:r>
       <w:proofErr w:type="gramStart"/>
       <w:r>
@@ -3304,6 +4028,7 @@
         </w:rPr>
         <w:t>.value</w:t>
       </w:r>
+      <w:proofErr w:type="spellEnd"/>
       <w:proofErr w:type="gramEnd"/>
     </w:p>
     <w:p>
@@ -3319,13 +4044,23 @@
           <w:szCs w:val="22"/>
         </w:rPr>
       </w:pPr>
-      <w:r>
-        <w:rPr>
-          <w:color w:val="000000" w:themeColor="text1"/>
-          <w:sz w:val="22"/>
-          <w:szCs w:val="22"/>
-        </w:rPr>
-        <w:t xml:space="preserve">keydown tells us when a key was pressed, it does not tell us which key, however the event object stores data about the event which </w:t>
+      <w:proofErr w:type="spellStart"/>
+      <w:r>
+        <w:rPr>
+          <w:color w:val="000000" w:themeColor="text1"/>
+          <w:sz w:val="22"/>
+          <w:szCs w:val="22"/>
+        </w:rPr>
+        <w:t>keydown</w:t>
+      </w:r>
+      <w:proofErr w:type="spellEnd"/>
+      <w:r>
+        <w:rPr>
+          <w:color w:val="000000" w:themeColor="text1"/>
+          <w:sz w:val="22"/>
+          <w:szCs w:val="22"/>
+        </w:rPr>
+        <w:t xml:space="preserve"> tells us when a key was pressed, it does not tell us which key, however the event object stores data about the event which </w:t>
       </w:r>
       <w:proofErr w:type="gramStart"/>
       <w:r>
@@ -3343,7 +4078,25 @@
           <w:sz w:val="22"/>
           <w:szCs w:val="22"/>
         </w:rPr>
-        <w:t xml:space="preserve"> this case was a key stroke, using event.key tells us what was </w:t>
+        <w:t xml:space="preserve"> this case was a key stroke, using </w:t>
+      </w:r>
+      <w:proofErr w:type="spellStart"/>
+      <w:r>
+        <w:rPr>
+          <w:color w:val="000000" w:themeColor="text1"/>
+          <w:sz w:val="22"/>
+          <w:szCs w:val="22"/>
+        </w:rPr>
+        <w:t>event.key</w:t>
+      </w:r>
+      <w:proofErr w:type="spellEnd"/>
+      <w:r>
+        <w:rPr>
+          <w:color w:val="000000" w:themeColor="text1"/>
+          <w:sz w:val="22"/>
+          <w:szCs w:val="22"/>
+        </w:rPr>
+        <w:t xml:space="preserve"> tells us what was </w:t>
       </w:r>
       <w:proofErr w:type="gramStart"/>
       <w:r>
@@ -3377,14 +4130,24 @@
           <w:szCs w:val="22"/>
         </w:rPr>
       </w:pPr>
-      <w:proofErr w:type="gramStart"/>
-      <w:r>
-        <w:rPr>
-          <w:color w:val="000000" w:themeColor="text1"/>
-          <w:sz w:val="22"/>
-          <w:szCs w:val="22"/>
-        </w:rPr>
-        <w:t>classList.add(</w:t>
+      <w:proofErr w:type="spellStart"/>
+      <w:proofErr w:type="gramStart"/>
+      <w:r>
+        <w:rPr>
+          <w:color w:val="000000" w:themeColor="text1"/>
+          <w:sz w:val="22"/>
+          <w:szCs w:val="22"/>
+        </w:rPr>
+        <w:t>classList.add</w:t>
+      </w:r>
+      <w:proofErr w:type="spellEnd"/>
+      <w:r>
+        <w:rPr>
+          <w:color w:val="000000" w:themeColor="text1"/>
+          <w:sz w:val="22"/>
+          <w:szCs w:val="22"/>
+        </w:rPr>
+        <w:t>(</w:t>
       </w:r>
       <w:proofErr w:type="gramEnd"/>
       <w:r>
@@ -3478,13 +4241,23 @@
           <w:u w:val="single"/>
         </w:rPr>
       </w:pPr>
-      <w:r>
-        <w:rPr>
-          <w:color w:val="000000" w:themeColor="text1"/>
-          <w:sz w:val="22"/>
-          <w:szCs w:val="22"/>
-        </w:rPr>
-        <w:t>Array.isArray(); is used to check if a variable is array or not</w:t>
+      <w:proofErr w:type="spellStart"/>
+      <w:r>
+        <w:rPr>
+          <w:color w:val="000000" w:themeColor="text1"/>
+          <w:sz w:val="22"/>
+          <w:szCs w:val="22"/>
+        </w:rPr>
+        <w:t>Array.isArray</w:t>
+      </w:r>
+      <w:proofErr w:type="spellEnd"/>
+      <w:r>
+        <w:rPr>
+          <w:color w:val="000000" w:themeColor="text1"/>
+          <w:sz w:val="22"/>
+          <w:szCs w:val="22"/>
+        </w:rPr>
+        <w:t>(); is used to check if a variable is array or not</w:t>
       </w:r>
     </w:p>
     <w:p>
@@ -3641,7 +4414,25 @@
           <w:sz w:val="22"/>
           <w:szCs w:val="22"/>
         </w:rPr>
-        <w:t>Arrays are objects in JS which means they hold a reference to something, this means in case we say arr2 = arr1. If we change smth in arr2 it’s also changed in arr1</w:t>
+        <w:t xml:space="preserve">Arrays are objects in JS which means they hold a reference to something, this means in case we say arr2 = arr1. If we change </w:t>
+      </w:r>
+      <w:proofErr w:type="spellStart"/>
+      <w:r>
+        <w:rPr>
+          <w:color w:val="000000" w:themeColor="text1"/>
+          <w:sz w:val="22"/>
+          <w:szCs w:val="22"/>
+        </w:rPr>
+        <w:t>smth</w:t>
+      </w:r>
+      <w:proofErr w:type="spellEnd"/>
+      <w:r>
+        <w:rPr>
+          <w:color w:val="000000" w:themeColor="text1"/>
+          <w:sz w:val="22"/>
+          <w:szCs w:val="22"/>
+        </w:rPr>
+        <w:t xml:space="preserve"> in arr2 it’s also changed in arr1</w:t>
       </w:r>
     </w:p>
     <w:p>
@@ -3730,23 +4521,95 @@
           <w:sz w:val="22"/>
           <w:szCs w:val="22"/>
         </w:rPr>
-        <w:t xml:space="preserve"> objects we can destructure arrays, </w:t>
-      </w:r>
-      <w:r>
-        <w:rPr>
-          <w:color w:val="000000" w:themeColor="text1"/>
-          <w:sz w:val="22"/>
-          <w:szCs w:val="22"/>
-        </w:rPr>
-        <w:t>const [firstValue, secondValue] = [1, 2, 3];</w:t>
-      </w:r>
-      <w:r>
-        <w:rPr>
-          <w:color w:val="000000" w:themeColor="text1"/>
-          <w:sz w:val="22"/>
-          <w:szCs w:val="22"/>
-        </w:rPr>
-        <w:t xml:space="preserve"> this takes the first array value and put it into firstValue and so on </w:t>
+        <w:t xml:space="preserve"> objects we can </w:t>
+      </w:r>
+      <w:proofErr w:type="spellStart"/>
+      <w:r>
+        <w:rPr>
+          <w:color w:val="000000" w:themeColor="text1"/>
+          <w:sz w:val="22"/>
+          <w:szCs w:val="22"/>
+        </w:rPr>
+        <w:t>destructure</w:t>
+      </w:r>
+      <w:proofErr w:type="spellEnd"/>
+      <w:r>
+        <w:rPr>
+          <w:color w:val="000000" w:themeColor="text1"/>
+          <w:sz w:val="22"/>
+          <w:szCs w:val="22"/>
+        </w:rPr>
+        <w:t xml:space="preserve"> arrays, </w:t>
+      </w:r>
+      <w:r>
+        <w:rPr>
+          <w:color w:val="000000" w:themeColor="text1"/>
+          <w:sz w:val="22"/>
+          <w:szCs w:val="22"/>
+        </w:rPr>
+        <w:t>const [</w:t>
+      </w:r>
+      <w:proofErr w:type="spellStart"/>
+      <w:r>
+        <w:rPr>
+          <w:color w:val="000000" w:themeColor="text1"/>
+          <w:sz w:val="22"/>
+          <w:szCs w:val="22"/>
+        </w:rPr>
+        <w:t>firstValue</w:t>
+      </w:r>
+      <w:proofErr w:type="spellEnd"/>
+      <w:r>
+        <w:rPr>
+          <w:color w:val="000000" w:themeColor="text1"/>
+          <w:sz w:val="22"/>
+          <w:szCs w:val="22"/>
+        </w:rPr>
+        <w:t xml:space="preserve">, </w:t>
+      </w:r>
+      <w:proofErr w:type="spellStart"/>
+      <w:r>
+        <w:rPr>
+          <w:color w:val="000000" w:themeColor="text1"/>
+          <w:sz w:val="22"/>
+          <w:szCs w:val="22"/>
+        </w:rPr>
+        <w:t>secondValue</w:t>
+      </w:r>
+      <w:proofErr w:type="spellEnd"/>
+      <w:r>
+        <w:rPr>
+          <w:color w:val="000000" w:themeColor="text1"/>
+          <w:sz w:val="22"/>
+          <w:szCs w:val="22"/>
+        </w:rPr>
+        <w:t>] = [1, 2, 3];</w:t>
+      </w:r>
+      <w:r>
+        <w:rPr>
+          <w:color w:val="000000" w:themeColor="text1"/>
+          <w:sz w:val="22"/>
+          <w:szCs w:val="22"/>
+        </w:rPr>
+        <w:t xml:space="preserve"> this takes the first array value and put it into </w:t>
+      </w:r>
+      <w:proofErr w:type="spellStart"/>
+      <w:r>
+        <w:rPr>
+          <w:color w:val="000000" w:themeColor="text1"/>
+          <w:sz w:val="22"/>
+          <w:szCs w:val="22"/>
+        </w:rPr>
+        <w:t>firstValue</w:t>
+      </w:r>
+      <w:proofErr w:type="spellEnd"/>
+      <w:r>
+        <w:rPr>
+          <w:color w:val="000000" w:themeColor="text1"/>
+          <w:sz w:val="22"/>
+          <w:szCs w:val="22"/>
+        </w:rPr>
+        <w:t xml:space="preserve"> and so on </w:t>
       </w:r>
     </w:p>
     <w:p>
@@ -3857,7 +4720,61 @@
           <w:sz w:val="22"/>
           <w:szCs w:val="22"/>
         </w:rPr>
-        <w:t xml:space="preserve"> (let i = 0; i &lt; 5; i++) </w:t>
+        <w:t xml:space="preserve"> (let </w:t>
+      </w:r>
+      <w:proofErr w:type="spellStart"/>
+      <w:r>
+        <w:rPr>
+          <w:color w:val="000000" w:themeColor="text1"/>
+          <w:sz w:val="22"/>
+          <w:szCs w:val="22"/>
+        </w:rPr>
+        <w:t>i</w:t>
+      </w:r>
+      <w:proofErr w:type="spellEnd"/>
+      <w:r>
+        <w:rPr>
+          <w:color w:val="000000" w:themeColor="text1"/>
+          <w:sz w:val="22"/>
+          <w:szCs w:val="22"/>
+        </w:rPr>
+        <w:t xml:space="preserve"> = 0; </w:t>
+      </w:r>
+      <w:proofErr w:type="spellStart"/>
+      <w:r>
+        <w:rPr>
+          <w:color w:val="000000" w:themeColor="text1"/>
+          <w:sz w:val="22"/>
+          <w:szCs w:val="22"/>
+        </w:rPr>
+        <w:t>i</w:t>
+      </w:r>
+      <w:proofErr w:type="spellEnd"/>
+      <w:r>
+        <w:rPr>
+          <w:color w:val="000000" w:themeColor="text1"/>
+          <w:sz w:val="22"/>
+          <w:szCs w:val="22"/>
+        </w:rPr>
+        <w:t xml:space="preserve"> &lt; 5; </w:t>
+      </w:r>
+      <w:proofErr w:type="spellStart"/>
+      <w:r>
+        <w:rPr>
+          <w:color w:val="000000" w:themeColor="text1"/>
+          <w:sz w:val="22"/>
+          <w:szCs w:val="22"/>
+        </w:rPr>
+        <w:t>i</w:t>
+      </w:r>
+      <w:proofErr w:type="spellEnd"/>
+      <w:r>
+        <w:rPr>
+          <w:color w:val="000000" w:themeColor="text1"/>
+          <w:sz w:val="22"/>
+          <w:szCs w:val="22"/>
+        </w:rPr>
+        <w:t xml:space="preserve">++) </w:t>
       </w:r>
       <w:proofErr w:type="gramStart"/>
       <w:r>
@@ -3875,8 +4792,18 @@
           <w:sz w:val="22"/>
           <w:szCs w:val="22"/>
         </w:rPr>
-        <w:t xml:space="preserve">  console.log(i</w:t>
-      </w:r>
+        <w:t xml:space="preserve">  console.log(</w:t>
+      </w:r>
+      <w:proofErr w:type="spellStart"/>
+      <w:r>
+        <w:rPr>
+          <w:color w:val="000000" w:themeColor="text1"/>
+          <w:sz w:val="22"/>
+          <w:szCs w:val="22"/>
+        </w:rPr>
+        <w:t>i</w:t>
+      </w:r>
+      <w:proofErr w:type="spellEnd"/>
       <w:proofErr w:type="gramStart"/>
       <w:r>
         <w:rPr>
@@ -3929,7 +4856,25 @@
           <w:sz w:val="22"/>
           <w:szCs w:val="22"/>
         </w:rPr>
-        <w:t>We have a for each looping in js the same we have in java and python here is a code example</w:t>
+        <w:t xml:space="preserve">We have a for each looping in </w:t>
+      </w:r>
+      <w:proofErr w:type="spellStart"/>
+      <w:r>
+        <w:rPr>
+          <w:color w:val="000000" w:themeColor="text1"/>
+          <w:sz w:val="22"/>
+          <w:szCs w:val="22"/>
+        </w:rPr>
+        <w:t>js</w:t>
+      </w:r>
+      <w:proofErr w:type="spellEnd"/>
+      <w:r>
+        <w:rPr>
+          <w:color w:val="000000" w:themeColor="text1"/>
+          <w:sz w:val="22"/>
+          <w:szCs w:val="22"/>
+        </w:rPr>
+        <w:t xml:space="preserve"> the same we have in java and python here is a code example</w:t>
       </w:r>
       <w:proofErr w:type="gramStart"/>
       <w:r>
@@ -4077,15 +5022,7 @@
           <w:sz w:val="22"/>
           <w:szCs w:val="22"/>
         </w:rPr>
-        <w:t xml:space="preserve">; </w:t>
-      </w:r>
-      <w:r>
-        <w:rPr>
-          <w:color w:val="000000" w:themeColor="text1"/>
-          <w:sz w:val="22"/>
-          <w:szCs w:val="22"/>
-        </w:rPr>
-        <w:t>Used mainly with objects to loop through their keys/property names.</w:t>
+        <w:t>; Used mainly with objects to loop through their keys/property names.</w:t>
       </w:r>
       <w:r>
         <w:rPr>
@@ -4475,6 +5412,7 @@
         </w:rPr>
         <w:t xml:space="preserve"> </w:t>
       </w:r>
+      <w:proofErr w:type="spellStart"/>
       <w:proofErr w:type="gramStart"/>
       <w:r>
         <w:rPr>
@@ -4484,6 +5422,7 @@
         </w:rPr>
         <w:t>its</w:t>
       </w:r>
+      <w:proofErr w:type="spellEnd"/>
       <w:proofErr w:type="gramEnd"/>
       <w:r>
         <w:rPr>
@@ -4760,25 +5699,53 @@
           <w:sz w:val="22"/>
           <w:szCs w:val="22"/>
         </w:rPr>
-        <w:t xml:space="preserve"> the function that we need to run. It only runs onetime after we hace waited.   Code example:</w:t>
-      </w:r>
-    </w:p>
-    <w:p>
-      <w:pPr>
-        <w:pStyle w:val="ListParagraph"/>
-        <w:rPr>
-          <w:color w:val="000000" w:themeColor="text1"/>
-          <w:sz w:val="22"/>
-          <w:szCs w:val="22"/>
-        </w:rPr>
-      </w:pPr>
-      <w:r>
-        <w:rPr>
-          <w:color w:val="000000" w:themeColor="text1"/>
-          <w:sz w:val="22"/>
-          <w:szCs w:val="22"/>
-        </w:rPr>
-        <w:t>setTimeout(</w:t>
+        <w:t xml:space="preserve"> the function that we need to run. It only runs onetime after we </w:t>
+      </w:r>
+      <w:proofErr w:type="spellStart"/>
+      <w:r>
+        <w:rPr>
+          <w:color w:val="000000" w:themeColor="text1"/>
+          <w:sz w:val="22"/>
+          <w:szCs w:val="22"/>
+        </w:rPr>
+        <w:t>hace</w:t>
+      </w:r>
+      <w:proofErr w:type="spellEnd"/>
+      <w:r>
+        <w:rPr>
+          <w:color w:val="000000" w:themeColor="text1"/>
+          <w:sz w:val="22"/>
+          <w:szCs w:val="22"/>
+        </w:rPr>
+        <w:t xml:space="preserve"> waited.   Code example:</w:t>
+      </w:r>
+    </w:p>
+    <w:p>
+      <w:pPr>
+        <w:pStyle w:val="ListParagraph"/>
+        <w:rPr>
+          <w:color w:val="000000" w:themeColor="text1"/>
+          <w:sz w:val="22"/>
+          <w:szCs w:val="22"/>
+        </w:rPr>
+      </w:pPr>
+      <w:proofErr w:type="spellStart"/>
+      <w:r>
+        <w:rPr>
+          <w:color w:val="000000" w:themeColor="text1"/>
+          <w:sz w:val="22"/>
+          <w:szCs w:val="22"/>
+        </w:rPr>
+        <w:t>setTimeout</w:t>
+      </w:r>
+      <w:proofErr w:type="spellEnd"/>
+      <w:r>
+        <w:rPr>
+          <w:color w:val="000000" w:themeColor="text1"/>
+          <w:sz w:val="22"/>
+          <w:szCs w:val="22"/>
+        </w:rPr>
+        <w:t>(</w:t>
       </w:r>
       <w:proofErr w:type="gramStart"/>
       <w:r>
@@ -4850,14 +5817,24 @@
           <w:szCs w:val="22"/>
         </w:rPr>
       </w:pPr>
-      <w:proofErr w:type="gramStart"/>
-      <w:r>
-        <w:rPr>
-          <w:color w:val="000000" w:themeColor="text1"/>
-          <w:sz w:val="22"/>
-          <w:szCs w:val="22"/>
-        </w:rPr>
-        <w:t>setInterval(</w:t>
+      <w:proofErr w:type="spellStart"/>
+      <w:proofErr w:type="gramStart"/>
+      <w:r>
+        <w:rPr>
+          <w:color w:val="000000" w:themeColor="text1"/>
+          <w:sz w:val="22"/>
+          <w:szCs w:val="22"/>
+        </w:rPr>
+        <w:t>setInterval</w:t>
+      </w:r>
+      <w:proofErr w:type="spellEnd"/>
+      <w:r>
+        <w:rPr>
+          <w:color w:val="000000" w:themeColor="text1"/>
+          <w:sz w:val="22"/>
+          <w:szCs w:val="22"/>
+        </w:rPr>
+        <w:t>(</w:t>
       </w:r>
       <w:proofErr w:type="gramEnd"/>
       <w:r>
@@ -4886,14 +5863,24 @@
         </w:rPr>
         <w:t xml:space="preserve"> </w:t>
       </w:r>
-      <w:proofErr w:type="gramStart"/>
-      <w:r>
-        <w:rPr>
-          <w:color w:val="000000" w:themeColor="text1"/>
-          <w:sz w:val="22"/>
-          <w:szCs w:val="22"/>
-        </w:rPr>
-        <w:t>setTimeout(</w:t>
+      <w:proofErr w:type="spellStart"/>
+      <w:proofErr w:type="gramStart"/>
+      <w:r>
+        <w:rPr>
+          <w:color w:val="000000" w:themeColor="text1"/>
+          <w:sz w:val="22"/>
+          <w:szCs w:val="22"/>
+        </w:rPr>
+        <w:t>setTimeout</w:t>
+      </w:r>
+      <w:proofErr w:type="spellEnd"/>
+      <w:r>
+        <w:rPr>
+          <w:color w:val="000000" w:themeColor="text1"/>
+          <w:sz w:val="22"/>
+          <w:szCs w:val="22"/>
+        </w:rPr>
+        <w:t>(</w:t>
       </w:r>
       <w:proofErr w:type="gramEnd"/>
       <w:r>
@@ -4918,14 +5905,24 @@
           <w:szCs w:val="22"/>
         </w:rPr>
       </w:pPr>
-      <w:proofErr w:type="gramStart"/>
-      <w:r>
-        <w:rPr>
-          <w:color w:val="000000" w:themeColor="text1"/>
-          <w:sz w:val="22"/>
-          <w:szCs w:val="22"/>
-        </w:rPr>
-        <w:t>clearInterval(</w:t>
+      <w:proofErr w:type="spellStart"/>
+      <w:proofErr w:type="gramStart"/>
+      <w:r>
+        <w:rPr>
+          <w:color w:val="000000" w:themeColor="text1"/>
+          <w:sz w:val="22"/>
+          <w:szCs w:val="22"/>
+        </w:rPr>
+        <w:t>clearInterval</w:t>
+      </w:r>
+      <w:proofErr w:type="spellEnd"/>
+      <w:r>
+        <w:rPr>
+          <w:color w:val="000000" w:themeColor="text1"/>
+          <w:sz w:val="22"/>
+          <w:szCs w:val="22"/>
+        </w:rPr>
+        <w:t>(</w:t>
       </w:r>
       <w:proofErr w:type="gramEnd"/>
       <w:r>
@@ -4983,8 +5980,18 @@
           <w:sz w:val="22"/>
           <w:szCs w:val="22"/>
         </w:rPr>
-        <w:t>.forEach</w:t>
-      </w:r>
+        <w:t>.</w:t>
+      </w:r>
+      <w:proofErr w:type="spellStart"/>
+      <w:r>
+        <w:rPr>
+          <w:color w:val="000000" w:themeColor="text1"/>
+          <w:sz w:val="22"/>
+          <w:szCs w:val="22"/>
+        </w:rPr>
+        <w:t>forEach</w:t>
+      </w:r>
+      <w:proofErr w:type="spellEnd"/>
       <w:proofErr w:type="gramEnd"/>
       <w:r>
         <w:rPr>
@@ -5106,22 +6113,60 @@
           <w:szCs w:val="22"/>
         </w:rPr>
       </w:pPr>
-      <w:r>
-        <w:rPr>
-          <w:color w:val="000000" w:themeColor="text1"/>
-          <w:sz w:val="22"/>
-          <w:szCs w:val="22"/>
-        </w:rPr>
-        <w:t xml:space="preserve">addEventListener needs to take a trigger and a function that acts once this trigger has happened the trigger can be a keydown and the action is a function that first checks for the type of the </w:t>
-      </w:r>
-      <w:proofErr w:type="gramStart"/>
-      <w:r>
-        <w:rPr>
-          <w:color w:val="000000" w:themeColor="text1"/>
-          <w:sz w:val="22"/>
-          <w:szCs w:val="22"/>
-        </w:rPr>
-        <w:t>event.key  then</w:t>
+      <w:proofErr w:type="spellStart"/>
+      <w:r>
+        <w:rPr>
+          <w:color w:val="000000" w:themeColor="text1"/>
+          <w:sz w:val="22"/>
+          <w:szCs w:val="22"/>
+        </w:rPr>
+        <w:t>addEventListener</w:t>
+      </w:r>
+      <w:proofErr w:type="spellEnd"/>
+      <w:r>
+        <w:rPr>
+          <w:color w:val="000000" w:themeColor="text1"/>
+          <w:sz w:val="22"/>
+          <w:szCs w:val="22"/>
+        </w:rPr>
+        <w:t xml:space="preserve"> needs to take a trigger and a function that acts once this trigger has happened the trigger can be a </w:t>
+      </w:r>
+      <w:proofErr w:type="spellStart"/>
+      <w:r>
+        <w:rPr>
+          <w:color w:val="000000" w:themeColor="text1"/>
+          <w:sz w:val="22"/>
+          <w:szCs w:val="22"/>
+        </w:rPr>
+        <w:t>keydown</w:t>
+      </w:r>
+      <w:proofErr w:type="spellEnd"/>
+      <w:r>
+        <w:rPr>
+          <w:color w:val="000000" w:themeColor="text1"/>
+          <w:sz w:val="22"/>
+          <w:szCs w:val="22"/>
+        </w:rPr>
+        <w:t xml:space="preserve"> and the action is a function that first checks for the type of the </w:t>
+      </w:r>
+      <w:proofErr w:type="spellStart"/>
+      <w:proofErr w:type="gramStart"/>
+      <w:r>
+        <w:rPr>
+          <w:color w:val="000000" w:themeColor="text1"/>
+          <w:sz w:val="22"/>
+          <w:szCs w:val="22"/>
+        </w:rPr>
+        <w:t>event.key</w:t>
+      </w:r>
+      <w:proofErr w:type="spellEnd"/>
+      <w:r>
+        <w:rPr>
+          <w:color w:val="000000" w:themeColor="text1"/>
+          <w:sz w:val="22"/>
+          <w:szCs w:val="22"/>
+        </w:rPr>
+        <w:t xml:space="preserve">  then</w:t>
       </w:r>
       <w:proofErr w:type="gramEnd"/>
       <w:r>
@@ -5146,6 +6191,7 @@
           <w:szCs w:val="22"/>
         </w:rPr>
       </w:pPr>
+      <w:proofErr w:type="spellStart"/>
       <w:proofErr w:type="gramStart"/>
       <w:r>
         <w:rPr>
@@ -5171,16 +6217,43 @@
           <w:sz w:val="22"/>
           <w:szCs w:val="22"/>
         </w:rPr>
-        <w:t>addEventListener(</w:t>
-      </w:r>
-      <w:proofErr w:type="gramEnd"/>
-      <w:r>
-        <w:rPr>
-          <w:color w:val="000000" w:themeColor="text1"/>
-          <w:sz w:val="22"/>
-          <w:szCs w:val="22"/>
-        </w:rPr>
-        <w:t xml:space="preserve">"keydown", (event) =&gt; </w:t>
+        <w:t>addEventListener</w:t>
+      </w:r>
+      <w:proofErr w:type="spellEnd"/>
+      <w:r>
+        <w:rPr>
+          <w:color w:val="000000" w:themeColor="text1"/>
+          <w:sz w:val="22"/>
+          <w:szCs w:val="22"/>
+        </w:rPr>
+        <w:t>(</w:t>
+      </w:r>
+      <w:proofErr w:type="gramEnd"/>
+      <w:r>
+        <w:rPr>
+          <w:color w:val="000000" w:themeColor="text1"/>
+          <w:sz w:val="22"/>
+          <w:szCs w:val="22"/>
+        </w:rPr>
+        <w:t>"</w:t>
+      </w:r>
+      <w:proofErr w:type="spellStart"/>
+      <w:r>
+        <w:rPr>
+          <w:color w:val="000000" w:themeColor="text1"/>
+          <w:sz w:val="22"/>
+          <w:szCs w:val="22"/>
+        </w:rPr>
+        <w:t>keydown</w:t>
+      </w:r>
+      <w:proofErr w:type="spellEnd"/>
+      <w:r>
+        <w:rPr>
+          <w:color w:val="000000" w:themeColor="text1"/>
+          <w:sz w:val="22"/>
+          <w:szCs w:val="22"/>
+        </w:rPr>
+        <w:t xml:space="preserve">", (event) =&gt; </w:t>
       </w:r>
       <w:proofErr w:type="gramStart"/>
       <w:r>
@@ -5226,6 +6299,677 @@
         </w:rPr>
         <w:t xml:space="preserve"> this listens for events on the entire webpage which is not a good design or logic</w:t>
       </w:r>
+    </w:p>
+    <w:p>
+      <w:pPr>
+        <w:rPr>
+          <w:b/>
+          <w:bCs/>
+          <w:color w:val="000000" w:themeColor="text1"/>
+          <w:u w:val="single"/>
+        </w:rPr>
+      </w:pPr>
+      <w:r>
+        <w:rPr>
+          <w:b/>
+          <w:bCs/>
+          <w:color w:val="000000" w:themeColor="text1"/>
+          <w:u w:val="single"/>
+        </w:rPr>
+        <w:t>Modules:</w:t>
+      </w:r>
+    </w:p>
+    <w:p>
+      <w:pPr>
+        <w:pStyle w:val="ListParagraph"/>
+        <w:numPr>
+          <w:ilvl w:val="0"/>
+          <w:numId w:val="12"/>
+        </w:numPr>
+        <w:rPr>
+          <w:color w:val="000000" w:themeColor="text1"/>
+          <w:sz w:val="22"/>
+          <w:szCs w:val="22"/>
+        </w:rPr>
+      </w:pPr>
+      <w:r>
+        <w:rPr>
+          <w:color w:val="000000" w:themeColor="text1"/>
+          <w:sz w:val="22"/>
+          <w:szCs w:val="22"/>
+        </w:rPr>
+        <w:t>In JavaScript/HTML, data attributes are custom attributes you add to HTML elements to store extra information.</w:t>
+      </w:r>
+      <w:r>
+        <w:rPr>
+          <w:color w:val="000000" w:themeColor="text1"/>
+          <w:sz w:val="22"/>
+          <w:szCs w:val="22"/>
+        </w:rPr>
+        <w:t xml:space="preserve"> And later can be called using </w:t>
+      </w:r>
+      <w:proofErr w:type="spellStart"/>
+      <w:proofErr w:type="gramStart"/>
+      <w:r>
+        <w:rPr>
+          <w:color w:val="000000" w:themeColor="text1"/>
+          <w:sz w:val="22"/>
+          <w:szCs w:val="22"/>
+        </w:rPr>
+        <w:t>querySelector</w:t>
+      </w:r>
+      <w:proofErr w:type="spellEnd"/>
+      <w:r>
+        <w:rPr>
+          <w:color w:val="000000" w:themeColor="text1"/>
+          <w:sz w:val="22"/>
+          <w:szCs w:val="22"/>
+        </w:rPr>
+        <w:t>(</w:t>
+      </w:r>
+      <w:proofErr w:type="gramEnd"/>
+      <w:r>
+        <w:rPr>
+          <w:color w:val="000000" w:themeColor="text1"/>
+          <w:sz w:val="22"/>
+          <w:szCs w:val="22"/>
+        </w:rPr>
+        <w:t xml:space="preserve">), store the result into a variable and call </w:t>
+      </w:r>
+      <w:proofErr w:type="gramStart"/>
+      <w:r>
+        <w:rPr>
+          <w:color w:val="000000" w:themeColor="text1"/>
+          <w:sz w:val="22"/>
+          <w:szCs w:val="22"/>
+        </w:rPr>
+        <w:t>the .</w:t>
+      </w:r>
+      <w:proofErr w:type="gramEnd"/>
+      <w:r>
+        <w:rPr>
+          <w:color w:val="000000" w:themeColor="text1"/>
+          <w:sz w:val="22"/>
+          <w:szCs w:val="22"/>
+        </w:rPr>
+        <w:t>dataset.name, .id or whatever</w:t>
+      </w:r>
+    </w:p>
+    <w:p>
+      <w:pPr>
+        <w:pStyle w:val="ListParagraph"/>
+        <w:numPr>
+          <w:ilvl w:val="0"/>
+          <w:numId w:val="12"/>
+        </w:numPr>
+        <w:rPr>
+          <w:color w:val="000000" w:themeColor="text1"/>
+          <w:sz w:val="22"/>
+          <w:szCs w:val="22"/>
+        </w:rPr>
+      </w:pPr>
+      <w:r>
+        <w:rPr>
+          <w:color w:val="000000" w:themeColor="text1"/>
+          <w:sz w:val="22"/>
+          <w:szCs w:val="22"/>
+        </w:rPr>
+        <w:t xml:space="preserve">Example of data attributes in action: </w:t>
+      </w:r>
+      <w:r>
+        <w:rPr>
+          <w:color w:val="000000" w:themeColor="text1"/>
+          <w:sz w:val="22"/>
+          <w:szCs w:val="22"/>
+        </w:rPr>
+        <w:t>&lt;button data-product-id="42"&gt;Buy&lt;/button&gt;</w:t>
+      </w:r>
+    </w:p>
+    <w:p>
+      <w:pPr>
+        <w:pStyle w:val="ListParagraph"/>
+        <w:rPr>
+          <w:color w:val="000000" w:themeColor="text1"/>
+          <w:sz w:val="22"/>
+          <w:szCs w:val="22"/>
+        </w:rPr>
+      </w:pPr>
+      <w:r>
+        <w:rPr>
+          <w:color w:val="000000" w:themeColor="text1"/>
+          <w:sz w:val="22"/>
+          <w:szCs w:val="22"/>
+        </w:rPr>
+        <w:t xml:space="preserve">const button = </w:t>
+      </w:r>
+      <w:proofErr w:type="spellStart"/>
+      <w:proofErr w:type="gramStart"/>
+      <w:r>
+        <w:rPr>
+          <w:color w:val="000000" w:themeColor="text1"/>
+          <w:sz w:val="22"/>
+          <w:szCs w:val="22"/>
+        </w:rPr>
+        <w:t>document.querySelector</w:t>
+      </w:r>
+      <w:proofErr w:type="spellEnd"/>
+      <w:proofErr w:type="gramEnd"/>
+      <w:r>
+        <w:rPr>
+          <w:color w:val="000000" w:themeColor="text1"/>
+          <w:sz w:val="22"/>
+          <w:szCs w:val="22"/>
+        </w:rPr>
+        <w:t>("button");</w:t>
+      </w:r>
+    </w:p>
+    <w:p>
+      <w:pPr>
+        <w:pStyle w:val="ListParagraph"/>
+        <w:rPr>
+          <w:color w:val="000000" w:themeColor="text1"/>
+          <w:sz w:val="22"/>
+          <w:szCs w:val="22"/>
+        </w:rPr>
+      </w:pPr>
+    </w:p>
+    <w:p>
+      <w:pPr>
+        <w:pStyle w:val="ListParagraph"/>
+        <w:rPr>
+          <w:color w:val="000000" w:themeColor="text1"/>
+          <w:sz w:val="22"/>
+          <w:szCs w:val="22"/>
+        </w:rPr>
+      </w:pPr>
+      <w:r>
+        <w:rPr>
+          <w:color w:val="000000" w:themeColor="text1"/>
+          <w:sz w:val="22"/>
+          <w:szCs w:val="22"/>
+        </w:rPr>
+        <w:t>console.log(</w:t>
+      </w:r>
+      <w:proofErr w:type="spellStart"/>
+      <w:proofErr w:type="gramStart"/>
+      <w:r>
+        <w:rPr>
+          <w:color w:val="000000" w:themeColor="text1"/>
+          <w:sz w:val="22"/>
+          <w:szCs w:val="22"/>
+        </w:rPr>
+        <w:t>button.dataset</w:t>
+      </w:r>
+      <w:proofErr w:type="gramEnd"/>
+      <w:r>
+        <w:rPr>
+          <w:color w:val="000000" w:themeColor="text1"/>
+          <w:sz w:val="22"/>
+          <w:szCs w:val="22"/>
+        </w:rPr>
+        <w:t>.productId</w:t>
+      </w:r>
+      <w:proofErr w:type="spellEnd"/>
+      <w:r>
+        <w:rPr>
+          <w:color w:val="000000" w:themeColor="text1"/>
+          <w:sz w:val="22"/>
+          <w:szCs w:val="22"/>
+        </w:rPr>
+        <w:t>);</w:t>
+      </w:r>
+    </w:p>
+    <w:p>
+      <w:pPr>
+        <w:pStyle w:val="ListParagraph"/>
+        <w:rPr>
+          <w:color w:val="000000" w:themeColor="text1"/>
+          <w:sz w:val="22"/>
+          <w:szCs w:val="22"/>
+        </w:rPr>
+      </w:pPr>
+      <w:r>
+        <w:rPr>
+          <w:color w:val="000000" w:themeColor="text1"/>
+          <w:sz w:val="22"/>
+          <w:szCs w:val="22"/>
+        </w:rPr>
+        <w:t>// "42"</w:t>
+      </w:r>
+    </w:p>
+    <w:p>
+      <w:pPr>
+        <w:pStyle w:val="ListParagraph"/>
+        <w:numPr>
+          <w:ilvl w:val="0"/>
+          <w:numId w:val="12"/>
+        </w:numPr>
+        <w:rPr>
+          <w:color w:val="000000" w:themeColor="text1"/>
+          <w:sz w:val="22"/>
+          <w:szCs w:val="22"/>
+        </w:rPr>
+      </w:pPr>
+      <w:r>
+        <w:rPr>
+          <w:color w:val="000000" w:themeColor="text1"/>
+          <w:sz w:val="22"/>
+          <w:szCs w:val="22"/>
+        </w:rPr>
+        <w:t xml:space="preserve">In different JS files we cannot have the same variable names, </w:t>
+      </w:r>
+      <w:proofErr w:type="gramStart"/>
+      <w:r>
+        <w:rPr>
+          <w:color w:val="000000" w:themeColor="text1"/>
+          <w:sz w:val="22"/>
+          <w:szCs w:val="22"/>
+        </w:rPr>
+        <w:t>as long as</w:t>
+      </w:r>
+      <w:proofErr w:type="gramEnd"/>
+      <w:r>
+        <w:rPr>
+          <w:color w:val="000000" w:themeColor="text1"/>
+          <w:sz w:val="22"/>
+          <w:szCs w:val="22"/>
+        </w:rPr>
+        <w:t xml:space="preserve"> we don’t treat them like module files</w:t>
+      </w:r>
+    </w:p>
+    <w:p>
+      <w:pPr>
+        <w:pStyle w:val="ListParagraph"/>
+        <w:numPr>
+          <w:ilvl w:val="0"/>
+          <w:numId w:val="12"/>
+        </w:numPr>
+        <w:rPr>
+          <w:color w:val="000000" w:themeColor="text1"/>
+          <w:sz w:val="22"/>
+          <w:szCs w:val="22"/>
+        </w:rPr>
+      </w:pPr>
+      <w:r>
+        <w:rPr>
+          <w:color w:val="000000" w:themeColor="text1"/>
+          <w:sz w:val="22"/>
+          <w:szCs w:val="22"/>
+        </w:rPr>
+        <w:t xml:space="preserve">To create a JS </w:t>
+      </w:r>
+      <w:proofErr w:type="gramStart"/>
+      <w:r>
+        <w:rPr>
+          <w:color w:val="000000" w:themeColor="text1"/>
+          <w:sz w:val="22"/>
+          <w:szCs w:val="22"/>
+        </w:rPr>
+        <w:t>module</w:t>
+      </w:r>
+      <w:proofErr w:type="gramEnd"/>
+      <w:r>
+        <w:rPr>
+          <w:color w:val="000000" w:themeColor="text1"/>
+          <w:sz w:val="22"/>
+          <w:szCs w:val="22"/>
+        </w:rPr>
+        <w:t xml:space="preserve"> we create a normal .</w:t>
+      </w:r>
+      <w:proofErr w:type="spellStart"/>
+      <w:r>
+        <w:rPr>
+          <w:color w:val="000000" w:themeColor="text1"/>
+          <w:sz w:val="22"/>
+          <w:szCs w:val="22"/>
+        </w:rPr>
+        <w:t>js</w:t>
+      </w:r>
+      <w:proofErr w:type="spellEnd"/>
+      <w:r>
+        <w:rPr>
+          <w:color w:val="000000" w:themeColor="text1"/>
+          <w:sz w:val="22"/>
+          <w:szCs w:val="22"/>
+        </w:rPr>
+        <w:t xml:space="preserve"> file but we don’t import it into the script tag</w:t>
+      </w:r>
+    </w:p>
+    <w:p>
+      <w:pPr>
+        <w:pStyle w:val="ListParagraph"/>
+        <w:numPr>
+          <w:ilvl w:val="0"/>
+          <w:numId w:val="12"/>
+        </w:numPr>
+        <w:rPr>
+          <w:color w:val="000000" w:themeColor="text1"/>
+          <w:sz w:val="22"/>
+          <w:szCs w:val="22"/>
+        </w:rPr>
+      </w:pPr>
+      <w:r>
+        <w:rPr>
+          <w:color w:val="000000" w:themeColor="text1"/>
+          <w:sz w:val="22"/>
+          <w:szCs w:val="22"/>
+        </w:rPr>
+        <w:t xml:space="preserve">The un-preferred way: </w:t>
+      </w:r>
+    </w:p>
+    <w:p>
+      <w:pPr>
+        <w:pStyle w:val="ListParagraph"/>
+        <w:rPr>
+          <w:color w:val="000000" w:themeColor="text1"/>
+          <w:sz w:val="22"/>
+          <w:szCs w:val="22"/>
+        </w:rPr>
+      </w:pPr>
+      <w:r>
+        <w:rPr>
+          <w:color w:val="000000" w:themeColor="text1"/>
+          <w:sz w:val="22"/>
+          <w:szCs w:val="22"/>
+        </w:rPr>
+        <w:t xml:space="preserve">&lt;script </w:t>
+      </w:r>
+      <w:proofErr w:type="spellStart"/>
+      <w:r>
+        <w:rPr>
+          <w:color w:val="000000" w:themeColor="text1"/>
+          <w:sz w:val="22"/>
+          <w:szCs w:val="22"/>
+        </w:rPr>
+        <w:t>src</w:t>
+      </w:r>
+      <w:proofErr w:type="spellEnd"/>
+      <w:r>
+        <w:rPr>
+          <w:color w:val="000000" w:themeColor="text1"/>
+          <w:sz w:val="22"/>
+          <w:szCs w:val="22"/>
+        </w:rPr>
+        <w:t>="math.js"&gt;&lt;/script&gt;</w:t>
+      </w:r>
+    </w:p>
+    <w:p>
+      <w:pPr>
+        <w:pStyle w:val="ListParagraph"/>
+        <w:rPr>
+          <w:color w:val="000000" w:themeColor="text1"/>
+          <w:sz w:val="22"/>
+          <w:szCs w:val="22"/>
+        </w:rPr>
+      </w:pPr>
+      <w:r>
+        <w:rPr>
+          <w:color w:val="000000" w:themeColor="text1"/>
+          <w:sz w:val="22"/>
+          <w:szCs w:val="22"/>
+        </w:rPr>
+        <w:t xml:space="preserve">&lt;script </w:t>
+      </w:r>
+      <w:proofErr w:type="spellStart"/>
+      <w:r>
+        <w:rPr>
+          <w:color w:val="000000" w:themeColor="text1"/>
+          <w:sz w:val="22"/>
+          <w:szCs w:val="22"/>
+        </w:rPr>
+        <w:t>src</w:t>
+      </w:r>
+      <w:proofErr w:type="spellEnd"/>
+      <w:r>
+        <w:rPr>
+          <w:color w:val="000000" w:themeColor="text1"/>
+          <w:sz w:val="22"/>
+          <w:szCs w:val="22"/>
+        </w:rPr>
+        <w:t>="user.js"&gt;&lt;/script&gt;</w:t>
+      </w:r>
+    </w:p>
+    <w:p>
+      <w:pPr>
+        <w:pStyle w:val="ListParagraph"/>
+        <w:rPr>
+          <w:color w:val="000000" w:themeColor="text1"/>
+          <w:sz w:val="22"/>
+          <w:szCs w:val="22"/>
+        </w:rPr>
+      </w:pPr>
+      <w:r>
+        <w:rPr>
+          <w:color w:val="000000" w:themeColor="text1"/>
+          <w:sz w:val="22"/>
+          <w:szCs w:val="22"/>
+        </w:rPr>
+        <w:t xml:space="preserve">&lt;script </w:t>
+      </w:r>
+      <w:proofErr w:type="spellStart"/>
+      <w:r>
+        <w:rPr>
+          <w:color w:val="000000" w:themeColor="text1"/>
+          <w:sz w:val="22"/>
+          <w:szCs w:val="22"/>
+        </w:rPr>
+        <w:t>src</w:t>
+      </w:r>
+      <w:proofErr w:type="spellEnd"/>
+      <w:r>
+        <w:rPr>
+          <w:color w:val="000000" w:themeColor="text1"/>
+          <w:sz w:val="22"/>
+          <w:szCs w:val="22"/>
+        </w:rPr>
+        <w:t>="app.js"&gt;&lt;/script&gt;</w:t>
+      </w:r>
+    </w:p>
+    <w:p>
+      <w:pPr>
+        <w:pStyle w:val="ListParagraph"/>
+        <w:numPr>
+          <w:ilvl w:val="0"/>
+          <w:numId w:val="12"/>
+        </w:numPr>
+        <w:rPr>
+          <w:color w:val="000000" w:themeColor="text1"/>
+          <w:sz w:val="22"/>
+          <w:szCs w:val="22"/>
+        </w:rPr>
+      </w:pPr>
+      <w:r>
+        <w:rPr>
+          <w:color w:val="000000" w:themeColor="text1"/>
+          <w:sz w:val="22"/>
+          <w:szCs w:val="22"/>
+        </w:rPr>
+        <w:t xml:space="preserve">The preferred way is to create a module each with its independent functionalities, export the functions and the variable </w:t>
+      </w:r>
+      <w:proofErr w:type="gramStart"/>
+      <w:r>
+        <w:rPr>
+          <w:color w:val="000000" w:themeColor="text1"/>
+          <w:sz w:val="22"/>
+          <w:szCs w:val="22"/>
+        </w:rPr>
+        <w:t>names,  then</w:t>
+      </w:r>
+      <w:proofErr w:type="gramEnd"/>
+      <w:r>
+        <w:rPr>
+          <w:color w:val="000000" w:themeColor="text1"/>
+          <w:sz w:val="22"/>
+          <w:szCs w:val="22"/>
+        </w:rPr>
+        <w:t xml:space="preserve"> import it into the files </w:t>
+      </w:r>
+      <w:proofErr w:type="gramStart"/>
+      <w:r>
+        <w:rPr>
+          <w:color w:val="000000" w:themeColor="text1"/>
+          <w:sz w:val="22"/>
+          <w:szCs w:val="22"/>
+        </w:rPr>
+        <w:t>its</w:t>
+      </w:r>
+      <w:proofErr w:type="gramEnd"/>
+      <w:r>
+        <w:rPr>
+          <w:color w:val="000000" w:themeColor="text1"/>
+          <w:sz w:val="22"/>
+          <w:szCs w:val="22"/>
+        </w:rPr>
+        <w:t xml:space="preserve"> needed on, we can then have 2 different </w:t>
+      </w:r>
+      <w:proofErr w:type="spellStart"/>
+      <w:r>
+        <w:rPr>
+          <w:color w:val="000000" w:themeColor="text1"/>
+          <w:sz w:val="22"/>
+          <w:szCs w:val="22"/>
+        </w:rPr>
+        <w:t>javascript</w:t>
+      </w:r>
+      <w:proofErr w:type="spellEnd"/>
+      <w:r>
+        <w:rPr>
+          <w:color w:val="000000" w:themeColor="text1"/>
+          <w:sz w:val="22"/>
+          <w:szCs w:val="22"/>
+        </w:rPr>
+        <w:t xml:space="preserve"> files, that has the same name and import var as name2</w:t>
+      </w:r>
+    </w:p>
+    <w:p>
+      <w:pPr>
+        <w:pStyle w:val="ListParagraph"/>
+        <w:numPr>
+          <w:ilvl w:val="0"/>
+          <w:numId w:val="12"/>
+        </w:numPr>
+        <w:rPr>
+          <w:color w:val="000000" w:themeColor="text1"/>
+          <w:sz w:val="22"/>
+          <w:szCs w:val="22"/>
+        </w:rPr>
+      </w:pPr>
+      <w:r>
+        <w:rPr>
+          <w:color w:val="000000" w:themeColor="text1"/>
+          <w:sz w:val="22"/>
+          <w:szCs w:val="22"/>
+        </w:rPr>
+        <w:t xml:space="preserve">To get a var or a </w:t>
+      </w:r>
+      <w:proofErr w:type="spellStart"/>
+      <w:r>
+        <w:rPr>
+          <w:color w:val="000000" w:themeColor="text1"/>
+          <w:sz w:val="22"/>
+          <w:szCs w:val="22"/>
+        </w:rPr>
+        <w:t>func</w:t>
+      </w:r>
+      <w:proofErr w:type="spellEnd"/>
+      <w:r>
+        <w:rPr>
+          <w:color w:val="000000" w:themeColor="text1"/>
+          <w:sz w:val="22"/>
+          <w:szCs w:val="22"/>
+        </w:rPr>
+        <w:t xml:space="preserve"> out of a module we use export.</w:t>
+      </w:r>
+    </w:p>
+    <w:p>
+      <w:pPr>
+        <w:pStyle w:val="ListParagraph"/>
+        <w:numPr>
+          <w:ilvl w:val="0"/>
+          <w:numId w:val="12"/>
+        </w:numPr>
+        <w:rPr>
+          <w:color w:val="000000" w:themeColor="text1"/>
+          <w:sz w:val="22"/>
+          <w:szCs w:val="22"/>
+        </w:rPr>
+      </w:pPr>
+      <w:r>
+        <w:rPr>
+          <w:color w:val="000000" w:themeColor="text1"/>
+          <w:sz w:val="22"/>
+          <w:szCs w:val="22"/>
+        </w:rPr>
+        <w:t>for Imports and Exports to work we Need to use live Servers</w:t>
+      </w:r>
+      <w:r>
+        <w:rPr>
+          <w:color w:val="000000" w:themeColor="text1"/>
+          <w:sz w:val="22"/>
+          <w:szCs w:val="22"/>
+        </w:rPr>
+        <w:t>, in VS code</w:t>
+      </w:r>
+    </w:p>
+    <w:p>
+      <w:pPr>
+        <w:pStyle w:val="ListParagraph"/>
+        <w:numPr>
+          <w:ilvl w:val="0"/>
+          <w:numId w:val="12"/>
+        </w:numPr>
+        <w:rPr>
+          <w:color w:val="000000" w:themeColor="text1"/>
+          <w:sz w:val="22"/>
+          <w:szCs w:val="22"/>
+        </w:rPr>
+      </w:pPr>
+      <w:proofErr w:type="gramStart"/>
+      <w:r>
+        <w:rPr>
+          <w:color w:val="000000" w:themeColor="text1"/>
+          <w:sz w:val="22"/>
+          <w:szCs w:val="22"/>
+        </w:rPr>
+        <w:t>when</w:t>
+      </w:r>
+      <w:proofErr w:type="gramEnd"/>
+      <w:r>
+        <w:rPr>
+          <w:color w:val="000000" w:themeColor="text1"/>
+          <w:sz w:val="22"/>
+          <w:szCs w:val="22"/>
+        </w:rPr>
+        <w:t xml:space="preserve"> importing </w:t>
+      </w:r>
+      <w:proofErr w:type="gramStart"/>
+      <w:r>
+        <w:rPr>
+          <w:color w:val="000000" w:themeColor="text1"/>
+          <w:sz w:val="22"/>
+          <w:szCs w:val="22"/>
+        </w:rPr>
+        <w:t>its</w:t>
+      </w:r>
+      <w:proofErr w:type="gramEnd"/>
+      <w:r>
+        <w:rPr>
+          <w:color w:val="000000" w:themeColor="text1"/>
+          <w:sz w:val="22"/>
+          <w:szCs w:val="22"/>
+        </w:rPr>
+        <w:t xml:space="preserve"> preferred to import the function or the variable and give it a local name</w:t>
+      </w:r>
+    </w:p>
+    <w:p>
+      <w:pPr>
+        <w:pStyle w:val="ListParagraph"/>
+        <w:rPr>
+          <w:color w:val="000000" w:themeColor="text1"/>
+          <w:sz w:val="22"/>
+          <w:szCs w:val="22"/>
+        </w:rPr>
+      </w:pPr>
     </w:p>
     <w:sectPr>
       <w:pgSz w:w="12240" w:h="15840"/>
@@ -6307,6 +8051,119 @@
     </w:lvl>
   </w:abstractNum>
   <w:abstractNum w:abstractNumId="9" w15:restartNumberingAfterBreak="0">
+    <w:nsid w:val="7C5352BD"/>
+    <w:multiLevelType w:val="hybridMultilevel"/>
+    <w:tmpl w:val="02D897D8"/>
+    <w:lvl w:ilvl="0" w:tplc="04090001">
+      <w:start w:val="1"/>
+      <w:numFmt w:val="bullet"/>
+      <w:lvlText w:val=""/>
+      <w:lvlJc w:val="left"/>
+      <w:pPr>
+        <w:ind w:left="720" w:hanging="360"/>
+      </w:pPr>
+      <w:rPr>
+        <w:rFonts w:ascii="Symbol" w:hAnsi="Symbol" w:hint="default"/>
+      </w:rPr>
+    </w:lvl>
+    <w:lvl w:ilvl="1" w:tplc="04090003" w:tentative="1">
+      <w:start w:val="1"/>
+      <w:numFmt w:val="bullet"/>
+      <w:lvlText w:val="o"/>
+      <w:lvlJc w:val="left"/>
+      <w:pPr>
+        <w:ind w:left="1440" w:hanging="360"/>
+      </w:pPr>
+      <w:rPr>
+        <w:rFonts w:ascii="Courier New" w:hAnsi="Courier New" w:cs="Courier New" w:hint="default"/>
+      </w:rPr>
+    </w:lvl>
+    <w:lvl w:ilvl="2" w:tplc="04090005" w:tentative="1">
+      <w:start w:val="1"/>
+      <w:numFmt w:val="bullet"/>
+      <w:lvlText w:val=""/>
+      <w:lvlJc w:val="left"/>
+      <w:pPr>
+        <w:ind w:left="2160" w:hanging="360"/>
+      </w:pPr>
+      <w:rPr>
+        <w:rFonts w:ascii="Wingdings" w:hAnsi="Wingdings" w:hint="default"/>
+      </w:rPr>
+    </w:lvl>
+    <w:lvl w:ilvl="3" w:tplc="04090001" w:tentative="1">
+      <w:start w:val="1"/>
+      <w:numFmt w:val="bullet"/>
+      <w:lvlText w:val=""/>
+      <w:lvlJc w:val="left"/>
+      <w:pPr>
+        <w:ind w:left="2880" w:hanging="360"/>
+      </w:pPr>
+      <w:rPr>
+        <w:rFonts w:ascii="Symbol" w:hAnsi="Symbol" w:hint="default"/>
+      </w:rPr>
+    </w:lvl>
+    <w:lvl w:ilvl="4" w:tplc="04090003" w:tentative="1">
+      <w:start w:val="1"/>
+      <w:numFmt w:val="bullet"/>
+      <w:lvlText w:val="o"/>
+      <w:lvlJc w:val="left"/>
+      <w:pPr>
+        <w:ind w:left="3600" w:hanging="360"/>
+      </w:pPr>
+      <w:rPr>
+        <w:rFonts w:ascii="Courier New" w:hAnsi="Courier New" w:cs="Courier New" w:hint="default"/>
+      </w:rPr>
+    </w:lvl>
+    <w:lvl w:ilvl="5" w:tplc="04090005" w:tentative="1">
+      <w:start w:val="1"/>
+      <w:numFmt w:val="bullet"/>
+      <w:lvlText w:val=""/>
+      <w:lvlJc w:val="left"/>
+      <w:pPr>
+        <w:ind w:left="4320" w:hanging="360"/>
+      </w:pPr>
+      <w:rPr>
+        <w:rFonts w:ascii="Wingdings" w:hAnsi="Wingdings" w:hint="default"/>
+      </w:rPr>
+    </w:lvl>
+    <w:lvl w:ilvl="6" w:tplc="04090001" w:tentative="1">
+      <w:start w:val="1"/>
+      <w:numFmt w:val="bullet"/>
+      <w:lvlText w:val=""/>
+      <w:lvlJc w:val="left"/>
+      <w:pPr>
+        <w:ind w:left="5040" w:hanging="360"/>
+      </w:pPr>
+      <w:rPr>
+        <w:rFonts w:ascii="Symbol" w:hAnsi="Symbol" w:hint="default"/>
+      </w:rPr>
+    </w:lvl>
+    <w:lvl w:ilvl="7" w:tplc="04090003" w:tentative="1">
+      <w:start w:val="1"/>
+      <w:numFmt w:val="bullet"/>
+      <w:lvlText w:val="o"/>
+      <w:lvlJc w:val="left"/>
+      <w:pPr>
+        <w:ind w:left="5760" w:hanging="360"/>
+      </w:pPr>
+      <w:rPr>
+        <w:rFonts w:ascii="Courier New" w:hAnsi="Courier New" w:cs="Courier New" w:hint="default"/>
+      </w:rPr>
+    </w:lvl>
+    <w:lvl w:ilvl="8" w:tplc="04090005" w:tentative="1">
+      <w:start w:val="1"/>
+      <w:numFmt w:val="bullet"/>
+      <w:lvlText w:val=""/>
+      <w:lvlJc w:val="left"/>
+      <w:pPr>
+        <w:ind w:left="6480" w:hanging="360"/>
+      </w:pPr>
+      <w:rPr>
+        <w:rFonts w:ascii="Wingdings" w:hAnsi="Wingdings" w:hint="default"/>
+      </w:rPr>
+    </w:lvl>
+  </w:abstractNum>
+  <w:abstractNum w:abstractNumId="10" w15:restartNumberingAfterBreak="0">
     <w:nsid w:val="7CA817BC"/>
     <w:multiLevelType w:val="hybridMultilevel"/>
     <w:tmpl w:val="7C287A30"/>
@@ -6419,7 +8276,7 @@
       </w:rPr>
     </w:lvl>
   </w:abstractNum>
-  <w:abstractNum w:abstractNumId="10" w15:restartNumberingAfterBreak="0">
+  <w:abstractNum w:abstractNumId="11" w15:restartNumberingAfterBreak="0">
     <w:nsid w:val="7F72049C"/>
     <w:multiLevelType w:val="multilevel"/>
     <w:tmpl w:val="1F242F62"/>
@@ -6587,7 +8444,7 @@
     <w:abstractNumId w:val="8"/>
   </w:num>
   <w:num w:numId="7" w16cid:durableId="97333426">
-    <w:abstractNumId w:val="10"/>
+    <w:abstractNumId w:val="11"/>
   </w:num>
   <w:num w:numId="8" w16cid:durableId="2078238912">
     <w:abstractNumId w:val="5"/>
@@ -6599,6 +8456,9 @@
     <w:abstractNumId w:val="7"/>
   </w:num>
   <w:num w:numId="11" w16cid:durableId="49500872">
+    <w:abstractNumId w:val="10"/>
+  </w:num>
+  <w:num w:numId="12" w16cid:durableId="1627009029">
     <w:abstractNumId w:val="9"/>
   </w:num>
 </w:numbering>

</xml_diff>

<commit_message>
add external libraries notes
</commit_message>
<xml_diff>
--- a/Javascript/Javascript basic notes.docx
+++ b/Javascript/Javascript basic notes.docx
@@ -6964,6 +6964,1290 @@
     <w:p>
       <w:pPr>
         <w:pStyle w:val="ListParagraph"/>
+        <w:numPr>
+          <w:ilvl w:val="0"/>
+          <w:numId w:val="12"/>
+        </w:numPr>
+        <w:rPr>
+          <w:color w:val="000000" w:themeColor="text1"/>
+          <w:sz w:val="22"/>
+          <w:szCs w:val="22"/>
+        </w:rPr>
+      </w:pPr>
+      <w:proofErr w:type="gramStart"/>
+      <w:r>
+        <w:rPr>
+          <w:color w:val="000000" w:themeColor="text1"/>
+          <w:sz w:val="22"/>
+          <w:szCs w:val="22"/>
+        </w:rPr>
+        <w:t>.</w:t>
+      </w:r>
+      <w:proofErr w:type="spellStart"/>
+      <w:r>
+        <w:rPr>
+          <w:color w:val="000000" w:themeColor="text1"/>
+          <w:sz w:val="22"/>
+          <w:szCs w:val="22"/>
+        </w:rPr>
+        <w:t>toFixed</w:t>
+      </w:r>
+      <w:proofErr w:type="spellEnd"/>
+      <w:proofErr w:type="gramEnd"/>
+      <w:r>
+        <w:rPr>
+          <w:color w:val="000000" w:themeColor="text1"/>
+          <w:sz w:val="22"/>
+          <w:szCs w:val="22"/>
+        </w:rPr>
+        <w:t xml:space="preserve">(number) decides and rounds some numbers after the decimal point, so </w:t>
+      </w:r>
+      <w:proofErr w:type="spellStart"/>
+      <w:r>
+        <w:rPr>
+          <w:color w:val="000000" w:themeColor="text1"/>
+          <w:sz w:val="22"/>
+          <w:szCs w:val="22"/>
+        </w:rPr>
+        <w:t>entiring</w:t>
+      </w:r>
+      <w:proofErr w:type="spellEnd"/>
+      <w:r>
+        <w:rPr>
+          <w:color w:val="000000" w:themeColor="text1"/>
+          <w:sz w:val="22"/>
+          <w:szCs w:val="22"/>
+        </w:rPr>
+        <w:t xml:space="preserve"> the number 2 would force it to show 2 numbers after the decimal point even if the number is zero</w:t>
+      </w:r>
+    </w:p>
+    <w:p>
+      <w:pPr>
+        <w:pStyle w:val="ListParagraph"/>
+        <w:numPr>
+          <w:ilvl w:val="0"/>
+          <w:numId w:val="12"/>
+        </w:numPr>
+        <w:rPr>
+          <w:color w:val="000000" w:themeColor="text1"/>
+          <w:sz w:val="22"/>
+          <w:szCs w:val="22"/>
+        </w:rPr>
+      </w:pPr>
+      <w:proofErr w:type="gramStart"/>
+      <w:r>
+        <w:rPr>
+          <w:color w:val="000000" w:themeColor="text1"/>
+          <w:sz w:val="22"/>
+          <w:szCs w:val="22"/>
+        </w:rPr>
+        <w:t>.remove</w:t>
+      </w:r>
+      <w:proofErr w:type="gramEnd"/>
+      <w:r>
+        <w:rPr>
+          <w:color w:val="000000" w:themeColor="text1"/>
+          <w:sz w:val="22"/>
+          <w:szCs w:val="22"/>
+        </w:rPr>
+        <w:t>() can delete an entire div from the DOM</w:t>
+      </w:r>
+      <w:r>
+        <w:rPr>
+          <w:color w:val="000000" w:themeColor="text1"/>
+          <w:sz w:val="22"/>
+          <w:szCs w:val="22"/>
+        </w:rPr>
+        <w:t xml:space="preserve"> </w:t>
+      </w:r>
+      <w:r>
+        <w:rPr>
+          <w:color w:val="000000" w:themeColor="text1"/>
+          <w:sz w:val="22"/>
+          <w:szCs w:val="22"/>
+        </w:rPr>
+        <w:sym w:font="Wingdings" w:char="F0E0"/>
+      </w:r>
+      <w:r>
+        <w:rPr>
+          <w:color w:val="000000" w:themeColor="text1"/>
+          <w:sz w:val="22"/>
+          <w:szCs w:val="22"/>
+        </w:rPr>
+        <w:t xml:space="preserve"> </w:t>
+      </w:r>
+    </w:p>
+    <w:p>
+      <w:pPr>
+        <w:pStyle w:val="ListParagraph"/>
+        <w:rPr>
+          <w:color w:val="000000" w:themeColor="text1"/>
+          <w:sz w:val="22"/>
+          <w:szCs w:val="22"/>
+        </w:rPr>
+      </w:pPr>
+      <w:r>
+        <w:rPr>
+          <w:color w:val="000000" w:themeColor="text1"/>
+          <w:sz w:val="22"/>
+          <w:szCs w:val="22"/>
+        </w:rPr>
+        <w:t xml:space="preserve">Code example would be: </w:t>
+      </w:r>
+    </w:p>
+    <w:p>
+      <w:pPr>
+        <w:pStyle w:val="ListParagraph"/>
+        <w:rPr>
+          <w:color w:val="000000" w:themeColor="text1"/>
+          <w:sz w:val="22"/>
+          <w:szCs w:val="22"/>
+        </w:rPr>
+      </w:pPr>
+      <w:r>
+        <w:rPr>
+          <w:color w:val="000000" w:themeColor="text1"/>
+          <w:sz w:val="22"/>
+          <w:szCs w:val="22"/>
+        </w:rPr>
+        <w:t>&lt;div id="product"&gt;</w:t>
+      </w:r>
+    </w:p>
+    <w:p>
+      <w:pPr>
+        <w:pStyle w:val="ListParagraph"/>
+        <w:rPr>
+          <w:color w:val="000000" w:themeColor="text1"/>
+          <w:sz w:val="22"/>
+          <w:szCs w:val="22"/>
+        </w:rPr>
+      </w:pPr>
+      <w:r>
+        <w:rPr>
+          <w:color w:val="000000" w:themeColor="text1"/>
+          <w:sz w:val="22"/>
+          <w:szCs w:val="22"/>
+        </w:rPr>
+        <w:t xml:space="preserve">    &lt;h2&gt;Laptop&lt;/h2&gt;</w:t>
+      </w:r>
+    </w:p>
+    <w:p>
+      <w:pPr>
+        <w:pStyle w:val="ListParagraph"/>
+        <w:rPr>
+          <w:color w:val="000000" w:themeColor="text1"/>
+          <w:sz w:val="22"/>
+          <w:szCs w:val="22"/>
+        </w:rPr>
+      </w:pPr>
+      <w:r>
+        <w:rPr>
+          <w:color w:val="000000" w:themeColor="text1"/>
+          <w:sz w:val="22"/>
+          <w:szCs w:val="22"/>
+        </w:rPr>
+        <w:t xml:space="preserve">    &lt;p&gt;€999&lt;/p&gt;</w:t>
+      </w:r>
+    </w:p>
+    <w:p>
+      <w:pPr>
+        <w:pStyle w:val="ListParagraph"/>
+        <w:rPr>
+          <w:color w:val="000000" w:themeColor="text1"/>
+          <w:sz w:val="22"/>
+          <w:szCs w:val="22"/>
+        </w:rPr>
+      </w:pPr>
+      <w:r>
+        <w:rPr>
+          <w:color w:val="000000" w:themeColor="text1"/>
+          <w:sz w:val="22"/>
+          <w:szCs w:val="22"/>
+        </w:rPr>
+        <w:t xml:space="preserve">    &lt;button&gt;Delete&lt;/button&gt;</w:t>
+      </w:r>
+    </w:p>
+    <w:p>
+      <w:pPr>
+        <w:pStyle w:val="ListParagraph"/>
+        <w:rPr>
+          <w:color w:val="000000" w:themeColor="text1"/>
+          <w:sz w:val="22"/>
+          <w:szCs w:val="22"/>
+        </w:rPr>
+      </w:pPr>
+      <w:r>
+        <w:rPr>
+          <w:color w:val="000000" w:themeColor="text1"/>
+          <w:sz w:val="22"/>
+          <w:szCs w:val="22"/>
+        </w:rPr>
+        <w:t>&lt;/div&gt;</w:t>
+      </w:r>
+    </w:p>
+    <w:p>
+      <w:pPr>
+        <w:pStyle w:val="ListParagraph"/>
+        <w:rPr>
+          <w:color w:val="000000" w:themeColor="text1"/>
+          <w:sz w:val="22"/>
+          <w:szCs w:val="22"/>
+        </w:rPr>
+      </w:pPr>
+      <w:r>
+        <w:rPr>
+          <w:color w:val="000000" w:themeColor="text1"/>
+          <w:sz w:val="22"/>
+          <w:szCs w:val="22"/>
+        </w:rPr>
+        <w:t xml:space="preserve">const product = </w:t>
+      </w:r>
+      <w:proofErr w:type="spellStart"/>
+      <w:proofErr w:type="gramStart"/>
+      <w:r>
+        <w:rPr>
+          <w:color w:val="000000" w:themeColor="text1"/>
+          <w:sz w:val="22"/>
+          <w:szCs w:val="22"/>
+        </w:rPr>
+        <w:t>document.querySelector</w:t>
+      </w:r>
+      <w:proofErr w:type="spellEnd"/>
+      <w:r>
+        <w:rPr>
+          <w:color w:val="000000" w:themeColor="text1"/>
+          <w:sz w:val="22"/>
+          <w:szCs w:val="22"/>
+        </w:rPr>
+        <w:t>("#</w:t>
+      </w:r>
+      <w:proofErr w:type="gramEnd"/>
+      <w:r>
+        <w:rPr>
+          <w:color w:val="000000" w:themeColor="text1"/>
+          <w:sz w:val="22"/>
+          <w:szCs w:val="22"/>
+        </w:rPr>
+        <w:t>product");</w:t>
+      </w:r>
+    </w:p>
+    <w:p>
+      <w:pPr>
+        <w:pStyle w:val="ListParagraph"/>
+        <w:rPr>
+          <w:color w:val="000000" w:themeColor="text1"/>
+          <w:sz w:val="22"/>
+          <w:szCs w:val="22"/>
+        </w:rPr>
+      </w:pPr>
+      <w:proofErr w:type="spellStart"/>
+      <w:proofErr w:type="gramStart"/>
+      <w:r>
+        <w:rPr>
+          <w:color w:val="000000" w:themeColor="text1"/>
+          <w:sz w:val="22"/>
+          <w:szCs w:val="22"/>
+        </w:rPr>
+        <w:t>product.remove</w:t>
+      </w:r>
+      <w:proofErr w:type="spellEnd"/>
+      <w:proofErr w:type="gramEnd"/>
+      <w:r>
+        <w:rPr>
+          <w:color w:val="000000" w:themeColor="text1"/>
+          <w:sz w:val="22"/>
+          <w:szCs w:val="22"/>
+        </w:rPr>
+        <w:t>();</w:t>
+      </w:r>
+    </w:p>
+    <w:p>
+      <w:pPr>
+        <w:ind w:left="720"/>
+        <w:rPr>
+          <w:color w:val="000000" w:themeColor="text1"/>
+          <w:sz w:val="22"/>
+          <w:szCs w:val="22"/>
+        </w:rPr>
+      </w:pPr>
+      <w:proofErr w:type="gramStart"/>
+      <w:r>
+        <w:rPr>
+          <w:color w:val="000000" w:themeColor="text1"/>
+          <w:sz w:val="22"/>
+          <w:szCs w:val="22"/>
+        </w:rPr>
+        <w:t>so</w:t>
+      </w:r>
+      <w:proofErr w:type="gramEnd"/>
+      <w:r>
+        <w:rPr>
+          <w:color w:val="000000" w:themeColor="text1"/>
+          <w:sz w:val="22"/>
+          <w:szCs w:val="22"/>
+        </w:rPr>
+        <w:t xml:space="preserve"> the steps are </w:t>
+      </w:r>
+      <w:proofErr w:type="gramStart"/>
+      <w:r>
+        <w:rPr>
+          <w:color w:val="000000" w:themeColor="text1"/>
+          <w:sz w:val="22"/>
+          <w:szCs w:val="22"/>
+        </w:rPr>
+        <w:t>get</w:t>
+      </w:r>
+      <w:proofErr w:type="gramEnd"/>
+      <w:r>
+        <w:rPr>
+          <w:color w:val="000000" w:themeColor="text1"/>
+          <w:sz w:val="22"/>
+          <w:szCs w:val="22"/>
+        </w:rPr>
+        <w:t xml:space="preserve"> the element and store it into a </w:t>
+      </w:r>
+      <w:proofErr w:type="spellStart"/>
+      <w:r>
+        <w:rPr>
+          <w:color w:val="000000" w:themeColor="text1"/>
+          <w:sz w:val="22"/>
+          <w:szCs w:val="22"/>
+        </w:rPr>
+        <w:t>javascript</w:t>
+      </w:r>
+      <w:proofErr w:type="spellEnd"/>
+      <w:r>
+        <w:rPr>
+          <w:color w:val="000000" w:themeColor="text1"/>
+          <w:sz w:val="22"/>
+          <w:szCs w:val="22"/>
+        </w:rPr>
+        <w:t xml:space="preserve"> variable using the </w:t>
+      </w:r>
+      <w:proofErr w:type="spellStart"/>
+      <w:proofErr w:type="gramStart"/>
+      <w:r>
+        <w:rPr>
+          <w:color w:val="000000" w:themeColor="text1"/>
+          <w:sz w:val="22"/>
+          <w:szCs w:val="22"/>
+        </w:rPr>
+        <w:t>querySelector</w:t>
+      </w:r>
+      <w:proofErr w:type="spellEnd"/>
+      <w:r>
+        <w:rPr>
+          <w:color w:val="000000" w:themeColor="text1"/>
+          <w:sz w:val="22"/>
+          <w:szCs w:val="22"/>
+        </w:rPr>
+        <w:t>(</w:t>
+      </w:r>
+      <w:proofErr w:type="gramEnd"/>
+      <w:r>
+        <w:rPr>
+          <w:color w:val="000000" w:themeColor="text1"/>
+          <w:sz w:val="22"/>
+          <w:szCs w:val="22"/>
+        </w:rPr>
+        <w:t>) and then use this variable to delete the element</w:t>
+      </w:r>
+    </w:p>
+    <w:p>
+      <w:pPr>
+        <w:rPr>
+          <w:color w:val="000000" w:themeColor="text1"/>
+          <w:sz w:val="22"/>
+          <w:szCs w:val="22"/>
+        </w:rPr>
+      </w:pPr>
+    </w:p>
+    <w:p>
+      <w:pPr>
+        <w:rPr>
+          <w:b/>
+          <w:bCs/>
+          <w:color w:val="000000" w:themeColor="text1"/>
+          <w:u w:val="single"/>
+        </w:rPr>
+      </w:pPr>
+      <w:r>
+        <w:rPr>
+          <w:b/>
+          <w:bCs/>
+          <w:color w:val="000000" w:themeColor="text1"/>
+          <w:u w:val="single"/>
+        </w:rPr>
+        <w:t>E</w:t>
+      </w:r>
+      <w:r>
+        <w:rPr>
+          <w:b/>
+          <w:bCs/>
+          <w:color w:val="000000" w:themeColor="text1"/>
+          <w:u w:val="single"/>
+        </w:rPr>
+        <w:t>xternal library:</w:t>
+      </w:r>
+    </w:p>
+    <w:p>
+      <w:pPr>
+        <w:pStyle w:val="ListParagraph"/>
+        <w:numPr>
+          <w:ilvl w:val="0"/>
+          <w:numId w:val="13"/>
+        </w:numPr>
+        <w:rPr>
+          <w:color w:val="000000" w:themeColor="text1"/>
+          <w:sz w:val="22"/>
+          <w:szCs w:val="22"/>
+        </w:rPr>
+      </w:pPr>
+      <w:r>
+        <w:rPr>
+          <w:color w:val="000000" w:themeColor="text1"/>
+          <w:sz w:val="22"/>
+          <w:szCs w:val="22"/>
+        </w:rPr>
+        <w:t>An external library is code that someone else has already written that you can use in your project.</w:t>
+      </w:r>
+    </w:p>
+    <w:p>
+      <w:pPr>
+        <w:pStyle w:val="ListParagraph"/>
+        <w:numPr>
+          <w:ilvl w:val="0"/>
+          <w:numId w:val="13"/>
+        </w:numPr>
+        <w:rPr>
+          <w:color w:val="000000" w:themeColor="text1"/>
+          <w:sz w:val="22"/>
+          <w:szCs w:val="22"/>
+        </w:rPr>
+      </w:pPr>
+      <w:r>
+        <w:rPr>
+          <w:color w:val="000000" w:themeColor="text1"/>
+          <w:sz w:val="22"/>
+          <w:szCs w:val="22"/>
+        </w:rPr>
+        <w:t>We use External Libraries m</w:t>
+      </w:r>
+      <w:r>
+        <w:rPr>
+          <w:color w:val="000000" w:themeColor="text1"/>
+          <w:sz w:val="22"/>
+          <w:szCs w:val="22"/>
+        </w:rPr>
+        <w:t>ainly because they save time and provide functionality that would otherwise take a lot of work to implement yourself.</w:t>
+      </w:r>
+    </w:p>
+    <w:p>
+      <w:pPr>
+        <w:pStyle w:val="ListParagraph"/>
+        <w:numPr>
+          <w:ilvl w:val="0"/>
+          <w:numId w:val="13"/>
+        </w:numPr>
+        <w:rPr>
+          <w:color w:val="000000" w:themeColor="text1"/>
+          <w:sz w:val="22"/>
+          <w:szCs w:val="22"/>
+        </w:rPr>
+      </w:pPr>
+      <w:r>
+        <w:rPr>
+          <w:color w:val="000000" w:themeColor="text1"/>
+          <w:sz w:val="22"/>
+          <w:szCs w:val="22"/>
+        </w:rPr>
+        <w:t>Day.js is a JavaScript library for working with dates and times.</w:t>
+      </w:r>
+      <w:r>
+        <w:rPr>
+          <w:color w:val="000000" w:themeColor="text1"/>
+          <w:sz w:val="22"/>
+          <w:szCs w:val="22"/>
+        </w:rPr>
+        <w:t xml:space="preserve">  </w:t>
+      </w:r>
+      <w:proofErr w:type="spellStart"/>
+      <w:proofErr w:type="gramStart"/>
+      <w:r>
+        <w:rPr>
+          <w:color w:val="000000" w:themeColor="text1"/>
+          <w:sz w:val="22"/>
+          <w:szCs w:val="22"/>
+        </w:rPr>
+        <w:t>dayjs</w:t>
+      </w:r>
+      <w:proofErr w:type="spellEnd"/>
+      <w:r>
+        <w:rPr>
+          <w:color w:val="000000" w:themeColor="text1"/>
+          <w:sz w:val="22"/>
+          <w:szCs w:val="22"/>
+        </w:rPr>
+        <w:t>(</w:t>
+      </w:r>
+      <w:proofErr w:type="gramEnd"/>
+      <w:r>
+        <w:rPr>
+          <w:color w:val="000000" w:themeColor="text1"/>
+          <w:sz w:val="22"/>
+          <w:szCs w:val="22"/>
+        </w:rPr>
+        <w:t>);</w:t>
+      </w:r>
+      <w:r>
+        <w:rPr>
+          <w:color w:val="000000" w:themeColor="text1"/>
+          <w:sz w:val="22"/>
+          <w:szCs w:val="22"/>
+        </w:rPr>
+        <w:t xml:space="preserve"> this function gives us a </w:t>
+      </w:r>
+      <w:proofErr w:type="spellStart"/>
+      <w:r>
+        <w:rPr>
+          <w:color w:val="000000" w:themeColor="text1"/>
+          <w:sz w:val="22"/>
+          <w:szCs w:val="22"/>
+        </w:rPr>
+        <w:t>dayjs</w:t>
+      </w:r>
+      <w:proofErr w:type="spellEnd"/>
+      <w:r>
+        <w:rPr>
+          <w:color w:val="000000" w:themeColor="text1"/>
+          <w:sz w:val="22"/>
+          <w:szCs w:val="22"/>
+        </w:rPr>
+        <w:t xml:space="preserve"> object to deal with. </w:t>
+      </w:r>
+    </w:p>
+    <w:p>
+      <w:pPr>
+        <w:pStyle w:val="ListParagraph"/>
+        <w:numPr>
+          <w:ilvl w:val="0"/>
+          <w:numId w:val="13"/>
+        </w:numPr>
+        <w:rPr>
+          <w:color w:val="000000" w:themeColor="text1"/>
+          <w:sz w:val="22"/>
+          <w:szCs w:val="22"/>
+        </w:rPr>
+      </w:pPr>
+      <w:proofErr w:type="spellStart"/>
+      <w:r>
+        <w:rPr>
+          <w:color w:val="000000" w:themeColor="text1"/>
+          <w:sz w:val="22"/>
+          <w:szCs w:val="22"/>
+        </w:rPr>
+        <w:t>dayjs</w:t>
+      </w:r>
+      <w:proofErr w:type="spellEnd"/>
+      <w:r>
+        <w:rPr>
+          <w:color w:val="000000" w:themeColor="text1"/>
+          <w:sz w:val="22"/>
+          <w:szCs w:val="22"/>
+        </w:rPr>
+        <w:t>(</w:t>
+      </w:r>
+      <w:proofErr w:type="gramStart"/>
+      <w:r>
+        <w:rPr>
+          <w:color w:val="000000" w:themeColor="text1"/>
+          <w:sz w:val="22"/>
+          <w:szCs w:val="22"/>
+        </w:rPr>
+        <w:t>).format</w:t>
+      </w:r>
+      <w:proofErr w:type="gramEnd"/>
+      <w:r>
+        <w:rPr>
+          <w:color w:val="000000" w:themeColor="text1"/>
+          <w:sz w:val="22"/>
+          <w:szCs w:val="22"/>
+        </w:rPr>
+        <w:t>("YYYY-MM-DD");</w:t>
+      </w:r>
+      <w:r>
+        <w:rPr>
+          <w:color w:val="000000" w:themeColor="text1"/>
+          <w:sz w:val="22"/>
+          <w:szCs w:val="22"/>
+        </w:rPr>
+        <w:t xml:space="preserve"> th</w:t>
+      </w:r>
+      <w:r>
+        <w:rPr>
+          <w:color w:val="000000" w:themeColor="text1"/>
+          <w:sz w:val="22"/>
+          <w:szCs w:val="22"/>
+        </w:rPr>
+        <w:t xml:space="preserve">is gives us the formatting ability. </w:t>
+      </w:r>
+    </w:p>
+    <w:p>
+      <w:pPr>
+        <w:pStyle w:val="ListParagraph"/>
+        <w:numPr>
+          <w:ilvl w:val="0"/>
+          <w:numId w:val="13"/>
+        </w:numPr>
+        <w:rPr>
+          <w:color w:val="000000" w:themeColor="text1"/>
+          <w:sz w:val="22"/>
+          <w:szCs w:val="22"/>
+        </w:rPr>
+      </w:pPr>
+      <w:r>
+        <w:rPr>
+          <w:color w:val="000000" w:themeColor="text1"/>
+          <w:sz w:val="22"/>
+          <w:szCs w:val="22"/>
+        </w:rPr>
+        <w:lastRenderedPageBreak/>
+        <w:t xml:space="preserve">const today = </w:t>
+      </w:r>
+      <w:proofErr w:type="spellStart"/>
+      <w:proofErr w:type="gramStart"/>
+      <w:r>
+        <w:rPr>
+          <w:color w:val="000000" w:themeColor="text1"/>
+          <w:sz w:val="22"/>
+          <w:szCs w:val="22"/>
+        </w:rPr>
+        <w:t>dayjs</w:t>
+      </w:r>
+      <w:proofErr w:type="spellEnd"/>
+      <w:r>
+        <w:rPr>
+          <w:color w:val="000000" w:themeColor="text1"/>
+          <w:sz w:val="22"/>
+          <w:szCs w:val="22"/>
+        </w:rPr>
+        <w:t>(</w:t>
+      </w:r>
+      <w:proofErr w:type="gramEnd"/>
+      <w:r>
+        <w:rPr>
+          <w:color w:val="000000" w:themeColor="text1"/>
+          <w:sz w:val="22"/>
+          <w:szCs w:val="22"/>
+        </w:rPr>
+        <w:t>);</w:t>
+      </w:r>
+      <w:r>
+        <w:rPr>
+          <w:color w:val="000000" w:themeColor="text1"/>
+          <w:sz w:val="22"/>
+          <w:szCs w:val="22"/>
+        </w:rPr>
+        <w:t xml:space="preserve"> the default for </w:t>
+      </w:r>
+      <w:proofErr w:type="spellStart"/>
+      <w:proofErr w:type="gramStart"/>
+      <w:r>
+        <w:rPr>
+          <w:color w:val="000000" w:themeColor="text1"/>
+          <w:sz w:val="22"/>
+          <w:szCs w:val="22"/>
+        </w:rPr>
+        <w:t>dayjs</w:t>
+      </w:r>
+      <w:proofErr w:type="spellEnd"/>
+      <w:r>
+        <w:rPr>
+          <w:color w:val="000000" w:themeColor="text1"/>
+          <w:sz w:val="22"/>
+          <w:szCs w:val="22"/>
+        </w:rPr>
+        <w:t>(</w:t>
+      </w:r>
+      <w:proofErr w:type="gramEnd"/>
+      <w:r>
+        <w:rPr>
+          <w:color w:val="000000" w:themeColor="text1"/>
+          <w:sz w:val="22"/>
+          <w:szCs w:val="22"/>
+        </w:rPr>
+        <w:t xml:space="preserve">) is to return the date of the current day. </w:t>
+      </w:r>
+      <w:proofErr w:type="gramStart"/>
+      <w:r>
+        <w:rPr>
+          <w:color w:val="000000" w:themeColor="text1"/>
+          <w:sz w:val="22"/>
+          <w:szCs w:val="22"/>
+        </w:rPr>
+        <w:t>However</w:t>
+      </w:r>
+      <w:proofErr w:type="gramEnd"/>
+      <w:r>
+        <w:rPr>
+          <w:color w:val="000000" w:themeColor="text1"/>
+          <w:sz w:val="22"/>
+          <w:szCs w:val="22"/>
+        </w:rPr>
+        <w:t xml:space="preserve"> we can pass </w:t>
+      </w:r>
+      <w:proofErr w:type="gramStart"/>
+      <w:r>
+        <w:rPr>
+          <w:color w:val="000000" w:themeColor="text1"/>
+          <w:sz w:val="22"/>
+          <w:szCs w:val="22"/>
+        </w:rPr>
+        <w:t>in</w:t>
+      </w:r>
+      <w:proofErr w:type="gramEnd"/>
+      <w:r>
+        <w:rPr>
+          <w:color w:val="000000" w:themeColor="text1"/>
+          <w:sz w:val="22"/>
+          <w:szCs w:val="22"/>
+        </w:rPr>
+        <w:t xml:space="preserve"> the constructor </w:t>
+      </w:r>
+      <w:proofErr w:type="gramStart"/>
+      <w:r>
+        <w:rPr>
+          <w:color w:val="000000" w:themeColor="text1"/>
+          <w:sz w:val="22"/>
+          <w:szCs w:val="22"/>
+        </w:rPr>
+        <w:t>the date</w:t>
+      </w:r>
+      <w:proofErr w:type="gramEnd"/>
+      <w:r>
+        <w:rPr>
+          <w:color w:val="000000" w:themeColor="text1"/>
+          <w:sz w:val="22"/>
+          <w:szCs w:val="22"/>
+        </w:rPr>
+        <w:t xml:space="preserve"> that we want to store into a new variable. For example: </w:t>
+      </w:r>
+      <w:r>
+        <w:rPr>
+          <w:color w:val="000000" w:themeColor="text1"/>
+          <w:sz w:val="22"/>
+          <w:szCs w:val="22"/>
+        </w:rPr>
+        <w:t xml:space="preserve">const birthday = </w:t>
+      </w:r>
+      <w:proofErr w:type="spellStart"/>
+      <w:proofErr w:type="gramStart"/>
+      <w:r>
+        <w:rPr>
+          <w:color w:val="000000" w:themeColor="text1"/>
+          <w:sz w:val="22"/>
+          <w:szCs w:val="22"/>
+        </w:rPr>
+        <w:t>dayjs</w:t>
+      </w:r>
+      <w:proofErr w:type="spellEnd"/>
+      <w:r>
+        <w:rPr>
+          <w:color w:val="000000" w:themeColor="text1"/>
+          <w:sz w:val="22"/>
+          <w:szCs w:val="22"/>
+        </w:rPr>
+        <w:t>(</w:t>
+      </w:r>
+      <w:proofErr w:type="gramEnd"/>
+      <w:r>
+        <w:rPr>
+          <w:color w:val="000000" w:themeColor="text1"/>
+          <w:sz w:val="22"/>
+          <w:szCs w:val="22"/>
+        </w:rPr>
+        <w:t>"2000-05-15");</w:t>
+      </w:r>
+    </w:p>
+    <w:p>
+      <w:pPr>
+        <w:pStyle w:val="ListParagraph"/>
+        <w:numPr>
+          <w:ilvl w:val="0"/>
+          <w:numId w:val="13"/>
+        </w:numPr>
+        <w:rPr>
+          <w:color w:val="000000" w:themeColor="text1"/>
+          <w:sz w:val="22"/>
+          <w:szCs w:val="22"/>
+        </w:rPr>
+      </w:pPr>
+      <w:proofErr w:type="gramStart"/>
+      <w:r>
+        <w:rPr>
+          <w:color w:val="000000" w:themeColor="text1"/>
+          <w:sz w:val="22"/>
+          <w:szCs w:val="22"/>
+        </w:rPr>
+        <w:t>when</w:t>
+      </w:r>
+      <w:proofErr w:type="gramEnd"/>
+      <w:r>
+        <w:rPr>
+          <w:color w:val="000000" w:themeColor="text1"/>
+          <w:sz w:val="22"/>
+          <w:szCs w:val="22"/>
+        </w:rPr>
+        <w:t xml:space="preserve"> formatting a </w:t>
+      </w:r>
+      <w:proofErr w:type="gramStart"/>
+      <w:r>
+        <w:rPr>
+          <w:color w:val="000000" w:themeColor="text1"/>
+          <w:sz w:val="22"/>
+          <w:szCs w:val="22"/>
+        </w:rPr>
+        <w:t>date</w:t>
+      </w:r>
+      <w:proofErr w:type="gramEnd"/>
+      <w:r>
+        <w:rPr>
+          <w:color w:val="000000" w:themeColor="text1"/>
+          <w:sz w:val="22"/>
+          <w:szCs w:val="22"/>
+        </w:rPr>
+        <w:t xml:space="preserve"> we can pass to the function called format certain data as a string this string </w:t>
+      </w:r>
+      <w:proofErr w:type="spellStart"/>
+      <w:r>
+        <w:rPr>
+          <w:color w:val="000000" w:themeColor="text1"/>
+          <w:sz w:val="22"/>
+          <w:szCs w:val="22"/>
+        </w:rPr>
+        <w:t>arg</w:t>
+      </w:r>
+      <w:proofErr w:type="spellEnd"/>
+      <w:r>
+        <w:rPr>
+          <w:color w:val="000000" w:themeColor="text1"/>
+          <w:sz w:val="22"/>
+          <w:szCs w:val="22"/>
+        </w:rPr>
+        <w:t xml:space="preserve"> is responsible for deciding the format style</w:t>
+      </w:r>
+    </w:p>
+    <w:p>
+      <w:pPr>
+        <w:pStyle w:val="ListParagraph"/>
+        <w:numPr>
+          <w:ilvl w:val="0"/>
+          <w:numId w:val="13"/>
+        </w:numPr>
+        <w:spacing w:before="100" w:beforeAutospacing="1" w:after="100" w:afterAutospacing="1" w:line="240" w:lineRule="auto"/>
+        <w:rPr>
+          <w:color w:val="000000" w:themeColor="text1"/>
+          <w:sz w:val="22"/>
+          <w:szCs w:val="22"/>
+        </w:rPr>
+      </w:pPr>
+      <w:r>
+        <w:rPr>
+          <w:color w:val="000000" w:themeColor="text1"/>
+          <w:sz w:val="22"/>
+          <w:szCs w:val="22"/>
+        </w:rPr>
+        <w:t>when you see:</w:t>
+      </w:r>
+      <w:r>
+        <w:rPr>
+          <w:color w:val="000000" w:themeColor="text1"/>
+          <w:sz w:val="22"/>
+          <w:szCs w:val="22"/>
+        </w:rPr>
+        <w:t xml:space="preserve"> </w:t>
+      </w:r>
+      <w:r>
+        <w:rPr>
+          <w:color w:val="000000" w:themeColor="text1"/>
+          <w:sz w:val="22"/>
+          <w:szCs w:val="22"/>
+        </w:rPr>
+        <w:t>import ...</w:t>
+      </w:r>
+      <w:r>
+        <w:rPr>
+          <w:color w:val="000000" w:themeColor="text1"/>
+          <w:sz w:val="22"/>
+          <w:szCs w:val="22"/>
+        </w:rPr>
+        <w:t xml:space="preserve"> </w:t>
+      </w:r>
+      <w:r>
+        <w:rPr>
+          <w:color w:val="000000" w:themeColor="text1"/>
+          <w:sz w:val="22"/>
+          <w:szCs w:val="22"/>
+        </w:rPr>
+        <w:t>export ...</w:t>
+      </w:r>
+      <w:r>
+        <w:rPr>
+          <w:color w:val="000000" w:themeColor="text1"/>
+          <w:sz w:val="22"/>
+          <w:szCs w:val="22"/>
+        </w:rPr>
+        <w:t xml:space="preserve"> </w:t>
+      </w:r>
+      <w:r>
+        <w:rPr>
+          <w:color w:val="000000" w:themeColor="text1"/>
+          <w:sz w:val="22"/>
+          <w:szCs w:val="22"/>
+        </w:rPr>
+        <w:t>you're working with ES modules (ESM)</w:t>
+      </w:r>
+    </w:p>
+    <w:p>
+      <w:pPr>
+        <w:pStyle w:val="ListParagraph"/>
+        <w:numPr>
+          <w:ilvl w:val="0"/>
+          <w:numId w:val="13"/>
+        </w:numPr>
+        <w:rPr>
+          <w:color w:val="000000" w:themeColor="text1"/>
+          <w:sz w:val="22"/>
+          <w:szCs w:val="22"/>
+        </w:rPr>
+      </w:pPr>
+      <w:r>
+        <w:rPr>
+          <w:color w:val="000000" w:themeColor="text1"/>
+          <w:sz w:val="22"/>
+          <w:szCs w:val="22"/>
+        </w:rPr>
+        <w:t xml:space="preserve">to import </w:t>
+      </w:r>
+      <w:proofErr w:type="spellStart"/>
+      <w:r>
+        <w:rPr>
+          <w:color w:val="000000" w:themeColor="text1"/>
+          <w:sz w:val="22"/>
+          <w:szCs w:val="22"/>
+        </w:rPr>
+        <w:t>dayjs</w:t>
+      </w:r>
+      <w:proofErr w:type="spellEnd"/>
+      <w:r>
+        <w:rPr>
+          <w:color w:val="000000" w:themeColor="text1"/>
+          <w:sz w:val="22"/>
+          <w:szCs w:val="22"/>
+        </w:rPr>
+        <w:t xml:space="preserve"> first we need to install it into our system then: </w:t>
+      </w:r>
+      <w:r>
+        <w:rPr>
+          <w:color w:val="000000" w:themeColor="text1"/>
+          <w:sz w:val="22"/>
+          <w:szCs w:val="22"/>
+        </w:rPr>
+        <w:t xml:space="preserve">import </w:t>
+      </w:r>
+      <w:proofErr w:type="spellStart"/>
+      <w:r>
+        <w:rPr>
+          <w:color w:val="000000" w:themeColor="text1"/>
+          <w:sz w:val="22"/>
+          <w:szCs w:val="22"/>
+        </w:rPr>
+        <w:t>dayjs</w:t>
+      </w:r>
+      <w:proofErr w:type="spellEnd"/>
+      <w:r>
+        <w:rPr>
+          <w:color w:val="000000" w:themeColor="text1"/>
+          <w:sz w:val="22"/>
+          <w:szCs w:val="22"/>
+        </w:rPr>
+        <w:t xml:space="preserve"> from "</w:t>
+      </w:r>
+      <w:proofErr w:type="spellStart"/>
+      <w:r>
+        <w:rPr>
+          <w:color w:val="000000" w:themeColor="text1"/>
+          <w:sz w:val="22"/>
+          <w:szCs w:val="22"/>
+        </w:rPr>
+        <w:t>dayjs</w:t>
+      </w:r>
+      <w:proofErr w:type="spellEnd"/>
+      <w:r>
+        <w:rPr>
+          <w:color w:val="000000" w:themeColor="text1"/>
+          <w:sz w:val="22"/>
+          <w:szCs w:val="22"/>
+        </w:rPr>
+        <w:t>";</w:t>
+      </w:r>
+    </w:p>
+    <w:p>
+      <w:pPr>
+        <w:pStyle w:val="ListParagraph"/>
+        <w:numPr>
+          <w:ilvl w:val="0"/>
+          <w:numId w:val="13"/>
+        </w:numPr>
+        <w:rPr>
+          <w:color w:val="000000" w:themeColor="text1"/>
+          <w:sz w:val="22"/>
+          <w:szCs w:val="22"/>
+        </w:rPr>
+      </w:pPr>
+      <w:r>
+        <w:rPr>
+          <w:color w:val="000000" w:themeColor="text1"/>
+          <w:sz w:val="22"/>
+          <w:szCs w:val="22"/>
+        </w:rPr>
+        <w:t xml:space="preserve">anything that we import without a </w:t>
+      </w:r>
+      <w:proofErr w:type="gramStart"/>
+      <w:r>
+        <w:rPr>
+          <w:color w:val="000000" w:themeColor="text1"/>
+          <w:sz w:val="22"/>
+          <w:szCs w:val="22"/>
+        </w:rPr>
+        <w:t>braces</w:t>
+      </w:r>
+      <w:proofErr w:type="gramEnd"/>
+      <w:r>
+        <w:rPr>
+          <w:color w:val="000000" w:themeColor="text1"/>
+          <w:sz w:val="22"/>
+          <w:szCs w:val="22"/>
+        </w:rPr>
+        <w:t xml:space="preserve"> is the default and we can choose its name on importing</w:t>
+      </w:r>
+      <w:r>
+        <w:rPr>
+          <w:color w:val="000000" w:themeColor="text1"/>
+          <w:sz w:val="22"/>
+          <w:szCs w:val="22"/>
+        </w:rPr>
+        <w:t xml:space="preserve">. </w:t>
+      </w:r>
+    </w:p>
+    <w:p>
+      <w:pPr>
+        <w:pStyle w:val="ListParagraph"/>
+        <w:numPr>
+          <w:ilvl w:val="0"/>
+          <w:numId w:val="13"/>
+        </w:numPr>
+        <w:rPr>
+          <w:color w:val="000000" w:themeColor="text1"/>
+          <w:sz w:val="22"/>
+          <w:szCs w:val="22"/>
+        </w:rPr>
+      </w:pPr>
+      <w:r>
+        <w:rPr>
+          <w:color w:val="000000" w:themeColor="text1"/>
+          <w:sz w:val="22"/>
+          <w:szCs w:val="22"/>
+        </w:rPr>
+        <w:t xml:space="preserve">A default export does not mean we </w:t>
+      </w:r>
+      <w:proofErr w:type="spellStart"/>
+      <w:proofErr w:type="gramStart"/>
+      <w:r>
+        <w:rPr>
+          <w:color w:val="000000" w:themeColor="text1"/>
+          <w:sz w:val="22"/>
+          <w:szCs w:val="22"/>
+        </w:rPr>
+        <w:t>cant</w:t>
+      </w:r>
+      <w:proofErr w:type="spellEnd"/>
+      <w:proofErr w:type="gramEnd"/>
+      <w:r>
+        <w:rPr>
+          <w:color w:val="000000" w:themeColor="text1"/>
+          <w:sz w:val="22"/>
+          <w:szCs w:val="22"/>
+        </w:rPr>
+        <w:t xml:space="preserve"> export any other function or variable</w:t>
+      </w:r>
+    </w:p>
+    <w:p>
+      <w:pPr>
+        <w:pStyle w:val="ListParagraph"/>
+        <w:numPr>
+          <w:ilvl w:val="0"/>
+          <w:numId w:val="13"/>
+        </w:numPr>
+        <w:rPr>
+          <w:color w:val="000000" w:themeColor="text1"/>
+          <w:sz w:val="22"/>
+          <w:szCs w:val="22"/>
+        </w:rPr>
+      </w:pPr>
+      <w:r>
+        <w:rPr>
+          <w:color w:val="000000" w:themeColor="text1"/>
+          <w:sz w:val="22"/>
+          <w:szCs w:val="22"/>
+        </w:rPr>
+        <w:t xml:space="preserve">export default let x = 10; // </w:t>
+      </w:r>
+      <w:r>
+        <w:rPr>
+          <w:rFonts w:ascii="Segoe UI Emoji" w:hAnsi="Segoe UI Emoji" w:cs="Segoe UI Emoji"/>
+          <w:color w:val="000000" w:themeColor="text1"/>
+          <w:sz w:val="22"/>
+          <w:szCs w:val="22"/>
+        </w:rPr>
+        <w:t>❌</w:t>
+      </w:r>
+      <w:r>
+        <w:rPr>
+          <w:rFonts w:ascii="Segoe UI Emoji" w:hAnsi="Segoe UI Emoji" w:cs="Segoe UI Emoji"/>
+          <w:color w:val="000000" w:themeColor="text1"/>
+          <w:sz w:val="22"/>
+          <w:szCs w:val="22"/>
+        </w:rPr>
+        <w:t xml:space="preserve"> default </w:t>
+      </w:r>
+      <w:proofErr w:type="gramStart"/>
+      <w:r>
+        <w:rPr>
+          <w:rFonts w:ascii="Segoe UI Emoji" w:hAnsi="Segoe UI Emoji" w:cs="Segoe UI Emoji"/>
+          <w:color w:val="000000" w:themeColor="text1"/>
+          <w:sz w:val="22"/>
+          <w:szCs w:val="22"/>
+        </w:rPr>
+        <w:t>cant</w:t>
+      </w:r>
+      <w:proofErr w:type="gramEnd"/>
+      <w:r>
+        <w:rPr>
+          <w:rFonts w:ascii="Segoe UI Emoji" w:hAnsi="Segoe UI Emoji" w:cs="Segoe UI Emoji"/>
+          <w:color w:val="000000" w:themeColor="text1"/>
+          <w:sz w:val="22"/>
+          <w:szCs w:val="22"/>
+        </w:rPr>
+        <w:t xml:space="preserve"> be replaced next to, let, const or var</w:t>
+      </w:r>
+    </w:p>
+    <w:p>
+      <w:pPr>
+        <w:pStyle w:val="ListParagraph"/>
+        <w:numPr>
+          <w:ilvl w:val="0"/>
+          <w:numId w:val="13"/>
+        </w:numPr>
+        <w:spacing w:before="100" w:beforeAutospacing="1" w:after="100" w:afterAutospacing="1" w:line="240" w:lineRule="auto"/>
+        <w:rPr>
+          <w:color w:val="000000" w:themeColor="text1"/>
+          <w:sz w:val="22"/>
+          <w:szCs w:val="22"/>
+        </w:rPr>
+      </w:pPr>
+      <w:r>
+        <w:rPr>
+          <w:color w:val="000000" w:themeColor="text1"/>
+          <w:sz w:val="22"/>
+          <w:szCs w:val="22"/>
+        </w:rPr>
+        <w:t>Model</w:t>
+      </w:r>
+      <w:r>
+        <w:rPr>
+          <w:color w:val="000000" w:themeColor="text1"/>
+          <w:sz w:val="22"/>
+          <w:szCs w:val="22"/>
+        </w:rPr>
+        <w:t xml:space="preserve">: </w:t>
+      </w:r>
+      <w:r>
+        <w:rPr>
+          <w:color w:val="000000" w:themeColor="text1"/>
+          <w:sz w:val="22"/>
+          <w:szCs w:val="22"/>
+        </w:rPr>
+        <w:t>JavaScript data + logic that works with the data.</w:t>
+      </w:r>
+      <w:r>
+        <w:rPr>
+          <w:color w:val="000000" w:themeColor="text1"/>
+          <w:sz w:val="22"/>
+          <w:szCs w:val="22"/>
+        </w:rPr>
+        <w:t xml:space="preserve"> </w:t>
+      </w:r>
+      <w:r>
+        <w:rPr>
+          <w:color w:val="000000" w:themeColor="text1"/>
+          <w:sz w:val="22"/>
+          <w:szCs w:val="22"/>
+        </w:rPr>
+        <w:t>View</w:t>
+      </w:r>
+      <w:r>
+        <w:rPr>
+          <w:color w:val="000000" w:themeColor="text1"/>
+          <w:sz w:val="22"/>
+          <w:szCs w:val="22"/>
+        </w:rPr>
+        <w:t xml:space="preserve">: </w:t>
+      </w:r>
+      <w:r>
+        <w:rPr>
+          <w:color w:val="000000" w:themeColor="text1"/>
+          <w:sz w:val="22"/>
+          <w:szCs w:val="22"/>
+        </w:rPr>
+        <w:t>What the user sees — mainly HTML/CSS, plus JavaScript that renders/updates the UI.</w:t>
+      </w:r>
+      <w:r>
+        <w:rPr>
+          <w:color w:val="000000" w:themeColor="text1"/>
+          <w:sz w:val="22"/>
+          <w:szCs w:val="22"/>
+        </w:rPr>
+        <w:t xml:space="preserve"> </w:t>
+      </w:r>
+      <w:r>
+        <w:rPr>
+          <w:color w:val="000000" w:themeColor="text1"/>
+          <w:sz w:val="22"/>
+          <w:szCs w:val="22"/>
+        </w:rPr>
+        <w:t>Controller</w:t>
+      </w:r>
+      <w:r>
+        <w:rPr>
+          <w:rFonts w:ascii="Segoe UI Emoji" w:hAnsi="Segoe UI Emoji" w:cs="Segoe UI Emoji"/>
+          <w:color w:val="000000" w:themeColor="text1"/>
+          <w:sz w:val="22"/>
+          <w:szCs w:val="22"/>
+        </w:rPr>
+        <w:t xml:space="preserve">: </w:t>
+      </w:r>
+      <w:r>
+        <w:rPr>
+          <w:color w:val="000000" w:themeColor="text1"/>
+          <w:sz w:val="22"/>
+          <w:szCs w:val="22"/>
+        </w:rPr>
+        <w:t>JavaScript that handles user actions/events and coordinates the Model and View.</w:t>
+      </w:r>
+    </w:p>
+    <w:p>
+      <w:pPr>
         <w:rPr>
           <w:color w:val="000000" w:themeColor="text1"/>
           <w:sz w:val="22"/>
@@ -7260,6 +8544,119 @@
     </w:lvl>
   </w:abstractNum>
   <w:abstractNum w:abstractNumId="2" w15:restartNumberingAfterBreak="0">
+    <w:nsid w:val="21A85D22"/>
+    <w:multiLevelType w:val="hybridMultilevel"/>
+    <w:tmpl w:val="5D587D8C"/>
+    <w:lvl w:ilvl="0" w:tplc="04090001">
+      <w:start w:val="1"/>
+      <w:numFmt w:val="bullet"/>
+      <w:lvlText w:val=""/>
+      <w:lvlJc w:val="left"/>
+      <w:pPr>
+        <w:ind w:left="720" w:hanging="360"/>
+      </w:pPr>
+      <w:rPr>
+        <w:rFonts w:ascii="Symbol" w:hAnsi="Symbol" w:hint="default"/>
+      </w:rPr>
+    </w:lvl>
+    <w:lvl w:ilvl="1" w:tplc="04090003" w:tentative="1">
+      <w:start w:val="1"/>
+      <w:numFmt w:val="bullet"/>
+      <w:lvlText w:val="o"/>
+      <w:lvlJc w:val="left"/>
+      <w:pPr>
+        <w:ind w:left="1440" w:hanging="360"/>
+      </w:pPr>
+      <w:rPr>
+        <w:rFonts w:ascii="Courier New" w:hAnsi="Courier New" w:cs="Courier New" w:hint="default"/>
+      </w:rPr>
+    </w:lvl>
+    <w:lvl w:ilvl="2" w:tplc="04090005" w:tentative="1">
+      <w:start w:val="1"/>
+      <w:numFmt w:val="bullet"/>
+      <w:lvlText w:val=""/>
+      <w:lvlJc w:val="left"/>
+      <w:pPr>
+        <w:ind w:left="2160" w:hanging="360"/>
+      </w:pPr>
+      <w:rPr>
+        <w:rFonts w:ascii="Wingdings" w:hAnsi="Wingdings" w:hint="default"/>
+      </w:rPr>
+    </w:lvl>
+    <w:lvl w:ilvl="3" w:tplc="04090001" w:tentative="1">
+      <w:start w:val="1"/>
+      <w:numFmt w:val="bullet"/>
+      <w:lvlText w:val=""/>
+      <w:lvlJc w:val="left"/>
+      <w:pPr>
+        <w:ind w:left="2880" w:hanging="360"/>
+      </w:pPr>
+      <w:rPr>
+        <w:rFonts w:ascii="Symbol" w:hAnsi="Symbol" w:hint="default"/>
+      </w:rPr>
+    </w:lvl>
+    <w:lvl w:ilvl="4" w:tplc="04090003" w:tentative="1">
+      <w:start w:val="1"/>
+      <w:numFmt w:val="bullet"/>
+      <w:lvlText w:val="o"/>
+      <w:lvlJc w:val="left"/>
+      <w:pPr>
+        <w:ind w:left="3600" w:hanging="360"/>
+      </w:pPr>
+      <w:rPr>
+        <w:rFonts w:ascii="Courier New" w:hAnsi="Courier New" w:cs="Courier New" w:hint="default"/>
+      </w:rPr>
+    </w:lvl>
+    <w:lvl w:ilvl="5" w:tplc="04090005" w:tentative="1">
+      <w:start w:val="1"/>
+      <w:numFmt w:val="bullet"/>
+      <w:lvlText w:val=""/>
+      <w:lvlJc w:val="left"/>
+      <w:pPr>
+        <w:ind w:left="4320" w:hanging="360"/>
+      </w:pPr>
+      <w:rPr>
+        <w:rFonts w:ascii="Wingdings" w:hAnsi="Wingdings" w:hint="default"/>
+      </w:rPr>
+    </w:lvl>
+    <w:lvl w:ilvl="6" w:tplc="04090001" w:tentative="1">
+      <w:start w:val="1"/>
+      <w:numFmt w:val="bullet"/>
+      <w:lvlText w:val=""/>
+      <w:lvlJc w:val="left"/>
+      <w:pPr>
+        <w:ind w:left="5040" w:hanging="360"/>
+      </w:pPr>
+      <w:rPr>
+        <w:rFonts w:ascii="Symbol" w:hAnsi="Symbol" w:hint="default"/>
+      </w:rPr>
+    </w:lvl>
+    <w:lvl w:ilvl="7" w:tplc="04090003" w:tentative="1">
+      <w:start w:val="1"/>
+      <w:numFmt w:val="bullet"/>
+      <w:lvlText w:val="o"/>
+      <w:lvlJc w:val="left"/>
+      <w:pPr>
+        <w:ind w:left="5760" w:hanging="360"/>
+      </w:pPr>
+      <w:rPr>
+        <w:rFonts w:ascii="Courier New" w:hAnsi="Courier New" w:cs="Courier New" w:hint="default"/>
+      </w:rPr>
+    </w:lvl>
+    <w:lvl w:ilvl="8" w:tplc="04090005" w:tentative="1">
+      <w:start w:val="1"/>
+      <w:numFmt w:val="bullet"/>
+      <w:lvlText w:val=""/>
+      <w:lvlJc w:val="left"/>
+      <w:pPr>
+        <w:ind w:left="6480" w:hanging="360"/>
+      </w:pPr>
+      <w:rPr>
+        <w:rFonts w:ascii="Wingdings" w:hAnsi="Wingdings" w:hint="default"/>
+      </w:rPr>
+    </w:lvl>
+  </w:abstractNum>
+  <w:abstractNum w:abstractNumId="3" w15:restartNumberingAfterBreak="0">
     <w:nsid w:val="287602B0"/>
     <w:multiLevelType w:val="hybridMultilevel"/>
     <w:tmpl w:val="9FB6BA26"/>
@@ -7372,7 +8769,7 @@
       </w:rPr>
     </w:lvl>
   </w:abstractNum>
-  <w:abstractNum w:abstractNumId="3" w15:restartNumberingAfterBreak="0">
+  <w:abstractNum w:abstractNumId="4" w15:restartNumberingAfterBreak="0">
     <w:nsid w:val="32A63574"/>
     <w:multiLevelType w:val="hybridMultilevel"/>
     <w:tmpl w:val="D3E6D67C"/>
@@ -7485,7 +8882,7 @@
       </w:rPr>
     </w:lvl>
   </w:abstractNum>
-  <w:abstractNum w:abstractNumId="4" w15:restartNumberingAfterBreak="0">
+  <w:abstractNum w:abstractNumId="5" w15:restartNumberingAfterBreak="0">
     <w:nsid w:val="572153BA"/>
     <w:multiLevelType w:val="hybridMultilevel"/>
     <w:tmpl w:val="B4FCCD2A"/>
@@ -7598,7 +8995,7 @@
       </w:rPr>
     </w:lvl>
   </w:abstractNum>
-  <w:abstractNum w:abstractNumId="5" w15:restartNumberingAfterBreak="0">
+  <w:abstractNum w:abstractNumId="6" w15:restartNumberingAfterBreak="0">
     <w:nsid w:val="62C452F9"/>
     <w:multiLevelType w:val="hybridMultilevel"/>
     <w:tmpl w:val="CAA478D8"/>
@@ -7711,7 +9108,7 @@
       </w:rPr>
     </w:lvl>
   </w:abstractNum>
-  <w:abstractNum w:abstractNumId="6" w15:restartNumberingAfterBreak="0">
+  <w:abstractNum w:abstractNumId="7" w15:restartNumberingAfterBreak="0">
     <w:nsid w:val="6BF4448B"/>
     <w:multiLevelType w:val="hybridMultilevel"/>
     <w:tmpl w:val="3A8A2742"/>
@@ -7824,7 +9221,7 @@
       </w:rPr>
     </w:lvl>
   </w:abstractNum>
-  <w:abstractNum w:abstractNumId="7" w15:restartNumberingAfterBreak="0">
+  <w:abstractNum w:abstractNumId="8" w15:restartNumberingAfterBreak="0">
     <w:nsid w:val="74605A05"/>
     <w:multiLevelType w:val="hybridMultilevel"/>
     <w:tmpl w:val="E346ABE0"/>
@@ -7937,7 +9334,7 @@
       </w:rPr>
     </w:lvl>
   </w:abstractNum>
-  <w:abstractNum w:abstractNumId="8" w15:restartNumberingAfterBreak="0">
+  <w:abstractNum w:abstractNumId="9" w15:restartNumberingAfterBreak="0">
     <w:nsid w:val="79CD0E53"/>
     <w:multiLevelType w:val="hybridMultilevel"/>
     <w:tmpl w:val="56742AC4"/>
@@ -8050,10 +9447,10 @@
       </w:rPr>
     </w:lvl>
   </w:abstractNum>
-  <w:abstractNum w:abstractNumId="9" w15:restartNumberingAfterBreak="0">
+  <w:abstractNum w:abstractNumId="10" w15:restartNumberingAfterBreak="0">
     <w:nsid w:val="7C5352BD"/>
     <w:multiLevelType w:val="hybridMultilevel"/>
-    <w:tmpl w:val="02D897D8"/>
+    <w:tmpl w:val="1E0E7DD8"/>
     <w:lvl w:ilvl="0" w:tplc="04090001">
       <w:start w:val="1"/>
       <w:numFmt w:val="bullet"/>
@@ -8163,7 +9560,7 @@
       </w:rPr>
     </w:lvl>
   </w:abstractNum>
-  <w:abstractNum w:abstractNumId="10" w15:restartNumberingAfterBreak="0">
+  <w:abstractNum w:abstractNumId="11" w15:restartNumberingAfterBreak="0">
     <w:nsid w:val="7CA817BC"/>
     <w:multiLevelType w:val="hybridMultilevel"/>
     <w:tmpl w:val="7C287A30"/>
@@ -8276,7 +9673,7 @@
       </w:rPr>
     </w:lvl>
   </w:abstractNum>
-  <w:abstractNum w:abstractNumId="11" w15:restartNumberingAfterBreak="0">
+  <w:abstractNum w:abstractNumId="12" w15:restartNumberingAfterBreak="0">
     <w:nsid w:val="7F72049C"/>
     <w:multiLevelType w:val="multilevel"/>
     <w:tmpl w:val="1F242F62"/>
@@ -8426,40 +9823,43 @@
     </w:lvl>
   </w:abstractNum>
   <w:num w:numId="1" w16cid:durableId="1595670622">
-    <w:abstractNumId w:val="4"/>
+    <w:abstractNumId w:val="5"/>
   </w:num>
   <w:num w:numId="2" w16cid:durableId="1253974616">
-    <w:abstractNumId w:val="3"/>
+    <w:abstractNumId w:val="4"/>
   </w:num>
   <w:num w:numId="3" w16cid:durableId="1151209963">
     <w:abstractNumId w:val="1"/>
   </w:num>
   <w:num w:numId="4" w16cid:durableId="2085225567">
-    <w:abstractNumId w:val="6"/>
+    <w:abstractNumId w:val="7"/>
   </w:num>
   <w:num w:numId="5" w16cid:durableId="968363398">
     <w:abstractNumId w:val="0"/>
   </w:num>
   <w:num w:numId="6" w16cid:durableId="1448768395">
+    <w:abstractNumId w:val="9"/>
+  </w:num>
+  <w:num w:numId="7" w16cid:durableId="97333426">
+    <w:abstractNumId w:val="12"/>
+  </w:num>
+  <w:num w:numId="8" w16cid:durableId="2078238912">
+    <w:abstractNumId w:val="6"/>
+  </w:num>
+  <w:num w:numId="9" w16cid:durableId="1133792355">
+    <w:abstractNumId w:val="3"/>
+  </w:num>
+  <w:num w:numId="10" w16cid:durableId="1949001774">
     <w:abstractNumId w:val="8"/>
   </w:num>
-  <w:num w:numId="7" w16cid:durableId="97333426">
+  <w:num w:numId="11" w16cid:durableId="49500872">
     <w:abstractNumId w:val="11"/>
   </w:num>
-  <w:num w:numId="8" w16cid:durableId="2078238912">
-    <w:abstractNumId w:val="5"/>
-  </w:num>
-  <w:num w:numId="9" w16cid:durableId="1133792355">
-    <w:abstractNumId w:val="2"/>
-  </w:num>
-  <w:num w:numId="10" w16cid:durableId="1949001774">
-    <w:abstractNumId w:val="7"/>
-  </w:num>
-  <w:num w:numId="11" w16cid:durableId="49500872">
+  <w:num w:numId="12" w16cid:durableId="1627009029">
     <w:abstractNumId w:val="10"/>
   </w:num>
-  <w:num w:numId="12" w16cid:durableId="1627009029">
-    <w:abstractNumId w:val="9"/>
+  <w:num w:numId="13" w16cid:durableId="2035300943">
+    <w:abstractNumId w:val="2"/>
   </w:num>
 </w:numbering>
 </file>
@@ -9468,6 +10868,63 @@
       <w14:ligatures w14:val="none"/>
     </w:rPr>
   </w:style>
+  <w:style w:type="paragraph" w:styleId="HTMLPreformatted">
+    <w:name w:val="HTML Preformatted"/>
+    <w:basedOn w:val="Normal"/>
+    <w:link w:val="HTMLPreformattedChar"/>
+    <w:uiPriority w:val="99"/>
+    <w:semiHidden/>
+    <w:unhideWhenUsed/>
+    <w:rsid w:val="00123297"/>
+    <w:pPr>
+      <w:tabs>
+        <w:tab w:val="left" w:pos="916"/>
+        <w:tab w:val="left" w:pos="1832"/>
+        <w:tab w:val="left" w:pos="2748"/>
+        <w:tab w:val="left" w:pos="3664"/>
+        <w:tab w:val="left" w:pos="4580"/>
+        <w:tab w:val="left" w:pos="5496"/>
+        <w:tab w:val="left" w:pos="6412"/>
+        <w:tab w:val="left" w:pos="7328"/>
+        <w:tab w:val="left" w:pos="8244"/>
+        <w:tab w:val="left" w:pos="9160"/>
+        <w:tab w:val="left" w:pos="10076"/>
+        <w:tab w:val="left" w:pos="10992"/>
+        <w:tab w:val="left" w:pos="11908"/>
+        <w:tab w:val="left" w:pos="12824"/>
+        <w:tab w:val="left" w:pos="13740"/>
+        <w:tab w:val="left" w:pos="14656"/>
+      </w:tabs>
+      <w:spacing w:after="0" w:line="240" w:lineRule="auto"/>
+    </w:pPr>
+    <w:rPr>
+      <w:rFonts w:ascii="Courier New" w:eastAsia="Times New Roman" w:hAnsi="Courier New" w:cs="Courier New"/>
+      <w:kern w:val="0"/>
+      <w:sz w:val="20"/>
+      <w:szCs w:val="20"/>
+      <w14:ligatures w14:val="none"/>
+    </w:rPr>
+  </w:style>
+  <w:style w:type="character" w:customStyle="1" w:styleId="HTMLPreformattedChar">
+    <w:name w:val="HTML Preformatted Char"/>
+    <w:basedOn w:val="DefaultParagraphFont"/>
+    <w:link w:val="HTMLPreformatted"/>
+    <w:uiPriority w:val="99"/>
+    <w:semiHidden/>
+    <w:rsid w:val="00123297"/>
+    <w:rPr>
+      <w:rFonts w:ascii="Courier New" w:eastAsia="Times New Roman" w:hAnsi="Courier New" w:cs="Courier New"/>
+      <w:kern w:val="0"/>
+      <w:sz w:val="20"/>
+      <w:szCs w:val="20"/>
+      <w14:ligatures w14:val="none"/>
+    </w:rPr>
+  </w:style>
+  <w:style w:type="character" w:customStyle="1" w:styleId="v">
+    <w:name w:val="ͼv"/>
+    <w:basedOn w:val="DefaultParagraphFont"/>
+    <w:rsid w:val="00123297"/>
+  </w:style>
 </w:styles>
 </file>
 

</xml_diff>

<commit_message>
add JS obj notes
</commit_message>
<xml_diff>
--- a/Javascript/Javascript basic notes.docx
+++ b/Javascript/Javascript basic notes.docx
@@ -8248,6 +8248,499 @@
     </w:p>
     <w:p>
       <w:pPr>
+        <w:rPr>
+          <w:b/>
+          <w:bCs/>
+          <w:color w:val="000000" w:themeColor="text1"/>
+          <w:u w:val="single"/>
+        </w:rPr>
+      </w:pPr>
+      <w:r>
+        <w:rPr>
+          <w:b/>
+          <w:bCs/>
+          <w:color w:val="000000" w:themeColor="text1"/>
+          <w:u w:val="single"/>
+        </w:rPr>
+        <w:t>OOP:</w:t>
+      </w:r>
+    </w:p>
+    <w:p>
+      <w:pPr>
+        <w:pStyle w:val="ListParagraph"/>
+        <w:numPr>
+          <w:ilvl w:val="0"/>
+          <w:numId w:val="14"/>
+        </w:numPr>
+        <w:rPr>
+          <w:b/>
+          <w:bCs/>
+          <w:color w:val="000000" w:themeColor="text1"/>
+          <w:u w:val="single"/>
+        </w:rPr>
+      </w:pPr>
+      <w:r>
+        <w:rPr>
+          <w:color w:val="000000" w:themeColor="text1"/>
+          <w:sz w:val="22"/>
+          <w:szCs w:val="22"/>
+        </w:rPr>
+        <w:t xml:space="preserve">Objects </w:t>
+      </w:r>
+      <w:proofErr w:type="gramStart"/>
+      <w:r>
+        <w:rPr>
+          <w:color w:val="000000" w:themeColor="text1"/>
+          <w:sz w:val="22"/>
+          <w:szCs w:val="22"/>
+        </w:rPr>
+        <w:t>follows</w:t>
+      </w:r>
+      <w:proofErr w:type="gramEnd"/>
+      <w:r>
+        <w:rPr>
+          <w:color w:val="000000" w:themeColor="text1"/>
+          <w:sz w:val="22"/>
+          <w:szCs w:val="22"/>
+        </w:rPr>
+        <w:t xml:space="preserve"> </w:t>
+      </w:r>
+      <w:proofErr w:type="spellStart"/>
+      <w:r>
+        <w:rPr>
+          <w:color w:val="000000" w:themeColor="text1"/>
+          <w:sz w:val="22"/>
+          <w:szCs w:val="22"/>
+        </w:rPr>
+        <w:t>camelCasing</w:t>
+      </w:r>
+      <w:proofErr w:type="spellEnd"/>
+      <w:r>
+        <w:rPr>
+          <w:color w:val="000000" w:themeColor="text1"/>
+          <w:sz w:val="22"/>
+          <w:szCs w:val="22"/>
+        </w:rPr>
+        <w:t xml:space="preserve"> naming conventions</w:t>
+      </w:r>
+    </w:p>
+    <w:p>
+      <w:pPr>
+        <w:pStyle w:val="ListParagraph"/>
+        <w:numPr>
+          <w:ilvl w:val="0"/>
+          <w:numId w:val="14"/>
+        </w:numPr>
+        <w:rPr>
+          <w:b/>
+          <w:bCs/>
+          <w:color w:val="000000" w:themeColor="text1"/>
+          <w:u w:val="single"/>
+        </w:rPr>
+      </w:pPr>
+      <w:proofErr w:type="gramStart"/>
+      <w:r>
+        <w:rPr>
+          <w:color w:val="000000" w:themeColor="text1"/>
+          <w:sz w:val="22"/>
+          <w:szCs w:val="22"/>
+        </w:rPr>
+        <w:t>when</w:t>
+      </w:r>
+      <w:proofErr w:type="gramEnd"/>
+      <w:r>
+        <w:rPr>
+          <w:color w:val="000000" w:themeColor="text1"/>
+          <w:sz w:val="22"/>
+          <w:szCs w:val="22"/>
+        </w:rPr>
+        <w:t xml:space="preserve"> creating an object, it should be named after the file name, we declare a const variable = object details. At the end of the file and out of the scope of this constant we can then export this const variable as if we export the entire object</w:t>
+      </w:r>
+    </w:p>
+    <w:p>
+      <w:pPr>
+        <w:pStyle w:val="ListParagraph"/>
+        <w:numPr>
+          <w:ilvl w:val="0"/>
+          <w:numId w:val="14"/>
+        </w:numPr>
+        <w:rPr>
+          <w:b/>
+          <w:bCs/>
+          <w:color w:val="000000" w:themeColor="text1"/>
+          <w:u w:val="single"/>
+        </w:rPr>
+      </w:pPr>
+      <w:r>
+        <w:rPr>
+          <w:color w:val="000000" w:themeColor="text1"/>
+          <w:sz w:val="22"/>
+          <w:szCs w:val="22"/>
+        </w:rPr>
+        <w:t xml:space="preserve">We use the JSON format </w:t>
+      </w:r>
+      <w:proofErr w:type="gramStart"/>
+      <w:r>
+        <w:rPr>
+          <w:color w:val="000000" w:themeColor="text1"/>
+          <w:sz w:val="22"/>
+          <w:szCs w:val="22"/>
+        </w:rPr>
+        <w:t>inside,</w:t>
+      </w:r>
+      <w:proofErr w:type="gramEnd"/>
+      <w:r>
+        <w:rPr>
+          <w:color w:val="000000" w:themeColor="text1"/>
+          <w:sz w:val="22"/>
+          <w:szCs w:val="22"/>
+        </w:rPr>
+        <w:t xml:space="preserve"> a function should have the </w:t>
+      </w:r>
+      <w:proofErr w:type="gramStart"/>
+      <w:r>
+        <w:rPr>
+          <w:color w:val="000000" w:themeColor="text1"/>
+          <w:sz w:val="22"/>
+          <w:szCs w:val="22"/>
+        </w:rPr>
+        <w:t>name :</w:t>
+      </w:r>
+      <w:proofErr w:type="gramEnd"/>
+      <w:r>
+        <w:rPr>
+          <w:color w:val="000000" w:themeColor="text1"/>
+          <w:sz w:val="22"/>
+          <w:szCs w:val="22"/>
+        </w:rPr>
+        <w:t xml:space="preserve"> </w:t>
+      </w:r>
+      <w:proofErr w:type="gramStart"/>
+      <w:r>
+        <w:rPr>
+          <w:color w:val="000000" w:themeColor="text1"/>
+          <w:sz w:val="22"/>
+          <w:szCs w:val="22"/>
+        </w:rPr>
+        <w:t>function(</w:t>
+      </w:r>
+      <w:proofErr w:type="gramEnd"/>
+      <w:r>
+        <w:rPr>
+          <w:color w:val="000000" w:themeColor="text1"/>
+          <w:sz w:val="22"/>
+          <w:szCs w:val="22"/>
+        </w:rPr>
+        <w:t>) then logic</w:t>
+      </w:r>
+    </w:p>
+    <w:p>
+      <w:pPr>
+        <w:pStyle w:val="ListParagraph"/>
+        <w:numPr>
+          <w:ilvl w:val="0"/>
+          <w:numId w:val="14"/>
+        </w:numPr>
+        <w:rPr>
+          <w:b/>
+          <w:bCs/>
+          <w:color w:val="000000" w:themeColor="text1"/>
+          <w:u w:val="single"/>
+        </w:rPr>
+      </w:pPr>
+      <w:r>
+        <w:rPr>
+          <w:color w:val="000000" w:themeColor="text1"/>
+          <w:sz w:val="22"/>
+          <w:szCs w:val="22"/>
+        </w:rPr>
+        <w:t xml:space="preserve">inside an object, when we declare a variable we </w:t>
+      </w:r>
+      <w:proofErr w:type="gramStart"/>
+      <w:r>
+        <w:rPr>
+          <w:color w:val="000000" w:themeColor="text1"/>
+          <w:sz w:val="22"/>
+          <w:szCs w:val="22"/>
+        </w:rPr>
+        <w:t>cant</w:t>
+      </w:r>
+      <w:proofErr w:type="gramEnd"/>
+      <w:r>
+        <w:rPr>
+          <w:color w:val="000000" w:themeColor="text1"/>
+          <w:sz w:val="22"/>
+          <w:szCs w:val="22"/>
+        </w:rPr>
+        <w:t xml:space="preserve"> use </w:t>
+      </w:r>
+      <w:proofErr w:type="spellStart"/>
+      <w:proofErr w:type="gramStart"/>
+      <w:r>
+        <w:rPr>
+          <w:color w:val="000000" w:themeColor="text1"/>
+          <w:sz w:val="22"/>
+          <w:szCs w:val="22"/>
+        </w:rPr>
+        <w:t>let,var</w:t>
+      </w:r>
+      <w:proofErr w:type="gramEnd"/>
+      <w:r>
+        <w:rPr>
+          <w:color w:val="000000" w:themeColor="text1"/>
+          <w:sz w:val="22"/>
+          <w:szCs w:val="22"/>
+        </w:rPr>
+        <w:t>,const</w:t>
+      </w:r>
+      <w:proofErr w:type="spellEnd"/>
+      <w:r>
+        <w:rPr>
+          <w:color w:val="000000" w:themeColor="text1"/>
+          <w:sz w:val="22"/>
+          <w:szCs w:val="22"/>
+        </w:rPr>
+        <w:t xml:space="preserve"> we can only use this inside a method inside this object</w:t>
+      </w:r>
+    </w:p>
+    <w:p>
+      <w:pPr>
+        <w:pStyle w:val="ListParagraph"/>
+        <w:numPr>
+          <w:ilvl w:val="0"/>
+          <w:numId w:val="14"/>
+        </w:numPr>
+        <w:rPr>
+          <w:b/>
+          <w:bCs/>
+          <w:color w:val="000000" w:themeColor="text1"/>
+          <w:u w:val="single"/>
+        </w:rPr>
+      </w:pPr>
+      <w:proofErr w:type="gramStart"/>
+      <w:r>
+        <w:rPr>
+          <w:color w:val="000000" w:themeColor="text1"/>
+          <w:sz w:val="22"/>
+          <w:szCs w:val="22"/>
+        </w:rPr>
+        <w:t>we</w:t>
+      </w:r>
+      <w:proofErr w:type="gramEnd"/>
+      <w:r>
+        <w:rPr>
+          <w:color w:val="000000" w:themeColor="text1"/>
+          <w:sz w:val="22"/>
+          <w:szCs w:val="22"/>
+        </w:rPr>
+        <w:t xml:space="preserve"> also </w:t>
+      </w:r>
+      <w:proofErr w:type="gramStart"/>
+      <w:r>
+        <w:rPr>
+          <w:color w:val="000000" w:themeColor="text1"/>
+          <w:sz w:val="22"/>
+          <w:szCs w:val="22"/>
+        </w:rPr>
+        <w:t>cant</w:t>
+      </w:r>
+      <w:proofErr w:type="gramEnd"/>
+      <w:r>
+        <w:rPr>
+          <w:color w:val="000000" w:themeColor="text1"/>
+          <w:sz w:val="22"/>
+          <w:szCs w:val="22"/>
+        </w:rPr>
+        <w:t xml:space="preserve"> use export inside an object it </w:t>
+      </w:r>
+      <w:proofErr w:type="gramStart"/>
+      <w:r>
+        <w:rPr>
+          <w:color w:val="000000" w:themeColor="text1"/>
+          <w:sz w:val="22"/>
+          <w:szCs w:val="22"/>
+        </w:rPr>
+        <w:t>has to</w:t>
+      </w:r>
+      <w:proofErr w:type="gramEnd"/>
+      <w:r>
+        <w:rPr>
+          <w:color w:val="000000" w:themeColor="text1"/>
+          <w:sz w:val="22"/>
+          <w:szCs w:val="22"/>
+        </w:rPr>
+        <w:t xml:space="preserve"> be done outside the scope of the object</w:t>
+      </w:r>
+    </w:p>
+    <w:p>
+      <w:pPr>
+        <w:pStyle w:val="ListParagraph"/>
+        <w:numPr>
+          <w:ilvl w:val="0"/>
+          <w:numId w:val="14"/>
+        </w:numPr>
+        <w:rPr>
+          <w:b/>
+          <w:bCs/>
+          <w:color w:val="000000" w:themeColor="text1"/>
+          <w:u w:val="single"/>
+        </w:rPr>
+      </w:pPr>
+      <w:r>
+        <w:rPr>
+          <w:color w:val="000000" w:themeColor="text1"/>
+          <w:sz w:val="22"/>
+          <w:szCs w:val="22"/>
+        </w:rPr>
+        <w:t xml:space="preserve">using arrow functions inside the object creates conflicts because of how the key </w:t>
+      </w:r>
+      <w:proofErr w:type="gramStart"/>
+      <w:r>
+        <w:rPr>
+          <w:color w:val="000000" w:themeColor="text1"/>
+          <w:sz w:val="22"/>
+          <w:szCs w:val="22"/>
+        </w:rPr>
+        <w:t>word this</w:t>
+      </w:r>
+      <w:proofErr w:type="gramEnd"/>
+      <w:r>
+        <w:rPr>
+          <w:color w:val="000000" w:themeColor="text1"/>
+          <w:sz w:val="22"/>
+          <w:szCs w:val="22"/>
+        </w:rPr>
+        <w:t xml:space="preserve"> works</w:t>
+      </w:r>
+    </w:p>
+    <w:p>
+      <w:pPr>
+        <w:pStyle w:val="ListParagraph"/>
+        <w:numPr>
+          <w:ilvl w:val="0"/>
+          <w:numId w:val="14"/>
+        </w:numPr>
+        <w:rPr>
+          <w:b/>
+          <w:bCs/>
+          <w:color w:val="000000" w:themeColor="text1"/>
+          <w:u w:val="single"/>
+        </w:rPr>
+      </w:pPr>
+      <w:proofErr w:type="gramStart"/>
+      <w:r>
+        <w:rPr>
+          <w:color w:val="000000" w:themeColor="text1"/>
+          <w:sz w:val="22"/>
+          <w:szCs w:val="22"/>
+        </w:rPr>
+        <w:t>just</w:t>
+      </w:r>
+      <w:proofErr w:type="gramEnd"/>
+      <w:r>
+        <w:rPr>
+          <w:color w:val="000000" w:themeColor="text1"/>
+          <w:sz w:val="22"/>
+          <w:szCs w:val="22"/>
+        </w:rPr>
+        <w:t xml:space="preserve"> like java, the word this </w:t>
+      </w:r>
+      <w:proofErr w:type="spellStart"/>
+      <w:r>
+        <w:rPr>
+          <w:color w:val="000000" w:themeColor="text1"/>
+          <w:sz w:val="22"/>
+          <w:szCs w:val="22"/>
+        </w:rPr>
+        <w:t>referes</w:t>
+      </w:r>
+      <w:proofErr w:type="spellEnd"/>
+      <w:r>
+        <w:rPr>
+          <w:color w:val="000000" w:themeColor="text1"/>
+          <w:sz w:val="22"/>
+          <w:szCs w:val="22"/>
+        </w:rPr>
+        <w:t xml:space="preserve"> to the current object instance</w:t>
+      </w:r>
+    </w:p>
+    <w:p>
+      <w:pPr>
+        <w:pStyle w:val="ListParagraph"/>
+        <w:numPr>
+          <w:ilvl w:val="0"/>
+          <w:numId w:val="14"/>
+        </w:numPr>
+        <w:rPr>
+          <w:b/>
+          <w:bCs/>
+          <w:color w:val="000000" w:themeColor="text1"/>
+          <w:u w:val="single"/>
+        </w:rPr>
+      </w:pPr>
+      <w:r>
+        <w:rPr>
+          <w:color w:val="000000" w:themeColor="text1"/>
+          <w:sz w:val="22"/>
+          <w:szCs w:val="22"/>
+        </w:rPr>
+        <w:t xml:space="preserve">const obj1 = new </w:t>
+      </w:r>
+      <w:proofErr w:type="gramStart"/>
+      <w:r>
+        <w:rPr>
+          <w:color w:val="000000" w:themeColor="text1"/>
+          <w:sz w:val="22"/>
+          <w:szCs w:val="22"/>
+        </w:rPr>
+        <w:t>Class(</w:t>
+      </w:r>
+      <w:proofErr w:type="gramEnd"/>
+      <w:r>
+        <w:rPr>
+          <w:color w:val="000000" w:themeColor="text1"/>
+          <w:sz w:val="22"/>
+          <w:szCs w:val="22"/>
+        </w:rPr>
+        <w:t>value, value2); this is how we create a new object instance of a class</w:t>
+      </w:r>
+    </w:p>
+    <w:p>
+      <w:pPr>
+        <w:rPr>
+          <w:b/>
+          <w:bCs/>
+          <w:color w:val="000000" w:themeColor="text1"/>
+          <w:u w:val="single"/>
+        </w:rPr>
+      </w:pPr>
+    </w:p>
+    <w:p>
+      <w:pPr>
+        <w:rPr>
+          <w:b/>
+          <w:bCs/>
+          <w:color w:val="000000" w:themeColor="text1"/>
+          <w:u w:val="single"/>
+        </w:rPr>
+      </w:pPr>
+      <w:r>
+        <w:rPr>
+          <w:b/>
+          <w:bCs/>
+          <w:color w:val="000000" w:themeColor="text1"/>
+          <w:u w:val="single"/>
+        </w:rPr>
+        <w:t>Classes:</w:t>
+      </w:r>
+    </w:p>
+    <w:p>
+      <w:pPr>
+        <w:pStyle w:val="ListParagraph"/>
+        <w:numPr>
+          <w:ilvl w:val="0"/>
+          <w:numId w:val="18"/>
+        </w:numPr>
         <w:rPr>
           <w:color w:val="000000" w:themeColor="text1"/>
           <w:sz w:val="22"/>
@@ -8431,6 +8924,119 @@
     </w:lvl>
   </w:abstractNum>
   <w:abstractNum w:abstractNumId="1" w15:restartNumberingAfterBreak="0">
+    <w:nsid w:val="0BC53885"/>
+    <w:multiLevelType w:val="hybridMultilevel"/>
+    <w:tmpl w:val="2FD68610"/>
+    <w:lvl w:ilvl="0" w:tplc="04090001">
+      <w:start w:val="1"/>
+      <w:numFmt w:val="bullet"/>
+      <w:lvlText w:val=""/>
+      <w:lvlJc w:val="left"/>
+      <w:pPr>
+        <w:ind w:left="720" w:hanging="360"/>
+      </w:pPr>
+      <w:rPr>
+        <w:rFonts w:ascii="Symbol" w:hAnsi="Symbol" w:hint="default"/>
+      </w:rPr>
+    </w:lvl>
+    <w:lvl w:ilvl="1" w:tplc="04090003" w:tentative="1">
+      <w:start w:val="1"/>
+      <w:numFmt w:val="bullet"/>
+      <w:lvlText w:val="o"/>
+      <w:lvlJc w:val="left"/>
+      <w:pPr>
+        <w:ind w:left="1440" w:hanging="360"/>
+      </w:pPr>
+      <w:rPr>
+        <w:rFonts w:ascii="Courier New" w:hAnsi="Courier New" w:cs="Courier New" w:hint="default"/>
+      </w:rPr>
+    </w:lvl>
+    <w:lvl w:ilvl="2" w:tplc="04090005" w:tentative="1">
+      <w:start w:val="1"/>
+      <w:numFmt w:val="bullet"/>
+      <w:lvlText w:val=""/>
+      <w:lvlJc w:val="left"/>
+      <w:pPr>
+        <w:ind w:left="2160" w:hanging="360"/>
+      </w:pPr>
+      <w:rPr>
+        <w:rFonts w:ascii="Wingdings" w:hAnsi="Wingdings" w:hint="default"/>
+      </w:rPr>
+    </w:lvl>
+    <w:lvl w:ilvl="3" w:tplc="04090001" w:tentative="1">
+      <w:start w:val="1"/>
+      <w:numFmt w:val="bullet"/>
+      <w:lvlText w:val=""/>
+      <w:lvlJc w:val="left"/>
+      <w:pPr>
+        <w:ind w:left="2880" w:hanging="360"/>
+      </w:pPr>
+      <w:rPr>
+        <w:rFonts w:ascii="Symbol" w:hAnsi="Symbol" w:hint="default"/>
+      </w:rPr>
+    </w:lvl>
+    <w:lvl w:ilvl="4" w:tplc="04090003" w:tentative="1">
+      <w:start w:val="1"/>
+      <w:numFmt w:val="bullet"/>
+      <w:lvlText w:val="o"/>
+      <w:lvlJc w:val="left"/>
+      <w:pPr>
+        <w:ind w:left="3600" w:hanging="360"/>
+      </w:pPr>
+      <w:rPr>
+        <w:rFonts w:ascii="Courier New" w:hAnsi="Courier New" w:cs="Courier New" w:hint="default"/>
+      </w:rPr>
+    </w:lvl>
+    <w:lvl w:ilvl="5" w:tplc="04090005" w:tentative="1">
+      <w:start w:val="1"/>
+      <w:numFmt w:val="bullet"/>
+      <w:lvlText w:val=""/>
+      <w:lvlJc w:val="left"/>
+      <w:pPr>
+        <w:ind w:left="4320" w:hanging="360"/>
+      </w:pPr>
+      <w:rPr>
+        <w:rFonts w:ascii="Wingdings" w:hAnsi="Wingdings" w:hint="default"/>
+      </w:rPr>
+    </w:lvl>
+    <w:lvl w:ilvl="6" w:tplc="04090001" w:tentative="1">
+      <w:start w:val="1"/>
+      <w:numFmt w:val="bullet"/>
+      <w:lvlText w:val=""/>
+      <w:lvlJc w:val="left"/>
+      <w:pPr>
+        <w:ind w:left="5040" w:hanging="360"/>
+      </w:pPr>
+      <w:rPr>
+        <w:rFonts w:ascii="Symbol" w:hAnsi="Symbol" w:hint="default"/>
+      </w:rPr>
+    </w:lvl>
+    <w:lvl w:ilvl="7" w:tplc="04090003" w:tentative="1">
+      <w:start w:val="1"/>
+      <w:numFmt w:val="bullet"/>
+      <w:lvlText w:val="o"/>
+      <w:lvlJc w:val="left"/>
+      <w:pPr>
+        <w:ind w:left="5760" w:hanging="360"/>
+      </w:pPr>
+      <w:rPr>
+        <w:rFonts w:ascii="Courier New" w:hAnsi="Courier New" w:cs="Courier New" w:hint="default"/>
+      </w:rPr>
+    </w:lvl>
+    <w:lvl w:ilvl="8" w:tplc="04090005" w:tentative="1">
+      <w:start w:val="1"/>
+      <w:numFmt w:val="bullet"/>
+      <w:lvlText w:val=""/>
+      <w:lvlJc w:val="left"/>
+      <w:pPr>
+        <w:ind w:left="6480" w:hanging="360"/>
+      </w:pPr>
+      <w:rPr>
+        <w:rFonts w:ascii="Wingdings" w:hAnsi="Wingdings" w:hint="default"/>
+      </w:rPr>
+    </w:lvl>
+  </w:abstractNum>
+  <w:abstractNum w:abstractNumId="2" w15:restartNumberingAfterBreak="0">
     <w:nsid w:val="0FD6436E"/>
     <w:multiLevelType w:val="hybridMultilevel"/>
     <w:tmpl w:val="0C2402B2"/>
@@ -8543,7 +9149,7 @@
       </w:rPr>
     </w:lvl>
   </w:abstractNum>
-  <w:abstractNum w:abstractNumId="2" w15:restartNumberingAfterBreak="0">
+  <w:abstractNum w:abstractNumId="3" w15:restartNumberingAfterBreak="0">
     <w:nsid w:val="21A85D22"/>
     <w:multiLevelType w:val="hybridMultilevel"/>
     <w:tmpl w:val="5D587D8C"/>
@@ -8656,7 +9262,120 @@
       </w:rPr>
     </w:lvl>
   </w:abstractNum>
-  <w:abstractNum w:abstractNumId="3" w15:restartNumberingAfterBreak="0">
+  <w:abstractNum w:abstractNumId="4" w15:restartNumberingAfterBreak="0">
+    <w:nsid w:val="25FB4FF8"/>
+    <w:multiLevelType w:val="hybridMultilevel"/>
+    <w:tmpl w:val="5EB82182"/>
+    <w:lvl w:ilvl="0" w:tplc="04090001">
+      <w:start w:val="1"/>
+      <w:numFmt w:val="bullet"/>
+      <w:lvlText w:val=""/>
+      <w:lvlJc w:val="left"/>
+      <w:pPr>
+        <w:ind w:left="2160" w:hanging="360"/>
+      </w:pPr>
+      <w:rPr>
+        <w:rFonts w:ascii="Symbol" w:hAnsi="Symbol" w:hint="default"/>
+      </w:rPr>
+    </w:lvl>
+    <w:lvl w:ilvl="1" w:tplc="04090003" w:tentative="1">
+      <w:start w:val="1"/>
+      <w:numFmt w:val="bullet"/>
+      <w:lvlText w:val="o"/>
+      <w:lvlJc w:val="left"/>
+      <w:pPr>
+        <w:ind w:left="2880" w:hanging="360"/>
+      </w:pPr>
+      <w:rPr>
+        <w:rFonts w:ascii="Courier New" w:hAnsi="Courier New" w:cs="Courier New" w:hint="default"/>
+      </w:rPr>
+    </w:lvl>
+    <w:lvl w:ilvl="2" w:tplc="04090005" w:tentative="1">
+      <w:start w:val="1"/>
+      <w:numFmt w:val="bullet"/>
+      <w:lvlText w:val=""/>
+      <w:lvlJc w:val="left"/>
+      <w:pPr>
+        <w:ind w:left="3600" w:hanging="360"/>
+      </w:pPr>
+      <w:rPr>
+        <w:rFonts w:ascii="Wingdings" w:hAnsi="Wingdings" w:hint="default"/>
+      </w:rPr>
+    </w:lvl>
+    <w:lvl w:ilvl="3" w:tplc="04090001" w:tentative="1">
+      <w:start w:val="1"/>
+      <w:numFmt w:val="bullet"/>
+      <w:lvlText w:val=""/>
+      <w:lvlJc w:val="left"/>
+      <w:pPr>
+        <w:ind w:left="4320" w:hanging="360"/>
+      </w:pPr>
+      <w:rPr>
+        <w:rFonts w:ascii="Symbol" w:hAnsi="Symbol" w:hint="default"/>
+      </w:rPr>
+    </w:lvl>
+    <w:lvl w:ilvl="4" w:tplc="04090003" w:tentative="1">
+      <w:start w:val="1"/>
+      <w:numFmt w:val="bullet"/>
+      <w:lvlText w:val="o"/>
+      <w:lvlJc w:val="left"/>
+      <w:pPr>
+        <w:ind w:left="5040" w:hanging="360"/>
+      </w:pPr>
+      <w:rPr>
+        <w:rFonts w:ascii="Courier New" w:hAnsi="Courier New" w:cs="Courier New" w:hint="default"/>
+      </w:rPr>
+    </w:lvl>
+    <w:lvl w:ilvl="5" w:tplc="04090005" w:tentative="1">
+      <w:start w:val="1"/>
+      <w:numFmt w:val="bullet"/>
+      <w:lvlText w:val=""/>
+      <w:lvlJc w:val="left"/>
+      <w:pPr>
+        <w:ind w:left="5760" w:hanging="360"/>
+      </w:pPr>
+      <w:rPr>
+        <w:rFonts w:ascii="Wingdings" w:hAnsi="Wingdings" w:hint="default"/>
+      </w:rPr>
+    </w:lvl>
+    <w:lvl w:ilvl="6" w:tplc="04090001" w:tentative="1">
+      <w:start w:val="1"/>
+      <w:numFmt w:val="bullet"/>
+      <w:lvlText w:val=""/>
+      <w:lvlJc w:val="left"/>
+      <w:pPr>
+        <w:ind w:left="6480" w:hanging="360"/>
+      </w:pPr>
+      <w:rPr>
+        <w:rFonts w:ascii="Symbol" w:hAnsi="Symbol" w:hint="default"/>
+      </w:rPr>
+    </w:lvl>
+    <w:lvl w:ilvl="7" w:tplc="04090003" w:tentative="1">
+      <w:start w:val="1"/>
+      <w:numFmt w:val="bullet"/>
+      <w:lvlText w:val="o"/>
+      <w:lvlJc w:val="left"/>
+      <w:pPr>
+        <w:ind w:left="7200" w:hanging="360"/>
+      </w:pPr>
+      <w:rPr>
+        <w:rFonts w:ascii="Courier New" w:hAnsi="Courier New" w:cs="Courier New" w:hint="default"/>
+      </w:rPr>
+    </w:lvl>
+    <w:lvl w:ilvl="8" w:tplc="04090005" w:tentative="1">
+      <w:start w:val="1"/>
+      <w:numFmt w:val="bullet"/>
+      <w:lvlText w:val=""/>
+      <w:lvlJc w:val="left"/>
+      <w:pPr>
+        <w:ind w:left="7920" w:hanging="360"/>
+      </w:pPr>
+      <w:rPr>
+        <w:rFonts w:ascii="Wingdings" w:hAnsi="Wingdings" w:hint="default"/>
+      </w:rPr>
+    </w:lvl>
+  </w:abstractNum>
+  <w:abstractNum w:abstractNumId="5" w15:restartNumberingAfterBreak="0">
     <w:nsid w:val="287602B0"/>
     <w:multiLevelType w:val="hybridMultilevel"/>
     <w:tmpl w:val="9FB6BA26"/>
@@ -8769,7 +9488,7 @@
       </w:rPr>
     </w:lvl>
   </w:abstractNum>
-  <w:abstractNum w:abstractNumId="4" w15:restartNumberingAfterBreak="0">
+  <w:abstractNum w:abstractNumId="6" w15:restartNumberingAfterBreak="0">
     <w:nsid w:val="32A63574"/>
     <w:multiLevelType w:val="hybridMultilevel"/>
     <w:tmpl w:val="D3E6D67C"/>
@@ -8882,7 +9601,120 @@
       </w:rPr>
     </w:lvl>
   </w:abstractNum>
-  <w:abstractNum w:abstractNumId="5" w15:restartNumberingAfterBreak="0">
+  <w:abstractNum w:abstractNumId="7" w15:restartNumberingAfterBreak="0">
+    <w:nsid w:val="47C87E2C"/>
+    <w:multiLevelType w:val="hybridMultilevel"/>
+    <w:tmpl w:val="56F6873E"/>
+    <w:lvl w:ilvl="0" w:tplc="04090001">
+      <w:start w:val="1"/>
+      <w:numFmt w:val="bullet"/>
+      <w:lvlText w:val=""/>
+      <w:lvlJc w:val="left"/>
+      <w:pPr>
+        <w:ind w:left="720" w:hanging="360"/>
+      </w:pPr>
+      <w:rPr>
+        <w:rFonts w:ascii="Symbol" w:hAnsi="Symbol" w:hint="default"/>
+      </w:rPr>
+    </w:lvl>
+    <w:lvl w:ilvl="1" w:tplc="04090003" w:tentative="1">
+      <w:start w:val="1"/>
+      <w:numFmt w:val="bullet"/>
+      <w:lvlText w:val="o"/>
+      <w:lvlJc w:val="left"/>
+      <w:pPr>
+        <w:ind w:left="1440" w:hanging="360"/>
+      </w:pPr>
+      <w:rPr>
+        <w:rFonts w:ascii="Courier New" w:hAnsi="Courier New" w:cs="Courier New" w:hint="default"/>
+      </w:rPr>
+    </w:lvl>
+    <w:lvl w:ilvl="2" w:tplc="04090005" w:tentative="1">
+      <w:start w:val="1"/>
+      <w:numFmt w:val="bullet"/>
+      <w:lvlText w:val=""/>
+      <w:lvlJc w:val="left"/>
+      <w:pPr>
+        <w:ind w:left="2160" w:hanging="360"/>
+      </w:pPr>
+      <w:rPr>
+        <w:rFonts w:ascii="Wingdings" w:hAnsi="Wingdings" w:hint="default"/>
+      </w:rPr>
+    </w:lvl>
+    <w:lvl w:ilvl="3" w:tplc="04090001" w:tentative="1">
+      <w:start w:val="1"/>
+      <w:numFmt w:val="bullet"/>
+      <w:lvlText w:val=""/>
+      <w:lvlJc w:val="left"/>
+      <w:pPr>
+        <w:ind w:left="2880" w:hanging="360"/>
+      </w:pPr>
+      <w:rPr>
+        <w:rFonts w:ascii="Symbol" w:hAnsi="Symbol" w:hint="default"/>
+      </w:rPr>
+    </w:lvl>
+    <w:lvl w:ilvl="4" w:tplc="04090003" w:tentative="1">
+      <w:start w:val="1"/>
+      <w:numFmt w:val="bullet"/>
+      <w:lvlText w:val="o"/>
+      <w:lvlJc w:val="left"/>
+      <w:pPr>
+        <w:ind w:left="3600" w:hanging="360"/>
+      </w:pPr>
+      <w:rPr>
+        <w:rFonts w:ascii="Courier New" w:hAnsi="Courier New" w:cs="Courier New" w:hint="default"/>
+      </w:rPr>
+    </w:lvl>
+    <w:lvl w:ilvl="5" w:tplc="04090005" w:tentative="1">
+      <w:start w:val="1"/>
+      <w:numFmt w:val="bullet"/>
+      <w:lvlText w:val=""/>
+      <w:lvlJc w:val="left"/>
+      <w:pPr>
+        <w:ind w:left="4320" w:hanging="360"/>
+      </w:pPr>
+      <w:rPr>
+        <w:rFonts w:ascii="Wingdings" w:hAnsi="Wingdings" w:hint="default"/>
+      </w:rPr>
+    </w:lvl>
+    <w:lvl w:ilvl="6" w:tplc="04090001" w:tentative="1">
+      <w:start w:val="1"/>
+      <w:numFmt w:val="bullet"/>
+      <w:lvlText w:val=""/>
+      <w:lvlJc w:val="left"/>
+      <w:pPr>
+        <w:ind w:left="5040" w:hanging="360"/>
+      </w:pPr>
+      <w:rPr>
+        <w:rFonts w:ascii="Symbol" w:hAnsi="Symbol" w:hint="default"/>
+      </w:rPr>
+    </w:lvl>
+    <w:lvl w:ilvl="7" w:tplc="04090003" w:tentative="1">
+      <w:start w:val="1"/>
+      <w:numFmt w:val="bullet"/>
+      <w:lvlText w:val="o"/>
+      <w:lvlJc w:val="left"/>
+      <w:pPr>
+        <w:ind w:left="5760" w:hanging="360"/>
+      </w:pPr>
+      <w:rPr>
+        <w:rFonts w:ascii="Courier New" w:hAnsi="Courier New" w:cs="Courier New" w:hint="default"/>
+      </w:rPr>
+    </w:lvl>
+    <w:lvl w:ilvl="8" w:tplc="04090005" w:tentative="1">
+      <w:start w:val="1"/>
+      <w:numFmt w:val="bullet"/>
+      <w:lvlText w:val=""/>
+      <w:lvlJc w:val="left"/>
+      <w:pPr>
+        <w:ind w:left="6480" w:hanging="360"/>
+      </w:pPr>
+      <w:rPr>
+        <w:rFonts w:ascii="Wingdings" w:hAnsi="Wingdings" w:hint="default"/>
+      </w:rPr>
+    </w:lvl>
+  </w:abstractNum>
+  <w:abstractNum w:abstractNumId="8" w15:restartNumberingAfterBreak="0">
     <w:nsid w:val="572153BA"/>
     <w:multiLevelType w:val="hybridMultilevel"/>
     <w:tmpl w:val="B4FCCD2A"/>
@@ -8995,7 +9827,7 @@
       </w:rPr>
     </w:lvl>
   </w:abstractNum>
-  <w:abstractNum w:abstractNumId="6" w15:restartNumberingAfterBreak="0">
+  <w:abstractNum w:abstractNumId="9" w15:restartNumberingAfterBreak="0">
     <w:nsid w:val="62C452F9"/>
     <w:multiLevelType w:val="hybridMultilevel"/>
     <w:tmpl w:val="CAA478D8"/>
@@ -9108,7 +9940,120 @@
       </w:rPr>
     </w:lvl>
   </w:abstractNum>
-  <w:abstractNum w:abstractNumId="7" w15:restartNumberingAfterBreak="0">
+  <w:abstractNum w:abstractNumId="10" w15:restartNumberingAfterBreak="0">
+    <w:nsid w:val="6B753F92"/>
+    <w:multiLevelType w:val="hybridMultilevel"/>
+    <w:tmpl w:val="2AD4633C"/>
+    <w:lvl w:ilvl="0" w:tplc="04090001">
+      <w:start w:val="1"/>
+      <w:numFmt w:val="bullet"/>
+      <w:lvlText w:val=""/>
+      <w:lvlJc w:val="left"/>
+      <w:pPr>
+        <w:ind w:left="720" w:hanging="360"/>
+      </w:pPr>
+      <w:rPr>
+        <w:rFonts w:ascii="Symbol" w:hAnsi="Symbol" w:hint="default"/>
+      </w:rPr>
+    </w:lvl>
+    <w:lvl w:ilvl="1" w:tplc="04090003" w:tentative="1">
+      <w:start w:val="1"/>
+      <w:numFmt w:val="bullet"/>
+      <w:lvlText w:val="o"/>
+      <w:lvlJc w:val="left"/>
+      <w:pPr>
+        <w:ind w:left="1440" w:hanging="360"/>
+      </w:pPr>
+      <w:rPr>
+        <w:rFonts w:ascii="Courier New" w:hAnsi="Courier New" w:cs="Courier New" w:hint="default"/>
+      </w:rPr>
+    </w:lvl>
+    <w:lvl w:ilvl="2" w:tplc="04090005" w:tentative="1">
+      <w:start w:val="1"/>
+      <w:numFmt w:val="bullet"/>
+      <w:lvlText w:val=""/>
+      <w:lvlJc w:val="left"/>
+      <w:pPr>
+        <w:ind w:left="2160" w:hanging="360"/>
+      </w:pPr>
+      <w:rPr>
+        <w:rFonts w:ascii="Wingdings" w:hAnsi="Wingdings" w:hint="default"/>
+      </w:rPr>
+    </w:lvl>
+    <w:lvl w:ilvl="3" w:tplc="04090001" w:tentative="1">
+      <w:start w:val="1"/>
+      <w:numFmt w:val="bullet"/>
+      <w:lvlText w:val=""/>
+      <w:lvlJc w:val="left"/>
+      <w:pPr>
+        <w:ind w:left="2880" w:hanging="360"/>
+      </w:pPr>
+      <w:rPr>
+        <w:rFonts w:ascii="Symbol" w:hAnsi="Symbol" w:hint="default"/>
+      </w:rPr>
+    </w:lvl>
+    <w:lvl w:ilvl="4" w:tplc="04090003" w:tentative="1">
+      <w:start w:val="1"/>
+      <w:numFmt w:val="bullet"/>
+      <w:lvlText w:val="o"/>
+      <w:lvlJc w:val="left"/>
+      <w:pPr>
+        <w:ind w:left="3600" w:hanging="360"/>
+      </w:pPr>
+      <w:rPr>
+        <w:rFonts w:ascii="Courier New" w:hAnsi="Courier New" w:cs="Courier New" w:hint="default"/>
+      </w:rPr>
+    </w:lvl>
+    <w:lvl w:ilvl="5" w:tplc="04090005" w:tentative="1">
+      <w:start w:val="1"/>
+      <w:numFmt w:val="bullet"/>
+      <w:lvlText w:val=""/>
+      <w:lvlJc w:val="left"/>
+      <w:pPr>
+        <w:ind w:left="4320" w:hanging="360"/>
+      </w:pPr>
+      <w:rPr>
+        <w:rFonts w:ascii="Wingdings" w:hAnsi="Wingdings" w:hint="default"/>
+      </w:rPr>
+    </w:lvl>
+    <w:lvl w:ilvl="6" w:tplc="04090001" w:tentative="1">
+      <w:start w:val="1"/>
+      <w:numFmt w:val="bullet"/>
+      <w:lvlText w:val=""/>
+      <w:lvlJc w:val="left"/>
+      <w:pPr>
+        <w:ind w:left="5040" w:hanging="360"/>
+      </w:pPr>
+      <w:rPr>
+        <w:rFonts w:ascii="Symbol" w:hAnsi="Symbol" w:hint="default"/>
+      </w:rPr>
+    </w:lvl>
+    <w:lvl w:ilvl="7" w:tplc="04090003" w:tentative="1">
+      <w:start w:val="1"/>
+      <w:numFmt w:val="bullet"/>
+      <w:lvlText w:val="o"/>
+      <w:lvlJc w:val="left"/>
+      <w:pPr>
+        <w:ind w:left="5760" w:hanging="360"/>
+      </w:pPr>
+      <w:rPr>
+        <w:rFonts w:ascii="Courier New" w:hAnsi="Courier New" w:cs="Courier New" w:hint="default"/>
+      </w:rPr>
+    </w:lvl>
+    <w:lvl w:ilvl="8" w:tplc="04090005" w:tentative="1">
+      <w:start w:val="1"/>
+      <w:numFmt w:val="bullet"/>
+      <w:lvlText w:val=""/>
+      <w:lvlJc w:val="left"/>
+      <w:pPr>
+        <w:ind w:left="6480" w:hanging="360"/>
+      </w:pPr>
+      <w:rPr>
+        <w:rFonts w:ascii="Wingdings" w:hAnsi="Wingdings" w:hint="default"/>
+      </w:rPr>
+    </w:lvl>
+  </w:abstractNum>
+  <w:abstractNum w:abstractNumId="11" w15:restartNumberingAfterBreak="0">
     <w:nsid w:val="6BF4448B"/>
     <w:multiLevelType w:val="hybridMultilevel"/>
     <w:tmpl w:val="3A8A2742"/>
@@ -9221,7 +10166,7 @@
       </w:rPr>
     </w:lvl>
   </w:abstractNum>
-  <w:abstractNum w:abstractNumId="8" w15:restartNumberingAfterBreak="0">
+  <w:abstractNum w:abstractNumId="12" w15:restartNumberingAfterBreak="0">
     <w:nsid w:val="74605A05"/>
     <w:multiLevelType w:val="hybridMultilevel"/>
     <w:tmpl w:val="E346ABE0"/>
@@ -9334,7 +10279,7 @@
       </w:rPr>
     </w:lvl>
   </w:abstractNum>
-  <w:abstractNum w:abstractNumId="9" w15:restartNumberingAfterBreak="0">
+  <w:abstractNum w:abstractNumId="13" w15:restartNumberingAfterBreak="0">
     <w:nsid w:val="79CD0E53"/>
     <w:multiLevelType w:val="hybridMultilevel"/>
     <w:tmpl w:val="56742AC4"/>
@@ -9447,7 +10392,120 @@
       </w:rPr>
     </w:lvl>
   </w:abstractNum>
-  <w:abstractNum w:abstractNumId="10" w15:restartNumberingAfterBreak="0">
+  <w:abstractNum w:abstractNumId="14" w15:restartNumberingAfterBreak="0">
+    <w:nsid w:val="7B792B0E"/>
+    <w:multiLevelType w:val="hybridMultilevel"/>
+    <w:tmpl w:val="C7E2C25C"/>
+    <w:lvl w:ilvl="0" w:tplc="04090001">
+      <w:start w:val="1"/>
+      <w:numFmt w:val="bullet"/>
+      <w:lvlText w:val=""/>
+      <w:lvlJc w:val="left"/>
+      <w:pPr>
+        <w:ind w:left="1440" w:hanging="360"/>
+      </w:pPr>
+      <w:rPr>
+        <w:rFonts w:ascii="Symbol" w:hAnsi="Symbol" w:hint="default"/>
+      </w:rPr>
+    </w:lvl>
+    <w:lvl w:ilvl="1" w:tplc="04090003" w:tentative="1">
+      <w:start w:val="1"/>
+      <w:numFmt w:val="bullet"/>
+      <w:lvlText w:val="o"/>
+      <w:lvlJc w:val="left"/>
+      <w:pPr>
+        <w:ind w:left="2160" w:hanging="360"/>
+      </w:pPr>
+      <w:rPr>
+        <w:rFonts w:ascii="Courier New" w:hAnsi="Courier New" w:cs="Courier New" w:hint="default"/>
+      </w:rPr>
+    </w:lvl>
+    <w:lvl w:ilvl="2" w:tplc="04090005" w:tentative="1">
+      <w:start w:val="1"/>
+      <w:numFmt w:val="bullet"/>
+      <w:lvlText w:val=""/>
+      <w:lvlJc w:val="left"/>
+      <w:pPr>
+        <w:ind w:left="2880" w:hanging="360"/>
+      </w:pPr>
+      <w:rPr>
+        <w:rFonts w:ascii="Wingdings" w:hAnsi="Wingdings" w:hint="default"/>
+      </w:rPr>
+    </w:lvl>
+    <w:lvl w:ilvl="3" w:tplc="04090001" w:tentative="1">
+      <w:start w:val="1"/>
+      <w:numFmt w:val="bullet"/>
+      <w:lvlText w:val=""/>
+      <w:lvlJc w:val="left"/>
+      <w:pPr>
+        <w:ind w:left="3600" w:hanging="360"/>
+      </w:pPr>
+      <w:rPr>
+        <w:rFonts w:ascii="Symbol" w:hAnsi="Symbol" w:hint="default"/>
+      </w:rPr>
+    </w:lvl>
+    <w:lvl w:ilvl="4" w:tplc="04090003" w:tentative="1">
+      <w:start w:val="1"/>
+      <w:numFmt w:val="bullet"/>
+      <w:lvlText w:val="o"/>
+      <w:lvlJc w:val="left"/>
+      <w:pPr>
+        <w:ind w:left="4320" w:hanging="360"/>
+      </w:pPr>
+      <w:rPr>
+        <w:rFonts w:ascii="Courier New" w:hAnsi="Courier New" w:cs="Courier New" w:hint="default"/>
+      </w:rPr>
+    </w:lvl>
+    <w:lvl w:ilvl="5" w:tplc="04090005" w:tentative="1">
+      <w:start w:val="1"/>
+      <w:numFmt w:val="bullet"/>
+      <w:lvlText w:val=""/>
+      <w:lvlJc w:val="left"/>
+      <w:pPr>
+        <w:ind w:left="5040" w:hanging="360"/>
+      </w:pPr>
+      <w:rPr>
+        <w:rFonts w:ascii="Wingdings" w:hAnsi="Wingdings" w:hint="default"/>
+      </w:rPr>
+    </w:lvl>
+    <w:lvl w:ilvl="6" w:tplc="04090001" w:tentative="1">
+      <w:start w:val="1"/>
+      <w:numFmt w:val="bullet"/>
+      <w:lvlText w:val=""/>
+      <w:lvlJc w:val="left"/>
+      <w:pPr>
+        <w:ind w:left="5760" w:hanging="360"/>
+      </w:pPr>
+      <w:rPr>
+        <w:rFonts w:ascii="Symbol" w:hAnsi="Symbol" w:hint="default"/>
+      </w:rPr>
+    </w:lvl>
+    <w:lvl w:ilvl="7" w:tplc="04090003" w:tentative="1">
+      <w:start w:val="1"/>
+      <w:numFmt w:val="bullet"/>
+      <w:lvlText w:val="o"/>
+      <w:lvlJc w:val="left"/>
+      <w:pPr>
+        <w:ind w:left="6480" w:hanging="360"/>
+      </w:pPr>
+      <w:rPr>
+        <w:rFonts w:ascii="Courier New" w:hAnsi="Courier New" w:cs="Courier New" w:hint="default"/>
+      </w:rPr>
+    </w:lvl>
+    <w:lvl w:ilvl="8" w:tplc="04090005" w:tentative="1">
+      <w:start w:val="1"/>
+      <w:numFmt w:val="bullet"/>
+      <w:lvlText w:val=""/>
+      <w:lvlJc w:val="left"/>
+      <w:pPr>
+        <w:ind w:left="7200" w:hanging="360"/>
+      </w:pPr>
+      <w:rPr>
+        <w:rFonts w:ascii="Wingdings" w:hAnsi="Wingdings" w:hint="default"/>
+      </w:rPr>
+    </w:lvl>
+  </w:abstractNum>
+  <w:abstractNum w:abstractNumId="15" w15:restartNumberingAfterBreak="0">
     <w:nsid w:val="7C5352BD"/>
     <w:multiLevelType w:val="hybridMultilevel"/>
     <w:tmpl w:val="1E0E7DD8"/>
@@ -9560,7 +10618,7 @@
       </w:rPr>
     </w:lvl>
   </w:abstractNum>
-  <w:abstractNum w:abstractNumId="11" w15:restartNumberingAfterBreak="0">
+  <w:abstractNum w:abstractNumId="16" w15:restartNumberingAfterBreak="0">
     <w:nsid w:val="7CA817BC"/>
     <w:multiLevelType w:val="hybridMultilevel"/>
     <w:tmpl w:val="7C287A30"/>
@@ -9673,7 +10731,7 @@
       </w:rPr>
     </w:lvl>
   </w:abstractNum>
-  <w:abstractNum w:abstractNumId="12" w15:restartNumberingAfterBreak="0">
+  <w:abstractNum w:abstractNumId="17" w15:restartNumberingAfterBreak="0">
     <w:nsid w:val="7F72049C"/>
     <w:multiLevelType w:val="multilevel"/>
     <w:tmpl w:val="1F242F62"/>
@@ -9823,43 +10881,58 @@
     </w:lvl>
   </w:abstractNum>
   <w:num w:numId="1" w16cid:durableId="1595670622">
-    <w:abstractNumId w:val="5"/>
+    <w:abstractNumId w:val="8"/>
   </w:num>
   <w:num w:numId="2" w16cid:durableId="1253974616">
-    <w:abstractNumId w:val="4"/>
+    <w:abstractNumId w:val="6"/>
   </w:num>
   <w:num w:numId="3" w16cid:durableId="1151209963">
-    <w:abstractNumId w:val="1"/>
+    <w:abstractNumId w:val="2"/>
   </w:num>
   <w:num w:numId="4" w16cid:durableId="2085225567">
-    <w:abstractNumId w:val="7"/>
+    <w:abstractNumId w:val="11"/>
   </w:num>
   <w:num w:numId="5" w16cid:durableId="968363398">
     <w:abstractNumId w:val="0"/>
   </w:num>
   <w:num w:numId="6" w16cid:durableId="1448768395">
+    <w:abstractNumId w:val="13"/>
+  </w:num>
+  <w:num w:numId="7" w16cid:durableId="97333426">
+    <w:abstractNumId w:val="17"/>
+  </w:num>
+  <w:num w:numId="8" w16cid:durableId="2078238912">
     <w:abstractNumId w:val="9"/>
   </w:num>
-  <w:num w:numId="7" w16cid:durableId="97333426">
+  <w:num w:numId="9" w16cid:durableId="1133792355">
+    <w:abstractNumId w:val="5"/>
+  </w:num>
+  <w:num w:numId="10" w16cid:durableId="1949001774">
     <w:abstractNumId w:val="12"/>
   </w:num>
-  <w:num w:numId="8" w16cid:durableId="2078238912">
-    <w:abstractNumId w:val="6"/>
+  <w:num w:numId="11" w16cid:durableId="49500872">
+    <w:abstractNumId w:val="16"/>
   </w:num>
-  <w:num w:numId="9" w16cid:durableId="1133792355">
+  <w:num w:numId="12" w16cid:durableId="1627009029">
+    <w:abstractNumId w:val="15"/>
+  </w:num>
+  <w:num w:numId="13" w16cid:durableId="2035300943">
     <w:abstractNumId w:val="3"/>
   </w:num>
-  <w:num w:numId="10" w16cid:durableId="1949001774">
-    <w:abstractNumId w:val="8"/>
+  <w:num w:numId="14" w16cid:durableId="582224159">
+    <w:abstractNumId w:val="1"/>
   </w:num>
-  <w:num w:numId="11" w16cid:durableId="49500872">
-    <w:abstractNumId w:val="11"/>
+  <w:num w:numId="15" w16cid:durableId="1146630300">
+    <w:abstractNumId w:val="14"/>
   </w:num>
-  <w:num w:numId="12" w16cid:durableId="1627009029">
+  <w:num w:numId="16" w16cid:durableId="1096558111">
+    <w:abstractNumId w:val="4"/>
+  </w:num>
+  <w:num w:numId="17" w16cid:durableId="41566618">
     <w:abstractNumId w:val="10"/>
   </w:num>
-  <w:num w:numId="13" w16cid:durableId="2035300943">
-    <w:abstractNumId w:val="2"/>
+  <w:num w:numId="18" w16cid:durableId="366835154">
+    <w:abstractNumId w:val="7"/>
   </w:num>
 </w:numbering>
 </file>

</xml_diff>

<commit_message>
add testing notes finished
</commit_message>
<xml_diff>
--- a/Javascript/Javascript basic notes.docx
+++ b/Javascript/Javascript basic notes.docx
@@ -7748,6 +7748,1626 @@
           <w:szCs w:val="22"/>
         </w:rPr>
         <w:t>if the child class in JS has a constructor that we wrote it does not call super()</w:t>
+      </w:r>
+    </w:p>
+    <w:p>
+      <w:pPr>
+        <w:rPr>
+          <w:color w:val="000000" w:themeColor="text1"/>
+          <w:sz w:val="22"/>
+          <w:szCs w:val="22"/>
+        </w:rPr>
+      </w:pPr>
+    </w:p>
+    <w:p>
+      <w:pPr>
+        <w:rPr>
+          <w:b/>
+          <w:bCs/>
+          <w:color w:val="000000" w:themeColor="text1"/>
+          <w:u w:val="single"/>
+        </w:rPr>
+      </w:pPr>
+      <w:r>
+        <w:rPr>
+          <w:b/>
+          <w:bCs/>
+          <w:color w:val="000000" w:themeColor="text1"/>
+          <w:u w:val="single"/>
+        </w:rPr>
+        <w:t xml:space="preserve">Manual </w:t>
+      </w:r>
+      <w:r>
+        <w:rPr>
+          <w:b/>
+          <w:bCs/>
+          <w:color w:val="000000" w:themeColor="text1"/>
+          <w:u w:val="single"/>
+        </w:rPr>
+        <w:t>Testing:</w:t>
+      </w:r>
+    </w:p>
+    <w:p>
+      <w:pPr>
+        <w:pStyle w:val="ListParagraph"/>
+        <w:numPr>
+          <w:ilvl w:val="0"/>
+          <w:numId w:val="19"/>
+        </w:numPr>
+        <w:rPr>
+          <w:color w:val="000000" w:themeColor="text1"/>
+          <w:sz w:val="22"/>
+          <w:szCs w:val="22"/>
+        </w:rPr>
+      </w:pPr>
+      <w:r>
+        <w:rPr>
+          <w:color w:val="000000" w:themeColor="text1"/>
+          <w:sz w:val="22"/>
+          <w:szCs w:val="22"/>
+        </w:rPr>
+        <w:t>Manual testing means that a person checks the website themselves, without automated test code.</w:t>
+      </w:r>
+      <w:r>
+        <w:rPr>
+          <w:color w:val="000000" w:themeColor="text1"/>
+          <w:sz w:val="22"/>
+          <w:szCs w:val="22"/>
+        </w:rPr>
+        <w:t xml:space="preserve"> </w:t>
+      </w:r>
+    </w:p>
+    <w:p>
+      <w:pPr>
+        <w:pStyle w:val="ListParagraph"/>
+        <w:numPr>
+          <w:ilvl w:val="0"/>
+          <w:numId w:val="19"/>
+        </w:numPr>
+        <w:rPr>
+          <w:color w:val="000000" w:themeColor="text1"/>
+          <w:sz w:val="22"/>
+          <w:szCs w:val="22"/>
+        </w:rPr>
+      </w:pPr>
+      <w:proofErr w:type="spellStart"/>
+      <w:r>
+        <w:rPr>
+          <w:color w:val="000000" w:themeColor="text1"/>
+          <w:sz w:val="22"/>
+          <w:szCs w:val="22"/>
+        </w:rPr>
+        <w:t>Its</w:t>
+      </w:r>
+      <w:proofErr w:type="spellEnd"/>
+      <w:r>
+        <w:rPr>
+          <w:color w:val="000000" w:themeColor="text1"/>
+          <w:sz w:val="22"/>
+          <w:szCs w:val="22"/>
+        </w:rPr>
+        <w:t xml:space="preserve"> totally inefficient, since we need to manually test the cases </w:t>
+      </w:r>
+      <w:proofErr w:type="spellStart"/>
+      <w:r>
+        <w:rPr>
+          <w:color w:val="000000" w:themeColor="text1"/>
+          <w:sz w:val="22"/>
+          <w:szCs w:val="22"/>
+        </w:rPr>
+        <w:t>everytime</w:t>
+      </w:r>
+      <w:proofErr w:type="spellEnd"/>
+      <w:r>
+        <w:rPr>
+          <w:color w:val="000000" w:themeColor="text1"/>
+          <w:sz w:val="22"/>
+          <w:szCs w:val="22"/>
+        </w:rPr>
+        <w:t xml:space="preserve"> we change our code base</w:t>
+      </w:r>
+    </w:p>
+    <w:p>
+      <w:pPr>
+        <w:pStyle w:val="ListParagraph"/>
+        <w:numPr>
+          <w:ilvl w:val="0"/>
+          <w:numId w:val="19"/>
+        </w:numPr>
+        <w:rPr>
+          <w:color w:val="000000" w:themeColor="text1"/>
+          <w:sz w:val="22"/>
+          <w:szCs w:val="22"/>
+        </w:rPr>
+      </w:pPr>
+      <w:r>
+        <w:rPr>
+          <w:color w:val="000000" w:themeColor="text1"/>
+          <w:sz w:val="22"/>
+          <w:szCs w:val="22"/>
+        </w:rPr>
+        <w:t>We will miss many input and test cases</w:t>
+      </w:r>
+    </w:p>
+    <w:p>
+      <w:pPr>
+        <w:pStyle w:val="ListParagraph"/>
+        <w:numPr>
+          <w:ilvl w:val="0"/>
+          <w:numId w:val="19"/>
+        </w:numPr>
+        <w:rPr>
+          <w:color w:val="000000" w:themeColor="text1"/>
+          <w:sz w:val="22"/>
+          <w:szCs w:val="22"/>
+        </w:rPr>
+      </w:pPr>
+      <w:r>
+        <w:rPr>
+          <w:color w:val="000000" w:themeColor="text1"/>
+          <w:sz w:val="22"/>
+          <w:szCs w:val="22"/>
+        </w:rPr>
+        <w:t>Its better to use Automated tests which means using code to test code</w:t>
+      </w:r>
+    </w:p>
+    <w:p>
+      <w:pPr>
+        <w:pStyle w:val="ListParagraph"/>
+        <w:numPr>
+          <w:ilvl w:val="0"/>
+          <w:numId w:val="19"/>
+        </w:numPr>
+        <w:rPr>
+          <w:color w:val="000000" w:themeColor="text1"/>
+          <w:sz w:val="22"/>
+          <w:szCs w:val="22"/>
+        </w:rPr>
+      </w:pPr>
+      <w:r>
+        <w:rPr>
+          <w:color w:val="000000" w:themeColor="text1"/>
+          <w:sz w:val="22"/>
+          <w:szCs w:val="22"/>
+        </w:rPr>
+        <w:t>We can write our code from scratch manually or we can use a framework, which is the most common approach</w:t>
+      </w:r>
+    </w:p>
+    <w:p>
+      <w:pPr>
+        <w:rPr>
+          <w:color w:val="000000" w:themeColor="text1"/>
+          <w:sz w:val="22"/>
+          <w:szCs w:val="22"/>
+        </w:rPr>
+      </w:pPr>
+    </w:p>
+    <w:p>
+      <w:pPr>
+        <w:rPr>
+          <w:b/>
+          <w:bCs/>
+          <w:color w:val="000000" w:themeColor="text1"/>
+          <w:u w:val="single"/>
+        </w:rPr>
+      </w:pPr>
+      <w:r>
+        <w:rPr>
+          <w:b/>
+          <w:bCs/>
+          <w:color w:val="000000" w:themeColor="text1"/>
+          <w:u w:val="single"/>
+        </w:rPr>
+        <w:t>Automatic Testing:</w:t>
+      </w:r>
+    </w:p>
+    <w:p>
+      <w:pPr>
+        <w:pStyle w:val="ListParagraph"/>
+        <w:numPr>
+          <w:ilvl w:val="0"/>
+          <w:numId w:val="20"/>
+        </w:numPr>
+        <w:rPr>
+          <w:color w:val="000000" w:themeColor="text1"/>
+          <w:sz w:val="22"/>
+          <w:szCs w:val="22"/>
+        </w:rPr>
+      </w:pPr>
+      <w:r>
+        <w:rPr>
+          <w:color w:val="000000" w:themeColor="text1"/>
+          <w:sz w:val="22"/>
+          <w:szCs w:val="22"/>
+        </w:rPr>
+        <w:t>The basic idea is to use code to test our code.</w:t>
+      </w:r>
+    </w:p>
+    <w:p>
+      <w:pPr>
+        <w:pStyle w:val="ListParagraph"/>
+        <w:numPr>
+          <w:ilvl w:val="0"/>
+          <w:numId w:val="20"/>
+        </w:numPr>
+        <w:rPr>
+          <w:color w:val="000000" w:themeColor="text1"/>
+          <w:sz w:val="22"/>
+          <w:szCs w:val="22"/>
+        </w:rPr>
+      </w:pPr>
+      <w:r>
+        <w:rPr>
+          <w:color w:val="000000" w:themeColor="text1"/>
+          <w:sz w:val="22"/>
+          <w:szCs w:val="22"/>
+        </w:rPr>
+        <w:t>Each JS module has a dedicated JS file to handle its tests usually we have a directory specific for testing only</w:t>
+      </w:r>
+    </w:p>
+    <w:p>
+      <w:pPr>
+        <w:pStyle w:val="ListParagraph"/>
+        <w:numPr>
+          <w:ilvl w:val="0"/>
+          <w:numId w:val="20"/>
+        </w:numPr>
+        <w:rPr>
+          <w:color w:val="000000" w:themeColor="text1"/>
+          <w:sz w:val="22"/>
+          <w:szCs w:val="22"/>
+        </w:rPr>
+      </w:pPr>
+      <w:r>
+        <w:rPr>
+          <w:color w:val="000000" w:themeColor="text1"/>
+          <w:sz w:val="22"/>
+          <w:szCs w:val="22"/>
+        </w:rPr>
+        <w:t>Without a JavaScript testing framework, you can still write tests as code, but you would have to build a lot of the testing infrastructure yourself.</w:t>
+      </w:r>
+      <w:r>
+        <w:rPr>
+          <w:color w:val="000000" w:themeColor="text1"/>
+          <w:sz w:val="22"/>
+          <w:szCs w:val="22"/>
+        </w:rPr>
+        <w:t xml:space="preserve"> </w:t>
+      </w:r>
+      <w:r>
+        <w:rPr>
+          <w:color w:val="000000" w:themeColor="text1"/>
+          <w:sz w:val="22"/>
+          <w:szCs w:val="22"/>
+        </w:rPr>
+        <w:t>The framework handles the boring infrastructure around your test.</w:t>
+      </w:r>
+    </w:p>
+    <w:p>
+      <w:pPr>
+        <w:pStyle w:val="ListParagraph"/>
+        <w:numPr>
+          <w:ilvl w:val="0"/>
+          <w:numId w:val="20"/>
+        </w:numPr>
+        <w:rPr>
+          <w:color w:val="000000" w:themeColor="text1"/>
+          <w:sz w:val="22"/>
+          <w:szCs w:val="22"/>
+        </w:rPr>
+      </w:pPr>
+      <w:r>
+        <w:rPr>
+          <w:color w:val="000000" w:themeColor="text1"/>
+          <w:sz w:val="22"/>
+          <w:szCs w:val="22"/>
+        </w:rPr>
+        <w:t>A T</w:t>
+      </w:r>
+      <w:r>
+        <w:rPr>
+          <w:color w:val="000000" w:themeColor="text1"/>
+          <w:sz w:val="22"/>
+          <w:szCs w:val="22"/>
+        </w:rPr>
+        <w:t>est suite is a group of test cases that test the same module</w:t>
+      </w:r>
+      <w:r>
+        <w:rPr>
+          <w:color w:val="000000" w:themeColor="text1"/>
+          <w:sz w:val="22"/>
+          <w:szCs w:val="22"/>
+        </w:rPr>
+        <w:t>.</w:t>
+      </w:r>
+    </w:p>
+    <w:p>
+      <w:pPr>
+        <w:pStyle w:val="ListParagraph"/>
+        <w:numPr>
+          <w:ilvl w:val="0"/>
+          <w:numId w:val="20"/>
+        </w:numPr>
+        <w:rPr>
+          <w:color w:val="000000" w:themeColor="text1"/>
+          <w:sz w:val="22"/>
+          <w:szCs w:val="22"/>
+        </w:rPr>
+      </w:pPr>
+      <w:proofErr w:type="spellStart"/>
+      <w:r>
+        <w:rPr>
+          <w:color w:val="000000" w:themeColor="text1"/>
+          <w:sz w:val="22"/>
+          <w:szCs w:val="22"/>
+        </w:rPr>
+        <w:t>Vitest</w:t>
+      </w:r>
+      <w:proofErr w:type="spellEnd"/>
+      <w:r>
+        <w:rPr>
+          <w:color w:val="000000" w:themeColor="text1"/>
+          <w:sz w:val="22"/>
+          <w:szCs w:val="22"/>
+        </w:rPr>
+        <w:t xml:space="preserve"> is the framework that </w:t>
+      </w:r>
+      <w:proofErr w:type="spellStart"/>
+      <w:r>
+        <w:rPr>
+          <w:color w:val="000000" w:themeColor="text1"/>
+          <w:sz w:val="22"/>
+          <w:szCs w:val="22"/>
+        </w:rPr>
+        <w:t>Im</w:t>
+      </w:r>
+      <w:proofErr w:type="spellEnd"/>
+      <w:r>
+        <w:rPr>
+          <w:color w:val="000000" w:themeColor="text1"/>
+          <w:sz w:val="22"/>
+          <w:szCs w:val="22"/>
+        </w:rPr>
+        <w:t xml:space="preserve"> supposed to learn for the sake of the project</w:t>
+      </w:r>
+    </w:p>
+    <w:p>
+      <w:pPr>
+        <w:pStyle w:val="ListParagraph"/>
+        <w:numPr>
+          <w:ilvl w:val="0"/>
+          <w:numId w:val="20"/>
+        </w:numPr>
+        <w:rPr>
+          <w:color w:val="000000" w:themeColor="text1"/>
+          <w:sz w:val="22"/>
+          <w:szCs w:val="22"/>
+        </w:rPr>
+      </w:pPr>
+      <w:r>
+        <w:rPr>
+          <w:color w:val="000000" w:themeColor="text1"/>
+          <w:sz w:val="22"/>
+          <w:szCs w:val="22"/>
+        </w:rPr>
+        <w:t>The rest of the notes will discuss the syntax and rules of the framework called Jasmine</w:t>
+      </w:r>
+    </w:p>
+    <w:p>
+      <w:pPr>
+        <w:pStyle w:val="ListParagraph"/>
+        <w:numPr>
+          <w:ilvl w:val="0"/>
+          <w:numId w:val="20"/>
+        </w:numPr>
+        <w:rPr>
+          <w:color w:val="000000" w:themeColor="text1"/>
+          <w:sz w:val="22"/>
+          <w:szCs w:val="22"/>
+        </w:rPr>
+      </w:pPr>
+      <w:r>
+        <w:rPr>
+          <w:color w:val="000000" w:themeColor="text1"/>
+          <w:sz w:val="22"/>
+          <w:szCs w:val="22"/>
+        </w:rPr>
+        <w:lastRenderedPageBreak/>
+        <w:t xml:space="preserve">To run Jasmine, we should download the open sources project from </w:t>
+      </w:r>
+      <w:proofErr w:type="spellStart"/>
+      <w:r>
+        <w:rPr>
+          <w:color w:val="000000" w:themeColor="text1"/>
+          <w:sz w:val="22"/>
+          <w:szCs w:val="22"/>
+        </w:rPr>
+        <w:t>github</w:t>
+      </w:r>
+      <w:proofErr w:type="spellEnd"/>
+      <w:r>
+        <w:rPr>
+          <w:color w:val="000000" w:themeColor="text1"/>
+          <w:sz w:val="22"/>
+          <w:szCs w:val="22"/>
+        </w:rPr>
+        <w:t>, and then put it in the same directory as our source code. Not inside but on the same tree level</w:t>
+      </w:r>
+    </w:p>
+    <w:p>
+      <w:pPr>
+        <w:pStyle w:val="ListParagraph"/>
+        <w:numPr>
+          <w:ilvl w:val="0"/>
+          <w:numId w:val="20"/>
+        </w:numPr>
+        <w:rPr>
+          <w:color w:val="000000" w:themeColor="text1"/>
+          <w:sz w:val="22"/>
+          <w:szCs w:val="22"/>
+        </w:rPr>
+      </w:pPr>
+      <w:r>
+        <w:rPr>
+          <w:color w:val="000000" w:themeColor="text1"/>
+          <w:sz w:val="22"/>
+          <w:szCs w:val="22"/>
+        </w:rPr>
+        <w:t>In Jasmine a spec means a test so we should create the .</w:t>
+      </w:r>
+      <w:proofErr w:type="spellStart"/>
+      <w:r>
+        <w:rPr>
+          <w:color w:val="000000" w:themeColor="text1"/>
+          <w:sz w:val="22"/>
+          <w:szCs w:val="22"/>
+        </w:rPr>
+        <w:t>js</w:t>
+      </w:r>
+      <w:proofErr w:type="spellEnd"/>
+      <w:r>
+        <w:rPr>
+          <w:color w:val="000000" w:themeColor="text1"/>
+          <w:sz w:val="22"/>
+          <w:szCs w:val="22"/>
+        </w:rPr>
+        <w:t xml:space="preserve"> test files inside that directory, in the older versions of Jasmine we have a runner html, it’s a </w:t>
+      </w:r>
+      <w:r>
+        <w:rPr>
+          <w:color w:val="000000" w:themeColor="text1"/>
+          <w:sz w:val="22"/>
+          <w:szCs w:val="22"/>
+        </w:rPr>
+        <w:t>webpage that loads and shows the results of our tests with errors, where they are and so on</w:t>
+      </w:r>
+    </w:p>
+    <w:p>
+      <w:pPr>
+        <w:pStyle w:val="ListParagraph"/>
+        <w:numPr>
+          <w:ilvl w:val="0"/>
+          <w:numId w:val="20"/>
+        </w:numPr>
+        <w:rPr>
+          <w:color w:val="000000" w:themeColor="text1"/>
+          <w:sz w:val="22"/>
+          <w:szCs w:val="22"/>
+        </w:rPr>
+      </w:pPr>
+      <w:r>
+        <w:rPr>
+          <w:color w:val="000000" w:themeColor="text1"/>
+          <w:sz w:val="22"/>
+          <w:szCs w:val="22"/>
+        </w:rPr>
+        <w:t>In Jasmine, to create a test suite we use function:  describe(param1, param2); param1 is a string that represents the name of the suite, param2 is a function, this function includes other functions these other functions are the test cases</w:t>
+      </w:r>
+    </w:p>
+    <w:p>
+      <w:pPr>
+        <w:pStyle w:val="ListParagraph"/>
+        <w:numPr>
+          <w:ilvl w:val="0"/>
+          <w:numId w:val="20"/>
+        </w:numPr>
+        <w:rPr>
+          <w:color w:val="000000" w:themeColor="text1"/>
+          <w:sz w:val="22"/>
+          <w:szCs w:val="22"/>
+        </w:rPr>
+      </w:pPr>
+      <w:r>
+        <w:rPr>
+          <w:color w:val="000000" w:themeColor="text1"/>
+          <w:sz w:val="22"/>
+          <w:szCs w:val="22"/>
+        </w:rPr>
+        <w:t>it("test name", function () { // test code });</w:t>
+      </w:r>
+      <w:r>
+        <w:rPr>
+          <w:color w:val="000000" w:themeColor="text1"/>
+          <w:sz w:val="22"/>
+          <w:szCs w:val="22"/>
+        </w:rPr>
+        <w:t xml:space="preserve">  </w:t>
+      </w:r>
+    </w:p>
+    <w:p>
+      <w:pPr>
+        <w:pStyle w:val="pdq2pgselectionanchorcontainer"/>
+        <w:numPr>
+          <w:ilvl w:val="0"/>
+          <w:numId w:val="20"/>
+        </w:numPr>
+        <w:rPr>
+          <w:rFonts w:asciiTheme="minorHAnsi" w:eastAsiaTheme="minorHAnsi" w:hAnsiTheme="minorHAnsi" w:cstheme="minorBidi"/>
+          <w:color w:val="000000" w:themeColor="text1"/>
+          <w:kern w:val="2"/>
+          <w:sz w:val="22"/>
+          <w:szCs w:val="22"/>
+          <w14:ligatures w14:val="standardContextual"/>
+        </w:rPr>
+      </w:pPr>
+      <w:r>
+        <w:rPr>
+          <w:rFonts w:asciiTheme="minorHAnsi" w:eastAsiaTheme="minorHAnsi" w:hAnsiTheme="minorHAnsi" w:cstheme="minorBidi"/>
+          <w:color w:val="000000" w:themeColor="text1"/>
+          <w:kern w:val="2"/>
+          <w:sz w:val="22"/>
+          <w:szCs w:val="22"/>
+          <w14:ligatures w14:val="standardContextual"/>
+        </w:rPr>
+        <w:t>expect() is used inside the it() function.</w:t>
+      </w:r>
+      <w:r>
+        <w:rPr>
+          <w:rFonts w:asciiTheme="minorHAnsi" w:eastAsiaTheme="minorHAnsi" w:hAnsiTheme="minorHAnsi" w:cstheme="minorBidi"/>
+          <w:color w:val="000000" w:themeColor="text1"/>
+          <w:kern w:val="2"/>
+          <w:sz w:val="22"/>
+          <w:szCs w:val="22"/>
+          <w14:ligatures w14:val="standardContextual"/>
+        </w:rPr>
+        <w:t xml:space="preserve"> </w:t>
+      </w:r>
+      <w:r>
+        <w:rPr>
+          <w:rFonts w:asciiTheme="minorHAnsi" w:eastAsiaTheme="minorHAnsi" w:hAnsiTheme="minorHAnsi" w:cstheme="minorBidi"/>
+          <w:color w:val="000000" w:themeColor="text1"/>
+          <w:kern w:val="2"/>
+          <w:sz w:val="22"/>
+          <w:szCs w:val="22"/>
+          <w14:ligatures w14:val="standardContextual"/>
+        </w:rPr>
+        <w:t>It receives the actual value that your code produces</w:t>
+      </w:r>
+    </w:p>
+    <w:p>
+      <w:pPr>
+        <w:pStyle w:val="ListParagraph"/>
+        <w:numPr>
+          <w:ilvl w:val="0"/>
+          <w:numId w:val="20"/>
+        </w:numPr>
+        <w:rPr>
+          <w:color w:val="000000" w:themeColor="text1"/>
+          <w:sz w:val="22"/>
+          <w:szCs w:val="22"/>
+        </w:rPr>
+      </w:pPr>
+      <w:r>
+        <w:rPr>
+          <w:color w:val="000000" w:themeColor="text1"/>
+          <w:sz w:val="22"/>
+          <w:szCs w:val="22"/>
+        </w:rPr>
+        <w:t>.</w:t>
+      </w:r>
+      <w:proofErr w:type="spellStart"/>
+      <w:r>
+        <w:rPr>
+          <w:color w:val="000000" w:themeColor="text1"/>
+          <w:sz w:val="22"/>
+          <w:szCs w:val="22"/>
+        </w:rPr>
+        <w:t>toEqual</w:t>
+      </w:r>
+      <w:proofErr w:type="spellEnd"/>
+      <w:r>
+        <w:rPr>
+          <w:color w:val="000000" w:themeColor="text1"/>
+          <w:sz w:val="22"/>
+          <w:szCs w:val="22"/>
+        </w:rPr>
+        <w:t>(</w:t>
+      </w:r>
+      <w:r>
+        <w:rPr>
+          <w:color w:val="000000" w:themeColor="text1"/>
+          <w:sz w:val="22"/>
+          <w:szCs w:val="22"/>
+        </w:rPr>
+        <w:t>the correct value</w:t>
+      </w:r>
+      <w:r>
+        <w:rPr>
+          <w:color w:val="000000" w:themeColor="text1"/>
+          <w:sz w:val="22"/>
+          <w:szCs w:val="22"/>
+        </w:rPr>
+        <w:t>)</w:t>
+      </w:r>
+    </w:p>
+    <w:p>
+      <w:pPr>
+        <w:pStyle w:val="ListParagraph"/>
+        <w:numPr>
+          <w:ilvl w:val="0"/>
+          <w:numId w:val="20"/>
+        </w:numPr>
+        <w:rPr>
+          <w:color w:val="000000" w:themeColor="text1"/>
+          <w:sz w:val="22"/>
+          <w:szCs w:val="22"/>
+        </w:rPr>
+      </w:pPr>
+      <w:r>
+        <w:rPr>
+          <w:color w:val="000000" w:themeColor="text1"/>
+          <w:sz w:val="22"/>
+          <w:szCs w:val="22"/>
+        </w:rPr>
+        <w:t>We can test values inside an array the same way we would just test data from a normal value like an int or so. Jasmie will compare the entire array inside the expect(what we have).</w:t>
+      </w:r>
+      <w:proofErr w:type="spellStart"/>
+      <w:r>
+        <w:rPr>
+          <w:color w:val="000000" w:themeColor="text1"/>
+          <w:sz w:val="22"/>
+          <w:szCs w:val="22"/>
+        </w:rPr>
+        <w:t>toEqual</w:t>
+      </w:r>
+      <w:proofErr w:type="spellEnd"/>
+      <w:r>
+        <w:rPr>
+          <w:color w:val="000000" w:themeColor="text1"/>
+          <w:sz w:val="22"/>
+          <w:szCs w:val="22"/>
+        </w:rPr>
+        <w:t>(correct input we expect);</w:t>
+      </w:r>
+    </w:p>
+    <w:p>
+      <w:pPr>
+        <w:pStyle w:val="ListParagraph"/>
+        <w:numPr>
+          <w:ilvl w:val="0"/>
+          <w:numId w:val="20"/>
+        </w:numPr>
+        <w:rPr>
+          <w:color w:val="000000" w:themeColor="text1"/>
+          <w:sz w:val="22"/>
+          <w:szCs w:val="22"/>
+        </w:rPr>
+      </w:pPr>
+      <w:proofErr w:type="spellStart"/>
+      <w:r>
+        <w:rPr>
+          <w:color w:val="000000" w:themeColor="text1"/>
+          <w:sz w:val="22"/>
+          <w:szCs w:val="22"/>
+        </w:rPr>
+        <w:t>toBe</w:t>
+      </w:r>
+      <w:proofErr w:type="spellEnd"/>
+      <w:r>
+        <w:rPr>
+          <w:color w:val="000000" w:themeColor="text1"/>
+          <w:sz w:val="22"/>
+          <w:szCs w:val="22"/>
+        </w:rPr>
+        <w:t>() checks object identity — whether they are literally the same array object.</w:t>
+      </w:r>
+      <w:r>
+        <w:rPr>
+          <w:color w:val="000000" w:themeColor="text1"/>
+          <w:sz w:val="22"/>
+          <w:szCs w:val="22"/>
+        </w:rPr>
+        <w:t xml:space="preserve"> Is not good when comparing arrays</w:t>
+      </w:r>
+    </w:p>
+    <w:p>
+      <w:pPr>
+        <w:pStyle w:val="ListParagraph"/>
+        <w:numPr>
+          <w:ilvl w:val="0"/>
+          <w:numId w:val="20"/>
+        </w:numPr>
+        <w:rPr>
+          <w:color w:val="000000" w:themeColor="text1"/>
+          <w:sz w:val="22"/>
+          <w:szCs w:val="22"/>
+        </w:rPr>
+      </w:pPr>
+      <w:r>
+        <w:rPr>
+          <w:color w:val="000000" w:themeColor="text1"/>
+          <w:sz w:val="22"/>
+          <w:szCs w:val="22"/>
+        </w:rPr>
+        <w:t>functions that has no return value, we usually test the behavior of it, for example if we have a function that adds something to the cart we test it by adding something to the cart and comparing the result to the expected or the actual effect.</w:t>
+      </w:r>
+    </w:p>
+    <w:p>
+      <w:pPr>
+        <w:pStyle w:val="ListParagraph"/>
+        <w:numPr>
+          <w:ilvl w:val="0"/>
+          <w:numId w:val="20"/>
+        </w:numPr>
+        <w:spacing w:before="100" w:beforeAutospacing="1" w:after="100" w:afterAutospacing="1" w:line="240" w:lineRule="auto"/>
+        <w:rPr>
+          <w:color w:val="000000" w:themeColor="text1"/>
+          <w:sz w:val="22"/>
+          <w:szCs w:val="22"/>
+        </w:rPr>
+      </w:pPr>
+      <w:r>
+        <w:rPr>
+          <w:color w:val="000000" w:themeColor="text1"/>
+          <w:sz w:val="22"/>
+          <w:szCs w:val="22"/>
+        </w:rPr>
+        <w:t>A flaky test is a test that sometimes passes and sometimes fails even though you haven't changed the code.</w:t>
+      </w:r>
+    </w:p>
+    <w:p>
+      <w:pPr>
+        <w:pStyle w:val="ListParagraph"/>
+        <w:numPr>
+          <w:ilvl w:val="0"/>
+          <w:numId w:val="20"/>
+        </w:numPr>
+        <w:rPr>
+          <w:color w:val="000000" w:themeColor="text1"/>
+          <w:sz w:val="22"/>
+          <w:szCs w:val="22"/>
+        </w:rPr>
+      </w:pPr>
+      <w:r>
+        <w:rPr>
+          <w:color w:val="000000" w:themeColor="text1"/>
+          <w:sz w:val="22"/>
+          <w:szCs w:val="22"/>
+        </w:rPr>
+        <w:t xml:space="preserve">Database testing follows the same basic testing principle as </w:t>
+      </w:r>
+      <w:proofErr w:type="spellStart"/>
+      <w:r>
+        <w:rPr>
+          <w:color w:val="000000" w:themeColor="text1"/>
+          <w:sz w:val="22"/>
+          <w:szCs w:val="22"/>
+        </w:rPr>
+        <w:t>localStorage</w:t>
+      </w:r>
+      <w:proofErr w:type="spellEnd"/>
+      <w:r>
+        <w:rPr>
+          <w:color w:val="000000" w:themeColor="text1"/>
+          <w:sz w:val="22"/>
+          <w:szCs w:val="22"/>
+        </w:rPr>
+        <w:t>: control the test data, execute the operation, verify the result, and isolate/clean up the state. The main difference is that databases are external, persistent systems and usually require asynchronous operations.</w:t>
+      </w:r>
+    </w:p>
+    <w:p>
+      <w:pPr>
+        <w:pStyle w:val="ListParagraph"/>
+        <w:numPr>
+          <w:ilvl w:val="0"/>
+          <w:numId w:val="20"/>
+        </w:numPr>
+        <w:rPr>
+          <w:color w:val="000000" w:themeColor="text1"/>
+          <w:sz w:val="22"/>
+          <w:szCs w:val="22"/>
+        </w:rPr>
+      </w:pPr>
+      <w:proofErr w:type="spellStart"/>
+      <w:r>
+        <w:rPr>
+          <w:color w:val="000000" w:themeColor="text1"/>
+          <w:sz w:val="22"/>
+          <w:szCs w:val="22"/>
+        </w:rPr>
+        <w:t>spyOn</w:t>
+      </w:r>
+      <w:proofErr w:type="spellEnd"/>
+      <w:r>
+        <w:rPr>
+          <w:color w:val="000000" w:themeColor="text1"/>
+          <w:sz w:val="22"/>
+          <w:szCs w:val="22"/>
+        </w:rPr>
+        <w:t>() allows Jasmine to watch a function and record how that function is used.</w:t>
+      </w:r>
+      <w:r>
+        <w:rPr>
+          <w:color w:val="000000" w:themeColor="text1"/>
+          <w:sz w:val="22"/>
+          <w:szCs w:val="22"/>
+        </w:rPr>
+        <w:t xml:space="preserve"> How many times was this function called and what value did it return</w:t>
+      </w:r>
+    </w:p>
+    <w:p>
+      <w:pPr>
+        <w:pStyle w:val="ListParagraph"/>
+        <w:numPr>
+          <w:ilvl w:val="0"/>
+          <w:numId w:val="20"/>
+        </w:numPr>
+        <w:rPr>
+          <w:color w:val="000000" w:themeColor="text1"/>
+          <w:sz w:val="22"/>
+          <w:szCs w:val="22"/>
+        </w:rPr>
+      </w:pPr>
+      <w:proofErr w:type="spellStart"/>
+      <w:r>
+        <w:rPr>
+          <w:color w:val="000000" w:themeColor="text1"/>
+          <w:sz w:val="22"/>
+          <w:szCs w:val="22"/>
+        </w:rPr>
+        <w:t>spyOn</w:t>
+      </w:r>
+      <w:proofErr w:type="spellEnd"/>
+      <w:r>
+        <w:rPr>
+          <w:color w:val="000000" w:themeColor="text1"/>
+          <w:sz w:val="22"/>
+          <w:szCs w:val="22"/>
+        </w:rPr>
+        <w:t>(sensor, "read");</w:t>
+      </w:r>
+      <w:r>
+        <w:rPr>
+          <w:color w:val="000000" w:themeColor="text1"/>
+          <w:sz w:val="22"/>
+          <w:szCs w:val="22"/>
+        </w:rPr>
+        <w:t xml:space="preserve"> here we are telling the </w:t>
+      </w:r>
+      <w:proofErr w:type="spellStart"/>
+      <w:r>
+        <w:rPr>
+          <w:color w:val="000000" w:themeColor="text1"/>
+          <w:sz w:val="22"/>
+          <w:szCs w:val="22"/>
+        </w:rPr>
+        <w:t>spyOn</w:t>
+      </w:r>
+      <w:proofErr w:type="spellEnd"/>
+      <w:r>
+        <w:rPr>
+          <w:color w:val="000000" w:themeColor="text1"/>
+          <w:sz w:val="22"/>
+          <w:szCs w:val="22"/>
+        </w:rPr>
+        <w:t xml:space="preserve"> to spy on the object called sensor and the function called read.</w:t>
+      </w:r>
+      <w:r>
+        <w:t xml:space="preserve"> </w:t>
+      </w:r>
+      <w:r>
+        <w:rPr>
+          <w:color w:val="000000" w:themeColor="text1"/>
+          <w:sz w:val="22"/>
+          <w:szCs w:val="22"/>
+        </w:rPr>
+        <w:t>It can also remember the arguments.</w:t>
+      </w:r>
+    </w:p>
+    <w:p>
+      <w:pPr>
+        <w:pStyle w:val="ListParagraph"/>
+        <w:numPr>
+          <w:ilvl w:val="0"/>
+          <w:numId w:val="20"/>
+        </w:numPr>
+        <w:rPr>
+          <w:color w:val="000000" w:themeColor="text1"/>
+          <w:sz w:val="22"/>
+          <w:szCs w:val="22"/>
+        </w:rPr>
+      </w:pPr>
+      <w:proofErr w:type="spellStart"/>
+      <w:r>
+        <w:rPr>
+          <w:color w:val="000000" w:themeColor="text1"/>
+          <w:sz w:val="22"/>
+          <w:szCs w:val="22"/>
+        </w:rPr>
+        <w:t>callFake</w:t>
+      </w:r>
+      <w:proofErr w:type="spellEnd"/>
+      <w:r>
+        <w:rPr>
+          <w:color w:val="000000" w:themeColor="text1"/>
+          <w:sz w:val="22"/>
+          <w:szCs w:val="22"/>
+        </w:rPr>
+        <w:t>() replaces the original function with a fake function that you control.</w:t>
+      </w:r>
+      <w:r>
+        <w:rPr>
+          <w:color w:val="000000" w:themeColor="text1"/>
+          <w:sz w:val="22"/>
+          <w:szCs w:val="22"/>
+        </w:rPr>
+        <w:t xml:space="preserve">  </w:t>
+      </w:r>
+      <w:proofErr w:type="spellStart"/>
+      <w:r>
+        <w:rPr>
+          <w:color w:val="000000" w:themeColor="text1"/>
+          <w:sz w:val="22"/>
+          <w:szCs w:val="22"/>
+        </w:rPr>
+        <w:t>callFake</w:t>
+      </w:r>
+      <w:proofErr w:type="spellEnd"/>
+      <w:r>
+        <w:rPr>
+          <w:color w:val="000000" w:themeColor="text1"/>
+          <w:sz w:val="22"/>
+          <w:szCs w:val="22"/>
+        </w:rPr>
+        <w:t>() help us remove the dependencies of a real object, that object might be too sensitive to deal with or simply not ready</w:t>
+      </w:r>
+    </w:p>
+    <w:p>
+      <w:pPr>
+        <w:pStyle w:val="ListParagraph"/>
+        <w:numPr>
+          <w:ilvl w:val="0"/>
+          <w:numId w:val="20"/>
+        </w:numPr>
+        <w:rPr>
+          <w:color w:val="000000" w:themeColor="text1"/>
+          <w:sz w:val="22"/>
+          <w:szCs w:val="22"/>
+        </w:rPr>
+      </w:pPr>
+      <w:proofErr w:type="spellStart"/>
+      <w:r>
+        <w:rPr>
+          <w:color w:val="000000" w:themeColor="text1"/>
+          <w:sz w:val="22"/>
+          <w:szCs w:val="22"/>
+        </w:rPr>
+        <w:t>spyOn</w:t>
+      </w:r>
+      <w:proofErr w:type="spellEnd"/>
+      <w:r>
+        <w:rPr>
+          <w:color w:val="000000" w:themeColor="text1"/>
+          <w:sz w:val="22"/>
+          <w:szCs w:val="22"/>
+        </w:rPr>
+        <w:t>(sensor, "</w:t>
+      </w:r>
+      <w:proofErr w:type="spellStart"/>
+      <w:r>
+        <w:rPr>
+          <w:color w:val="000000" w:themeColor="text1"/>
+          <w:sz w:val="22"/>
+          <w:szCs w:val="22"/>
+        </w:rPr>
+        <w:t>readTemperature</w:t>
+      </w:r>
+      <w:proofErr w:type="spellEnd"/>
+      <w:r>
+        <w:rPr>
+          <w:color w:val="000000" w:themeColor="text1"/>
+          <w:sz w:val="22"/>
+          <w:szCs w:val="22"/>
+        </w:rPr>
+        <w:t>").</w:t>
+      </w:r>
+      <w:proofErr w:type="spellStart"/>
+      <w:r>
+        <w:rPr>
+          <w:color w:val="000000" w:themeColor="text1"/>
+          <w:sz w:val="22"/>
+          <w:szCs w:val="22"/>
+        </w:rPr>
+        <w:t>and.callFake</w:t>
+      </w:r>
+      <w:proofErr w:type="spellEnd"/>
+      <w:r>
+        <w:rPr>
+          <w:color w:val="000000" w:themeColor="text1"/>
+          <w:sz w:val="22"/>
+          <w:szCs w:val="22"/>
+        </w:rPr>
+        <w:t>(function () {</w:t>
+      </w:r>
+    </w:p>
+    <w:p>
+      <w:pPr>
+        <w:ind w:left="720"/>
+        <w:rPr>
+          <w:color w:val="000000" w:themeColor="text1"/>
+          <w:sz w:val="22"/>
+          <w:szCs w:val="22"/>
+        </w:rPr>
+      </w:pPr>
+      <w:r>
+        <w:rPr>
+          <w:color w:val="000000" w:themeColor="text1"/>
+          <w:sz w:val="22"/>
+          <w:szCs w:val="22"/>
+        </w:rPr>
+        <w:t>//fake implementation of the function or simply just a return value</w:t>
+      </w:r>
+    </w:p>
+    <w:p>
+      <w:pPr>
+        <w:ind w:left="720"/>
+        <w:rPr>
+          <w:color w:val="000000" w:themeColor="text1"/>
+          <w:sz w:val="22"/>
+          <w:szCs w:val="22"/>
+        </w:rPr>
+      </w:pPr>
+      <w:r>
+        <w:rPr>
+          <w:color w:val="000000" w:themeColor="text1"/>
+          <w:sz w:val="22"/>
+          <w:szCs w:val="22"/>
+        </w:rPr>
+        <w:t xml:space="preserve">  return 25;</w:t>
+      </w:r>
+    </w:p>
+    <w:p>
+      <w:pPr>
+        <w:ind w:left="720"/>
+        <w:rPr>
+          <w:color w:val="000000" w:themeColor="text1"/>
+          <w:sz w:val="22"/>
+          <w:szCs w:val="22"/>
+        </w:rPr>
+      </w:pPr>
+      <w:r>
+        <w:rPr>
+          <w:color w:val="000000" w:themeColor="text1"/>
+          <w:sz w:val="22"/>
+          <w:szCs w:val="22"/>
+        </w:rPr>
+        <w:t>});</w:t>
+      </w:r>
+    </w:p>
+    <w:p>
+      <w:pPr>
+        <w:pStyle w:val="ListParagraph"/>
+        <w:numPr>
+          <w:ilvl w:val="0"/>
+          <w:numId w:val="20"/>
+        </w:numPr>
+        <w:rPr>
+          <w:color w:val="000000" w:themeColor="text1"/>
+          <w:sz w:val="22"/>
+          <w:szCs w:val="22"/>
+        </w:rPr>
+      </w:pPr>
+      <w:r>
+        <w:rPr>
+          <w:color w:val="000000" w:themeColor="text1"/>
+          <w:sz w:val="22"/>
+          <w:szCs w:val="22"/>
+        </w:rPr>
+        <w:t>Fake can receive parameters</w:t>
+      </w:r>
+      <w:r>
+        <w:rPr>
+          <w:color w:val="000000" w:themeColor="text1"/>
+          <w:sz w:val="22"/>
+          <w:szCs w:val="22"/>
+        </w:rPr>
+        <w:t xml:space="preserve"> </w:t>
+      </w:r>
+      <w:r>
+        <w:rPr>
+          <w:color w:val="000000" w:themeColor="text1"/>
+          <w:sz w:val="22"/>
+          <w:szCs w:val="22"/>
+        </w:rPr>
+        <w:t>Your fake function can also receive the same arguments.</w:t>
+      </w:r>
+    </w:p>
+    <w:p>
+      <w:pPr>
+        <w:pStyle w:val="ListParagraph"/>
+        <w:numPr>
+          <w:ilvl w:val="0"/>
+          <w:numId w:val="20"/>
+        </w:numPr>
+        <w:rPr>
+          <w:color w:val="000000" w:themeColor="text1"/>
+          <w:sz w:val="22"/>
+          <w:szCs w:val="22"/>
+        </w:rPr>
+      </w:pPr>
+      <w:r>
+        <w:rPr>
+          <w:color w:val="000000" w:themeColor="text1"/>
+          <w:sz w:val="22"/>
+          <w:szCs w:val="22"/>
+        </w:rPr>
+        <w:t>.</w:t>
+      </w:r>
+      <w:proofErr w:type="spellStart"/>
+      <w:r>
+        <w:rPr>
+          <w:color w:val="000000" w:themeColor="text1"/>
+          <w:sz w:val="22"/>
+          <w:szCs w:val="22"/>
+        </w:rPr>
+        <w:t>toContain</w:t>
+      </w:r>
+      <w:proofErr w:type="spellEnd"/>
+      <w:r>
+        <w:rPr>
+          <w:color w:val="000000" w:themeColor="text1"/>
+          <w:sz w:val="22"/>
+          <w:szCs w:val="22"/>
+        </w:rPr>
+        <w:t>() checks whether something exists inside another value, most commonly an array or a string.</w:t>
+      </w:r>
+      <w:r>
+        <w:rPr>
+          <w:color w:val="000000" w:themeColor="text1"/>
+          <w:sz w:val="22"/>
+          <w:szCs w:val="22"/>
+        </w:rPr>
+        <w:t xml:space="preserve"> </w:t>
+      </w:r>
+    </w:p>
+    <w:p>
+      <w:pPr>
+        <w:pStyle w:val="ListParagraph"/>
+        <w:numPr>
+          <w:ilvl w:val="0"/>
+          <w:numId w:val="20"/>
+        </w:numPr>
+        <w:rPr>
+          <w:color w:val="000000" w:themeColor="text1"/>
+          <w:sz w:val="22"/>
+          <w:szCs w:val="22"/>
+        </w:rPr>
+      </w:pPr>
+      <w:r>
+        <w:rPr>
+          <w:color w:val="000000" w:themeColor="text1"/>
+          <w:sz w:val="22"/>
+          <w:szCs w:val="22"/>
+        </w:rPr>
+        <w:lastRenderedPageBreak/>
+        <w:t>.</w:t>
+      </w:r>
+      <w:proofErr w:type="spellStart"/>
+      <w:r>
+        <w:rPr>
+          <w:color w:val="000000" w:themeColor="text1"/>
+          <w:sz w:val="22"/>
+          <w:szCs w:val="22"/>
+        </w:rPr>
+        <w:t>not</w:t>
+      </w:r>
+      <w:r>
+        <w:rPr>
+          <w:color w:val="000000" w:themeColor="text1"/>
+          <w:sz w:val="22"/>
+          <w:szCs w:val="22"/>
+        </w:rPr>
+        <w:t>.equal</w:t>
+      </w:r>
+      <w:proofErr w:type="spellEnd"/>
+      <w:r>
+        <w:rPr>
+          <w:color w:val="000000" w:themeColor="text1"/>
+          <w:sz w:val="22"/>
+          <w:szCs w:val="22"/>
+        </w:rPr>
+        <w:t>()</w:t>
+      </w:r>
+      <w:r>
+        <w:rPr>
+          <w:color w:val="000000" w:themeColor="text1"/>
+          <w:sz w:val="22"/>
+          <w:szCs w:val="22"/>
+        </w:rPr>
+        <w:t xml:space="preserve"> negates a matcher.</w:t>
+      </w:r>
+    </w:p>
+    <w:p>
+      <w:pPr>
+        <w:pStyle w:val="ListParagraph"/>
+        <w:numPr>
+          <w:ilvl w:val="0"/>
+          <w:numId w:val="20"/>
+        </w:numPr>
+        <w:rPr>
+          <w:color w:val="000000" w:themeColor="text1"/>
+          <w:sz w:val="22"/>
+          <w:szCs w:val="22"/>
+        </w:rPr>
+      </w:pPr>
+      <w:r>
+        <w:rPr>
+          <w:color w:val="000000" w:themeColor="text1"/>
+          <w:sz w:val="22"/>
+          <w:szCs w:val="22"/>
+        </w:rPr>
+        <w:t>Jasmine hooks are functions that Jasmine runs automatically at specific points during your tests.</w:t>
+      </w:r>
+      <w:r>
+        <w:rPr>
+          <w:color w:val="000000" w:themeColor="text1"/>
+          <w:sz w:val="22"/>
+          <w:szCs w:val="22"/>
+        </w:rPr>
+        <w:t xml:space="preserve"> </w:t>
+      </w:r>
+      <w:r>
+        <w:rPr>
+          <w:color w:val="000000" w:themeColor="text1"/>
+          <w:sz w:val="22"/>
+          <w:szCs w:val="22"/>
+        </w:rPr>
+        <w:t>They're mainly used for setup and cleanup.</w:t>
+      </w:r>
+      <w:r>
+        <w:rPr>
+          <w:color w:val="000000" w:themeColor="text1"/>
+          <w:sz w:val="22"/>
+          <w:szCs w:val="22"/>
+        </w:rPr>
+        <w:t xml:space="preserve"> </w:t>
+      </w:r>
+    </w:p>
+    <w:p>
+      <w:pPr>
+        <w:pStyle w:val="ListParagraph"/>
+        <w:numPr>
+          <w:ilvl w:val="0"/>
+          <w:numId w:val="20"/>
+        </w:numPr>
+        <w:rPr>
+          <w:color w:val="000000" w:themeColor="text1"/>
+          <w:sz w:val="22"/>
+          <w:szCs w:val="22"/>
+        </w:rPr>
+      </w:pPr>
+      <w:proofErr w:type="spellStart"/>
+      <w:r>
+        <w:rPr>
+          <w:color w:val="000000" w:themeColor="text1"/>
+          <w:sz w:val="22"/>
+          <w:szCs w:val="22"/>
+        </w:rPr>
+        <w:t>beforeEach</w:t>
+      </w:r>
+      <w:proofErr w:type="spellEnd"/>
+      <w:r>
+        <w:rPr>
+          <w:color w:val="000000" w:themeColor="text1"/>
+          <w:sz w:val="22"/>
+          <w:szCs w:val="22"/>
+        </w:rPr>
+        <w:t>(), after each, before all and after all. All of them can be inside the describe and they behave and work the same way they do in Java Junit and mock testing.</w:t>
+      </w:r>
+    </w:p>
+    <w:p>
+      <w:pPr>
+        <w:pStyle w:val="ListParagraph"/>
+        <w:numPr>
+          <w:ilvl w:val="0"/>
+          <w:numId w:val="20"/>
+        </w:numPr>
+        <w:rPr>
+          <w:color w:val="000000" w:themeColor="text1"/>
+          <w:sz w:val="22"/>
+          <w:szCs w:val="22"/>
+        </w:rPr>
+      </w:pPr>
+      <w:r>
+        <w:rPr>
+          <w:color w:val="000000" w:themeColor="text1"/>
+          <w:sz w:val="22"/>
+          <w:szCs w:val="22"/>
+        </w:rPr>
+        <w:t xml:space="preserve">Unrelated: </w:t>
+      </w:r>
+      <w:proofErr w:type="spellStart"/>
+      <w:r>
+        <w:rPr>
+          <w:color w:val="000000" w:themeColor="text1"/>
+          <w:sz w:val="22"/>
+          <w:szCs w:val="22"/>
+        </w:rPr>
+        <w:t>innerText</w:t>
+      </w:r>
+      <w:proofErr w:type="spellEnd"/>
+      <w:r>
+        <w:rPr>
+          <w:color w:val="000000" w:themeColor="text1"/>
+          <w:sz w:val="22"/>
+          <w:szCs w:val="22"/>
+        </w:rPr>
+        <w:t xml:space="preserve">, </w:t>
+      </w:r>
+      <w:r>
+        <w:rPr>
+          <w:color w:val="000000" w:themeColor="text1"/>
+          <w:sz w:val="22"/>
+          <w:szCs w:val="22"/>
+        </w:rPr>
+        <w:t>It lets you get or change the visible text inside an HTML element.</w:t>
+      </w:r>
+    </w:p>
+    <w:p>
+      <w:pPr>
+        <w:pStyle w:val="HTMLPreformatted"/>
+        <w:numPr>
+          <w:ilvl w:val="0"/>
+          <w:numId w:val="20"/>
+        </w:numPr>
+        <w:rPr>
+          <w:rFonts w:asciiTheme="minorHAnsi" w:eastAsiaTheme="minorHAnsi" w:hAnsiTheme="minorHAnsi" w:cstheme="minorBidi"/>
+          <w:color w:val="000000" w:themeColor="text1"/>
+          <w:kern w:val="2"/>
+          <w:sz w:val="22"/>
+          <w:szCs w:val="22"/>
+          <w14:ligatures w14:val="standardContextual"/>
+        </w:rPr>
+      </w:pPr>
+      <w:r>
+        <w:rPr>
+          <w:rFonts w:asciiTheme="minorHAnsi" w:eastAsiaTheme="minorHAnsi" w:hAnsiTheme="minorHAnsi" w:cstheme="minorBidi"/>
+          <w:color w:val="000000" w:themeColor="text1"/>
+          <w:kern w:val="2"/>
+          <w:sz w:val="22"/>
+          <w:szCs w:val="22"/>
+          <w14:ligatures w14:val="standardContextual"/>
+        </w:rPr>
+        <w:t>&lt;p id="status"&gt;Sensor connected&lt;/p&gt;</w:t>
+      </w:r>
+    </w:p>
+    <w:p>
+      <w:pPr>
+        <w:pStyle w:val="NormalWeb"/>
+        <w:ind w:left="720"/>
+        <w:rPr>
+          <w:rFonts w:asciiTheme="minorHAnsi" w:eastAsiaTheme="minorHAnsi" w:hAnsiTheme="minorHAnsi" w:cstheme="minorBidi"/>
+          <w:color w:val="000000" w:themeColor="text1"/>
+          <w:kern w:val="2"/>
+          <w:sz w:val="22"/>
+          <w:szCs w:val="22"/>
+          <w14:ligatures w14:val="standardContextual"/>
+        </w:rPr>
+      </w:pPr>
+      <w:r>
+        <w:rPr>
+          <w:rFonts w:asciiTheme="minorHAnsi" w:eastAsiaTheme="minorHAnsi" w:hAnsiTheme="minorHAnsi" w:cstheme="minorBidi"/>
+          <w:color w:val="000000" w:themeColor="text1"/>
+          <w:kern w:val="2"/>
+          <w:sz w:val="22"/>
+          <w:szCs w:val="22"/>
+          <w14:ligatures w14:val="standardContextual"/>
+        </w:rPr>
+        <w:t>JavaScript:</w:t>
+      </w:r>
+    </w:p>
+    <w:p>
+      <w:pPr>
+        <w:pStyle w:val="HTMLPreformatted"/>
+        <w:ind w:left="720"/>
+        <w:rPr>
+          <w:rFonts w:asciiTheme="minorHAnsi" w:eastAsiaTheme="minorHAnsi" w:hAnsiTheme="minorHAnsi" w:cstheme="minorBidi"/>
+          <w:color w:val="000000" w:themeColor="text1"/>
+          <w:kern w:val="2"/>
+          <w:sz w:val="22"/>
+          <w:szCs w:val="22"/>
+          <w14:ligatures w14:val="standardContextual"/>
+        </w:rPr>
+      </w:pPr>
+      <w:r>
+        <w:rPr>
+          <w:rFonts w:asciiTheme="minorHAnsi" w:eastAsiaTheme="minorHAnsi" w:hAnsiTheme="minorHAnsi" w:cstheme="minorBidi"/>
+          <w:color w:val="000000" w:themeColor="text1"/>
+          <w:kern w:val="2"/>
+          <w:sz w:val="22"/>
+          <w:szCs w:val="22"/>
+          <w14:ligatures w14:val="standardContextual"/>
+        </w:rPr>
+        <w:t xml:space="preserve">const status = </w:t>
+      </w:r>
+      <w:proofErr w:type="spellStart"/>
+      <w:r>
+        <w:rPr>
+          <w:rFonts w:asciiTheme="minorHAnsi" w:eastAsiaTheme="minorHAnsi" w:hAnsiTheme="minorHAnsi" w:cstheme="minorBidi"/>
+          <w:color w:val="000000" w:themeColor="text1"/>
+          <w:kern w:val="2"/>
+          <w:sz w:val="22"/>
+          <w:szCs w:val="22"/>
+          <w14:ligatures w14:val="standardContextual"/>
+        </w:rPr>
+        <w:t>document.getElementById</w:t>
+      </w:r>
+      <w:proofErr w:type="spellEnd"/>
+      <w:r>
+        <w:rPr>
+          <w:rFonts w:asciiTheme="minorHAnsi" w:eastAsiaTheme="minorHAnsi" w:hAnsiTheme="minorHAnsi" w:cstheme="minorBidi"/>
+          <w:color w:val="000000" w:themeColor="text1"/>
+          <w:kern w:val="2"/>
+          <w:sz w:val="22"/>
+          <w:szCs w:val="22"/>
+          <w14:ligatures w14:val="standardContextual"/>
+        </w:rPr>
+        <w:t>("status");</w:t>
+      </w:r>
+    </w:p>
+    <w:p>
+      <w:pPr>
+        <w:pStyle w:val="HTMLPreformatted"/>
+        <w:ind w:left="720"/>
+        <w:rPr>
+          <w:rFonts w:asciiTheme="minorHAnsi" w:eastAsiaTheme="minorHAnsi" w:hAnsiTheme="minorHAnsi" w:cstheme="minorBidi"/>
+          <w:color w:val="000000" w:themeColor="text1"/>
+          <w:kern w:val="2"/>
+          <w:sz w:val="22"/>
+          <w:szCs w:val="22"/>
+          <w14:ligatures w14:val="standardContextual"/>
+        </w:rPr>
+      </w:pPr>
+    </w:p>
+    <w:p>
+      <w:pPr>
+        <w:pStyle w:val="HTMLPreformatted"/>
+        <w:ind w:left="720"/>
+        <w:rPr>
+          <w:rFonts w:asciiTheme="minorHAnsi" w:eastAsiaTheme="minorHAnsi" w:hAnsiTheme="minorHAnsi" w:cstheme="minorBidi"/>
+          <w:color w:val="000000" w:themeColor="text1"/>
+          <w:kern w:val="2"/>
+          <w:sz w:val="22"/>
+          <w:szCs w:val="22"/>
+          <w14:ligatures w14:val="standardContextual"/>
+        </w:rPr>
+      </w:pPr>
+      <w:r>
+        <w:rPr>
+          <w:rFonts w:asciiTheme="minorHAnsi" w:eastAsiaTheme="minorHAnsi" w:hAnsiTheme="minorHAnsi" w:cstheme="minorBidi"/>
+          <w:color w:val="000000" w:themeColor="text1"/>
+          <w:kern w:val="2"/>
+          <w:sz w:val="22"/>
+          <w:szCs w:val="22"/>
+          <w14:ligatures w14:val="standardContextual"/>
+        </w:rPr>
+        <w:t>console.log(</w:t>
+      </w:r>
+      <w:proofErr w:type="spellStart"/>
+      <w:r>
+        <w:rPr>
+          <w:rFonts w:asciiTheme="minorHAnsi" w:eastAsiaTheme="minorHAnsi" w:hAnsiTheme="minorHAnsi" w:cstheme="minorBidi"/>
+          <w:color w:val="000000" w:themeColor="text1"/>
+          <w:kern w:val="2"/>
+          <w:sz w:val="22"/>
+          <w:szCs w:val="22"/>
+          <w14:ligatures w14:val="standardContextual"/>
+        </w:rPr>
+        <w:t>status.innerText</w:t>
+      </w:r>
+      <w:proofErr w:type="spellEnd"/>
+      <w:r>
+        <w:rPr>
+          <w:rFonts w:asciiTheme="minorHAnsi" w:eastAsiaTheme="minorHAnsi" w:hAnsiTheme="minorHAnsi" w:cstheme="minorBidi"/>
+          <w:color w:val="000000" w:themeColor="text1"/>
+          <w:kern w:val="2"/>
+          <w:sz w:val="22"/>
+          <w:szCs w:val="22"/>
+          <w14:ligatures w14:val="standardContextual"/>
+        </w:rPr>
+        <w:t>);</w:t>
+      </w:r>
+    </w:p>
+    <w:p>
+      <w:pPr>
+        <w:pStyle w:val="NormalWeb"/>
+        <w:ind w:left="720"/>
+        <w:rPr>
+          <w:rFonts w:asciiTheme="minorHAnsi" w:eastAsiaTheme="minorHAnsi" w:hAnsiTheme="minorHAnsi" w:cstheme="minorBidi"/>
+          <w:color w:val="000000" w:themeColor="text1"/>
+          <w:kern w:val="2"/>
+          <w:sz w:val="22"/>
+          <w:szCs w:val="22"/>
+          <w14:ligatures w14:val="standardContextual"/>
+        </w:rPr>
+      </w:pPr>
+      <w:r>
+        <w:rPr>
+          <w:rFonts w:asciiTheme="minorHAnsi" w:eastAsiaTheme="minorHAnsi" w:hAnsiTheme="minorHAnsi" w:cstheme="minorBidi"/>
+          <w:color w:val="000000" w:themeColor="text1"/>
+          <w:kern w:val="2"/>
+          <w:sz w:val="22"/>
+          <w:szCs w:val="22"/>
+          <w14:ligatures w14:val="standardContextual"/>
+        </w:rPr>
+        <w:t>Result:</w:t>
+      </w:r>
+    </w:p>
+    <w:p>
+      <w:pPr>
+        <w:pStyle w:val="HTMLPreformatted"/>
+        <w:ind w:left="720"/>
+        <w:rPr>
+          <w:rFonts w:asciiTheme="minorHAnsi" w:eastAsiaTheme="minorHAnsi" w:hAnsiTheme="minorHAnsi" w:cstheme="minorBidi"/>
+          <w:color w:val="000000" w:themeColor="text1"/>
+          <w:kern w:val="2"/>
+          <w:sz w:val="22"/>
+          <w:szCs w:val="22"/>
+          <w14:ligatures w14:val="standardContextual"/>
+        </w:rPr>
+      </w:pPr>
+      <w:r>
+        <w:rPr>
+          <w:rFonts w:asciiTheme="minorHAnsi" w:eastAsiaTheme="minorHAnsi" w:hAnsiTheme="minorHAnsi" w:cstheme="minorBidi"/>
+          <w:color w:val="000000" w:themeColor="text1"/>
+          <w:kern w:val="2"/>
+          <w:sz w:val="22"/>
+          <w:szCs w:val="22"/>
+          <w14:ligatures w14:val="standardContextual"/>
+        </w:rPr>
+        <w:t>Sensor connected</w:t>
+      </w:r>
+    </w:p>
+    <w:p>
+      <w:pPr>
+        <w:pStyle w:val="ListParagraph"/>
+        <w:numPr>
+          <w:ilvl w:val="0"/>
+          <w:numId w:val="20"/>
+        </w:numPr>
+        <w:rPr>
+          <w:color w:val="000000" w:themeColor="text1"/>
+          <w:sz w:val="22"/>
+          <w:szCs w:val="22"/>
+        </w:rPr>
+      </w:pPr>
+      <w:proofErr w:type="spellStart"/>
+      <w:r>
+        <w:rPr>
+          <w:color w:val="000000" w:themeColor="text1"/>
+          <w:sz w:val="22"/>
+          <w:szCs w:val="22"/>
+        </w:rPr>
+        <w:t>innerText</w:t>
+      </w:r>
+      <w:proofErr w:type="spellEnd"/>
+      <w:r>
+        <w:rPr>
+          <w:color w:val="000000" w:themeColor="text1"/>
+          <w:sz w:val="22"/>
+          <w:szCs w:val="22"/>
+        </w:rPr>
+        <w:t xml:space="preserve"> is a DOM property used to read or change the text displayed inside an HTML element.</w:t>
       </w:r>
     </w:p>
     <w:sectPr>
@@ -8152,6 +9772,119 @@
     </w:lvl>
   </w:abstractNum>
   <w:abstractNum w:abstractNumId="3" w15:restartNumberingAfterBreak="0">
+    <w:nsid w:val="180073A9"/>
+    <w:multiLevelType w:val="hybridMultilevel"/>
+    <w:tmpl w:val="C4208BC4"/>
+    <w:lvl w:ilvl="0" w:tplc="04090001">
+      <w:start w:val="1"/>
+      <w:numFmt w:val="bullet"/>
+      <w:lvlText w:val=""/>
+      <w:lvlJc w:val="left"/>
+      <w:pPr>
+        <w:ind w:left="720" w:hanging="360"/>
+      </w:pPr>
+      <w:rPr>
+        <w:rFonts w:ascii="Symbol" w:hAnsi="Symbol" w:hint="default"/>
+      </w:rPr>
+    </w:lvl>
+    <w:lvl w:ilvl="1" w:tplc="04090003" w:tentative="1">
+      <w:start w:val="1"/>
+      <w:numFmt w:val="bullet"/>
+      <w:lvlText w:val="o"/>
+      <w:lvlJc w:val="left"/>
+      <w:pPr>
+        <w:ind w:left="1440" w:hanging="360"/>
+      </w:pPr>
+      <w:rPr>
+        <w:rFonts w:ascii="Courier New" w:hAnsi="Courier New" w:cs="Courier New" w:hint="default"/>
+      </w:rPr>
+    </w:lvl>
+    <w:lvl w:ilvl="2" w:tplc="04090005" w:tentative="1">
+      <w:start w:val="1"/>
+      <w:numFmt w:val="bullet"/>
+      <w:lvlText w:val=""/>
+      <w:lvlJc w:val="left"/>
+      <w:pPr>
+        <w:ind w:left="2160" w:hanging="360"/>
+      </w:pPr>
+      <w:rPr>
+        <w:rFonts w:ascii="Wingdings" w:hAnsi="Wingdings" w:hint="default"/>
+      </w:rPr>
+    </w:lvl>
+    <w:lvl w:ilvl="3" w:tplc="04090001" w:tentative="1">
+      <w:start w:val="1"/>
+      <w:numFmt w:val="bullet"/>
+      <w:lvlText w:val=""/>
+      <w:lvlJc w:val="left"/>
+      <w:pPr>
+        <w:ind w:left="2880" w:hanging="360"/>
+      </w:pPr>
+      <w:rPr>
+        <w:rFonts w:ascii="Symbol" w:hAnsi="Symbol" w:hint="default"/>
+      </w:rPr>
+    </w:lvl>
+    <w:lvl w:ilvl="4" w:tplc="04090003" w:tentative="1">
+      <w:start w:val="1"/>
+      <w:numFmt w:val="bullet"/>
+      <w:lvlText w:val="o"/>
+      <w:lvlJc w:val="left"/>
+      <w:pPr>
+        <w:ind w:left="3600" w:hanging="360"/>
+      </w:pPr>
+      <w:rPr>
+        <w:rFonts w:ascii="Courier New" w:hAnsi="Courier New" w:cs="Courier New" w:hint="default"/>
+      </w:rPr>
+    </w:lvl>
+    <w:lvl w:ilvl="5" w:tplc="04090005" w:tentative="1">
+      <w:start w:val="1"/>
+      <w:numFmt w:val="bullet"/>
+      <w:lvlText w:val=""/>
+      <w:lvlJc w:val="left"/>
+      <w:pPr>
+        <w:ind w:left="4320" w:hanging="360"/>
+      </w:pPr>
+      <w:rPr>
+        <w:rFonts w:ascii="Wingdings" w:hAnsi="Wingdings" w:hint="default"/>
+      </w:rPr>
+    </w:lvl>
+    <w:lvl w:ilvl="6" w:tplc="04090001" w:tentative="1">
+      <w:start w:val="1"/>
+      <w:numFmt w:val="bullet"/>
+      <w:lvlText w:val=""/>
+      <w:lvlJc w:val="left"/>
+      <w:pPr>
+        <w:ind w:left="5040" w:hanging="360"/>
+      </w:pPr>
+      <w:rPr>
+        <w:rFonts w:ascii="Symbol" w:hAnsi="Symbol" w:hint="default"/>
+      </w:rPr>
+    </w:lvl>
+    <w:lvl w:ilvl="7" w:tplc="04090003" w:tentative="1">
+      <w:start w:val="1"/>
+      <w:numFmt w:val="bullet"/>
+      <w:lvlText w:val="o"/>
+      <w:lvlJc w:val="left"/>
+      <w:pPr>
+        <w:ind w:left="5760" w:hanging="360"/>
+      </w:pPr>
+      <w:rPr>
+        <w:rFonts w:ascii="Courier New" w:hAnsi="Courier New" w:cs="Courier New" w:hint="default"/>
+      </w:rPr>
+    </w:lvl>
+    <w:lvl w:ilvl="8" w:tplc="04090005" w:tentative="1">
+      <w:start w:val="1"/>
+      <w:numFmt w:val="bullet"/>
+      <w:lvlText w:val=""/>
+      <w:lvlJc w:val="left"/>
+      <w:pPr>
+        <w:ind w:left="6480" w:hanging="360"/>
+      </w:pPr>
+      <w:rPr>
+        <w:rFonts w:ascii="Wingdings" w:hAnsi="Wingdings" w:hint="default"/>
+      </w:rPr>
+    </w:lvl>
+  </w:abstractNum>
+  <w:abstractNum w:abstractNumId="4" w15:restartNumberingAfterBreak="0">
     <w:nsid w:val="21A85D22"/>
     <w:multiLevelType w:val="hybridMultilevel"/>
     <w:tmpl w:val="5D587D8C"/>
@@ -8264,7 +9997,7 @@
       </w:rPr>
     </w:lvl>
   </w:abstractNum>
-  <w:abstractNum w:abstractNumId="4" w15:restartNumberingAfterBreak="0">
+  <w:abstractNum w:abstractNumId="5" w15:restartNumberingAfterBreak="0">
     <w:nsid w:val="25FB4FF8"/>
     <w:multiLevelType w:val="hybridMultilevel"/>
     <w:tmpl w:val="5EB82182"/>
@@ -8377,7 +10110,7 @@
       </w:rPr>
     </w:lvl>
   </w:abstractNum>
-  <w:abstractNum w:abstractNumId="5" w15:restartNumberingAfterBreak="0">
+  <w:abstractNum w:abstractNumId="6" w15:restartNumberingAfterBreak="0">
     <w:nsid w:val="287602B0"/>
     <w:multiLevelType w:val="hybridMultilevel"/>
     <w:tmpl w:val="9FB6BA26"/>
@@ -8490,7 +10223,7 @@
       </w:rPr>
     </w:lvl>
   </w:abstractNum>
-  <w:abstractNum w:abstractNumId="6" w15:restartNumberingAfterBreak="0">
+  <w:abstractNum w:abstractNumId="7" w15:restartNumberingAfterBreak="0">
     <w:nsid w:val="32A63574"/>
     <w:multiLevelType w:val="hybridMultilevel"/>
     <w:tmpl w:val="D3E6D67C"/>
@@ -8603,7 +10336,7 @@
       </w:rPr>
     </w:lvl>
   </w:abstractNum>
-  <w:abstractNum w:abstractNumId="7" w15:restartNumberingAfterBreak="0">
+  <w:abstractNum w:abstractNumId="8" w15:restartNumberingAfterBreak="0">
     <w:nsid w:val="47C87E2C"/>
     <w:multiLevelType w:val="hybridMultilevel"/>
     <w:tmpl w:val="12A6ED96"/>
@@ -8716,7 +10449,7 @@
       </w:rPr>
     </w:lvl>
   </w:abstractNum>
-  <w:abstractNum w:abstractNumId="8" w15:restartNumberingAfterBreak="0">
+  <w:abstractNum w:abstractNumId="9" w15:restartNumberingAfterBreak="0">
     <w:nsid w:val="572153BA"/>
     <w:multiLevelType w:val="hybridMultilevel"/>
     <w:tmpl w:val="B4FCCD2A"/>
@@ -8829,7 +10562,7 @@
       </w:rPr>
     </w:lvl>
   </w:abstractNum>
-  <w:abstractNum w:abstractNumId="9" w15:restartNumberingAfterBreak="0">
+  <w:abstractNum w:abstractNumId="10" w15:restartNumberingAfterBreak="0">
     <w:nsid w:val="62C452F9"/>
     <w:multiLevelType w:val="hybridMultilevel"/>
     <w:tmpl w:val="CAA478D8"/>
@@ -8942,7 +10675,7 @@
       </w:rPr>
     </w:lvl>
   </w:abstractNum>
-  <w:abstractNum w:abstractNumId="10" w15:restartNumberingAfterBreak="0">
+  <w:abstractNum w:abstractNumId="11" w15:restartNumberingAfterBreak="0">
     <w:nsid w:val="6B753F92"/>
     <w:multiLevelType w:val="hybridMultilevel"/>
     <w:tmpl w:val="2AD4633C"/>
@@ -9055,7 +10788,7 @@
       </w:rPr>
     </w:lvl>
   </w:abstractNum>
-  <w:abstractNum w:abstractNumId="11" w15:restartNumberingAfterBreak="0">
+  <w:abstractNum w:abstractNumId="12" w15:restartNumberingAfterBreak="0">
     <w:nsid w:val="6BF4448B"/>
     <w:multiLevelType w:val="hybridMultilevel"/>
     <w:tmpl w:val="3A8A2742"/>
@@ -9168,7 +10901,120 @@
       </w:rPr>
     </w:lvl>
   </w:abstractNum>
-  <w:abstractNum w:abstractNumId="12" w15:restartNumberingAfterBreak="0">
+  <w:abstractNum w:abstractNumId="13" w15:restartNumberingAfterBreak="0">
+    <w:nsid w:val="6FCD6DB0"/>
+    <w:multiLevelType w:val="hybridMultilevel"/>
+    <w:tmpl w:val="5F02461E"/>
+    <w:lvl w:ilvl="0" w:tplc="04090001">
+      <w:start w:val="1"/>
+      <w:numFmt w:val="bullet"/>
+      <w:lvlText w:val=""/>
+      <w:lvlJc w:val="left"/>
+      <w:pPr>
+        <w:ind w:left="720" w:hanging="360"/>
+      </w:pPr>
+      <w:rPr>
+        <w:rFonts w:ascii="Symbol" w:hAnsi="Symbol" w:hint="default"/>
+      </w:rPr>
+    </w:lvl>
+    <w:lvl w:ilvl="1" w:tplc="04090003">
+      <w:start w:val="1"/>
+      <w:numFmt w:val="bullet"/>
+      <w:lvlText w:val="o"/>
+      <w:lvlJc w:val="left"/>
+      <w:pPr>
+        <w:ind w:left="1440" w:hanging="360"/>
+      </w:pPr>
+      <w:rPr>
+        <w:rFonts w:ascii="Courier New" w:hAnsi="Courier New" w:cs="Courier New" w:hint="default"/>
+      </w:rPr>
+    </w:lvl>
+    <w:lvl w:ilvl="2" w:tplc="04090005" w:tentative="1">
+      <w:start w:val="1"/>
+      <w:numFmt w:val="bullet"/>
+      <w:lvlText w:val=""/>
+      <w:lvlJc w:val="left"/>
+      <w:pPr>
+        <w:ind w:left="2160" w:hanging="360"/>
+      </w:pPr>
+      <w:rPr>
+        <w:rFonts w:ascii="Wingdings" w:hAnsi="Wingdings" w:hint="default"/>
+      </w:rPr>
+    </w:lvl>
+    <w:lvl w:ilvl="3" w:tplc="04090001" w:tentative="1">
+      <w:start w:val="1"/>
+      <w:numFmt w:val="bullet"/>
+      <w:lvlText w:val=""/>
+      <w:lvlJc w:val="left"/>
+      <w:pPr>
+        <w:ind w:left="2880" w:hanging="360"/>
+      </w:pPr>
+      <w:rPr>
+        <w:rFonts w:ascii="Symbol" w:hAnsi="Symbol" w:hint="default"/>
+      </w:rPr>
+    </w:lvl>
+    <w:lvl w:ilvl="4" w:tplc="04090003" w:tentative="1">
+      <w:start w:val="1"/>
+      <w:numFmt w:val="bullet"/>
+      <w:lvlText w:val="o"/>
+      <w:lvlJc w:val="left"/>
+      <w:pPr>
+        <w:ind w:left="3600" w:hanging="360"/>
+      </w:pPr>
+      <w:rPr>
+        <w:rFonts w:ascii="Courier New" w:hAnsi="Courier New" w:cs="Courier New" w:hint="default"/>
+      </w:rPr>
+    </w:lvl>
+    <w:lvl w:ilvl="5" w:tplc="04090005" w:tentative="1">
+      <w:start w:val="1"/>
+      <w:numFmt w:val="bullet"/>
+      <w:lvlText w:val=""/>
+      <w:lvlJc w:val="left"/>
+      <w:pPr>
+        <w:ind w:left="4320" w:hanging="360"/>
+      </w:pPr>
+      <w:rPr>
+        <w:rFonts w:ascii="Wingdings" w:hAnsi="Wingdings" w:hint="default"/>
+      </w:rPr>
+    </w:lvl>
+    <w:lvl w:ilvl="6" w:tplc="04090001" w:tentative="1">
+      <w:start w:val="1"/>
+      <w:numFmt w:val="bullet"/>
+      <w:lvlText w:val=""/>
+      <w:lvlJc w:val="left"/>
+      <w:pPr>
+        <w:ind w:left="5040" w:hanging="360"/>
+      </w:pPr>
+      <w:rPr>
+        <w:rFonts w:ascii="Symbol" w:hAnsi="Symbol" w:hint="default"/>
+      </w:rPr>
+    </w:lvl>
+    <w:lvl w:ilvl="7" w:tplc="04090003" w:tentative="1">
+      <w:start w:val="1"/>
+      <w:numFmt w:val="bullet"/>
+      <w:lvlText w:val="o"/>
+      <w:lvlJc w:val="left"/>
+      <w:pPr>
+        <w:ind w:left="5760" w:hanging="360"/>
+      </w:pPr>
+      <w:rPr>
+        <w:rFonts w:ascii="Courier New" w:hAnsi="Courier New" w:cs="Courier New" w:hint="default"/>
+      </w:rPr>
+    </w:lvl>
+    <w:lvl w:ilvl="8" w:tplc="04090005" w:tentative="1">
+      <w:start w:val="1"/>
+      <w:numFmt w:val="bullet"/>
+      <w:lvlText w:val=""/>
+      <w:lvlJc w:val="left"/>
+      <w:pPr>
+        <w:ind w:left="6480" w:hanging="360"/>
+      </w:pPr>
+      <w:rPr>
+        <w:rFonts w:ascii="Wingdings" w:hAnsi="Wingdings" w:hint="default"/>
+      </w:rPr>
+    </w:lvl>
+  </w:abstractNum>
+  <w:abstractNum w:abstractNumId="14" w15:restartNumberingAfterBreak="0">
     <w:nsid w:val="74605A05"/>
     <w:multiLevelType w:val="hybridMultilevel"/>
     <w:tmpl w:val="E346ABE0"/>
@@ -9281,7 +11127,7 @@
       </w:rPr>
     </w:lvl>
   </w:abstractNum>
-  <w:abstractNum w:abstractNumId="13" w15:restartNumberingAfterBreak="0">
+  <w:abstractNum w:abstractNumId="15" w15:restartNumberingAfterBreak="0">
     <w:nsid w:val="79CD0E53"/>
     <w:multiLevelType w:val="hybridMultilevel"/>
     <w:tmpl w:val="56742AC4"/>
@@ -9394,7 +11240,7 @@
       </w:rPr>
     </w:lvl>
   </w:abstractNum>
-  <w:abstractNum w:abstractNumId="14" w15:restartNumberingAfterBreak="0">
+  <w:abstractNum w:abstractNumId="16" w15:restartNumberingAfterBreak="0">
     <w:nsid w:val="7B792B0E"/>
     <w:multiLevelType w:val="hybridMultilevel"/>
     <w:tmpl w:val="C7E2C25C"/>
@@ -9507,7 +11353,7 @@
       </w:rPr>
     </w:lvl>
   </w:abstractNum>
-  <w:abstractNum w:abstractNumId="15" w15:restartNumberingAfterBreak="0">
+  <w:abstractNum w:abstractNumId="17" w15:restartNumberingAfterBreak="0">
     <w:nsid w:val="7C5352BD"/>
     <w:multiLevelType w:val="hybridMultilevel"/>
     <w:tmpl w:val="1E0E7DD8"/>
@@ -9620,7 +11466,7 @@
       </w:rPr>
     </w:lvl>
   </w:abstractNum>
-  <w:abstractNum w:abstractNumId="16" w15:restartNumberingAfterBreak="0">
+  <w:abstractNum w:abstractNumId="18" w15:restartNumberingAfterBreak="0">
     <w:nsid w:val="7CA817BC"/>
     <w:multiLevelType w:val="hybridMultilevel"/>
     <w:tmpl w:val="7C287A30"/>
@@ -9733,7 +11579,7 @@
       </w:rPr>
     </w:lvl>
   </w:abstractNum>
-  <w:abstractNum w:abstractNumId="17" w15:restartNumberingAfterBreak="0">
+  <w:abstractNum w:abstractNumId="19" w15:restartNumberingAfterBreak="0">
     <w:nsid w:val="7F72049C"/>
     <w:multiLevelType w:val="multilevel"/>
     <w:tmpl w:val="1F242F62"/>
@@ -9883,58 +11729,64 @@
     </w:lvl>
   </w:abstractNum>
   <w:num w:numId="1" w16cid:durableId="1595670622">
-    <w:abstractNumId w:val="8"/>
+    <w:abstractNumId w:val="9"/>
   </w:num>
   <w:num w:numId="2" w16cid:durableId="1253974616">
-    <w:abstractNumId w:val="6"/>
+    <w:abstractNumId w:val="7"/>
   </w:num>
   <w:num w:numId="3" w16cid:durableId="1151209963">
     <w:abstractNumId w:val="2"/>
   </w:num>
   <w:num w:numId="4" w16cid:durableId="2085225567">
-    <w:abstractNumId w:val="11"/>
+    <w:abstractNumId w:val="12"/>
   </w:num>
   <w:num w:numId="5" w16cid:durableId="968363398">
     <w:abstractNumId w:val="0"/>
   </w:num>
   <w:num w:numId="6" w16cid:durableId="1448768395">
-    <w:abstractNumId w:val="13"/>
+    <w:abstractNumId w:val="15"/>
   </w:num>
   <w:num w:numId="7" w16cid:durableId="97333426">
+    <w:abstractNumId w:val="19"/>
+  </w:num>
+  <w:num w:numId="8" w16cid:durableId="2078238912">
+    <w:abstractNumId w:val="10"/>
+  </w:num>
+  <w:num w:numId="9" w16cid:durableId="1133792355">
+    <w:abstractNumId w:val="6"/>
+  </w:num>
+  <w:num w:numId="10" w16cid:durableId="1949001774">
+    <w:abstractNumId w:val="14"/>
+  </w:num>
+  <w:num w:numId="11" w16cid:durableId="49500872">
+    <w:abstractNumId w:val="18"/>
+  </w:num>
+  <w:num w:numId="12" w16cid:durableId="1627009029">
     <w:abstractNumId w:val="17"/>
   </w:num>
-  <w:num w:numId="8" w16cid:durableId="2078238912">
-    <w:abstractNumId w:val="9"/>
-  </w:num>
-  <w:num w:numId="9" w16cid:durableId="1133792355">
-    <w:abstractNumId w:val="5"/>
-  </w:num>
-  <w:num w:numId="10" w16cid:durableId="1949001774">
-    <w:abstractNumId w:val="12"/>
-  </w:num>
-  <w:num w:numId="11" w16cid:durableId="49500872">
-    <w:abstractNumId w:val="16"/>
-  </w:num>
-  <w:num w:numId="12" w16cid:durableId="1627009029">
-    <w:abstractNumId w:val="15"/>
-  </w:num>
   <w:num w:numId="13" w16cid:durableId="2035300943">
-    <w:abstractNumId w:val="3"/>
+    <w:abstractNumId w:val="4"/>
   </w:num>
   <w:num w:numId="14" w16cid:durableId="582224159">
     <w:abstractNumId w:val="1"/>
   </w:num>
   <w:num w:numId="15" w16cid:durableId="1146630300">
-    <w:abstractNumId w:val="14"/>
+    <w:abstractNumId w:val="16"/>
   </w:num>
   <w:num w:numId="16" w16cid:durableId="1096558111">
-    <w:abstractNumId w:val="4"/>
+    <w:abstractNumId w:val="5"/>
   </w:num>
   <w:num w:numId="17" w16cid:durableId="41566618">
-    <w:abstractNumId w:val="10"/>
+    <w:abstractNumId w:val="11"/>
   </w:num>
   <w:num w:numId="18" w16cid:durableId="366835154">
-    <w:abstractNumId w:val="7"/>
+    <w:abstractNumId w:val="8"/>
+  </w:num>
+  <w:num w:numId="19" w16cid:durableId="837962617">
+    <w:abstractNumId w:val="3"/>
+  </w:num>
+  <w:num w:numId="20" w16cid:durableId="708997360">
+    <w:abstractNumId w:val="13"/>
   </w:num>
 </w:numbering>
 </file>
@@ -11000,6 +12852,26 @@
     <w:basedOn w:val="DefaultParagraphFont"/>
     <w:rsid w:val="00123297"/>
   </w:style>
+  <w:style w:type="character" w:customStyle="1" w:styleId="13">
+    <w:name w:val="ͼ13"/>
+    <w:basedOn w:val="DefaultParagraphFont"/>
+    <w:rsid w:val="00E20586"/>
+  </w:style>
+  <w:style w:type="character" w:customStyle="1" w:styleId="12">
+    <w:name w:val="ͼ12"/>
+    <w:basedOn w:val="DefaultParagraphFont"/>
+    <w:rsid w:val="00E20586"/>
+  </w:style>
+  <w:style w:type="character" w:customStyle="1" w:styleId="z">
+    <w:name w:val="ͼz"/>
+    <w:basedOn w:val="DefaultParagraphFont"/>
+    <w:rsid w:val="00E20586"/>
+  </w:style>
+  <w:style w:type="character" w:customStyle="1" w:styleId="11">
+    <w:name w:val="ͼ11"/>
+    <w:basedOn w:val="DefaultParagraphFont"/>
+    <w:rsid w:val="00E20586"/>
+  </w:style>
 </w:styles>
 </file>
 

</xml_diff>

<commit_message>
finish intro to backend
</commit_message>
<xml_diff>
--- a/Javascript/Javascript basic notes.docx
+++ b/Javascript/Javascript basic notes.docx
@@ -9913,6 +9913,24 @@
     <w:p>
       <w:pPr>
         <w:rPr>
+          <w:color w:val="000000" w:themeColor="text1"/>
+          <w:sz w:val="22"/>
+          <w:szCs w:val="22"/>
+        </w:rPr>
+      </w:pPr>
+    </w:p>
+    <w:p>
+      <w:pPr>
+        <w:rPr>
+          <w:color w:val="000000" w:themeColor="text1"/>
+          <w:sz w:val="22"/>
+          <w:szCs w:val="22"/>
+        </w:rPr>
+      </w:pPr>
+    </w:p>
+    <w:p>
+      <w:pPr>
+        <w:rPr>
           <w:b/>
           <w:bCs/>
           <w:color w:val="000000" w:themeColor="text1"/>
@@ -9926,6 +9944,7 @@
           <w:color w:val="000000" w:themeColor="text1"/>
           <w:u w:val="single"/>
         </w:rPr>
+        <w:lastRenderedPageBreak/>
         <w:t>Inheritance:</w:t>
       </w:r>
     </w:p>
@@ -9948,7 +9967,6 @@
           <w:sz w:val="22"/>
           <w:szCs w:val="22"/>
         </w:rPr>
-        <w:lastRenderedPageBreak/>
         <w:t>T</w:t>
       </w:r>
       <w:r>
@@ -10699,6 +10717,220 @@
           <w:ilvl w:val="0"/>
           <w:numId w:val="18"/>
         </w:numPr>
+        <w:rPr>
+          <w:color w:val="000000" w:themeColor="text1"/>
+          <w:sz w:val="22"/>
+          <w:szCs w:val="22"/>
+        </w:rPr>
+      </w:pPr>
+      <w:proofErr w:type="gramStart"/>
+      <w:r>
+        <w:rPr>
+          <w:color w:val="000000" w:themeColor="text1"/>
+          <w:sz w:val="22"/>
+          <w:szCs w:val="22"/>
+        </w:rPr>
+        <w:t>Polymorphism</w:t>
+      </w:r>
+      <w:proofErr w:type="gramEnd"/>
+      <w:r>
+        <w:rPr>
+          <w:color w:val="000000" w:themeColor="text1"/>
+          <w:sz w:val="22"/>
+          <w:szCs w:val="22"/>
+        </w:rPr>
+        <w:t xml:space="preserve"> which means many forms, is the ability to invoke different method types based on the object type. We don’t need to check for the object type before we execute the function </w:t>
+      </w:r>
+      <w:proofErr w:type="gramStart"/>
+      <w:r>
+        <w:rPr>
+          <w:color w:val="000000" w:themeColor="text1"/>
+          <w:sz w:val="22"/>
+          <w:szCs w:val="22"/>
+        </w:rPr>
+        <w:t>its</w:t>
+      </w:r>
+      <w:proofErr w:type="gramEnd"/>
+      <w:r>
+        <w:rPr>
+          <w:color w:val="000000" w:themeColor="text1"/>
+          <w:sz w:val="22"/>
+          <w:szCs w:val="22"/>
+        </w:rPr>
+        <w:t xml:space="preserve"> to be decided during the run time.</w:t>
+      </w:r>
+    </w:p>
+    <w:p>
+      <w:pPr>
+        <w:pStyle w:val="ListParagraph"/>
+        <w:numPr>
+          <w:ilvl w:val="0"/>
+          <w:numId w:val="18"/>
+        </w:numPr>
+        <w:rPr>
+          <w:color w:val="000000" w:themeColor="text1"/>
+          <w:sz w:val="22"/>
+          <w:szCs w:val="22"/>
+        </w:rPr>
+      </w:pPr>
+      <w:r>
+        <w:rPr>
+          <w:color w:val="000000" w:themeColor="text1"/>
+          <w:sz w:val="22"/>
+          <w:szCs w:val="22"/>
+        </w:rPr>
+        <w:t xml:space="preserve">Regular functions get their </w:t>
+      </w:r>
+      <w:proofErr w:type="gramStart"/>
+      <w:r>
+        <w:rPr>
+          <w:color w:val="000000" w:themeColor="text1"/>
+          <w:sz w:val="22"/>
+          <w:szCs w:val="22"/>
+        </w:rPr>
+        <w:t>own this</w:t>
+      </w:r>
+      <w:proofErr w:type="gramEnd"/>
+      <w:r>
+        <w:rPr>
+          <w:color w:val="000000" w:themeColor="text1"/>
+          <w:sz w:val="22"/>
+          <w:szCs w:val="22"/>
+        </w:rPr>
+        <w:t xml:space="preserve"> depending on how they are called. Arrow functions don't create their own this; they inherit this from the surrounding scope</w:t>
+      </w:r>
+      <w:r>
+        <w:rPr>
+          <w:color w:val="000000" w:themeColor="text1"/>
+          <w:sz w:val="22"/>
+          <w:szCs w:val="22"/>
+        </w:rPr>
+        <w:t>; which is usually the object they are inside.</w:t>
+      </w:r>
+    </w:p>
+    <w:p>
+      <w:pPr>
+        <w:pStyle w:val="ListParagraph"/>
+        <w:numPr>
+          <w:ilvl w:val="0"/>
+          <w:numId w:val="18"/>
+        </w:numPr>
+        <w:rPr>
+          <w:color w:val="000000" w:themeColor="text1"/>
+          <w:sz w:val="22"/>
+          <w:szCs w:val="22"/>
+        </w:rPr>
+      </w:pPr>
+      <w:proofErr w:type="gramStart"/>
+      <w:r>
+        <w:rPr>
+          <w:color w:val="000000" w:themeColor="text1"/>
+          <w:sz w:val="22"/>
+          <w:szCs w:val="22"/>
+        </w:rPr>
+        <w:t>.call</w:t>
+      </w:r>
+      <w:proofErr w:type="gramEnd"/>
+      <w:r>
+        <w:rPr>
+          <w:color w:val="000000" w:themeColor="text1"/>
+          <w:sz w:val="22"/>
+          <w:szCs w:val="22"/>
+        </w:rPr>
+        <w:t xml:space="preserve">() simply </w:t>
+      </w:r>
+      <w:proofErr w:type="gramStart"/>
+      <w:r>
+        <w:rPr>
+          <w:color w:val="000000" w:themeColor="text1"/>
+          <w:sz w:val="22"/>
+          <w:szCs w:val="22"/>
+        </w:rPr>
+        <w:t>means:</w:t>
+      </w:r>
+      <w:proofErr w:type="gramEnd"/>
+      <w:r>
+        <w:rPr>
+          <w:color w:val="000000" w:themeColor="text1"/>
+          <w:sz w:val="22"/>
+          <w:szCs w:val="22"/>
+        </w:rPr>
+        <w:t xml:space="preserve"> run this </w:t>
+      </w:r>
+      <w:proofErr w:type="gramStart"/>
+      <w:r>
+        <w:rPr>
+          <w:color w:val="000000" w:themeColor="text1"/>
+          <w:sz w:val="22"/>
+          <w:szCs w:val="22"/>
+        </w:rPr>
+        <w:t>function, but</w:t>
+      </w:r>
+      <w:proofErr w:type="gramEnd"/>
+      <w:r>
+        <w:rPr>
+          <w:color w:val="000000" w:themeColor="text1"/>
+          <w:sz w:val="22"/>
+          <w:szCs w:val="22"/>
+        </w:rPr>
+        <w:t xml:space="preserve"> choose what this is.</w:t>
+      </w:r>
+      <w:r>
+        <w:rPr>
+          <w:color w:val="000000" w:themeColor="text1"/>
+          <w:sz w:val="22"/>
+          <w:szCs w:val="22"/>
+        </w:rPr>
+        <w:t xml:space="preserve"> </w:t>
+      </w:r>
+      <w:proofErr w:type="gramStart"/>
+      <w:r>
+        <w:rPr>
+          <w:color w:val="000000" w:themeColor="text1"/>
+          <w:sz w:val="22"/>
+          <w:szCs w:val="22"/>
+        </w:rPr>
+        <w:t>So</w:t>
+      </w:r>
+      <w:proofErr w:type="gramEnd"/>
+      <w:r>
+        <w:rPr>
+          <w:color w:val="000000" w:themeColor="text1"/>
+          <w:sz w:val="22"/>
+          <w:szCs w:val="22"/>
+        </w:rPr>
+        <w:t xml:space="preserve"> it helps us </w:t>
+      </w:r>
+      <w:proofErr w:type="gramStart"/>
+      <w:r>
+        <w:rPr>
+          <w:color w:val="000000" w:themeColor="text1"/>
+          <w:sz w:val="22"/>
+          <w:szCs w:val="22"/>
+        </w:rPr>
+        <w:t>achieving</w:t>
+      </w:r>
+      <w:proofErr w:type="gramEnd"/>
+      <w:r>
+        <w:rPr>
+          <w:color w:val="000000" w:themeColor="text1"/>
+          <w:sz w:val="22"/>
+          <w:szCs w:val="22"/>
+        </w:rPr>
+        <w:t xml:space="preserve"> polymorphism, we choose which overridden function we want to use.</w:t>
+      </w:r>
+    </w:p>
+    <w:p>
+      <w:pPr>
+        <w:rPr>
+          <w:color w:val="000000" w:themeColor="text1"/>
+          <w:sz w:val="22"/>
+          <w:szCs w:val="22"/>
+        </w:rPr>
+      </w:pPr>
+    </w:p>
+    <w:p>
+      <w:pPr>
         <w:rPr>
           <w:color w:val="000000" w:themeColor="text1"/>
           <w:sz w:val="22"/>
@@ -10904,15 +11136,6 @@
     <w:p>
       <w:pPr>
         <w:rPr>
-          <w:color w:val="000000" w:themeColor="text1"/>
-          <w:sz w:val="22"/>
-          <w:szCs w:val="22"/>
-        </w:rPr>
-      </w:pPr>
-    </w:p>
-    <w:p>
-      <w:pPr>
-        <w:rPr>
           <w:b/>
           <w:bCs/>
           <w:color w:val="000000" w:themeColor="text1"/>
@@ -11658,6 +11881,7 @@
           <w:sz w:val="22"/>
           <w:szCs w:val="22"/>
         </w:rPr>
+        <w:lastRenderedPageBreak/>
         <w:t>A flaky test is a test that sometimes passes and sometimes fails even though you haven't changed the code.</w:t>
       </w:r>
     </w:p>
@@ -11853,7 +12077,6 @@
           <w:sz w:val="22"/>
           <w:szCs w:val="22"/>
         </w:rPr>
-        <w:lastRenderedPageBreak/>
         <w:t>callFake</w:t>
       </w:r>
       <w:proofErr w:type="spellEnd"/>
@@ -12616,6 +12839,690 @@
           <w:szCs w:val="22"/>
         </w:rPr>
       </w:pPr>
+    </w:p>
+    <w:p>
+      <w:pPr>
+        <w:rPr>
+          <w:b/>
+          <w:bCs/>
+          <w:color w:val="000000" w:themeColor="text1"/>
+          <w:u w:val="single"/>
+        </w:rPr>
+      </w:pPr>
+      <w:r>
+        <w:rPr>
+          <w:b/>
+          <w:bCs/>
+          <w:color w:val="000000" w:themeColor="text1"/>
+          <w:u w:val="single"/>
+        </w:rPr>
+        <w:lastRenderedPageBreak/>
+        <w:t>Intro to Backend:</w:t>
+      </w:r>
+    </w:p>
+    <w:p>
+      <w:pPr>
+        <w:pStyle w:val="ListParagraph"/>
+        <w:numPr>
+          <w:ilvl w:val="0"/>
+          <w:numId w:val="20"/>
+        </w:numPr>
+        <w:rPr>
+          <w:color w:val="000000" w:themeColor="text1"/>
+          <w:sz w:val="22"/>
+          <w:szCs w:val="22"/>
+        </w:rPr>
+      </w:pPr>
+      <w:r>
+        <w:rPr>
+          <w:color w:val="000000" w:themeColor="text1"/>
+          <w:sz w:val="22"/>
+          <w:szCs w:val="22"/>
+        </w:rPr>
+        <w:t xml:space="preserve">In a JavaScript context, </w:t>
+      </w:r>
+      <w:r>
+        <w:rPr>
+          <w:b/>
+          <w:bCs/>
+          <w:color w:val="000000" w:themeColor="text1"/>
+          <w:sz w:val="22"/>
+          <w:szCs w:val="22"/>
+        </w:rPr>
+        <w:t>backend</w:t>
+      </w:r>
+      <w:r>
+        <w:rPr>
+          <w:color w:val="000000" w:themeColor="text1"/>
+          <w:sz w:val="22"/>
+          <w:szCs w:val="22"/>
+        </w:rPr>
+        <w:t xml:space="preserve"> means the part of an application that runs </w:t>
+      </w:r>
+      <w:r>
+        <w:rPr>
+          <w:b/>
+          <w:bCs/>
+          <w:color w:val="000000" w:themeColor="text1"/>
+          <w:sz w:val="22"/>
+          <w:szCs w:val="22"/>
+        </w:rPr>
+        <w:t>on a server</w:t>
+      </w:r>
+      <w:r>
+        <w:rPr>
+          <w:color w:val="000000" w:themeColor="text1"/>
+          <w:sz w:val="22"/>
+          <w:szCs w:val="22"/>
+        </w:rPr>
+        <w:t>, not in the user's browser</w:t>
+      </w:r>
+      <w:r>
+        <w:rPr>
+          <w:color w:val="000000" w:themeColor="text1"/>
+          <w:sz w:val="22"/>
+          <w:szCs w:val="22"/>
+        </w:rPr>
+        <w:t>. Includes, database, authentication, business logic and so on.</w:t>
+      </w:r>
+    </w:p>
+    <w:p>
+      <w:pPr>
+        <w:pStyle w:val="ListParagraph"/>
+        <w:numPr>
+          <w:ilvl w:val="0"/>
+          <w:numId w:val="20"/>
+        </w:numPr>
+        <w:rPr>
+          <w:color w:val="000000" w:themeColor="text1"/>
+          <w:sz w:val="22"/>
+          <w:szCs w:val="22"/>
+        </w:rPr>
+      </w:pPr>
+      <w:r>
+        <w:rPr>
+          <w:color w:val="000000" w:themeColor="text1"/>
+          <w:sz w:val="22"/>
+          <w:szCs w:val="22"/>
+        </w:rPr>
+        <w:t xml:space="preserve">new </w:t>
+      </w:r>
+      <w:proofErr w:type="spellStart"/>
+      <w:proofErr w:type="gramStart"/>
+      <w:r>
+        <w:rPr>
+          <w:color w:val="000000" w:themeColor="text1"/>
+          <w:sz w:val="22"/>
+          <w:szCs w:val="22"/>
+        </w:rPr>
+        <w:t>XMLHttpRequest</w:t>
+      </w:r>
+      <w:proofErr w:type="spellEnd"/>
+      <w:r>
+        <w:rPr>
+          <w:color w:val="000000" w:themeColor="text1"/>
+          <w:sz w:val="22"/>
+          <w:szCs w:val="22"/>
+        </w:rPr>
+        <w:t>(</w:t>
+      </w:r>
+      <w:proofErr w:type="gramEnd"/>
+      <w:r>
+        <w:rPr>
+          <w:color w:val="000000" w:themeColor="text1"/>
+          <w:sz w:val="22"/>
+          <w:szCs w:val="22"/>
+        </w:rPr>
+        <w:t>) creates an object that JavaScript can use to send a request to a server and receive data back.</w:t>
+      </w:r>
+    </w:p>
+    <w:p>
+      <w:pPr>
+        <w:pStyle w:val="ListParagraph"/>
+        <w:numPr>
+          <w:ilvl w:val="0"/>
+          <w:numId w:val="20"/>
+        </w:numPr>
+        <w:rPr>
+          <w:color w:val="000000" w:themeColor="text1"/>
+          <w:sz w:val="22"/>
+          <w:szCs w:val="22"/>
+        </w:rPr>
+      </w:pPr>
+      <w:proofErr w:type="gramStart"/>
+      <w:r>
+        <w:rPr>
+          <w:color w:val="000000" w:themeColor="text1"/>
+          <w:sz w:val="22"/>
+          <w:szCs w:val="22"/>
+        </w:rPr>
+        <w:t>.open</w:t>
+      </w:r>
+      <w:proofErr w:type="gramEnd"/>
+      <w:r>
+        <w:rPr>
+          <w:color w:val="000000" w:themeColor="text1"/>
+          <w:sz w:val="22"/>
+          <w:szCs w:val="22"/>
+        </w:rPr>
+        <w:t>() takes two main parameters</w:t>
+      </w:r>
+      <w:r>
+        <w:rPr>
+          <w:color w:val="000000" w:themeColor="text1"/>
+          <w:sz w:val="22"/>
+          <w:szCs w:val="22"/>
+        </w:rPr>
+        <w:t xml:space="preserve">, the first one is the HTTP method, and the other one is the URL of the resource we want to access. </w:t>
+      </w:r>
+      <w:proofErr w:type="gramStart"/>
+      <w:r>
+        <w:rPr>
+          <w:color w:val="000000" w:themeColor="text1"/>
+          <w:sz w:val="22"/>
+          <w:szCs w:val="22"/>
+        </w:rPr>
+        <w:t>.open</w:t>
+      </w:r>
+      <w:proofErr w:type="gramEnd"/>
+      <w:r>
+        <w:rPr>
+          <w:color w:val="000000" w:themeColor="text1"/>
+          <w:sz w:val="22"/>
+          <w:szCs w:val="22"/>
+        </w:rPr>
+        <w:t>() is only to prepare for the HTTP request it does not even start a connection, it also does not have a return value</w:t>
+      </w:r>
+    </w:p>
+    <w:p>
+      <w:pPr>
+        <w:pStyle w:val="ListParagraph"/>
+        <w:numPr>
+          <w:ilvl w:val="0"/>
+          <w:numId w:val="20"/>
+        </w:numPr>
+        <w:rPr>
+          <w:color w:val="000000" w:themeColor="text1"/>
+          <w:sz w:val="22"/>
+          <w:szCs w:val="22"/>
+        </w:rPr>
+      </w:pPr>
+      <w:proofErr w:type="gramStart"/>
+      <w:r>
+        <w:rPr>
+          <w:color w:val="000000" w:themeColor="text1"/>
+          <w:sz w:val="22"/>
+          <w:szCs w:val="22"/>
+        </w:rPr>
+        <w:t>.send</w:t>
+      </w:r>
+      <w:proofErr w:type="gramEnd"/>
+      <w:r>
+        <w:rPr>
+          <w:color w:val="000000" w:themeColor="text1"/>
+          <w:sz w:val="22"/>
+          <w:szCs w:val="22"/>
+        </w:rPr>
+        <w:t>() is where actually the magic happens, it sends the request to the server, uses the established connection or establishes a new one, provides the request body If needed</w:t>
+      </w:r>
+    </w:p>
+    <w:p>
+      <w:pPr>
+        <w:pStyle w:val="ListParagraph"/>
+        <w:rPr>
+          <w:color w:val="000000" w:themeColor="text1"/>
+          <w:sz w:val="22"/>
+          <w:szCs w:val="22"/>
+        </w:rPr>
+      </w:pPr>
+      <w:proofErr w:type="spellStart"/>
+      <w:proofErr w:type="gramStart"/>
+      <w:r>
+        <w:rPr>
+          <w:color w:val="000000" w:themeColor="text1"/>
+          <w:sz w:val="22"/>
+          <w:szCs w:val="22"/>
+        </w:rPr>
+        <w:t>request.send</w:t>
+      </w:r>
+      <w:proofErr w:type="spellEnd"/>
+      <w:proofErr w:type="gramEnd"/>
+      <w:r>
+        <w:rPr>
+          <w:color w:val="000000" w:themeColor="text1"/>
+          <w:sz w:val="22"/>
+          <w:szCs w:val="22"/>
+        </w:rPr>
+        <w:t>(</w:t>
+      </w:r>
+      <w:proofErr w:type="spellStart"/>
+      <w:r>
+        <w:rPr>
+          <w:color w:val="000000" w:themeColor="text1"/>
+          <w:sz w:val="22"/>
+          <w:szCs w:val="22"/>
+        </w:rPr>
+        <w:t>JSON.stringify</w:t>
+      </w:r>
+      <w:proofErr w:type="spellEnd"/>
+      <w:proofErr w:type="gramStart"/>
+      <w:r>
+        <w:rPr>
+          <w:color w:val="000000" w:themeColor="text1"/>
+          <w:sz w:val="22"/>
+          <w:szCs w:val="22"/>
+        </w:rPr>
+        <w:t>({ name</w:t>
+      </w:r>
+      <w:proofErr w:type="gramEnd"/>
+      <w:r>
+        <w:rPr>
+          <w:color w:val="000000" w:themeColor="text1"/>
+          <w:sz w:val="22"/>
+          <w:szCs w:val="22"/>
+        </w:rPr>
+        <w:t>: "John", email: "john@example.com</w:t>
+      </w:r>
+      <w:proofErr w:type="gramStart"/>
+      <w:r>
+        <w:rPr>
+          <w:color w:val="000000" w:themeColor="text1"/>
+          <w:sz w:val="22"/>
+          <w:szCs w:val="22"/>
+        </w:rPr>
+        <w:t>" }</w:t>
+      </w:r>
+      <w:proofErr w:type="gramEnd"/>
+      <w:r>
+        <w:rPr>
+          <w:color w:val="000000" w:themeColor="text1"/>
+          <w:sz w:val="22"/>
+          <w:szCs w:val="22"/>
+        </w:rPr>
+        <w:t>));</w:t>
+      </w:r>
+    </w:p>
+    <w:p>
+      <w:pPr>
+        <w:pStyle w:val="ListParagraph"/>
+        <w:numPr>
+          <w:ilvl w:val="0"/>
+          <w:numId w:val="20"/>
+        </w:numPr>
+        <w:rPr>
+          <w:color w:val="000000" w:themeColor="text1"/>
+          <w:sz w:val="22"/>
+          <w:szCs w:val="22"/>
+        </w:rPr>
+      </w:pPr>
+      <w:proofErr w:type="gramStart"/>
+      <w:r>
+        <w:rPr>
+          <w:color w:val="000000" w:themeColor="text1"/>
+          <w:sz w:val="22"/>
+          <w:szCs w:val="22"/>
+        </w:rPr>
+        <w:t>.response</w:t>
+      </w:r>
+      <w:proofErr w:type="gramEnd"/>
+      <w:r>
+        <w:rPr>
+          <w:color w:val="000000" w:themeColor="text1"/>
+          <w:sz w:val="22"/>
+          <w:szCs w:val="22"/>
+        </w:rPr>
+        <w:t xml:space="preserve"> is a property that contains the data the server sent back after your request.</w:t>
+      </w:r>
+      <w:r>
+        <w:rPr>
+          <w:color w:val="000000" w:themeColor="text1"/>
+          <w:sz w:val="22"/>
+          <w:szCs w:val="22"/>
+        </w:rPr>
+        <w:t xml:space="preserve"> The response has only the response body. To get the status code for example we use </w:t>
+      </w:r>
+      <w:proofErr w:type="spellStart"/>
+      <w:proofErr w:type="gramStart"/>
+      <w:r>
+        <w:rPr>
+          <w:color w:val="000000" w:themeColor="text1"/>
+          <w:sz w:val="22"/>
+          <w:szCs w:val="22"/>
+        </w:rPr>
+        <w:t>request.status</w:t>
+      </w:r>
+      <w:proofErr w:type="spellEnd"/>
+      <w:proofErr w:type="gramEnd"/>
+    </w:p>
+    <w:p>
+      <w:pPr>
+        <w:pStyle w:val="ListParagraph"/>
+        <w:numPr>
+          <w:ilvl w:val="0"/>
+          <w:numId w:val="20"/>
+        </w:numPr>
+        <w:rPr>
+          <w:color w:val="000000" w:themeColor="text1"/>
+          <w:sz w:val="22"/>
+          <w:szCs w:val="22"/>
+        </w:rPr>
+      </w:pPr>
+      <w:r>
+        <w:rPr>
+          <w:color w:val="000000" w:themeColor="text1"/>
+          <w:sz w:val="22"/>
+          <w:szCs w:val="22"/>
+        </w:rPr>
+        <w:t xml:space="preserve">Data format that our server can </w:t>
+      </w:r>
+      <w:proofErr w:type="gramStart"/>
+      <w:r>
+        <w:rPr>
+          <w:color w:val="000000" w:themeColor="text1"/>
+          <w:sz w:val="22"/>
+          <w:szCs w:val="22"/>
+        </w:rPr>
+        <w:t>receive</w:t>
+      </w:r>
+      <w:proofErr w:type="gramEnd"/>
+      <w:r>
+        <w:rPr>
+          <w:color w:val="000000" w:themeColor="text1"/>
+          <w:sz w:val="22"/>
+          <w:szCs w:val="22"/>
+        </w:rPr>
+        <w:t xml:space="preserve"> and we can use using our </w:t>
+      </w:r>
+      <w:proofErr w:type="spellStart"/>
+      <w:proofErr w:type="gramStart"/>
+      <w:r>
+        <w:rPr>
+          <w:color w:val="000000" w:themeColor="text1"/>
+          <w:sz w:val="22"/>
+          <w:szCs w:val="22"/>
+        </w:rPr>
+        <w:t>request.response</w:t>
+      </w:r>
+      <w:proofErr w:type="spellEnd"/>
+      <w:proofErr w:type="gramEnd"/>
+      <w:r>
+        <w:rPr>
+          <w:color w:val="000000" w:themeColor="text1"/>
+          <w:sz w:val="22"/>
+          <w:szCs w:val="22"/>
+        </w:rPr>
+        <w:t xml:space="preserve"> are: </w:t>
+      </w:r>
+      <w:proofErr w:type="gramStart"/>
+      <w:r>
+        <w:rPr>
+          <w:color w:val="000000" w:themeColor="text1"/>
+          <w:sz w:val="22"/>
+          <w:szCs w:val="22"/>
+        </w:rPr>
+        <w:t>  Plain</w:t>
+      </w:r>
+      <w:proofErr w:type="gramEnd"/>
+      <w:r>
+        <w:rPr>
+          <w:color w:val="000000" w:themeColor="text1"/>
+          <w:sz w:val="22"/>
+          <w:szCs w:val="22"/>
+        </w:rPr>
+        <w:t xml:space="preserve"> text → text/</w:t>
+      </w:r>
+      <w:proofErr w:type="gramStart"/>
+      <w:r>
+        <w:rPr>
+          <w:color w:val="000000" w:themeColor="text1"/>
+          <w:sz w:val="22"/>
+          <w:szCs w:val="22"/>
+        </w:rPr>
+        <w:t xml:space="preserve">plain </w:t>
+      </w:r>
+      <w:r>
+        <w:rPr>
+          <w:color w:val="000000" w:themeColor="text1"/>
+          <w:sz w:val="22"/>
+          <w:szCs w:val="22"/>
+        </w:rPr>
+        <w:t xml:space="preserve"> </w:t>
+      </w:r>
+      <w:r>
+        <w:rPr>
+          <w:color w:val="000000" w:themeColor="text1"/>
+          <w:sz w:val="22"/>
+          <w:szCs w:val="22"/>
+        </w:rPr>
+        <w:t>JSON</w:t>
+      </w:r>
+      <w:proofErr w:type="gramEnd"/>
+      <w:r>
+        <w:rPr>
+          <w:color w:val="000000" w:themeColor="text1"/>
+          <w:sz w:val="22"/>
+          <w:szCs w:val="22"/>
+        </w:rPr>
+        <w:t xml:space="preserve"> → application/</w:t>
+      </w:r>
+      <w:proofErr w:type="spellStart"/>
+      <w:r>
+        <w:rPr>
+          <w:color w:val="000000" w:themeColor="text1"/>
+          <w:sz w:val="22"/>
+          <w:szCs w:val="22"/>
+        </w:rPr>
+        <w:t>json</w:t>
+      </w:r>
+      <w:proofErr w:type="spellEnd"/>
+      <w:r>
+        <w:rPr>
+          <w:color w:val="000000" w:themeColor="text1"/>
+          <w:sz w:val="22"/>
+          <w:szCs w:val="22"/>
+        </w:rPr>
+        <w:t xml:space="preserve"> HTML → text/html XML → application/xml Images → image/</w:t>
+      </w:r>
+      <w:proofErr w:type="spellStart"/>
+      <w:r>
+        <w:rPr>
+          <w:color w:val="000000" w:themeColor="text1"/>
+          <w:sz w:val="22"/>
+          <w:szCs w:val="22"/>
+        </w:rPr>
+        <w:t>png</w:t>
+      </w:r>
+      <w:proofErr w:type="spellEnd"/>
+      <w:r>
+        <w:rPr>
+          <w:color w:val="000000" w:themeColor="text1"/>
+          <w:sz w:val="22"/>
+          <w:szCs w:val="22"/>
+        </w:rPr>
+        <w:t>, image/jpeg, image/</w:t>
+      </w:r>
+      <w:proofErr w:type="spellStart"/>
+      <w:r>
+        <w:rPr>
+          <w:color w:val="000000" w:themeColor="text1"/>
+          <w:sz w:val="22"/>
+          <w:szCs w:val="22"/>
+        </w:rPr>
+        <w:t>webp</w:t>
+      </w:r>
+      <w:proofErr w:type="spellEnd"/>
+      <w:r>
+        <w:rPr>
+          <w:color w:val="000000" w:themeColor="text1"/>
+          <w:sz w:val="22"/>
+          <w:szCs w:val="22"/>
+        </w:rPr>
+        <w:t>, etc. Audio → audio/mpeg, audio/</w:t>
+      </w:r>
+      <w:proofErr w:type="gramStart"/>
+      <w:r>
+        <w:rPr>
+          <w:color w:val="000000" w:themeColor="text1"/>
+          <w:sz w:val="22"/>
+          <w:szCs w:val="22"/>
+        </w:rPr>
+        <w:t>wav</w:t>
+      </w:r>
+      <w:proofErr w:type="gramEnd"/>
+      <w:r>
+        <w:rPr>
+          <w:color w:val="000000" w:themeColor="text1"/>
+          <w:sz w:val="22"/>
+          <w:szCs w:val="22"/>
+        </w:rPr>
+        <w:t>, etc. Video → video/mp4, etc. PDF → application/pdf CSV → text/csv Binary data/files → application/octet-stream JavaScript → text/</w:t>
+      </w:r>
+      <w:proofErr w:type="spellStart"/>
+      <w:r>
+        <w:rPr>
+          <w:color w:val="000000" w:themeColor="text1"/>
+          <w:sz w:val="22"/>
+          <w:szCs w:val="22"/>
+        </w:rPr>
+        <w:t>javascript</w:t>
+      </w:r>
+      <w:proofErr w:type="spellEnd"/>
+      <w:r>
+        <w:rPr>
+          <w:color w:val="000000" w:themeColor="text1"/>
+          <w:sz w:val="22"/>
+          <w:szCs w:val="22"/>
+        </w:rPr>
+        <w:t xml:space="preserve"> CSS → text/</w:t>
+      </w:r>
+      <w:proofErr w:type="spellStart"/>
+      <w:r>
+        <w:rPr>
+          <w:color w:val="000000" w:themeColor="text1"/>
+          <w:sz w:val="22"/>
+          <w:szCs w:val="22"/>
+        </w:rPr>
+        <w:t>css</w:t>
+      </w:r>
+      <w:proofErr w:type="spellEnd"/>
+    </w:p>
+    <w:p>
+      <w:pPr>
+        <w:pStyle w:val="ListParagraph"/>
+        <w:numPr>
+          <w:ilvl w:val="0"/>
+          <w:numId w:val="20"/>
+        </w:numPr>
+        <w:rPr>
+          <w:color w:val="000000" w:themeColor="text1"/>
+          <w:sz w:val="22"/>
+          <w:szCs w:val="22"/>
+        </w:rPr>
+      </w:pPr>
+      <w:r>
+        <w:rPr>
+          <w:color w:val="000000" w:themeColor="text1"/>
+          <w:sz w:val="22"/>
+          <w:szCs w:val="22"/>
+        </w:rPr>
+        <w:t xml:space="preserve">We can use </w:t>
+      </w:r>
+      <w:proofErr w:type="spellStart"/>
+      <w:proofErr w:type="gramStart"/>
+      <w:r>
+        <w:rPr>
+          <w:color w:val="000000" w:themeColor="text1"/>
+          <w:sz w:val="22"/>
+          <w:szCs w:val="22"/>
+        </w:rPr>
+        <w:t>request.addEventListenere</w:t>
+      </w:r>
+      <w:proofErr w:type="spellEnd"/>
+      <w:proofErr w:type="gramEnd"/>
+      <w:r>
+        <w:rPr>
+          <w:color w:val="000000" w:themeColor="text1"/>
+          <w:sz w:val="22"/>
+          <w:szCs w:val="22"/>
+        </w:rPr>
+        <w:t xml:space="preserve">(‘load’. () =&gt; {}) here we can wait for the request to load and this execute some </w:t>
+      </w:r>
+      <w:r>
+        <w:rPr>
+          <w:color w:val="000000" w:themeColor="text1"/>
+          <w:sz w:val="22"/>
+          <w:szCs w:val="22"/>
+        </w:rPr>
+        <w:t>function</w:t>
+      </w:r>
+    </w:p>
+    <w:p>
+      <w:pPr>
+        <w:pStyle w:val="ListParagraph"/>
+        <w:numPr>
+          <w:ilvl w:val="0"/>
+          <w:numId w:val="20"/>
+        </w:numPr>
+        <w:rPr>
+          <w:color w:val="000000" w:themeColor="text1"/>
+          <w:sz w:val="22"/>
+          <w:szCs w:val="22"/>
+        </w:rPr>
+      </w:pPr>
+      <w:r>
+        <w:rPr>
+          <w:color w:val="000000" w:themeColor="text1"/>
+          <w:sz w:val="22"/>
+          <w:szCs w:val="22"/>
+        </w:rPr>
+        <w:t xml:space="preserve">The request object which is const request = new </w:t>
+      </w:r>
+      <w:proofErr w:type="spellStart"/>
+      <w:proofErr w:type="gramStart"/>
+      <w:r>
+        <w:rPr>
+          <w:color w:val="000000" w:themeColor="text1"/>
+          <w:sz w:val="22"/>
+          <w:szCs w:val="22"/>
+        </w:rPr>
+        <w:t>XMLHttpRequest</w:t>
+      </w:r>
+      <w:proofErr w:type="spellEnd"/>
+      <w:r>
+        <w:rPr>
+          <w:color w:val="000000" w:themeColor="text1"/>
+          <w:sz w:val="22"/>
+          <w:szCs w:val="22"/>
+        </w:rPr>
+        <w:t>(</w:t>
+      </w:r>
+      <w:proofErr w:type="gramEnd"/>
+      <w:r>
+        <w:rPr>
+          <w:color w:val="000000" w:themeColor="text1"/>
+          <w:sz w:val="22"/>
+          <w:szCs w:val="22"/>
+        </w:rPr>
+        <w:t xml:space="preserve">) is async so when we wait for an event </w:t>
+      </w:r>
+      <w:proofErr w:type="gramStart"/>
+      <w:r>
+        <w:rPr>
+          <w:color w:val="000000" w:themeColor="text1"/>
+          <w:sz w:val="22"/>
+          <w:szCs w:val="22"/>
+        </w:rPr>
+        <w:t>its</w:t>
+      </w:r>
+      <w:proofErr w:type="gramEnd"/>
+      <w:r>
+        <w:rPr>
+          <w:color w:val="000000" w:themeColor="text1"/>
+          <w:sz w:val="22"/>
+          <w:szCs w:val="22"/>
+        </w:rPr>
+        <w:t xml:space="preserve"> not blocking since again from within its async</w:t>
+      </w:r>
     </w:p>
     <w:sectPr>
       <w:pgSz w:w="12240" w:h="15840"/>
@@ -14151,7 +15058,7 @@
   <w:abstractNum w:abstractNumId="13" w15:restartNumberingAfterBreak="0">
     <w:nsid w:val="6FCD6DB0"/>
     <w:multiLevelType w:val="hybridMultilevel"/>
-    <w:tmpl w:val="5F02461E"/>
+    <w:tmpl w:val="4B72B6AC"/>
     <w:lvl w:ilvl="0" w:tplc="04090001">
       <w:start w:val="1"/>
       <w:numFmt w:val="bullet"/>

</xml_diff>

<commit_message>
add error handling finished
</commit_message>
<xml_diff>
--- a/Javascript/Javascript basic notes.docx
+++ b/Javascript/Javascript basic notes.docx
@@ -16417,6 +16417,1673 @@
     </w:p>
     <w:p>
       <w:pPr>
+        <w:rPr>
+          <w:color w:val="000000" w:themeColor="text1"/>
+          <w:sz w:val="22"/>
+          <w:szCs w:val="22"/>
+        </w:rPr>
+      </w:pPr>
+    </w:p>
+    <w:p>
+      <w:pPr>
+        <w:rPr>
+          <w:b/>
+          <w:bCs/>
+          <w:color w:val="000000" w:themeColor="text1"/>
+          <w:u w:val="single"/>
+        </w:rPr>
+      </w:pPr>
+      <w:r>
+        <w:rPr>
+          <w:b/>
+          <w:bCs/>
+          <w:color w:val="000000" w:themeColor="text1"/>
+          <w:u w:val="single"/>
+        </w:rPr>
+        <w:t>Async/Await:</w:t>
+      </w:r>
+    </w:p>
+    <w:p>
+      <w:pPr>
+        <w:pStyle w:val="ListParagraph"/>
+        <w:numPr>
+          <w:ilvl w:val="0"/>
+          <w:numId w:val="24"/>
+        </w:numPr>
+        <w:rPr>
+          <w:color w:val="000000" w:themeColor="text1"/>
+          <w:sz w:val="22"/>
+          <w:szCs w:val="22"/>
+        </w:rPr>
+      </w:pPr>
+      <w:r>
+        <w:rPr>
+          <w:color w:val="000000" w:themeColor="text1"/>
+          <w:sz w:val="22"/>
+          <w:szCs w:val="22"/>
+        </w:rPr>
+        <w:t>async/await is one of the most important parts of modern JavaScript because it makes asynchronous code look and behave more like synchronous code.</w:t>
+      </w:r>
+    </w:p>
+    <w:p>
+      <w:pPr>
+        <w:pStyle w:val="ListParagraph"/>
+        <w:numPr>
+          <w:ilvl w:val="0"/>
+          <w:numId w:val="24"/>
+        </w:numPr>
+        <w:rPr>
+          <w:color w:val="000000" w:themeColor="text1"/>
+          <w:sz w:val="22"/>
+          <w:szCs w:val="22"/>
+        </w:rPr>
+      </w:pPr>
+      <w:r>
+        <w:rPr>
+          <w:color w:val="000000" w:themeColor="text1"/>
+          <w:sz w:val="22"/>
+          <w:szCs w:val="22"/>
+        </w:rPr>
+        <w:t>async/await is a nicer syntax for working with Promises.</w:t>
+      </w:r>
+    </w:p>
+    <w:p>
+      <w:pPr>
+        <w:pStyle w:val="ListParagraph"/>
+        <w:numPr>
+          <w:ilvl w:val="0"/>
+          <w:numId w:val="24"/>
+        </w:numPr>
+        <w:rPr>
+          <w:color w:val="000000" w:themeColor="text1"/>
+          <w:sz w:val="22"/>
+          <w:szCs w:val="22"/>
+        </w:rPr>
+      </w:pPr>
+      <w:r>
+        <w:rPr>
+          <w:color w:val="000000" w:themeColor="text1"/>
+          <w:sz w:val="22"/>
+          <w:szCs w:val="22"/>
+        </w:rPr>
+        <w:t xml:space="preserve">An async function always returns a promise and we can </w:t>
+      </w:r>
+      <w:proofErr w:type="gramStart"/>
+      <w:r>
+        <w:rPr>
+          <w:color w:val="000000" w:themeColor="text1"/>
+          <w:sz w:val="22"/>
+          <w:szCs w:val="22"/>
+        </w:rPr>
+        <w:t>use .then</w:t>
+      </w:r>
+      <w:proofErr w:type="gramEnd"/>
+      <w:r>
+        <w:rPr>
+          <w:color w:val="000000" w:themeColor="text1"/>
+          <w:sz w:val="22"/>
+          <w:szCs w:val="22"/>
+        </w:rPr>
+        <w:t xml:space="preserve">() on it. </w:t>
+      </w:r>
+      <w:r>
+        <w:rPr>
+          <w:color w:val="000000" w:themeColor="text1"/>
+          <w:sz w:val="22"/>
+          <w:szCs w:val="22"/>
+        </w:rPr>
+        <w:t xml:space="preserve">return inside an async function can be used as a value in the </w:t>
+      </w:r>
+      <w:proofErr w:type="gramStart"/>
+      <w:r>
+        <w:rPr>
+          <w:color w:val="000000" w:themeColor="text1"/>
+          <w:sz w:val="22"/>
+          <w:szCs w:val="22"/>
+        </w:rPr>
+        <w:t>then(</w:t>
+      </w:r>
+      <w:proofErr w:type="gramEnd"/>
+      <w:r>
+        <w:rPr>
+          <w:color w:val="000000" w:themeColor="text1"/>
+          <w:sz w:val="22"/>
+          <w:szCs w:val="22"/>
+        </w:rPr>
+        <w:t>)</w:t>
+      </w:r>
+      <w:r>
+        <w:rPr>
+          <w:color w:val="000000" w:themeColor="text1"/>
+          <w:sz w:val="22"/>
+          <w:szCs w:val="22"/>
+        </w:rPr>
+        <w:t>. The same way as if we are using resolve as a promise.</w:t>
+      </w:r>
+    </w:p>
+    <w:p>
+      <w:pPr>
+        <w:pStyle w:val="ListParagraph"/>
+        <w:numPr>
+          <w:ilvl w:val="0"/>
+          <w:numId w:val="24"/>
+        </w:numPr>
+        <w:rPr>
+          <w:color w:val="000000" w:themeColor="text1"/>
+          <w:sz w:val="22"/>
+          <w:szCs w:val="22"/>
+        </w:rPr>
+      </w:pPr>
+      <w:r>
+        <w:rPr>
+          <w:color w:val="000000" w:themeColor="text1"/>
+          <w:sz w:val="22"/>
+          <w:szCs w:val="22"/>
+        </w:rPr>
+        <w:t>await means: "wait for this Promise to finish, then give me its result."</w:t>
+      </w:r>
+      <w:r>
+        <w:rPr>
+          <w:color w:val="000000" w:themeColor="text1"/>
+          <w:sz w:val="22"/>
+          <w:szCs w:val="22"/>
+        </w:rPr>
+        <w:t xml:space="preserve"> Await does not return a promise.</w:t>
+      </w:r>
+    </w:p>
+    <w:p>
+      <w:pPr>
+        <w:pStyle w:val="ListParagraph"/>
+        <w:numPr>
+          <w:ilvl w:val="0"/>
+          <w:numId w:val="24"/>
+        </w:numPr>
+        <w:rPr>
+          <w:color w:val="000000" w:themeColor="text1"/>
+          <w:sz w:val="22"/>
+          <w:szCs w:val="22"/>
+        </w:rPr>
+      </w:pPr>
+      <w:r>
+        <w:rPr>
+          <w:color w:val="000000" w:themeColor="text1"/>
+          <w:sz w:val="22"/>
+          <w:szCs w:val="22"/>
+        </w:rPr>
+        <w:t>a</w:t>
+      </w:r>
+      <w:r>
+        <w:rPr>
+          <w:color w:val="000000" w:themeColor="text1"/>
+          <w:sz w:val="22"/>
+          <w:szCs w:val="22"/>
+        </w:rPr>
+        <w:t>wait is blocking inside the async function</w:t>
+      </w:r>
+      <w:r>
+        <w:rPr>
+          <w:color w:val="000000" w:themeColor="text1"/>
+          <w:sz w:val="22"/>
+          <w:szCs w:val="22"/>
+        </w:rPr>
+        <w:t xml:space="preserve">. </w:t>
+      </w:r>
+    </w:p>
+    <w:p>
+      <w:pPr>
+        <w:pStyle w:val="ListParagraph"/>
+        <w:numPr>
+          <w:ilvl w:val="0"/>
+          <w:numId w:val="24"/>
+        </w:numPr>
+        <w:rPr>
+          <w:color w:val="000000" w:themeColor="text1"/>
+          <w:sz w:val="22"/>
+          <w:szCs w:val="22"/>
+        </w:rPr>
+      </w:pPr>
+      <w:r>
+        <w:rPr>
+          <w:color w:val="000000" w:themeColor="text1"/>
+          <w:sz w:val="22"/>
+          <w:szCs w:val="22"/>
+        </w:rPr>
+        <w:lastRenderedPageBreak/>
+        <w:t>The return value of await is the resolved value of the Promise.</w:t>
+      </w:r>
+      <w:r>
+        <w:rPr>
+          <w:color w:val="000000" w:themeColor="text1"/>
+          <w:sz w:val="22"/>
+          <w:szCs w:val="22"/>
+        </w:rPr>
+        <w:t xml:space="preserve"> We </w:t>
+      </w:r>
+      <w:proofErr w:type="spellStart"/>
+      <w:proofErr w:type="gramStart"/>
+      <w:r>
+        <w:rPr>
+          <w:color w:val="000000" w:themeColor="text1"/>
+          <w:sz w:val="22"/>
+          <w:szCs w:val="22"/>
+        </w:rPr>
+        <w:t>cant</w:t>
+      </w:r>
+      <w:proofErr w:type="spellEnd"/>
+      <w:proofErr w:type="gramEnd"/>
+      <w:r>
+        <w:rPr>
+          <w:color w:val="000000" w:themeColor="text1"/>
+          <w:sz w:val="22"/>
+          <w:szCs w:val="22"/>
+        </w:rPr>
+        <w:t xml:space="preserve"> write </w:t>
+      </w:r>
+      <w:proofErr w:type="gramStart"/>
+      <w:r>
+        <w:rPr>
+          <w:color w:val="000000" w:themeColor="text1"/>
+          <w:sz w:val="22"/>
+          <w:szCs w:val="22"/>
+        </w:rPr>
+        <w:t>await</w:t>
+      </w:r>
+      <w:proofErr w:type="gramEnd"/>
+      <w:r>
+        <w:rPr>
+          <w:color w:val="000000" w:themeColor="text1"/>
+          <w:sz w:val="22"/>
+          <w:szCs w:val="22"/>
+        </w:rPr>
+        <w:t xml:space="preserve"> outside the async</w:t>
+      </w:r>
+    </w:p>
+    <w:p>
+      <w:pPr>
+        <w:pStyle w:val="ListParagraph"/>
+        <w:numPr>
+          <w:ilvl w:val="0"/>
+          <w:numId w:val="24"/>
+        </w:numPr>
+        <w:rPr>
+          <w:color w:val="000000" w:themeColor="text1"/>
+          <w:sz w:val="22"/>
+          <w:szCs w:val="22"/>
+        </w:rPr>
+      </w:pPr>
+      <w:r>
+        <w:rPr>
+          <w:color w:val="000000" w:themeColor="text1"/>
+          <w:sz w:val="22"/>
+          <w:szCs w:val="22"/>
+        </w:rPr>
+        <w:t xml:space="preserve">async function </w:t>
+      </w:r>
+      <w:proofErr w:type="gramStart"/>
+      <w:r>
+        <w:rPr>
+          <w:color w:val="000000" w:themeColor="text1"/>
+          <w:sz w:val="22"/>
+          <w:szCs w:val="22"/>
+        </w:rPr>
+        <w:t>main(</w:t>
+      </w:r>
+      <w:proofErr w:type="gramEnd"/>
+      <w:r>
+        <w:rPr>
+          <w:color w:val="000000" w:themeColor="text1"/>
+          <w:sz w:val="22"/>
+          <w:szCs w:val="22"/>
+        </w:rPr>
+        <w:t>) {</w:t>
+      </w:r>
+    </w:p>
+    <w:p>
+      <w:pPr>
+        <w:ind w:left="720"/>
+        <w:rPr>
+          <w:color w:val="000000" w:themeColor="text1"/>
+          <w:sz w:val="22"/>
+          <w:szCs w:val="22"/>
+        </w:rPr>
+      </w:pPr>
+      <w:r>
+        <w:rPr>
+          <w:color w:val="000000" w:themeColor="text1"/>
+          <w:sz w:val="22"/>
+          <w:szCs w:val="22"/>
+        </w:rPr>
+        <w:t xml:space="preserve">  try {</w:t>
+      </w:r>
+    </w:p>
+    <w:p>
+      <w:pPr>
+        <w:ind w:left="720"/>
+        <w:rPr>
+          <w:color w:val="000000" w:themeColor="text1"/>
+          <w:sz w:val="22"/>
+          <w:szCs w:val="22"/>
+        </w:rPr>
+      </w:pPr>
+      <w:r>
+        <w:rPr>
+          <w:color w:val="000000" w:themeColor="text1"/>
+          <w:sz w:val="22"/>
+          <w:szCs w:val="22"/>
+        </w:rPr>
+        <w:t xml:space="preserve">    const user = await </w:t>
+      </w:r>
+      <w:proofErr w:type="spellStart"/>
+      <w:proofErr w:type="gramStart"/>
+      <w:r>
+        <w:rPr>
+          <w:color w:val="000000" w:themeColor="text1"/>
+          <w:sz w:val="22"/>
+          <w:szCs w:val="22"/>
+        </w:rPr>
+        <w:t>getUser</w:t>
+      </w:r>
+      <w:proofErr w:type="spellEnd"/>
+      <w:r>
+        <w:rPr>
+          <w:color w:val="000000" w:themeColor="text1"/>
+          <w:sz w:val="22"/>
+          <w:szCs w:val="22"/>
+        </w:rPr>
+        <w:t>(</w:t>
+      </w:r>
+      <w:proofErr w:type="gramEnd"/>
+      <w:r>
+        <w:rPr>
+          <w:color w:val="000000" w:themeColor="text1"/>
+          <w:sz w:val="22"/>
+          <w:szCs w:val="22"/>
+        </w:rPr>
+        <w:t>);</w:t>
+      </w:r>
+    </w:p>
+    <w:p>
+      <w:pPr>
+        <w:ind w:left="720"/>
+        <w:rPr>
+          <w:color w:val="000000" w:themeColor="text1"/>
+          <w:sz w:val="22"/>
+          <w:szCs w:val="22"/>
+        </w:rPr>
+      </w:pPr>
+    </w:p>
+    <w:p>
+      <w:pPr>
+        <w:ind w:left="720"/>
+        <w:rPr>
+          <w:color w:val="000000" w:themeColor="text1"/>
+          <w:sz w:val="22"/>
+          <w:szCs w:val="22"/>
+        </w:rPr>
+      </w:pPr>
+      <w:r>
+        <w:rPr>
+          <w:color w:val="000000" w:themeColor="text1"/>
+          <w:sz w:val="22"/>
+          <w:szCs w:val="22"/>
+        </w:rPr>
+        <w:t xml:space="preserve">    console.log(user);</w:t>
+      </w:r>
+    </w:p>
+    <w:p>
+      <w:pPr>
+        <w:ind w:left="720"/>
+        <w:rPr>
+          <w:color w:val="000000" w:themeColor="text1"/>
+          <w:sz w:val="22"/>
+          <w:szCs w:val="22"/>
+        </w:rPr>
+      </w:pPr>
+      <w:r>
+        <w:rPr>
+          <w:color w:val="000000" w:themeColor="text1"/>
+          <w:sz w:val="22"/>
+          <w:szCs w:val="22"/>
+        </w:rPr>
+        <w:t xml:space="preserve">  } catch (</w:t>
+      </w:r>
+      <w:proofErr w:type="gramStart"/>
+      <w:r>
+        <w:rPr>
+          <w:color w:val="000000" w:themeColor="text1"/>
+          <w:sz w:val="22"/>
+          <w:szCs w:val="22"/>
+        </w:rPr>
+        <w:t>error) {</w:t>
+      </w:r>
+      <w:proofErr w:type="gramEnd"/>
+    </w:p>
+    <w:p>
+      <w:pPr>
+        <w:ind w:left="720"/>
+        <w:rPr>
+          <w:color w:val="000000" w:themeColor="text1"/>
+          <w:sz w:val="22"/>
+          <w:szCs w:val="22"/>
+        </w:rPr>
+      </w:pPr>
+      <w:r>
+        <w:rPr>
+          <w:color w:val="000000" w:themeColor="text1"/>
+          <w:sz w:val="22"/>
+          <w:szCs w:val="22"/>
+        </w:rPr>
+        <w:t xml:space="preserve">    </w:t>
+      </w:r>
+      <w:proofErr w:type="gramStart"/>
+      <w:r>
+        <w:rPr>
+          <w:color w:val="000000" w:themeColor="text1"/>
+          <w:sz w:val="22"/>
+          <w:szCs w:val="22"/>
+        </w:rPr>
+        <w:t>console.log(</w:t>
+      </w:r>
+      <w:proofErr w:type="gramEnd"/>
+      <w:r>
+        <w:rPr>
+          <w:color w:val="000000" w:themeColor="text1"/>
+          <w:sz w:val="22"/>
+          <w:szCs w:val="22"/>
+        </w:rPr>
+        <w:t>"Something went wrong:", error);</w:t>
+      </w:r>
+    </w:p>
+    <w:p>
+      <w:pPr>
+        <w:ind w:left="720"/>
+        <w:rPr>
+          <w:color w:val="000000" w:themeColor="text1"/>
+          <w:sz w:val="22"/>
+          <w:szCs w:val="22"/>
+        </w:rPr>
+      </w:pPr>
+      <w:r>
+        <w:rPr>
+          <w:color w:val="000000" w:themeColor="text1"/>
+          <w:sz w:val="22"/>
+          <w:szCs w:val="22"/>
+        </w:rPr>
+        <w:t xml:space="preserve">  }</w:t>
+      </w:r>
+    </w:p>
+    <w:p>
+      <w:pPr>
+        <w:ind w:left="720"/>
+        <w:rPr>
+          <w:color w:val="000000" w:themeColor="text1"/>
+          <w:sz w:val="22"/>
+          <w:szCs w:val="22"/>
+        </w:rPr>
+      </w:pPr>
+      <w:r>
+        <w:rPr>
+          <w:color w:val="000000" w:themeColor="text1"/>
+          <w:sz w:val="22"/>
+          <w:szCs w:val="22"/>
+        </w:rPr>
+        <w:t>}</w:t>
+      </w:r>
+    </w:p>
+    <w:p>
+      <w:pPr>
+        <w:pStyle w:val="ListParagraph"/>
+        <w:numPr>
+          <w:ilvl w:val="0"/>
+          <w:numId w:val="24"/>
+        </w:numPr>
+        <w:rPr>
+          <w:color w:val="000000" w:themeColor="text1"/>
+          <w:sz w:val="22"/>
+          <w:szCs w:val="22"/>
+        </w:rPr>
+      </w:pPr>
+      <w:proofErr w:type="gramStart"/>
+      <w:r>
+        <w:rPr>
+          <w:color w:val="000000" w:themeColor="text1"/>
+          <w:sz w:val="22"/>
+          <w:szCs w:val="22"/>
+        </w:rPr>
+        <w:t>the</w:t>
+      </w:r>
+      <w:proofErr w:type="gramEnd"/>
+      <w:r>
+        <w:rPr>
+          <w:color w:val="000000" w:themeColor="text1"/>
+          <w:sz w:val="22"/>
+          <w:szCs w:val="22"/>
+        </w:rPr>
+        <w:t xml:space="preserve"> value from the async or from the await can be stored into a variable and used </w:t>
+      </w:r>
+      <w:proofErr w:type="gramStart"/>
+      <w:r>
+        <w:rPr>
+          <w:color w:val="000000" w:themeColor="text1"/>
+          <w:sz w:val="22"/>
+          <w:szCs w:val="22"/>
+        </w:rPr>
+        <w:t>later on</w:t>
+      </w:r>
+      <w:proofErr w:type="gramEnd"/>
+      <w:r>
+        <w:rPr>
+          <w:color w:val="000000" w:themeColor="text1"/>
+          <w:sz w:val="22"/>
+          <w:szCs w:val="22"/>
+        </w:rPr>
+        <w:t>.</w:t>
+      </w:r>
+    </w:p>
+    <w:p>
+      <w:pPr>
+        <w:pStyle w:val="ListParagraph"/>
+        <w:numPr>
+          <w:ilvl w:val="0"/>
+          <w:numId w:val="24"/>
+        </w:numPr>
+        <w:rPr>
+          <w:color w:val="000000" w:themeColor="text1"/>
+          <w:sz w:val="22"/>
+          <w:szCs w:val="22"/>
+        </w:rPr>
+      </w:pPr>
+      <w:r>
+        <w:rPr>
+          <w:color w:val="000000" w:themeColor="text1"/>
+          <w:sz w:val="22"/>
+          <w:szCs w:val="22"/>
+        </w:rPr>
+        <w:t>await gives you the value that the Promise eventually resolves with.</w:t>
+      </w:r>
+    </w:p>
+    <w:p>
+      <w:pPr>
+        <w:pStyle w:val="ListParagraph"/>
+        <w:numPr>
+          <w:ilvl w:val="0"/>
+          <w:numId w:val="24"/>
+        </w:numPr>
+        <w:rPr>
+          <w:color w:val="000000" w:themeColor="text1"/>
+          <w:sz w:val="22"/>
+          <w:szCs w:val="22"/>
+        </w:rPr>
+      </w:pPr>
+      <w:r>
+        <w:rPr>
+          <w:color w:val="000000" w:themeColor="text1"/>
+          <w:sz w:val="22"/>
+          <w:szCs w:val="22"/>
+        </w:rPr>
+        <w:t>T</w:t>
+      </w:r>
+      <w:r>
+        <w:rPr>
+          <w:color w:val="000000" w:themeColor="text1"/>
+          <w:sz w:val="22"/>
+          <w:szCs w:val="22"/>
+        </w:rPr>
+        <w:t>he result from the await stored into a variable is the equivalent of using the result of the same constant from a promise</w:t>
+      </w:r>
+      <w:r>
+        <w:rPr>
+          <w:color w:val="000000" w:themeColor="text1"/>
+          <w:sz w:val="22"/>
+          <w:szCs w:val="22"/>
+        </w:rPr>
+        <w:t>.</w:t>
+      </w:r>
+    </w:p>
+    <w:p>
+      <w:pPr>
+        <w:rPr>
+          <w:b/>
+          <w:bCs/>
+          <w:color w:val="000000" w:themeColor="text1"/>
+          <w:u w:val="single"/>
+        </w:rPr>
+      </w:pPr>
+    </w:p>
+    <w:p>
+      <w:pPr>
+        <w:rPr>
+          <w:b/>
+          <w:bCs/>
+          <w:color w:val="000000" w:themeColor="text1"/>
+          <w:u w:val="single"/>
+        </w:rPr>
+      </w:pPr>
+      <w:r>
+        <w:rPr>
+          <w:b/>
+          <w:bCs/>
+          <w:color w:val="000000" w:themeColor="text1"/>
+          <w:u w:val="single"/>
+        </w:rPr>
+        <w:t>Error Handling:</w:t>
+      </w:r>
+    </w:p>
+    <w:p>
+      <w:pPr>
+        <w:pStyle w:val="ListParagraph"/>
+        <w:numPr>
+          <w:ilvl w:val="0"/>
+          <w:numId w:val="25"/>
+        </w:numPr>
+        <w:rPr>
+          <w:b/>
+          <w:bCs/>
+          <w:color w:val="000000" w:themeColor="text1"/>
+          <w:u w:val="single"/>
+        </w:rPr>
+      </w:pPr>
+      <w:r>
+        <w:rPr>
+          <w:color w:val="000000" w:themeColor="text1"/>
+          <w:sz w:val="22"/>
+          <w:szCs w:val="22"/>
+        </w:rPr>
+        <w:t xml:space="preserve">We use the same try {} </w:t>
+      </w:r>
+      <w:proofErr w:type="gramStart"/>
+      <w:r>
+        <w:rPr>
+          <w:color w:val="000000" w:themeColor="text1"/>
+          <w:sz w:val="22"/>
+          <w:szCs w:val="22"/>
+        </w:rPr>
+        <w:t>catch{</w:t>
+      </w:r>
+      <w:proofErr w:type="gramEnd"/>
+      <w:r>
+        <w:rPr>
+          <w:color w:val="000000" w:themeColor="text1"/>
+          <w:sz w:val="22"/>
+          <w:szCs w:val="22"/>
+        </w:rPr>
+        <w:t>} methods from java</w:t>
+      </w:r>
+    </w:p>
+    <w:p>
+      <w:pPr>
+        <w:ind w:left="720"/>
+        <w:rPr>
+          <w:color w:val="000000" w:themeColor="text1"/>
+          <w:sz w:val="22"/>
+          <w:szCs w:val="22"/>
+        </w:rPr>
+      </w:pPr>
+      <w:proofErr w:type="spellStart"/>
+      <w:proofErr w:type="gramStart"/>
+      <w:r>
+        <w:rPr>
+          <w:color w:val="000000" w:themeColor="text1"/>
+          <w:sz w:val="22"/>
+          <w:szCs w:val="22"/>
+        </w:rPr>
+        <w:t>window.onerror</w:t>
+      </w:r>
+      <w:proofErr w:type="spellEnd"/>
+      <w:proofErr w:type="gramEnd"/>
+      <w:r>
+        <w:rPr>
+          <w:color w:val="000000" w:themeColor="text1"/>
+          <w:sz w:val="22"/>
+          <w:szCs w:val="22"/>
+        </w:rPr>
+        <w:t xml:space="preserve"> = function (</w:t>
+      </w:r>
+      <w:proofErr w:type="gramStart"/>
+      <w:r>
+        <w:rPr>
+          <w:color w:val="000000" w:themeColor="text1"/>
+          <w:sz w:val="22"/>
+          <w:szCs w:val="22"/>
+        </w:rPr>
+        <w:t>message) {</w:t>
+      </w:r>
+      <w:proofErr w:type="gramEnd"/>
+    </w:p>
+    <w:p>
+      <w:pPr>
+        <w:ind w:left="720"/>
+        <w:rPr>
+          <w:color w:val="000000" w:themeColor="text1"/>
+          <w:sz w:val="22"/>
+          <w:szCs w:val="22"/>
+        </w:rPr>
+      </w:pPr>
+      <w:r>
+        <w:rPr>
+          <w:color w:val="000000" w:themeColor="text1"/>
+          <w:sz w:val="22"/>
+          <w:szCs w:val="22"/>
+        </w:rPr>
+        <w:t xml:space="preserve">  </w:t>
+      </w:r>
+      <w:proofErr w:type="gramStart"/>
+      <w:r>
+        <w:rPr>
+          <w:color w:val="000000" w:themeColor="text1"/>
+          <w:sz w:val="22"/>
+          <w:szCs w:val="22"/>
+        </w:rPr>
+        <w:t>console.log(</w:t>
+      </w:r>
+      <w:proofErr w:type="gramEnd"/>
+      <w:r>
+        <w:rPr>
+          <w:color w:val="000000" w:themeColor="text1"/>
+          <w:sz w:val="22"/>
+          <w:szCs w:val="22"/>
+        </w:rPr>
+        <w:t>"Error:", message);</w:t>
+      </w:r>
+    </w:p>
+    <w:p>
+      <w:pPr>
+        <w:ind w:left="720"/>
+        <w:rPr>
+          <w:color w:val="000000" w:themeColor="text1"/>
+          <w:sz w:val="22"/>
+          <w:szCs w:val="22"/>
+        </w:rPr>
+      </w:pPr>
+      <w:r>
+        <w:rPr>
+          <w:color w:val="000000" w:themeColor="text1"/>
+          <w:sz w:val="22"/>
+          <w:szCs w:val="22"/>
+        </w:rPr>
+        <w:t>};</w:t>
+      </w:r>
+    </w:p>
+    <w:p>
+      <w:pPr>
+        <w:ind w:left="720"/>
+        <w:rPr>
+          <w:color w:val="000000" w:themeColor="text1"/>
+          <w:sz w:val="22"/>
+          <w:szCs w:val="22"/>
+        </w:rPr>
+      </w:pPr>
+      <w:proofErr w:type="spellStart"/>
+      <w:proofErr w:type="gramStart"/>
+      <w:r>
+        <w:rPr>
+          <w:color w:val="000000" w:themeColor="text1"/>
+          <w:sz w:val="22"/>
+          <w:szCs w:val="22"/>
+        </w:rPr>
+        <w:t>doesNotExist</w:t>
+      </w:r>
+      <w:proofErr w:type="spellEnd"/>
+      <w:r>
+        <w:rPr>
+          <w:color w:val="000000" w:themeColor="text1"/>
+          <w:sz w:val="22"/>
+          <w:szCs w:val="22"/>
+        </w:rPr>
+        <w:t>(</w:t>
+      </w:r>
+      <w:proofErr w:type="gramEnd"/>
+      <w:r>
+        <w:rPr>
+          <w:color w:val="000000" w:themeColor="text1"/>
+          <w:sz w:val="22"/>
+          <w:szCs w:val="22"/>
+        </w:rPr>
+        <w:t>);</w:t>
+      </w:r>
+    </w:p>
+    <w:p>
+      <w:pPr>
+        <w:pStyle w:val="ListParagraph"/>
+        <w:numPr>
+          <w:ilvl w:val="0"/>
+          <w:numId w:val="25"/>
+        </w:numPr>
+        <w:rPr>
+          <w:color w:val="000000" w:themeColor="text1"/>
+          <w:sz w:val="22"/>
+          <w:szCs w:val="22"/>
+        </w:rPr>
+      </w:pPr>
+      <w:r>
+        <w:rPr>
+          <w:color w:val="000000" w:themeColor="text1"/>
+          <w:sz w:val="22"/>
+          <w:szCs w:val="22"/>
+        </w:rPr>
+        <w:t xml:space="preserve">We can also listen to error using the </w:t>
+      </w:r>
+      <w:proofErr w:type="spellStart"/>
+      <w:r>
+        <w:rPr>
+          <w:color w:val="000000" w:themeColor="text1"/>
+          <w:sz w:val="22"/>
+          <w:szCs w:val="22"/>
+        </w:rPr>
+        <w:t>evenlistner</w:t>
+      </w:r>
+      <w:proofErr w:type="spellEnd"/>
+      <w:r>
+        <w:rPr>
+          <w:color w:val="000000" w:themeColor="text1"/>
+          <w:sz w:val="22"/>
+          <w:szCs w:val="22"/>
+        </w:rPr>
+        <w:t xml:space="preserve">: </w:t>
+      </w:r>
+    </w:p>
+    <w:p>
+      <w:pPr>
+        <w:ind w:left="720"/>
+        <w:rPr>
+          <w:color w:val="000000" w:themeColor="text1"/>
+          <w:sz w:val="22"/>
+          <w:szCs w:val="22"/>
+        </w:rPr>
+      </w:pPr>
+      <w:proofErr w:type="spellStart"/>
+      <w:proofErr w:type="gramStart"/>
+      <w:r>
+        <w:rPr>
+          <w:color w:val="000000" w:themeColor="text1"/>
+          <w:sz w:val="22"/>
+          <w:szCs w:val="22"/>
+        </w:rPr>
+        <w:t>window.addEventListener</w:t>
+      </w:r>
+      <w:proofErr w:type="spellEnd"/>
+      <w:proofErr w:type="gramEnd"/>
+      <w:r>
+        <w:rPr>
+          <w:color w:val="000000" w:themeColor="text1"/>
+          <w:sz w:val="22"/>
+          <w:szCs w:val="22"/>
+        </w:rPr>
+        <w:t>("error", (event) =&gt; {</w:t>
+      </w:r>
+    </w:p>
+    <w:p>
+      <w:pPr>
+        <w:ind w:left="720"/>
+        <w:rPr>
+          <w:color w:val="000000" w:themeColor="text1"/>
+          <w:sz w:val="22"/>
+          <w:szCs w:val="22"/>
+        </w:rPr>
+      </w:pPr>
+      <w:r>
+        <w:rPr>
+          <w:color w:val="000000" w:themeColor="text1"/>
+          <w:sz w:val="22"/>
+          <w:szCs w:val="22"/>
+        </w:rPr>
+        <w:t xml:space="preserve">  </w:t>
+      </w:r>
+      <w:proofErr w:type="gramStart"/>
+      <w:r>
+        <w:rPr>
+          <w:color w:val="000000" w:themeColor="text1"/>
+          <w:sz w:val="22"/>
+          <w:szCs w:val="22"/>
+        </w:rPr>
+        <w:t>console.log(</w:t>
+      </w:r>
+      <w:proofErr w:type="gramEnd"/>
+      <w:r>
+        <w:rPr>
+          <w:color w:val="000000" w:themeColor="text1"/>
+          <w:sz w:val="22"/>
+          <w:szCs w:val="22"/>
+        </w:rPr>
+        <w:t>"Something went wrong!");</w:t>
+      </w:r>
+    </w:p>
+    <w:p>
+      <w:pPr>
+        <w:ind w:left="720"/>
+        <w:rPr>
+          <w:color w:val="000000" w:themeColor="text1"/>
+          <w:sz w:val="22"/>
+          <w:szCs w:val="22"/>
+        </w:rPr>
+      </w:pPr>
+      <w:r>
+        <w:rPr>
+          <w:color w:val="000000" w:themeColor="text1"/>
+          <w:sz w:val="22"/>
+          <w:szCs w:val="22"/>
+        </w:rPr>
+        <w:t xml:space="preserve">  console.log(</w:t>
+      </w:r>
+      <w:proofErr w:type="spellStart"/>
+      <w:proofErr w:type="gramStart"/>
+      <w:r>
+        <w:rPr>
+          <w:color w:val="000000" w:themeColor="text1"/>
+          <w:sz w:val="22"/>
+          <w:szCs w:val="22"/>
+        </w:rPr>
+        <w:t>event.error</w:t>
+      </w:r>
+      <w:proofErr w:type="spellEnd"/>
+      <w:proofErr w:type="gramEnd"/>
+      <w:r>
+        <w:rPr>
+          <w:color w:val="000000" w:themeColor="text1"/>
+          <w:sz w:val="22"/>
+          <w:szCs w:val="22"/>
+        </w:rPr>
+        <w:t>);</w:t>
+      </w:r>
+    </w:p>
+    <w:p>
+      <w:pPr>
+        <w:ind w:left="720"/>
+        <w:rPr>
+          <w:color w:val="000000" w:themeColor="text1"/>
+          <w:sz w:val="22"/>
+          <w:szCs w:val="22"/>
+        </w:rPr>
+      </w:pPr>
+      <w:r>
+        <w:rPr>
+          <w:color w:val="000000" w:themeColor="text1"/>
+          <w:sz w:val="22"/>
+          <w:szCs w:val="22"/>
+        </w:rPr>
+        <w:t>});</w:t>
+      </w:r>
+    </w:p>
+    <w:p>
+      <w:pPr>
+        <w:pStyle w:val="ListParagraph"/>
+        <w:numPr>
+          <w:ilvl w:val="0"/>
+          <w:numId w:val="25"/>
+        </w:numPr>
+        <w:rPr>
+          <w:color w:val="000000" w:themeColor="text1"/>
+          <w:sz w:val="22"/>
+          <w:szCs w:val="22"/>
+        </w:rPr>
+      </w:pPr>
+      <w:r>
+        <w:rPr>
+          <w:color w:val="000000" w:themeColor="text1"/>
+          <w:sz w:val="22"/>
+          <w:szCs w:val="22"/>
+        </w:rPr>
+        <w:t xml:space="preserve">The event listeners can listen </w:t>
+      </w:r>
+      <w:proofErr w:type="gramStart"/>
+      <w:r>
+        <w:rPr>
+          <w:color w:val="000000" w:themeColor="text1"/>
+          <w:sz w:val="22"/>
+          <w:szCs w:val="22"/>
+        </w:rPr>
+        <w:t>for</w:t>
+      </w:r>
+      <w:proofErr w:type="gramEnd"/>
+      <w:r>
+        <w:rPr>
+          <w:color w:val="000000" w:themeColor="text1"/>
+          <w:sz w:val="22"/>
+          <w:szCs w:val="22"/>
+        </w:rPr>
+        <w:t xml:space="preserve"> </w:t>
+      </w:r>
+      <w:proofErr w:type="gramStart"/>
+      <w:r>
+        <w:rPr>
+          <w:color w:val="000000" w:themeColor="text1"/>
+          <w:sz w:val="22"/>
+          <w:szCs w:val="22"/>
+        </w:rPr>
+        <w:t>error</w:t>
+      </w:r>
+      <w:proofErr w:type="gramEnd"/>
+      <w:r>
+        <w:rPr>
+          <w:color w:val="000000" w:themeColor="text1"/>
+          <w:sz w:val="22"/>
+          <w:szCs w:val="22"/>
+        </w:rPr>
+        <w:t xml:space="preserve"> in images, html, </w:t>
+      </w:r>
+      <w:proofErr w:type="spellStart"/>
+      <w:r>
+        <w:rPr>
+          <w:color w:val="000000" w:themeColor="text1"/>
+          <w:sz w:val="22"/>
+          <w:szCs w:val="22"/>
+        </w:rPr>
+        <w:t>css</w:t>
+      </w:r>
+      <w:proofErr w:type="spellEnd"/>
+      <w:r>
+        <w:rPr>
+          <w:color w:val="000000" w:themeColor="text1"/>
+          <w:sz w:val="22"/>
+          <w:szCs w:val="22"/>
+        </w:rPr>
+        <w:t xml:space="preserve"> or any data format</w:t>
+      </w:r>
+    </w:p>
+    <w:p>
+      <w:pPr>
+        <w:pStyle w:val="ListParagraph"/>
+        <w:numPr>
+          <w:ilvl w:val="0"/>
+          <w:numId w:val="25"/>
+        </w:numPr>
+        <w:rPr>
+          <w:color w:val="000000" w:themeColor="text1"/>
+          <w:sz w:val="22"/>
+          <w:szCs w:val="22"/>
+        </w:rPr>
+      </w:pPr>
+      <w:r>
+        <w:rPr>
+          <w:color w:val="000000" w:themeColor="text1"/>
+          <w:sz w:val="22"/>
+          <w:szCs w:val="22"/>
+        </w:rPr>
+        <w:t>When writing a try catch block, our code will skip the rest of the try ones it encounters an error</w:t>
+      </w:r>
+    </w:p>
+    <w:p>
+      <w:pPr>
+        <w:pStyle w:val="ListParagraph"/>
+        <w:numPr>
+          <w:ilvl w:val="0"/>
+          <w:numId w:val="25"/>
+        </w:numPr>
+        <w:rPr>
+          <w:color w:val="000000" w:themeColor="text1"/>
+          <w:sz w:val="22"/>
+          <w:szCs w:val="22"/>
+        </w:rPr>
+      </w:pPr>
+      <w:r>
+        <w:rPr>
+          <w:color w:val="000000" w:themeColor="text1"/>
+          <w:sz w:val="22"/>
+          <w:szCs w:val="22"/>
+        </w:rPr>
+        <w:lastRenderedPageBreak/>
+        <w:t xml:space="preserve">Use </w:t>
+      </w:r>
+      <w:proofErr w:type="gramStart"/>
+      <w:r>
+        <w:rPr>
+          <w:color w:val="000000" w:themeColor="text1"/>
+          <w:sz w:val="22"/>
+          <w:szCs w:val="22"/>
+        </w:rPr>
+        <w:t>try</w:t>
+      </w:r>
+      <w:proofErr w:type="gramEnd"/>
+      <w:r>
+        <w:rPr>
+          <w:color w:val="000000" w:themeColor="text1"/>
+          <w:sz w:val="22"/>
+          <w:szCs w:val="22"/>
+        </w:rPr>
+        <w:t>...catch when you know an operation might fail and you have a meaningful way to respond to that failure.</w:t>
+      </w:r>
+      <w:r>
+        <w:rPr>
+          <w:color w:val="000000" w:themeColor="text1"/>
+          <w:sz w:val="22"/>
+          <w:szCs w:val="22"/>
+        </w:rPr>
+        <w:t xml:space="preserve"> </w:t>
+      </w:r>
+      <w:proofErr w:type="gramStart"/>
+      <w:r>
+        <w:rPr>
+          <w:color w:val="000000" w:themeColor="text1"/>
+          <w:sz w:val="22"/>
+          <w:szCs w:val="22"/>
+        </w:rPr>
+        <w:t>So</w:t>
+      </w:r>
+      <w:proofErr w:type="gramEnd"/>
+      <w:r>
+        <w:rPr>
+          <w:color w:val="000000" w:themeColor="text1"/>
+          <w:sz w:val="22"/>
+          <w:szCs w:val="22"/>
+        </w:rPr>
+        <w:t xml:space="preserve"> in case we know a failure might </w:t>
+      </w:r>
+      <w:proofErr w:type="gramStart"/>
+      <w:r>
+        <w:rPr>
+          <w:color w:val="000000" w:themeColor="text1"/>
+          <w:sz w:val="22"/>
+          <w:szCs w:val="22"/>
+        </w:rPr>
+        <w:t>happen</w:t>
+      </w:r>
+      <w:proofErr w:type="gramEnd"/>
+      <w:r>
+        <w:rPr>
+          <w:color w:val="000000" w:themeColor="text1"/>
+          <w:sz w:val="22"/>
+          <w:szCs w:val="22"/>
+        </w:rPr>
+        <w:t xml:space="preserve"> but we don’t know yet how to handle it using, try catch is not recommended.</w:t>
+      </w:r>
+    </w:p>
+    <w:p>
+      <w:pPr>
+        <w:pStyle w:val="ListParagraph"/>
+        <w:numPr>
+          <w:ilvl w:val="0"/>
+          <w:numId w:val="25"/>
+        </w:numPr>
+        <w:rPr>
+          <w:color w:val="000000" w:themeColor="text1"/>
+          <w:sz w:val="22"/>
+          <w:szCs w:val="22"/>
+        </w:rPr>
+      </w:pPr>
+      <w:r>
+        <w:rPr>
+          <w:color w:val="000000" w:themeColor="text1"/>
+          <w:sz w:val="22"/>
+          <w:szCs w:val="22"/>
+        </w:rPr>
+        <w:t xml:space="preserve">function </w:t>
+      </w:r>
+      <w:proofErr w:type="spellStart"/>
+      <w:r>
+        <w:rPr>
+          <w:color w:val="000000" w:themeColor="text1"/>
+          <w:sz w:val="22"/>
+          <w:szCs w:val="22"/>
+        </w:rPr>
+        <w:t>createUser</w:t>
+      </w:r>
+      <w:proofErr w:type="spellEnd"/>
+      <w:r>
+        <w:rPr>
+          <w:color w:val="000000" w:themeColor="text1"/>
+          <w:sz w:val="22"/>
+          <w:szCs w:val="22"/>
+        </w:rPr>
+        <w:t>(</w:t>
+      </w:r>
+      <w:proofErr w:type="gramStart"/>
+      <w:r>
+        <w:rPr>
+          <w:color w:val="000000" w:themeColor="text1"/>
+          <w:sz w:val="22"/>
+          <w:szCs w:val="22"/>
+        </w:rPr>
+        <w:t>name) {</w:t>
+      </w:r>
+      <w:proofErr w:type="gramEnd"/>
+    </w:p>
+    <w:p>
+      <w:pPr>
+        <w:ind w:left="720"/>
+        <w:rPr>
+          <w:color w:val="000000" w:themeColor="text1"/>
+          <w:sz w:val="22"/>
+          <w:szCs w:val="22"/>
+        </w:rPr>
+      </w:pPr>
+      <w:r>
+        <w:rPr>
+          <w:color w:val="000000" w:themeColor="text1"/>
+          <w:sz w:val="22"/>
+          <w:szCs w:val="22"/>
+        </w:rPr>
+        <w:t xml:space="preserve">  if </w:t>
+      </w:r>
+      <w:proofErr w:type="gramStart"/>
+      <w:r>
+        <w:rPr>
+          <w:color w:val="000000" w:themeColor="text1"/>
+          <w:sz w:val="22"/>
+          <w:szCs w:val="22"/>
+        </w:rPr>
+        <w:t>(!name</w:t>
+      </w:r>
+      <w:proofErr w:type="gramEnd"/>
+      <w:r>
+        <w:rPr>
+          <w:color w:val="000000" w:themeColor="text1"/>
+          <w:sz w:val="22"/>
+          <w:szCs w:val="22"/>
+        </w:rPr>
+        <w:t>) {</w:t>
+      </w:r>
+    </w:p>
+    <w:p>
+      <w:pPr>
+        <w:ind w:left="720"/>
+        <w:rPr>
+          <w:color w:val="000000" w:themeColor="text1"/>
+          <w:sz w:val="22"/>
+          <w:szCs w:val="22"/>
+        </w:rPr>
+      </w:pPr>
+      <w:r>
+        <w:rPr>
+          <w:color w:val="000000" w:themeColor="text1"/>
+          <w:sz w:val="22"/>
+          <w:szCs w:val="22"/>
+        </w:rPr>
+        <w:t xml:space="preserve">    throw new </w:t>
+      </w:r>
+      <w:proofErr w:type="gramStart"/>
+      <w:r>
+        <w:rPr>
+          <w:color w:val="000000" w:themeColor="text1"/>
+          <w:sz w:val="22"/>
+          <w:szCs w:val="22"/>
+        </w:rPr>
+        <w:t>Error(</w:t>
+      </w:r>
+      <w:proofErr w:type="gramEnd"/>
+      <w:r>
+        <w:rPr>
+          <w:color w:val="000000" w:themeColor="text1"/>
+          <w:sz w:val="22"/>
+          <w:szCs w:val="22"/>
+        </w:rPr>
+        <w:t>"Name is required");</w:t>
+      </w:r>
+    </w:p>
+    <w:p>
+      <w:pPr>
+        <w:ind w:left="720"/>
+        <w:rPr>
+          <w:color w:val="000000" w:themeColor="text1"/>
+          <w:sz w:val="22"/>
+          <w:szCs w:val="22"/>
+        </w:rPr>
+      </w:pPr>
+      <w:r>
+        <w:rPr>
+          <w:color w:val="000000" w:themeColor="text1"/>
+          <w:sz w:val="22"/>
+          <w:szCs w:val="22"/>
+        </w:rPr>
+        <w:t xml:space="preserve">  }</w:t>
+      </w:r>
+    </w:p>
+    <w:p>
+      <w:pPr>
+        <w:ind w:left="720"/>
+        <w:rPr>
+          <w:color w:val="000000" w:themeColor="text1"/>
+          <w:sz w:val="22"/>
+          <w:szCs w:val="22"/>
+        </w:rPr>
+      </w:pPr>
+    </w:p>
+    <w:p>
+      <w:pPr>
+        <w:ind w:left="720"/>
+        <w:rPr>
+          <w:color w:val="000000" w:themeColor="text1"/>
+          <w:sz w:val="22"/>
+          <w:szCs w:val="22"/>
+        </w:rPr>
+      </w:pPr>
+      <w:r>
+        <w:rPr>
+          <w:color w:val="000000" w:themeColor="text1"/>
+          <w:sz w:val="22"/>
+          <w:szCs w:val="22"/>
+        </w:rPr>
+        <w:t xml:space="preserve">  </w:t>
+      </w:r>
+      <w:proofErr w:type="gramStart"/>
+      <w:r>
+        <w:rPr>
+          <w:color w:val="000000" w:themeColor="text1"/>
+          <w:sz w:val="22"/>
+          <w:szCs w:val="22"/>
+        </w:rPr>
+        <w:t>console.log(</w:t>
+      </w:r>
+      <w:proofErr w:type="gramEnd"/>
+      <w:r>
+        <w:rPr>
+          <w:color w:val="000000" w:themeColor="text1"/>
+          <w:sz w:val="22"/>
+          <w:szCs w:val="22"/>
+        </w:rPr>
+        <w:t>`Creating user: ${name}`);</w:t>
+      </w:r>
+    </w:p>
+    <w:p>
+      <w:pPr>
+        <w:ind w:left="720"/>
+        <w:rPr>
+          <w:color w:val="000000" w:themeColor="text1"/>
+          <w:sz w:val="22"/>
+          <w:szCs w:val="22"/>
+        </w:rPr>
+      </w:pPr>
+      <w:r>
+        <w:rPr>
+          <w:color w:val="000000" w:themeColor="text1"/>
+          <w:sz w:val="22"/>
+          <w:szCs w:val="22"/>
+        </w:rPr>
+        <w:t>}</w:t>
+      </w:r>
+    </w:p>
+    <w:p>
+      <w:pPr>
+        <w:ind w:left="720"/>
+        <w:rPr>
+          <w:color w:val="000000" w:themeColor="text1"/>
+          <w:sz w:val="22"/>
+          <w:szCs w:val="22"/>
+        </w:rPr>
+      </w:pPr>
+    </w:p>
+    <w:p>
+      <w:pPr>
+        <w:ind w:left="720"/>
+        <w:rPr>
+          <w:color w:val="000000" w:themeColor="text1"/>
+          <w:sz w:val="22"/>
+          <w:szCs w:val="22"/>
+        </w:rPr>
+      </w:pPr>
+      <w:proofErr w:type="spellStart"/>
+      <w:proofErr w:type="gramStart"/>
+      <w:r>
+        <w:rPr>
+          <w:color w:val="000000" w:themeColor="text1"/>
+          <w:sz w:val="22"/>
+          <w:szCs w:val="22"/>
+        </w:rPr>
+        <w:t>createUser</w:t>
+      </w:r>
+      <w:proofErr w:type="spellEnd"/>
+      <w:r>
+        <w:rPr>
+          <w:color w:val="000000" w:themeColor="text1"/>
+          <w:sz w:val="22"/>
+          <w:szCs w:val="22"/>
+        </w:rPr>
+        <w:t>(</w:t>
+      </w:r>
+      <w:proofErr w:type="gramEnd"/>
+      <w:r>
+        <w:rPr>
+          <w:color w:val="000000" w:themeColor="text1"/>
+          <w:sz w:val="22"/>
+          <w:szCs w:val="22"/>
+        </w:rPr>
+        <w:t>"");</w:t>
+      </w:r>
+    </w:p>
+    <w:p>
+      <w:pPr>
+        <w:pStyle w:val="ListParagraph"/>
+        <w:numPr>
+          <w:ilvl w:val="0"/>
+          <w:numId w:val="25"/>
+        </w:numPr>
+        <w:rPr>
+          <w:color w:val="000000" w:themeColor="text1"/>
+          <w:sz w:val="22"/>
+          <w:szCs w:val="22"/>
+        </w:rPr>
+      </w:pPr>
+      <w:r>
+        <w:rPr>
+          <w:color w:val="000000" w:themeColor="text1"/>
+          <w:sz w:val="22"/>
+          <w:szCs w:val="22"/>
+        </w:rPr>
+        <w:t xml:space="preserve">The URL Parameter can be called: </w:t>
+      </w:r>
+      <w:r>
+        <w:rPr>
+          <w:color w:val="000000" w:themeColor="text1"/>
+          <w:sz w:val="22"/>
+          <w:szCs w:val="22"/>
+        </w:rPr>
+        <w:t>it can be called as the where close for a data resource</w:t>
+      </w:r>
+    </w:p>
+    <w:p>
+      <w:pPr>
+        <w:pStyle w:val="ListParagraph"/>
+        <w:numPr>
+          <w:ilvl w:val="0"/>
+          <w:numId w:val="25"/>
+        </w:numPr>
+        <w:rPr>
+          <w:color w:val="000000" w:themeColor="text1"/>
+          <w:sz w:val="22"/>
+          <w:szCs w:val="22"/>
+        </w:rPr>
+      </w:pPr>
+      <w:r>
+        <w:rPr>
+          <w:color w:val="000000" w:themeColor="text1"/>
+          <w:sz w:val="22"/>
+          <w:szCs w:val="22"/>
+        </w:rPr>
+        <w:t>URL is a built-in JavaScript class that gives you useful properties and methods for working with URLs.</w:t>
+      </w:r>
+      <w:r>
+        <w:rPr>
+          <w:color w:val="000000" w:themeColor="text1"/>
+          <w:sz w:val="22"/>
+          <w:szCs w:val="22"/>
+        </w:rPr>
+        <w:t xml:space="preserve"> </w:t>
+      </w:r>
+    </w:p>
+    <w:p>
+      <w:pPr>
+        <w:pStyle w:val="ListParagraph"/>
+        <w:numPr>
+          <w:ilvl w:val="0"/>
+          <w:numId w:val="25"/>
+        </w:numPr>
+        <w:rPr>
+          <w:color w:val="000000" w:themeColor="text1"/>
+          <w:sz w:val="22"/>
+          <w:szCs w:val="22"/>
+        </w:rPr>
+      </w:pPr>
+      <w:r>
+        <w:rPr>
+          <w:color w:val="000000" w:themeColor="text1"/>
+          <w:sz w:val="22"/>
+          <w:szCs w:val="22"/>
+        </w:rPr>
+        <w:t>For example, it gives you things like:</w:t>
+      </w:r>
+    </w:p>
+    <w:p>
+      <w:pPr>
+        <w:ind w:left="720"/>
+        <w:rPr>
+          <w:color w:val="000000" w:themeColor="text1"/>
+          <w:sz w:val="22"/>
+          <w:szCs w:val="22"/>
+        </w:rPr>
+      </w:pPr>
+      <w:proofErr w:type="spellStart"/>
+      <w:proofErr w:type="gramStart"/>
+      <w:r>
+        <w:rPr>
+          <w:color w:val="000000" w:themeColor="text1"/>
+          <w:sz w:val="22"/>
+          <w:szCs w:val="22"/>
+        </w:rPr>
+        <w:t>url.hostname</w:t>
+      </w:r>
+      <w:proofErr w:type="spellEnd"/>
+      <w:proofErr w:type="gramEnd"/>
+      <w:r>
+        <w:rPr>
+          <w:color w:val="000000" w:themeColor="text1"/>
+          <w:sz w:val="22"/>
+          <w:szCs w:val="22"/>
+        </w:rPr>
+        <w:t xml:space="preserve"> → the domain </w:t>
+      </w:r>
+    </w:p>
+    <w:p>
+      <w:pPr>
+        <w:ind w:left="720"/>
+        <w:rPr>
+          <w:color w:val="000000" w:themeColor="text1"/>
+          <w:sz w:val="22"/>
+          <w:szCs w:val="22"/>
+        </w:rPr>
+      </w:pPr>
+      <w:proofErr w:type="spellStart"/>
+      <w:proofErr w:type="gramStart"/>
+      <w:r>
+        <w:rPr>
+          <w:color w:val="000000" w:themeColor="text1"/>
+          <w:sz w:val="22"/>
+          <w:szCs w:val="22"/>
+        </w:rPr>
+        <w:t>url.pathname</w:t>
+      </w:r>
+      <w:proofErr w:type="spellEnd"/>
+      <w:proofErr w:type="gramEnd"/>
+      <w:r>
+        <w:rPr>
+          <w:color w:val="000000" w:themeColor="text1"/>
+          <w:sz w:val="22"/>
+          <w:szCs w:val="22"/>
+        </w:rPr>
+        <w:t xml:space="preserve"> → the path </w:t>
+      </w:r>
+    </w:p>
+    <w:p>
+      <w:pPr>
+        <w:ind w:left="720"/>
+        <w:rPr>
+          <w:color w:val="000000" w:themeColor="text1"/>
+          <w:sz w:val="22"/>
+          <w:szCs w:val="22"/>
+        </w:rPr>
+      </w:pPr>
+      <w:proofErr w:type="spellStart"/>
+      <w:proofErr w:type="gramStart"/>
+      <w:r>
+        <w:rPr>
+          <w:color w:val="000000" w:themeColor="text1"/>
+          <w:sz w:val="22"/>
+          <w:szCs w:val="22"/>
+        </w:rPr>
+        <w:t>url.search</w:t>
+      </w:r>
+      <w:proofErr w:type="spellEnd"/>
+      <w:proofErr w:type="gramEnd"/>
+      <w:r>
+        <w:rPr>
+          <w:color w:val="000000" w:themeColor="text1"/>
+          <w:sz w:val="22"/>
+          <w:szCs w:val="22"/>
+        </w:rPr>
+        <w:t xml:space="preserve"> → the query string </w:t>
+      </w:r>
+    </w:p>
+    <w:p>
+      <w:pPr>
+        <w:ind w:left="720"/>
+        <w:rPr>
+          <w:color w:val="000000" w:themeColor="text1"/>
+          <w:sz w:val="22"/>
+          <w:szCs w:val="22"/>
+        </w:rPr>
+      </w:pPr>
+      <w:proofErr w:type="spellStart"/>
+      <w:proofErr w:type="gramStart"/>
+      <w:r>
+        <w:rPr>
+          <w:color w:val="000000" w:themeColor="text1"/>
+          <w:sz w:val="22"/>
+          <w:szCs w:val="22"/>
+        </w:rPr>
+        <w:t>url.hash</w:t>
+      </w:r>
+      <w:proofErr w:type="spellEnd"/>
+      <w:proofErr w:type="gramEnd"/>
+      <w:r>
+        <w:rPr>
+          <w:color w:val="000000" w:themeColor="text1"/>
+          <w:sz w:val="22"/>
+          <w:szCs w:val="22"/>
+        </w:rPr>
+        <w:t xml:space="preserve"> → the hash </w:t>
+      </w:r>
+    </w:p>
+    <w:p>
+      <w:pPr>
+        <w:ind w:left="720"/>
+        <w:rPr>
+          <w:color w:val="000000" w:themeColor="text1"/>
+          <w:sz w:val="22"/>
+          <w:szCs w:val="22"/>
+        </w:rPr>
+      </w:pPr>
+      <w:proofErr w:type="spellStart"/>
+      <w:proofErr w:type="gramStart"/>
+      <w:r>
+        <w:rPr>
+          <w:color w:val="000000" w:themeColor="text1"/>
+          <w:sz w:val="22"/>
+          <w:szCs w:val="22"/>
+        </w:rPr>
+        <w:t>url.searchParams</w:t>
+      </w:r>
+      <w:proofErr w:type="spellEnd"/>
+      <w:proofErr w:type="gramEnd"/>
+      <w:r>
+        <w:rPr>
+          <w:color w:val="000000" w:themeColor="text1"/>
+          <w:sz w:val="22"/>
+          <w:szCs w:val="22"/>
+        </w:rPr>
+        <w:t xml:space="preserve"> → tools for working with query parameters</w:t>
+      </w:r>
+    </w:p>
+    <w:p>
+      <w:pPr>
+        <w:pStyle w:val="ListParagraph"/>
+        <w:rPr>
+          <w:color w:val="000000" w:themeColor="text1"/>
+          <w:sz w:val="22"/>
+          <w:szCs w:val="22"/>
+        </w:rPr>
+      </w:pPr>
+    </w:p>
+    <w:p>
+      <w:pPr>
+        <w:pStyle w:val="ListParagraph"/>
         <w:rPr>
           <w:color w:val="000000" w:themeColor="text1"/>
           <w:sz w:val="22"/>
@@ -17956,6 +19623,119 @@
     </w:lvl>
   </w:abstractNum>
   <w:abstractNum w:abstractNumId="13" w15:restartNumberingAfterBreak="0">
+    <w:nsid w:val="5FD70259"/>
+    <w:multiLevelType w:val="hybridMultilevel"/>
+    <w:tmpl w:val="EC6C7E14"/>
+    <w:lvl w:ilvl="0" w:tplc="04090001">
+      <w:start w:val="1"/>
+      <w:numFmt w:val="bullet"/>
+      <w:lvlText w:val=""/>
+      <w:lvlJc w:val="left"/>
+      <w:pPr>
+        <w:ind w:left="720" w:hanging="360"/>
+      </w:pPr>
+      <w:rPr>
+        <w:rFonts w:ascii="Symbol" w:hAnsi="Symbol" w:hint="default"/>
+      </w:rPr>
+    </w:lvl>
+    <w:lvl w:ilvl="1" w:tplc="04090003" w:tentative="1">
+      <w:start w:val="1"/>
+      <w:numFmt w:val="bullet"/>
+      <w:lvlText w:val="o"/>
+      <w:lvlJc w:val="left"/>
+      <w:pPr>
+        <w:ind w:left="1440" w:hanging="360"/>
+      </w:pPr>
+      <w:rPr>
+        <w:rFonts w:ascii="Courier New" w:hAnsi="Courier New" w:cs="Courier New" w:hint="default"/>
+      </w:rPr>
+    </w:lvl>
+    <w:lvl w:ilvl="2" w:tplc="04090005" w:tentative="1">
+      <w:start w:val="1"/>
+      <w:numFmt w:val="bullet"/>
+      <w:lvlText w:val=""/>
+      <w:lvlJc w:val="left"/>
+      <w:pPr>
+        <w:ind w:left="2160" w:hanging="360"/>
+      </w:pPr>
+      <w:rPr>
+        <w:rFonts w:ascii="Wingdings" w:hAnsi="Wingdings" w:hint="default"/>
+      </w:rPr>
+    </w:lvl>
+    <w:lvl w:ilvl="3" w:tplc="04090001" w:tentative="1">
+      <w:start w:val="1"/>
+      <w:numFmt w:val="bullet"/>
+      <w:lvlText w:val=""/>
+      <w:lvlJc w:val="left"/>
+      <w:pPr>
+        <w:ind w:left="2880" w:hanging="360"/>
+      </w:pPr>
+      <w:rPr>
+        <w:rFonts w:ascii="Symbol" w:hAnsi="Symbol" w:hint="default"/>
+      </w:rPr>
+    </w:lvl>
+    <w:lvl w:ilvl="4" w:tplc="04090003" w:tentative="1">
+      <w:start w:val="1"/>
+      <w:numFmt w:val="bullet"/>
+      <w:lvlText w:val="o"/>
+      <w:lvlJc w:val="left"/>
+      <w:pPr>
+        <w:ind w:left="3600" w:hanging="360"/>
+      </w:pPr>
+      <w:rPr>
+        <w:rFonts w:ascii="Courier New" w:hAnsi="Courier New" w:cs="Courier New" w:hint="default"/>
+      </w:rPr>
+    </w:lvl>
+    <w:lvl w:ilvl="5" w:tplc="04090005" w:tentative="1">
+      <w:start w:val="1"/>
+      <w:numFmt w:val="bullet"/>
+      <w:lvlText w:val=""/>
+      <w:lvlJc w:val="left"/>
+      <w:pPr>
+        <w:ind w:left="4320" w:hanging="360"/>
+      </w:pPr>
+      <w:rPr>
+        <w:rFonts w:ascii="Wingdings" w:hAnsi="Wingdings" w:hint="default"/>
+      </w:rPr>
+    </w:lvl>
+    <w:lvl w:ilvl="6" w:tplc="04090001" w:tentative="1">
+      <w:start w:val="1"/>
+      <w:numFmt w:val="bullet"/>
+      <w:lvlText w:val=""/>
+      <w:lvlJc w:val="left"/>
+      <w:pPr>
+        <w:ind w:left="5040" w:hanging="360"/>
+      </w:pPr>
+      <w:rPr>
+        <w:rFonts w:ascii="Symbol" w:hAnsi="Symbol" w:hint="default"/>
+      </w:rPr>
+    </w:lvl>
+    <w:lvl w:ilvl="7" w:tplc="04090003" w:tentative="1">
+      <w:start w:val="1"/>
+      <w:numFmt w:val="bullet"/>
+      <w:lvlText w:val="o"/>
+      <w:lvlJc w:val="left"/>
+      <w:pPr>
+        <w:ind w:left="5760" w:hanging="360"/>
+      </w:pPr>
+      <w:rPr>
+        <w:rFonts w:ascii="Courier New" w:hAnsi="Courier New" w:cs="Courier New" w:hint="default"/>
+      </w:rPr>
+    </w:lvl>
+    <w:lvl w:ilvl="8" w:tplc="04090005" w:tentative="1">
+      <w:start w:val="1"/>
+      <w:numFmt w:val="bullet"/>
+      <w:lvlText w:val=""/>
+      <w:lvlJc w:val="left"/>
+      <w:pPr>
+        <w:ind w:left="6480" w:hanging="360"/>
+      </w:pPr>
+      <w:rPr>
+        <w:rFonts w:ascii="Wingdings" w:hAnsi="Wingdings" w:hint="default"/>
+      </w:rPr>
+    </w:lvl>
+  </w:abstractNum>
+  <w:abstractNum w:abstractNumId="14" w15:restartNumberingAfterBreak="0">
     <w:nsid w:val="62C452F9"/>
     <w:multiLevelType w:val="hybridMultilevel"/>
     <w:tmpl w:val="CAA478D8"/>
@@ -18068,7 +19848,156 @@
       </w:rPr>
     </w:lvl>
   </w:abstractNum>
-  <w:abstractNum w:abstractNumId="14" w15:restartNumberingAfterBreak="0">
+  <w:abstractNum w:abstractNumId="15" w15:restartNumberingAfterBreak="0">
+    <w:nsid w:val="652933D5"/>
+    <w:multiLevelType w:val="multilevel"/>
+    <w:tmpl w:val="84AA0E7C"/>
+    <w:lvl w:ilvl="0">
+      <w:start w:val="1"/>
+      <w:numFmt w:val="bullet"/>
+      <w:lvlText w:val=""/>
+      <w:lvlJc w:val="left"/>
+      <w:pPr>
+        <w:tabs>
+          <w:tab w:val="num" w:pos="720"/>
+        </w:tabs>
+        <w:ind w:left="720" w:hanging="360"/>
+      </w:pPr>
+      <w:rPr>
+        <w:rFonts w:ascii="Symbol" w:hAnsi="Symbol" w:hint="default"/>
+        <w:sz w:val="20"/>
+      </w:rPr>
+    </w:lvl>
+    <w:lvl w:ilvl="1" w:tentative="1">
+      <w:start w:val="1"/>
+      <w:numFmt w:val="bullet"/>
+      <w:lvlText w:val="o"/>
+      <w:lvlJc w:val="left"/>
+      <w:pPr>
+        <w:tabs>
+          <w:tab w:val="num" w:pos="1440"/>
+        </w:tabs>
+        <w:ind w:left="1440" w:hanging="360"/>
+      </w:pPr>
+      <w:rPr>
+        <w:rFonts w:ascii="Courier New" w:hAnsi="Courier New" w:hint="default"/>
+        <w:sz w:val="20"/>
+      </w:rPr>
+    </w:lvl>
+    <w:lvl w:ilvl="2" w:tentative="1">
+      <w:start w:val="1"/>
+      <w:numFmt w:val="bullet"/>
+      <w:lvlText w:val=""/>
+      <w:lvlJc w:val="left"/>
+      <w:pPr>
+        <w:tabs>
+          <w:tab w:val="num" w:pos="2160"/>
+        </w:tabs>
+        <w:ind w:left="2160" w:hanging="360"/>
+      </w:pPr>
+      <w:rPr>
+        <w:rFonts w:ascii="Wingdings" w:hAnsi="Wingdings" w:hint="default"/>
+        <w:sz w:val="20"/>
+      </w:rPr>
+    </w:lvl>
+    <w:lvl w:ilvl="3" w:tentative="1">
+      <w:start w:val="1"/>
+      <w:numFmt w:val="bullet"/>
+      <w:lvlText w:val=""/>
+      <w:lvlJc w:val="left"/>
+      <w:pPr>
+        <w:tabs>
+          <w:tab w:val="num" w:pos="2880"/>
+        </w:tabs>
+        <w:ind w:left="2880" w:hanging="360"/>
+      </w:pPr>
+      <w:rPr>
+        <w:rFonts w:ascii="Wingdings" w:hAnsi="Wingdings" w:hint="default"/>
+        <w:sz w:val="20"/>
+      </w:rPr>
+    </w:lvl>
+    <w:lvl w:ilvl="4" w:tentative="1">
+      <w:start w:val="1"/>
+      <w:numFmt w:val="bullet"/>
+      <w:lvlText w:val=""/>
+      <w:lvlJc w:val="left"/>
+      <w:pPr>
+        <w:tabs>
+          <w:tab w:val="num" w:pos="3600"/>
+        </w:tabs>
+        <w:ind w:left="3600" w:hanging="360"/>
+      </w:pPr>
+      <w:rPr>
+        <w:rFonts w:ascii="Wingdings" w:hAnsi="Wingdings" w:hint="default"/>
+        <w:sz w:val="20"/>
+      </w:rPr>
+    </w:lvl>
+    <w:lvl w:ilvl="5" w:tentative="1">
+      <w:start w:val="1"/>
+      <w:numFmt w:val="bullet"/>
+      <w:lvlText w:val=""/>
+      <w:lvlJc w:val="left"/>
+      <w:pPr>
+        <w:tabs>
+          <w:tab w:val="num" w:pos="4320"/>
+        </w:tabs>
+        <w:ind w:left="4320" w:hanging="360"/>
+      </w:pPr>
+      <w:rPr>
+        <w:rFonts w:ascii="Wingdings" w:hAnsi="Wingdings" w:hint="default"/>
+        <w:sz w:val="20"/>
+      </w:rPr>
+    </w:lvl>
+    <w:lvl w:ilvl="6" w:tentative="1">
+      <w:start w:val="1"/>
+      <w:numFmt w:val="bullet"/>
+      <w:lvlText w:val=""/>
+      <w:lvlJc w:val="left"/>
+      <w:pPr>
+        <w:tabs>
+          <w:tab w:val="num" w:pos="5040"/>
+        </w:tabs>
+        <w:ind w:left="5040" w:hanging="360"/>
+      </w:pPr>
+      <w:rPr>
+        <w:rFonts w:ascii="Wingdings" w:hAnsi="Wingdings" w:hint="default"/>
+        <w:sz w:val="20"/>
+      </w:rPr>
+    </w:lvl>
+    <w:lvl w:ilvl="7" w:tentative="1">
+      <w:start w:val="1"/>
+      <w:numFmt w:val="bullet"/>
+      <w:lvlText w:val=""/>
+      <w:lvlJc w:val="left"/>
+      <w:pPr>
+        <w:tabs>
+          <w:tab w:val="num" w:pos="5760"/>
+        </w:tabs>
+        <w:ind w:left="5760" w:hanging="360"/>
+      </w:pPr>
+      <w:rPr>
+        <w:rFonts w:ascii="Wingdings" w:hAnsi="Wingdings" w:hint="default"/>
+        <w:sz w:val="20"/>
+      </w:rPr>
+    </w:lvl>
+    <w:lvl w:ilvl="8" w:tentative="1">
+      <w:start w:val="1"/>
+      <w:numFmt w:val="bullet"/>
+      <w:lvlText w:val=""/>
+      <w:lvlJc w:val="left"/>
+      <w:pPr>
+        <w:tabs>
+          <w:tab w:val="num" w:pos="6480"/>
+        </w:tabs>
+        <w:ind w:left="6480" w:hanging="360"/>
+      </w:pPr>
+      <w:rPr>
+        <w:rFonts w:ascii="Wingdings" w:hAnsi="Wingdings" w:hint="default"/>
+        <w:sz w:val="20"/>
+      </w:rPr>
+    </w:lvl>
+  </w:abstractNum>
+  <w:abstractNum w:abstractNumId="16" w15:restartNumberingAfterBreak="0">
     <w:nsid w:val="6B753F92"/>
     <w:multiLevelType w:val="hybridMultilevel"/>
     <w:tmpl w:val="2AD4633C"/>
@@ -18181,7 +20110,7 @@
       </w:rPr>
     </w:lvl>
   </w:abstractNum>
-  <w:abstractNum w:abstractNumId="15" w15:restartNumberingAfterBreak="0">
+  <w:abstractNum w:abstractNumId="17" w15:restartNumberingAfterBreak="0">
     <w:nsid w:val="6BF4448B"/>
     <w:multiLevelType w:val="hybridMultilevel"/>
     <w:tmpl w:val="3A8A2742"/>
@@ -18294,7 +20223,7 @@
       </w:rPr>
     </w:lvl>
   </w:abstractNum>
-  <w:abstractNum w:abstractNumId="16" w15:restartNumberingAfterBreak="0">
+  <w:abstractNum w:abstractNumId="18" w15:restartNumberingAfterBreak="0">
     <w:nsid w:val="6FCD6DB0"/>
     <w:multiLevelType w:val="hybridMultilevel"/>
     <w:tmpl w:val="4B72B6AC"/>
@@ -18407,7 +20336,120 @@
       </w:rPr>
     </w:lvl>
   </w:abstractNum>
-  <w:abstractNum w:abstractNumId="17" w15:restartNumberingAfterBreak="0">
+  <w:abstractNum w:abstractNumId="19" w15:restartNumberingAfterBreak="0">
+    <w:nsid w:val="73863F13"/>
+    <w:multiLevelType w:val="hybridMultilevel"/>
+    <w:tmpl w:val="1146281C"/>
+    <w:lvl w:ilvl="0" w:tplc="04090001">
+      <w:start w:val="1"/>
+      <w:numFmt w:val="bullet"/>
+      <w:lvlText w:val=""/>
+      <w:lvlJc w:val="left"/>
+      <w:pPr>
+        <w:ind w:left="720" w:hanging="360"/>
+      </w:pPr>
+      <w:rPr>
+        <w:rFonts w:ascii="Symbol" w:hAnsi="Symbol" w:hint="default"/>
+      </w:rPr>
+    </w:lvl>
+    <w:lvl w:ilvl="1" w:tplc="04090003" w:tentative="1">
+      <w:start w:val="1"/>
+      <w:numFmt w:val="bullet"/>
+      <w:lvlText w:val="o"/>
+      <w:lvlJc w:val="left"/>
+      <w:pPr>
+        <w:ind w:left="1440" w:hanging="360"/>
+      </w:pPr>
+      <w:rPr>
+        <w:rFonts w:ascii="Courier New" w:hAnsi="Courier New" w:cs="Courier New" w:hint="default"/>
+      </w:rPr>
+    </w:lvl>
+    <w:lvl w:ilvl="2" w:tplc="04090005" w:tentative="1">
+      <w:start w:val="1"/>
+      <w:numFmt w:val="bullet"/>
+      <w:lvlText w:val=""/>
+      <w:lvlJc w:val="left"/>
+      <w:pPr>
+        <w:ind w:left="2160" w:hanging="360"/>
+      </w:pPr>
+      <w:rPr>
+        <w:rFonts w:ascii="Wingdings" w:hAnsi="Wingdings" w:hint="default"/>
+      </w:rPr>
+    </w:lvl>
+    <w:lvl w:ilvl="3" w:tplc="04090001" w:tentative="1">
+      <w:start w:val="1"/>
+      <w:numFmt w:val="bullet"/>
+      <w:lvlText w:val=""/>
+      <w:lvlJc w:val="left"/>
+      <w:pPr>
+        <w:ind w:left="2880" w:hanging="360"/>
+      </w:pPr>
+      <w:rPr>
+        <w:rFonts w:ascii="Symbol" w:hAnsi="Symbol" w:hint="default"/>
+      </w:rPr>
+    </w:lvl>
+    <w:lvl w:ilvl="4" w:tplc="04090003" w:tentative="1">
+      <w:start w:val="1"/>
+      <w:numFmt w:val="bullet"/>
+      <w:lvlText w:val="o"/>
+      <w:lvlJc w:val="left"/>
+      <w:pPr>
+        <w:ind w:left="3600" w:hanging="360"/>
+      </w:pPr>
+      <w:rPr>
+        <w:rFonts w:ascii="Courier New" w:hAnsi="Courier New" w:cs="Courier New" w:hint="default"/>
+      </w:rPr>
+    </w:lvl>
+    <w:lvl w:ilvl="5" w:tplc="04090005" w:tentative="1">
+      <w:start w:val="1"/>
+      <w:numFmt w:val="bullet"/>
+      <w:lvlText w:val=""/>
+      <w:lvlJc w:val="left"/>
+      <w:pPr>
+        <w:ind w:left="4320" w:hanging="360"/>
+      </w:pPr>
+      <w:rPr>
+        <w:rFonts w:ascii="Wingdings" w:hAnsi="Wingdings" w:hint="default"/>
+      </w:rPr>
+    </w:lvl>
+    <w:lvl w:ilvl="6" w:tplc="04090001" w:tentative="1">
+      <w:start w:val="1"/>
+      <w:numFmt w:val="bullet"/>
+      <w:lvlText w:val=""/>
+      <w:lvlJc w:val="left"/>
+      <w:pPr>
+        <w:ind w:left="5040" w:hanging="360"/>
+      </w:pPr>
+      <w:rPr>
+        <w:rFonts w:ascii="Symbol" w:hAnsi="Symbol" w:hint="default"/>
+      </w:rPr>
+    </w:lvl>
+    <w:lvl w:ilvl="7" w:tplc="04090003" w:tentative="1">
+      <w:start w:val="1"/>
+      <w:numFmt w:val="bullet"/>
+      <w:lvlText w:val="o"/>
+      <w:lvlJc w:val="left"/>
+      <w:pPr>
+        <w:ind w:left="5760" w:hanging="360"/>
+      </w:pPr>
+      <w:rPr>
+        <w:rFonts w:ascii="Courier New" w:hAnsi="Courier New" w:cs="Courier New" w:hint="default"/>
+      </w:rPr>
+    </w:lvl>
+    <w:lvl w:ilvl="8" w:tplc="04090005" w:tentative="1">
+      <w:start w:val="1"/>
+      <w:numFmt w:val="bullet"/>
+      <w:lvlText w:val=""/>
+      <w:lvlJc w:val="left"/>
+      <w:pPr>
+        <w:ind w:left="6480" w:hanging="360"/>
+      </w:pPr>
+      <w:rPr>
+        <w:rFonts w:ascii="Wingdings" w:hAnsi="Wingdings" w:hint="default"/>
+      </w:rPr>
+    </w:lvl>
+  </w:abstractNum>
+  <w:abstractNum w:abstractNumId="20" w15:restartNumberingAfterBreak="0">
     <w:nsid w:val="74605A05"/>
     <w:multiLevelType w:val="hybridMultilevel"/>
     <w:tmpl w:val="E346ABE0"/>
@@ -18520,7 +20562,7 @@
       </w:rPr>
     </w:lvl>
   </w:abstractNum>
-  <w:abstractNum w:abstractNumId="18" w15:restartNumberingAfterBreak="0">
+  <w:abstractNum w:abstractNumId="21" w15:restartNumberingAfterBreak="0">
     <w:nsid w:val="79CD0E53"/>
     <w:multiLevelType w:val="hybridMultilevel"/>
     <w:tmpl w:val="56742AC4"/>
@@ -18633,7 +20675,7 @@
       </w:rPr>
     </w:lvl>
   </w:abstractNum>
-  <w:abstractNum w:abstractNumId="19" w15:restartNumberingAfterBreak="0">
+  <w:abstractNum w:abstractNumId="22" w15:restartNumberingAfterBreak="0">
     <w:nsid w:val="7B792B0E"/>
     <w:multiLevelType w:val="hybridMultilevel"/>
     <w:tmpl w:val="C7E2C25C"/>
@@ -18746,7 +20788,7 @@
       </w:rPr>
     </w:lvl>
   </w:abstractNum>
-  <w:abstractNum w:abstractNumId="20" w15:restartNumberingAfterBreak="0">
+  <w:abstractNum w:abstractNumId="23" w15:restartNumberingAfterBreak="0">
     <w:nsid w:val="7C5352BD"/>
     <w:multiLevelType w:val="hybridMultilevel"/>
     <w:tmpl w:val="1E0E7DD8"/>
@@ -18859,7 +20901,7 @@
       </w:rPr>
     </w:lvl>
   </w:abstractNum>
-  <w:abstractNum w:abstractNumId="21" w15:restartNumberingAfterBreak="0">
+  <w:abstractNum w:abstractNumId="24" w15:restartNumberingAfterBreak="0">
     <w:nsid w:val="7CA817BC"/>
     <w:multiLevelType w:val="hybridMultilevel"/>
     <w:tmpl w:val="7C287A30"/>
@@ -18972,7 +21014,7 @@
       </w:rPr>
     </w:lvl>
   </w:abstractNum>
-  <w:abstractNum w:abstractNumId="22" w15:restartNumberingAfterBreak="0">
+  <w:abstractNum w:abstractNumId="25" w15:restartNumberingAfterBreak="0">
     <w:nsid w:val="7F72049C"/>
     <w:multiLevelType w:val="multilevel"/>
     <w:tmpl w:val="1F242F62"/>
@@ -19131,31 +21173,31 @@
     <w:abstractNumId w:val="2"/>
   </w:num>
   <w:num w:numId="4" w16cid:durableId="2085225567">
-    <w:abstractNumId w:val="15"/>
+    <w:abstractNumId w:val="17"/>
   </w:num>
   <w:num w:numId="5" w16cid:durableId="968363398">
     <w:abstractNumId w:val="0"/>
   </w:num>
   <w:num w:numId="6" w16cid:durableId="1448768395">
-    <w:abstractNumId w:val="18"/>
+    <w:abstractNumId w:val="21"/>
   </w:num>
   <w:num w:numId="7" w16cid:durableId="97333426">
-    <w:abstractNumId w:val="22"/>
+    <w:abstractNumId w:val="25"/>
   </w:num>
   <w:num w:numId="8" w16cid:durableId="2078238912">
-    <w:abstractNumId w:val="13"/>
+    <w:abstractNumId w:val="14"/>
   </w:num>
   <w:num w:numId="9" w16cid:durableId="1133792355">
     <w:abstractNumId w:val="8"/>
   </w:num>
   <w:num w:numId="10" w16cid:durableId="1949001774">
-    <w:abstractNumId w:val="17"/>
+    <w:abstractNumId w:val="20"/>
   </w:num>
   <w:num w:numId="11" w16cid:durableId="49500872">
-    <w:abstractNumId w:val="21"/>
+    <w:abstractNumId w:val="24"/>
   </w:num>
   <w:num w:numId="12" w16cid:durableId="1627009029">
-    <w:abstractNumId w:val="20"/>
+    <w:abstractNumId w:val="23"/>
   </w:num>
   <w:num w:numId="13" w16cid:durableId="2035300943">
     <w:abstractNumId w:val="6"/>
@@ -19164,13 +21206,13 @@
     <w:abstractNumId w:val="1"/>
   </w:num>
   <w:num w:numId="15" w16cid:durableId="1146630300">
-    <w:abstractNumId w:val="19"/>
+    <w:abstractNumId w:val="22"/>
   </w:num>
   <w:num w:numId="16" w16cid:durableId="1096558111">
     <w:abstractNumId w:val="7"/>
   </w:num>
   <w:num w:numId="17" w16cid:durableId="41566618">
-    <w:abstractNumId w:val="14"/>
+    <w:abstractNumId w:val="16"/>
   </w:num>
   <w:num w:numId="18" w16cid:durableId="366835154">
     <w:abstractNumId w:val="11"/>
@@ -19179,7 +21221,7 @@
     <w:abstractNumId w:val="4"/>
   </w:num>
   <w:num w:numId="20" w16cid:durableId="708997360">
-    <w:abstractNumId w:val="16"/>
+    <w:abstractNumId w:val="18"/>
   </w:num>
   <w:num w:numId="21" w16cid:durableId="522406567">
     <w:abstractNumId w:val="5"/>
@@ -19189,6 +21231,15 @@
   </w:num>
   <w:num w:numId="23" w16cid:durableId="14618509">
     <w:abstractNumId w:val="10"/>
+  </w:num>
+  <w:num w:numId="24" w16cid:durableId="469632866">
+    <w:abstractNumId w:val="13"/>
+  </w:num>
+  <w:num w:numId="25" w16cid:durableId="989477440">
+    <w:abstractNumId w:val="19"/>
+  </w:num>
+  <w:num w:numId="26" w16cid:durableId="101416428">
+    <w:abstractNumId w:val="15"/>
   </w:num>
 </w:numbering>
 </file>

</xml_diff>